<commit_message>
doc: remove External Coach
</commit_message>
<xml_diff>
--- a/docs/SportManagement_BusinessRules_v2.0_updated.docx
+++ b/docs/SportManagement_BusinessRules_v2.0_updated.docx
@@ -61,7 +61,7 @@
         <w:spacing w:before="240" w:after="240"/>
       </w:pPr>
       <w:r>
-        <w:t>Thuật ngữ: Sport (môn); Class (lớp/khóa học có mã như Cầu lông 01); Session (buổi học); Room (phòng/sân); SeatHold (giữ chỗ tạm thời khi checkout); ClassPackage (gói của một lớp); ExternalCoach (huấn luyện viên tự do thuê sân); PointWallet (ví điểm). Sáu vai trò hệ thống: System Administrator, Center Manager, Coach, ExternalCoach, Member, Receptionist.</w:t>
+        <w:t>Thuật ngữ: Sport (môn); Class (lớp/khóa học có mã như Cầu lông 01); Session (buổi học); Room (phòng/sân); SeatHold (giữ chỗ tạm thời khi checkout); ClassPackage (gói của một lớp); PointWallet (ví điểm). Năm vai trò hệ thống: System Administrator, Center Manager, Coach, Member, Receptionist. Trung tâm không có huấn luyện viên freelancer và không cho phép gym/huấn luyện viên bên ngoài vào hoạt động; người ngoài muốn thuê sân dùng tài khoản Member bình thường (BR-140).</w:t>
       </w:r>
     </w:p>
     <w:p>
@@ -399,7 +399,7 @@
                 <w:sz w:val="18"/>
                 <w:szCs w:val="18"/>
               </w:rPr>
-              <w:t>Chỉ System Administrator được tạo tài khoản System Administrator, Center Manager và Receptionist; gán hoặc thay đổi vai trò người dùng. Center Manager được tạo và quản lý tài khoản Coach của trung tâm (kèm CoachSpecialty theo BR-96) và duyệt tài khoản ExternalCoach (BR-105), nhưng không được gán hoặc đổi vai trò. Mỗi tài khoản có đúng một vai trò. System Administrator đầu tiên được khởi tạo khi triển khai. Sau khi đổi vai trò có hiệu lực, request xác thực tiếp theo phải đối chiếu vai trò hiện tại; JWT mang vai trò cũ khác vai trò hiện tại bị từ chối. Đây không phải cam kết thu hồi toàn bộ token hoặc logout-all.</w:t>
+              <w:t>Chỉ System Administrator được tạo tài khoản System Administrator, Center Manager và Receptionist; gán hoặc thay đổi vai trò người dùng. Center Manager được tạo và quản lý tài khoản Coach của trung tâm (kèm CoachSpecialty theo BR-96), nhưng không được gán hoặc đổi vai trò. Mỗi tài khoản có đúng một vai trò. System Administrator đầu tiên được khởi tạo khi triển khai. Sau khi đổi vai trò có hiệu lực, request xác thực tiếp theo phải đối chiếu vai trò hiện tại; JWT mang vai trò cũ khác vai trò hiện tại bị từ chối. Đây không phải cam kết thu hồi toàn bộ token hoặc logout-all.</w:t>
             </w:r>
           </w:p>
         </w:tc>
@@ -512,7 +512,7 @@
                 <w:sz w:val="18"/>
                 <w:szCs w:val="18"/>
               </w:rPr>
-              <w:t>Mỗi tài khoản người dùng được gán chính xác một vai trò: System Administrator, Center Manager, Coach, ExternalCoach, Member hoặc Receptionist. Coach là huấn luyện viên của trung tâm; ExternalCoach là huấn luyện viên tự do thuê sân; hai vai trò tách biệt về tài khoản, quyền và dữ liệu. Khách chưa đăng nhập (Guest) không phải vai trò; Guest chỉ xem nội dung công khai của landing page (môn thể thao, lớp đang mở, giá, lịch sân trống tổng quát) và được đăng ký tài khoản Member hoặc ExternalCoach.</w:t>
+              <w:t>Mỗi tài khoản người dùng được gán chính xác một vai trò: System Administrator, Center Manager, Coach, Member hoặc Receptionist. Coach là huấn luyện viên của trung tâm. Trung tâm không có huấn luyện viên freelancer và không cho phép gym hoặc huấn luyện viên bên ngoài vào hoạt động (BR-140). Khách chưa đăng nhập (Guest) không phải vai trò; Guest chỉ xem nội dung công khai của landing page (môn thể thao, lớp đang mở, giá, lịch sân trống tổng quát) và được đăng ký tài khoản Member.</w:t>
             </w:r>
           </w:p>
         </w:tc>
@@ -575,7 +575,7 @@
                 <w:sz w:val="18"/>
                 <w:szCs w:val="18"/>
               </w:rPr>
-              <w:t>Đặc tả Tác nhân, Phần 2; thêm ExternalCoach, feedback giảng viên</w:t>
+              <w:t>Đặc tả Tác nhân, Phần 2; Quyết định người dùng 06/10/2026 — bỏ ExternalCoach, Member thuê sân</w:t>
             </w:r>
           </w:p>
         </w:tc>
@@ -960,7 +960,7 @@
                 <w:sz w:val="18"/>
                 <w:szCs w:val="18"/>
               </w:rPr>
-              <w:t>Mọi thao tác quản trị và nghiệp vụ quan trọng của System Administrator, Center Manager, Coach, ExternalCoach và Receptionist phải được ghi Audit Log, gồm người thực hiện, hành động, đối tượng bị tác động và thời điểm. Các nhóm thao tác bắt buộc ghi gồm: CRUD môn thể thao, tạo/duyệt/khóa tài khoản Coach và ExternalCoach, tạo/sửa/hủy lớp và lịch, quyết định về ngưỡng hoàn vốn, thuê/hủy sân, cộng/trừ/điều chỉnh điểm. Thao tác khóa hoặc mở khóa tài khoản phải ghi thêm lý do.</w:t>
+              <w:t>Mọi thao tác quản trị và nghiệp vụ quan trọng của System Administrator, Center Manager, Coach và Receptionist phải được ghi Audit Log, gồm người thực hiện, hành động, đối tượng bị tác động và thời điểm. Các nhóm thao tác bắt buộc ghi gồm: CRUD môn thể thao, tạo/khóa tài khoản Coach, tạo/sửa/hủy lớp và lịch, quyết định về ngưỡng hoàn vốn, thuê/hủy sân, cộng/trừ/điều chỉnh điểm. Thao tác khóa hoặc mở khóa tài khoản phải ghi thêm lý do.</w:t>
             </w:r>
           </w:p>
         </w:tc>
@@ -1521,7 +1521,7 @@
                 <w:sz w:val="18"/>
                 <w:szCs w:val="18"/>
               </w:rPr>
-              <w:t>Mỗi vai trò trong 6 vai trò hệ thống (System Administrator, Center Manager, Coach, ExternalCoach, Member, Receptionist) có tên vai trò (role_name) duy nhất trên toàn hệ thống; không có hai bản ghi Role nào được trùng tên — được đảm bảo bởi seed data cố định (6 dòng) cộng với một ràng buộc unique.</w:t>
+              <w:t>Mỗi vai trò trong 5 vai trò hệ thống (System Administrator, Center Manager, Coach, Member, Receptionist) có tên vai trò (role_name) duy nhất trên toàn hệ thống; không có hai bản ghi Role nào được trùng tên — được đảm bảo bởi seed data cố định (5 dòng) cộng với một ràng buộc unique.</w:t>
             </w:r>
           </w:p>
         </w:tc>
@@ -1584,7 +1584,7 @@
                 <w:sz w:val="18"/>
                 <w:szCs w:val="18"/>
               </w:rPr>
-              <w:t>Xem xét Thiết kế v2 — kiểm toán tính duy nhất; thêm ExternalCoach</w:t>
+              <w:t>Xem xét Thiết kế v2 — kiểm toán tính duy nhất; bỏ ExternalCoach</w:t>
             </w:r>
           </w:p>
         </w:tc>
@@ -2500,7 +2500,7 @@
                 <w:sz w:val="18"/>
                 <w:szCs w:val="18"/>
               </w:rPr>
-              <w:t>Mỗi Room (phòng tập/sân) thuộc một RoomType tương thích với một hoặc nhiều Sport. Tại mọi thời điểm một Room chỉ phục vụ tối đa một hoạt động: buổi lớp, buổi PT, lượt thuê của ExternalCoach hoặc khung giờ bị khóa; hệ thống từ chối mọi hoạt động giao thời gian với hoạt động khác trên cùng Room và phải được đảm bảo ở tầng cơ sở dữ liệu, không chỉ ở giao diện.</w:t>
+              <w:t>Mỗi Room (phòng tập/sân) thuộc một RoomType tương thích với một hoặc nhiều Sport. Tại mọi thời điểm một Room chỉ phục vụ tối đa một hoạt động: buổi lớp, buổi PT, lượt thuê của Member hoặc khung giờ bị khóa; hệ thống từ chối mọi hoạt động giao thời gian với hoạt động khác trên cùng Room và phải được đảm bảo ở tầng cơ sở dữ liệu, không chỉ ở giao diện.</w:t>
             </w:r>
           </w:p>
         </w:tc>
@@ -4652,8 +4652,7 @@
                 <w:sz w:val="18"/>
                 <w:szCs w:val="18"/>
               </w:rPr>
-              <w:lastRenderedPageBreak/>
-              <w:t>BR-13</w:t>
+              <w:t>BR-141</w:t>
             </w:r>
           </w:p>
         </w:tc>
@@ -4674,7 +4673,7 @@
                 <w:sz w:val="18"/>
                 <w:szCs w:val="18"/>
               </w:rPr>
-              <w:t>Thời lượng mỗi buổi của lớp lấy từ cấu hình của Sport (BR-106). Khi Center Manager nhập StartTime của buổi, EndTime = StartTime + thời lượng; giờ cụ thể và thời lượng không được hard-code trong business logic. Riêng buổi PT có thời lượng cố định 90 phút theo BR-70.</w:t>
+              <w:t>Dữ liệu khởi tạo (seed) có lịch lớp cố định cho hai môn GroupCourse. Bóng rổ: Thứ 2-4-6, 07:00–09:00 và Thứ 3-5-7, 14:00–16:00 (hai lớp Bóng rổ 01 và Bóng rổ 02). Cầu lông: cùng hai khung giờ trên sân cầu lông riêng (Cầu lông 01 và Cầu lông 02). Các khung giờ còn lại của sân là khung trống mở cho Member thuê (BR-126). Center Manager có thể thêm lớp hoặc sân vào các khung giờ khác trong tương lai theo BR-14 và BR-111; mọi lịch mới vẫn phải qua kiểm tra xung đột BR-112.</w:t>
             </w:r>
           </w:p>
         </w:tc>
@@ -4716,7 +4715,7 @@
                 <w:sz w:val="18"/>
                 <w:szCs w:val="18"/>
               </w:rPr>
-              <w:t>Tĩnh</w:t>
+              <w:t>Động</w:t>
             </w:r>
           </w:p>
         </w:tc>
@@ -4737,7 +4736,7 @@
                 <w:sz w:val="18"/>
                 <w:szCs w:val="18"/>
               </w:rPr>
-              <w:t>Quyết định người dùng; thời lượng theo cấu hình môn</w:t>
+              <w:t>Quyết định người dùng 06/10/2026 — bỏ ExternalCoach, Member thuê sân</w:t>
             </w:r>
           </w:p>
         </w:tc>
@@ -4765,6 +4764,119 @@
                 <w:sz w:val="18"/>
                 <w:szCs w:val="18"/>
               </w:rPr>
+              <w:lastRenderedPageBreak/>
+              <w:t>BR-13</w:t>
+            </w:r>
+          </w:p>
+        </w:tc>
+        <w:tc>
+          <w:tcPr>
+            <w:tcW w:w="5200" w:type="dxa"/>
+            <w:tcMar>
+              <w:top w:w="60" w:type="dxa"/>
+              <w:left w:w="100" w:type="dxa"/>
+              <w:bottom w:w="60" w:type="dxa"/>
+              <w:right w:w="100" w:type="dxa"/>
+            </w:tcMar>
+            <w:vAlign w:val="center"/>
+          </w:tcPr>
+          <w:p>
+            <w:r>
+              <w:rPr>
+                <w:sz w:val="18"/>
+                <w:szCs w:val="18"/>
+              </w:rPr>
+              <w:t>Thời lượng mỗi buổi của lớp lấy từ cấu hình của Sport (BR-106). Khi Center Manager nhập StartTime của buổi, EndTime = StartTime + thời lượng; giờ cụ thể và thời lượng không được hard-code trong business logic. Riêng buổi PT có thời lượng cố định 90 phút theo BR-70.</w:t>
+            </w:r>
+          </w:p>
+        </w:tc>
+        <w:tc>
+          <w:tcPr>
+            <w:tcW w:w="1400" w:type="dxa"/>
+            <w:tcMar>
+              <w:top w:w="60" w:type="dxa"/>
+              <w:left w:w="100" w:type="dxa"/>
+              <w:bottom w:w="60" w:type="dxa"/>
+              <w:right w:w="100" w:type="dxa"/>
+            </w:tcMar>
+            <w:vAlign w:val="center"/>
+          </w:tcPr>
+          <w:p>
+            <w:r>
+              <w:rPr>
+                <w:sz w:val="18"/>
+                <w:szCs w:val="18"/>
+              </w:rPr>
+              <w:t>Ràng buộc</w:t>
+            </w:r>
+          </w:p>
+        </w:tc>
+        <w:tc>
+          <w:tcPr>
+            <w:tcW w:w="1300" w:type="dxa"/>
+            <w:tcMar>
+              <w:top w:w="60" w:type="dxa"/>
+              <w:left w:w="100" w:type="dxa"/>
+              <w:bottom w:w="60" w:type="dxa"/>
+              <w:right w:w="100" w:type="dxa"/>
+            </w:tcMar>
+            <w:vAlign w:val="center"/>
+          </w:tcPr>
+          <w:p>
+            <w:r>
+              <w:rPr>
+                <w:sz w:val="18"/>
+                <w:szCs w:val="18"/>
+              </w:rPr>
+              <w:t>Tĩnh</w:t>
+            </w:r>
+          </w:p>
+        </w:tc>
+        <w:tc>
+          <w:tcPr>
+            <w:tcW w:w="2400" w:type="dxa"/>
+            <w:tcMar>
+              <w:top w:w="60" w:type="dxa"/>
+              <w:left w:w="100" w:type="dxa"/>
+              <w:bottom w:w="60" w:type="dxa"/>
+              <w:right w:w="100" w:type="dxa"/>
+            </w:tcMar>
+            <w:vAlign w:val="center"/>
+          </w:tcPr>
+          <w:p>
+            <w:r>
+              <w:rPr>
+                <w:sz w:val="18"/>
+                <w:szCs w:val="18"/>
+              </w:rPr>
+              <w:t>Quyết định người dùng; thời lượng theo cấu hình môn</w:t>
+            </w:r>
+          </w:p>
+        </w:tc>
+      </w:tr>
+      <w:tr>
+        <w:trPr>
+          <w:cantSplit/>
+        </w:trPr>
+        <w:tc>
+          <w:tcPr>
+            <w:tcW w:w="900" w:type="dxa"/>
+            <w:tcMar>
+              <w:top w:w="60" w:type="dxa"/>
+              <w:left w:w="100" w:type="dxa"/>
+              <w:bottom w:w="60" w:type="dxa"/>
+              <w:right w:w="100" w:type="dxa"/>
+            </w:tcMar>
+            <w:vAlign w:val="center"/>
+          </w:tcPr>
+          <w:p>
+            <w:r>
+              <w:rPr>
+                <w:b/>
+                <w:bCs/>
+                <w:sz w:val="18"/>
+                <w:szCs w:val="18"/>
+              </w:rPr>
               <w:t>BR-14</w:t>
             </w:r>
           </w:p>
@@ -4786,7 +4898,7 @@
                 <w:sz w:val="18"/>
                 <w:szCs w:val="18"/>
               </w:rPr>
-              <w:t>Chỉ Center Manager được tạo lớp, xếp lịch (ngày, giờ, Room), publish, close, hủy, phân công hoặc phân công lại Coach cho lớp. Coach được phân công phải là tài khoản Coach (không phải ExternalCoach), đang hoạt động và có CoachSpecialty khớp Sport của lớp (BR-96). Coach không được tự tạo, sửa, hủy, publish hoặc thay đổi lịch được giao.</w:t>
+              <w:t>Chỉ Center Manager được tạo lớp, xếp lịch (ngày, giờ, Room), publish, close, hủy, phân công hoặc phân công lại Coach cho lớp. Coach được phân công phải là tài khoản Coach đang hoạt động và có CoachSpecialty khớp Sport của lớp (BR-96). Coach không được tự tạo, sửa, hủy, publish hoặc thay đổi lịch được giao.</w:t>
             </w:r>
           </w:p>
         </w:tc>
@@ -9033,7 +9145,7 @@
           <w:b/>
           <w:bCs/>
         </w:rPr>
-        <w:t>H. Coach ngoài (ExternalCoach) &amp; Thuê sân</w:t>
+        <w:t>H. Thuê sân của Member</w:t>
       </w:r>
     </w:p>
     <w:p>
@@ -9041,7 +9153,7 @@
         <w:spacing w:before="240" w:after="240"/>
       </w:pPr>
       <w:r>
-        <w:t>ExternalCoach là huấn luyện viên tự do thuê sân của trung tâm để dạy học viên riêng của họ. Nguồn thu của trung tâm từ nhóm này là phí thuê sân theo giờ; trung tâm không quản lý học viên riêng, hợp đồng hay lương của coach ngoài.</w:t>
+        <w:t>Trung tâm không có huấn luyện viên freelancer và không cho phép gym hoặc huấn luyện viên bên ngoài vào hoạt động. Huấn luyện viên bên ngoài thuê sân được hiểu là Member bình thường; mọi Member đều có thêm chức năng đặt (thuê) sân còn trống. Trung tâm chỉ thu phí thuê sân của Member, không quan tâm Member dùng sân vào việc gì (kể cả dạy học) và không quản lý người đi cùng.</w:t>
       </w:r>
     </w:p>
     <w:tbl>
@@ -9232,7 +9344,7 @@
                 <w:sz w:val="18"/>
                 <w:szCs w:val="18"/>
               </w:rPr>
-              <w:t>BR-105</w:t>
+              <w:t>BR-125</w:t>
             </w:r>
           </w:p>
         </w:tc>
@@ -9253,7 +9365,7 @@
                 <w:sz w:val="18"/>
                 <w:szCs w:val="18"/>
               </w:rPr>
-              <w:t>ExternalCoach tự đăng ký trên landing page bằng email (xác thực OTP theo BR-78), họ tên, số điện thoại, môn giảng dạy và mô tả; tài khoản ở trạng thái PendingApproval và chưa được thuê sân. Center Manager Approve hoặc Reject (Reject phải có lý do và gửi email); chỉ ExternalCoach Approved mới được dùng chức năng thuê sân. Manager được Suspend hoặc Reactivate ExternalCoach kèm lý do và Audit Log.</w:t>
+              <w:t>Chức năng thuê sân của Member gồm: xem khung giờ sân còn trống, thuê và hủy lượt thuê của chính mình, thanh toán, xem ví điểm và lịch sử thuê của chính mình. Chức năng này không cấp thêm quyền xem dữ liệu Member khác, roster, lớp của trung tâm, báo cáo hay thay đổi lịch của trung tâm.</w:t>
             </w:r>
           </w:p>
         </w:tc>
@@ -9295,7 +9407,7 @@
                 <w:sz w:val="18"/>
                 <w:szCs w:val="18"/>
               </w:rPr>
-              <w:t>Động</w:t>
+              <w:t>Tĩnh</w:t>
             </w:r>
           </w:p>
         </w:tc>
@@ -9316,7 +9428,7 @@
                 <w:sz w:val="18"/>
                 <w:szCs w:val="18"/>
               </w:rPr>
-              <w:t>Feedback giảng viên — tài khoản riêng phân biệt coach ngoài; người dùng chọn: tự đăng ký + Manager duyệt</w:t>
+              <w:t>Quyết định người dùng 06/10/2026 — bỏ ExternalCoach, Member thuê sân</w:t>
             </w:r>
           </w:p>
         </w:tc>
@@ -9344,7 +9456,7 @@
                 <w:sz w:val="18"/>
                 <w:szCs w:val="18"/>
               </w:rPr>
-              <w:t>BR-125</w:t>
+              <w:t>BR-140</w:t>
             </w:r>
           </w:p>
         </w:tc>
@@ -9365,7 +9477,7 @@
                 <w:sz w:val="18"/>
                 <w:szCs w:val="18"/>
               </w:rPr>
-              <w:t>ExternalCoach chỉ được: cập nhật hồ sơ cá nhân, xem khung giờ sân còn trống, thuê và hủy lượt thuê của chính mình, thanh toán, xem ví điểm và lịch sử thuê của chính mình. ExternalCoach không được xem dữ liệu Member, roster, lớp của trung tâm, báo cáo hay thay đổi lịch của trung tâm.</w:t>
+              <w:t>Trung tâm không có huấn luyện viên freelancer và không cho phép gym hoặc huấn luyện viên bên ngoài vào hoạt động tại trung tâm. Huấn luyện viên bên ngoài muốn dùng sân đăng ký tài khoản Member bình thường (BR-1, BR-78) và được hiểu là Member như mọi người; không có vai trò, luồng đăng ký hay phê duyệt riêng. Mọi Member đều có thêm chức năng đặt (thuê) sân còn trống.</w:t>
             </w:r>
           </w:p>
         </w:tc>
@@ -9428,7 +9540,7 @@
                 <w:sz w:val="18"/>
                 <w:szCs w:val="18"/>
               </w:rPr>
-              <w:t>Feedback giảng viên</w:t>
+              <w:t>Quyết định người dùng 06/10/2026 — bỏ ExternalCoach, Member thuê sân</w:t>
             </w:r>
           </w:p>
         </w:tc>
@@ -9477,7 +9589,7 @@
                 <w:sz w:val="18"/>
                 <w:szCs w:val="18"/>
               </w:rPr>
-              <w:t>Khung giờ sân được hiển thị là còn trống chỉ khi Room tương thích với Sport, nằm trong giờ hoạt động (BR-109), không bị khóa và không có buổi lớp, buổi PT hoặc lượt thuê nào khác (BR-108). Đơn vị đặt là khối 60 phút.</w:t>
+              <w:t>Khung giờ sân được hiển thị là còn trống chỉ khi Room tương thích với Sport, nằm trong giờ hoạt động (BR-109), không bị khóa và không có buổi lớp, buổi PT hoặc lượt thuê nào khác (BR-108); các khung giờ lớp cố định theo BR-141 vì vậy không cho thuê. Đơn vị đặt là khối 60 phút.</w:t>
             </w:r>
           </w:p>
         </w:tc>
@@ -9540,7 +9652,7 @@
                 <w:sz w:val="18"/>
                 <w:szCs w:val="18"/>
               </w:rPr>
-              <w:t>Feedback giảng viên — coach ngoài pick giờ tập còn available</w:t>
+              <w:t>Quyết định người dùng 06/10/2026 — bỏ ExternalCoach, Member thuê sân</w:t>
             </w:r>
           </w:p>
         </w:tc>
@@ -9652,7 +9764,7 @@
                 <w:sz w:val="18"/>
                 <w:szCs w:val="18"/>
               </w:rPr>
-              <w:t>Feedback giảng viên — thu tiền từ coach freelancer</w:t>
+              <w:t>Quyết định người dùng 06/10/2026 — bỏ ExternalCoach, Member thuê sân</w:t>
             </w:r>
           </w:p>
         </w:tc>
@@ -9701,7 +9813,7 @@
                 <w:sz w:val="18"/>
                 <w:szCs w:val="18"/>
               </w:rPr>
-              <w:t>Lượt thuê (CourtRental) gồm ExternalCoach, Room, ngày và giờ bắt đầu/kết thúc theo bội số 60 phút, tối đa 4 giờ mỗi lượt và đặt trước tối đa 30 ngày (cấu hình được). Khi checkout, khung giờ được giữ như SeatHold (BR-115); lượt thuê chỉ CONFIRMED sau khi thanh toán thành công bằng VNPay và/hoặc điểm (BR-136).</w:t>
+              <w:t>Lượt thuê (CourtRental) gồm Member, Room, ngày và giờ bắt đầu/kết thúc theo bội số 60 phút, tối đa 4 giờ mỗi lượt và đặt trước tối đa 30 ngày (cấu hình được). Member không phải khai báo số người hay mục đích sử dụng và hệ thống không đặt giới hạn số người. Khi checkout, khung giờ được giữ như SeatHold (BR-115); lượt thuê chỉ CONFIRMED sau khi thanh toán thành công bằng VNPay và/hoặc điểm (BR-136).</w:t>
             </w:r>
           </w:p>
         </w:tc>
@@ -9764,7 +9876,7 @@
                 <w:sz w:val="18"/>
                 <w:szCs w:val="18"/>
               </w:rPr>
-              <w:t>Feedback giảng viên</w:t>
+              <w:t>Quyết định người dùng 06/10/2026 — bỏ ExternalCoach, Member thuê sân</w:t>
             </w:r>
           </w:p>
         </w:tc>
@@ -9813,7 +9925,7 @@
                 <w:sz w:val="18"/>
                 <w:szCs w:val="18"/>
               </w:rPr>
-              <w:t>ExternalCoach hủy lượt thuê từ 24 giờ trở lên trước giờ bắt đầu được hoàn 100% giá trị thực trả bằng điểm; hủy muộn hơn hoặc không đến thì không được hoàn. Lượt thuê bị trung tâm hủy (BR-130) luôn được hoàn 100% bằng điểm.</w:t>
+              <w:t>Member hủy lượt thuê từ 24 giờ trở lên trước giờ bắt đầu được hoàn 100% giá trị thực trả bằng điểm; hủy muộn hơn hoặc không đến thì không được hoàn. Lượt thuê bị trung tâm hủy (BR-130) luôn được hoàn 100% bằng điểm.</w:t>
             </w:r>
           </w:p>
         </w:tc>
@@ -9876,7 +9988,7 @@
                 <w:sz w:val="18"/>
                 <w:szCs w:val="18"/>
               </w:rPr>
-              <w:t>Feedback giảng viên; người dùng chọn: hủy trước 24 giờ</w:t>
+              <w:t>Quyết định người dùng 06/10/2026 — bỏ ExternalCoach, Member thuê sân</w:t>
             </w:r>
           </w:p>
         </w:tc>
@@ -9925,7 +10037,7 @@
                 <w:sz w:val="18"/>
                 <w:szCs w:val="18"/>
               </w:rPr>
-              <w:t>Khi có sự cố (mất điện, hỏng sân, bảo trì khẩn), Center Manager tạo Incident Notice chọn phạm vi (Room và khung giờ, hoặc toàn trung tâm) và lý do. Hệ thống khóa khung giờ bị ảnh hưởng (BR-109), gửi email ngay qua outbox cho Coach được phân công, ExternalCoach có lượt thuê và học viên của lớp bị ảnh hưởng (BR-138). Lượt thuê bị ảnh hưởng tự động hủy và hoàn 100% bằng điểm, ExternalCoach được ưu tiên đặt lại khung giờ khác; buổi lớp bị ảnh hưởng xử lý theo BR-54.</w:t>
+              <w:t>Khi có sự cố (mất điện, hỏng sân, bảo trì khẩn), Center Manager tạo Incident Notice chọn phạm vi (Room và khung giờ, hoặc toàn trung tâm) và lý do. Hệ thống khóa khung giờ bị ảnh hưởng (BR-109), gửi email ngay qua outbox cho Coach được phân công, Member có lượt thuê và học viên của lớp bị ảnh hưởng (BR-138). Lượt thuê bị ảnh hưởng tự động hủy và hoàn 100% bằng điểm, Member được ưu tiên đặt lại khung giờ khác; buổi lớp bị ảnh hưởng xử lý theo BR-54.</w:t>
             </w:r>
           </w:p>
         </w:tc>
@@ -10037,7 +10149,7 @@
                 <w:sz w:val="18"/>
                 <w:szCs w:val="18"/>
               </w:rPr>
-              <w:t>Center Manager và Receptionist xem Lịch sân (Court Schedule) theo ngày/tuần/Room; mỗi khung giờ hiển thị chủ thể sử dụng (lớp và Coach, PT và Coach, ExternalCoach thuê, bảo trì). Với lớp nhóm và PT hiển thị danh sách học viên (họ tên, tình trạng điểm danh); với lượt thuê của ExternalCoach hiển thị thông tin coach và số người dự kiến nếu coach khai báo, không quản lý học viên riêng của coach ngoài và không điểm danh học viên của ExternalCoach (Receptionist và Coach không điểm danh cho lượt thuê sân). Coach chỉ xem Lịch sân liên quan đến lớp mình phụ trách.</w:t>
+              <w:t>Center Manager và Receptionist xem Lịch sân (Court Schedule) theo ngày/tuần/Room; mỗi khung giờ hiển thị chủ thể sử dụng (lớp và Coach, PT và Coach, Member thuê, bảo trì). Với lớp nhóm và PT hiển thị danh sách học viên (họ tên, tình trạng điểm danh); với lượt thuê sân chỉ hiển thị Member đã thuê, không quản lý người đi cùng và không điểm danh (Receptionist và Coach không điểm danh cho lượt thuê sân). Coach chỉ xem Lịch sân liên quan đến lớp mình phụ trách.</w:t>
             </w:r>
           </w:p>
         </w:tc>
@@ -10150,7 +10262,7 @@
                 <w:sz w:val="18"/>
                 <w:szCs w:val="18"/>
               </w:rPr>
-              <w:t>Nguồn thu từ coach freelancer là phí thuê sân theo giờ (CourtRental), thu qua Invoice bằng VNPay và/hoặc điểm. Trung tâm không thu phần trăm học phí của coach ngoài, không quản lý hợp đồng hay lương (BR-101). Doanh thu thuê sân được báo cáo riêng theo BR-137.</w:t>
+              <w:t>Nguồn thu từ thuê sân là phí thuê theo giờ (CourtRental), tính cho Member đã thuê và thu qua Invoice bằng VNPay và/hoặc điểm. Trung tâm không quan tâm Member dùng sân vào việc gì (tập luyện, dạy học...), không thu phần trăm học phí của ai, không quản lý hợp đồng hay lương (BR-101). Doanh thu thuê sân được báo cáo riêng theo BR-137.</w:t>
             </w:r>
           </w:p>
         </w:tc>
@@ -10213,7 +10325,7 @@
                 <w:sz w:val="18"/>
                 <w:szCs w:val="18"/>
               </w:rPr>
-              <w:t>Feedback giảng viên; người dùng chọn: phí thuê sân theo giờ</w:t>
+              <w:t>Quyết định người dùng 06/10/2026 — bỏ ExternalCoach, Member thuê sân</w:t>
             </w:r>
           </w:p>
         </w:tc>
@@ -10262,7 +10374,7 @@
                 <w:sz w:val="18"/>
                 <w:szCs w:val="18"/>
               </w:rPr>
-              <w:t>Một ExternalCoach không được có hai lượt thuê giao thời gian nhau; mỗi khung giờ của mỗi Room chỉ thuộc một lượt thuê (BR-108). ExternalCoach ở trạng thái Suspended hoặc chưa Approved không được đặt mới; lượt thuê đã CONFIRMED vẫn xử lý theo BR-129.</w:t>
+              <w:t>Một Member không được có hai lượt thuê giao thời gian nhau; mỗi khung giờ của mỗi Room chỉ thuộc một lượt thuê (BR-108). Member bị khóa tài khoản không được đặt mới; lượt thuê đã CONFIRMED vẫn xử lý theo BR-129.</w:t>
             </w:r>
           </w:p>
         </w:tc>
@@ -10325,7 +10437,7 @@
                 <w:sz w:val="18"/>
                 <w:szCs w:val="18"/>
               </w:rPr>
-              <w:t>Feedback giảng viên</w:t>
+              <w:t>Quyết định người dùng 06/10/2026 — bỏ ExternalCoach, Member thuê sân</w:t>
             </w:r>
           </w:p>
         </w:tc>
@@ -10568,7 +10680,7 @@
                 <w:sz w:val="18"/>
                 <w:szCs w:val="18"/>
               </w:rPr>
-              <w:t>Member được tự checkout gói cho chính mình; Receptionist được checkout thay cho một Member được chọn rõ ràng (kể cả có dùng điểm theo BR-139); ExternalCoach được tự checkout lượt thuê sân của chính mình. Hệ thống phải lưu riêng người thụ hưởng dịch vụ và người khởi tạo checkout. Center Manager được xem giao dịch và xử lý ngoại lệ nhưng System Administrator không mặc nhiên có quyền Payment hoặc Revenue.</w:t>
+              <w:t>Member được tự checkout gói cho chính mình; Receptionist được checkout thay cho một Member được chọn rõ ràng (kể cả có dùng điểm theo BR-139); Member tự checkout lượt thuê sân của chính mình. Hệ thống phải lưu riêng người thụ hưởng dịch vụ và người khởi tạo checkout. Center Manager được xem giao dịch và xử lý ngoại lệ nhưng System Administrator không mặc nhiên có quyền Payment hoặc Revenue.</w:t>
             </w:r>
           </w:p>
         </w:tc>
@@ -10631,7 +10743,7 @@
                 <w:sz w:val="18"/>
                 <w:szCs w:val="18"/>
               </w:rPr>
-              <w:t>Quyết định người dùng 25–; thêm ExternalCoach</w:t>
+              <w:t>Quyết định người dùng 25–; thuê sân thuộc chức năng Member</w:t>
             </w:r>
           </w:p>
         </w:tc>
@@ -11689,7 +11801,7 @@
                 <w:sz w:val="18"/>
                 <w:szCs w:val="18"/>
               </w:rPr>
-              <w:t>Mỗi Member và mỗi ExternalCoach có đúng một ví điểm (PointWallet); 1 điểm có giá trị 1.000 VND. Số dư không âm và được lưu bằng PointLedger (còn gọi Point Transaction) chỉ ghi thêm (Earn, Hold, Release, Spend, Adjustment); mỗi dòng có ReferenceId duy nhất, người thực hiện, lý do và số dư sau, không được sửa hoặc xóa. Điểm không đổi ra tiền mặt, không rút, không chuyển nhượng và không hết hạn trong phiên bản này. Điểm chỉ được cộng khi: hoàn trả theo BR-91, BR-92, BR-122, BR-129, BR-130; bồi hoàn thanh toán trùng/thừa hoặc chỗ đã hết (BR-117); hoặc Center Manager điều chỉnh có lý do và Audit Log.</w:t>
+              <w:t>Mỗi Member có đúng một ví điểm (PointWallet); 1 điểm có giá trị 1.000 VND. Số dư không âm và được lưu bằng PointLedger (còn gọi Point Transaction) chỉ ghi thêm (Earn, Hold, Release, Spend, Adjustment); mỗi dòng có ReferenceId duy nhất, người thực hiện, lý do và số dư sau, không được sửa hoặc xóa. Điểm không đổi ra tiền mặt, không rút, không chuyển nhượng và không hết hạn trong phiên bản này. Điểm chỉ được cộng khi: hoàn trả theo BR-91, BR-92, BR-122, BR-129, BR-130; bồi hoàn thanh toán trùng/thừa hoặc chỗ đã hết (BR-117); hoặc Center Manager điều chỉnh có lý do và Audit Log.</w:t>
             </w:r>
           </w:p>
         </w:tc>
@@ -11801,7 +11913,7 @@
                 <w:sz w:val="18"/>
                 <w:szCs w:val="18"/>
               </w:rPr>
-              <w:t>Hệ thống không thực hiện hoàn tiền mặt hoặc chuyển khoản trả lại cho bất kỳ giao dịch nào và không gọi VNPay Refund API. Mọi khoản hoàn trả hoặc bồi hoàn của trung tâm cho Member hoặc ExternalCoach đều thực hiện bằng điểm theo BR-134. Đối soát thanh toán thu tiền (BR-84, BR-85, BR-88) không thay đổi.</w:t>
+              <w:t>Hệ thống không thực hiện hoàn tiền mặt hoặc chuyển khoản trả lại cho bất kỳ giao dịch nào và không gọi VNPay Refund API. Mọi khoản hoàn trả hoặc bồi hoàn của trung tâm cho Member đều thực hiện bằng điểm theo BR-134. Đối soát thanh toán thu tiền (BR-84, BR-85, BR-88) không thay đổi.</w:t>
             </w:r>
           </w:p>
         </w:tc>
@@ -13557,7 +13669,7 @@
                 <w:sz w:val="18"/>
                 <w:szCs w:val="18"/>
               </w:rPr>
-              <w:t>Coach không có Specialty Personal Training và ExternalCoach không được gọi AI workout suggestion hoặc lưu kết quả AI thành Workout Plan. Việc ẩn menu không thay thế kiểm tra backend; endpoint AI phải kiểm tra role Coach, Specialty Personal Training và quan hệ huấn luyện Active.</w:t>
+              <w:t>Coach không có Specialty Personal Training không được gọi AI workout suggestion hoặc lưu kết quả AI thành Workout Plan. Việc ẩn menu không thay thế kiểm tra backend; endpoint AI phải kiểm tra role Coach, Specialty Personal Training và quan hệ huấn luyện Active.</w:t>
             </w:r>
           </w:p>
         </w:tc>
@@ -14640,7 +14752,7 @@
                 <w:sz w:val="18"/>
                 <w:szCs w:val="18"/>
               </w:rPr>
-              <w:t>Center Manager xem báo cáo theo khoảng thời gian gồm: số hội viên (mới, đang Active), tình trạng đăng ký từng lớp (Capacity, số ghi danh CONFIRMED, SeatHold, ThresholdStatus, tỷ lệ lấp), doanh thu theo môn và theo nguồn (BR-95), doanh thu thuê sân theo ExternalCoach, điểm phát hành/sử dụng/còn lại, và lịch sử thao tác quan trọng (Audit Log).</w:t>
+              <w:t>Center Manager xem báo cáo theo khoảng thời gian gồm: số hội viên (mới, đang Active), tình trạng đăng ký từng lớp (Capacity, số ghi danh CONFIRMED, SeatHold, ThresholdStatus, tỷ lệ lấp), doanh thu theo môn và theo nguồn (BR-95), doanh thu thuê sân theo Member thuê, điểm phát hành/sử dụng/còn lại, và lịch sử thao tác quan trọng (Audit Log).</w:t>
             </w:r>
           </w:p>
         </w:tc>
@@ -15162,7 +15274,7 @@
                 <w:sz w:val="18"/>
                 <w:szCs w:val="18"/>
               </w:rPr>
-              <w:t>Center Manager có thể gửi thông báo thủ công qua email (sự cố, thay đổi vận hành) tới nhóm Coach, ExternalCoach có lượt thuê trong khung giờ được chọn hoặc Member của lớp được chọn. Nội dung và danh sách người nhận được ghi Audit Log; email gửi qua outbox (BR-34) và lỗi gửi không chặn hành động gốc.</w:t>
+              <w:t>Center Manager có thể gửi thông báo thủ công qua email (sự cố, thay đổi vận hành) tới nhóm Coach, Member có lượt thuê trong khung giờ được chọn hoặc Member của lớp được chọn. Nội dung và danh sách người nhận được ghi Audit Log; email gửi qua outbox (BR-34) và lỗi gửi không chặn hành động gốc.</w:t>
             </w:r>
           </w:p>
         </w:tc>
@@ -16351,7 +16463,7 @@
                 <w:sz w:val="18"/>
                 <w:szCs w:val="18"/>
               </w:rPr>
-              <w:t>Toàn hệ thống (6 giá trị cố định, gồm ExternalCoach)</w:t>
+              <w:t>Toàn hệ thống (5 giá trị cố định)</w:t>
             </w:r>
           </w:p>
         </w:tc>
@@ -16372,7 +16484,7 @@
                 <w:sz w:val="18"/>
                 <w:szCs w:val="18"/>
               </w:rPr>
-              <w:t>UNIQUE constraint + seed data cố định (6 dòng)</w:t>
+              <w:t>UNIQUE constraint + seed data cố định (5 dòng)</w:t>
             </w:r>
           </w:p>
         </w:tc>
@@ -17456,7 +17568,7 @@
                 <w:sz w:val="18"/>
                 <w:szCs w:val="18"/>
               </w:rPr>
-              <w:t>Mỗi Member/ExternalCoach có đúng một ví điểm</w:t>
+              <w:t>Mỗi Member có đúng một ví điểm</w:t>
             </w:r>
           </w:p>
         </w:tc>
@@ -19160,7 +19272,7 @@
                 <w:sz w:val="18"/>
                 <w:szCs w:val="18"/>
               </w:rPr>
-              <w:t>Học viên riêng của ExternalCoach</w:t>
+              <w:t>Người đi cùng khi Member thuê sân</w:t>
             </w:r>
           </w:p>
         </w:tc>
@@ -19181,7 +19293,7 @@
                 <w:sz w:val="18"/>
                 <w:szCs w:val="18"/>
               </w:rPr>
-              <w:t>Không quản lý và không điểm danh; chỉ lưu số người dự kiến nếu coach khai báo (BR-131) — đã chốt</w:t>
+              <w:t>Không khai báo, không quản lý, không điểm danh, không giới hạn số người (BR-128, BR-131) — đã chốt</w:t>
             </w:r>
           </w:p>
         </w:tc>

</xml_diff>

<commit_message>
remove funct homework for member
</commit_message>
<xml_diff>
--- a/docs/SportManagement_BusinessRules_v2.0_updated.docx
+++ b/docs/SportManagement_BusinessRules_v2.0_updated.docx
@@ -7714,7 +7714,7 @@
                 <w:sz w:val="18"/>
                 <w:szCs w:val="18"/>
               </w:rPr>
-              <w:t>Workout Result, nhận xét tiến độ và bài tập về nhà chỉ được ghi cho buổi PT 1:1 và chỉ bởi Coach thực sự phụ trách buổi đó (Coach có Specialty Personal Training). Buổi lớp nhóm chỉ có điểm danh (BR-98): Coach lớp nhóm không được ghi Workout Result, nhận xét tiến độ hoặc bài tập về nhà.</w:t>
+              <w:t>Workout Result và nhận xét tiến độ chỉ được ghi cho buổi PT 1:1 và chỉ bởi Coach thực sự phụ trách buổi đó (Coach có Specialty Personal Training). Buổi lớp nhóm chỉ có điểm danh (BR-98): Coach lớp nhóm không được ghi Workout Result hoặc nhận xét tiến độ.</w:t>
             </w:r>
           </w:p>
         </w:tc>
@@ -9059,7 +9059,7 @@
                 <w:sz w:val="18"/>
                 <w:szCs w:val="18"/>
               </w:rPr>
-              <w:t>Coach có Specialty Personal Training được xem lịch PT và học viên được phân công; xem mục tiêu/trình độ trong phạm vi quan hệ Active; tạo hoặc cập nhật Workout Plan; ghi kết quả, tiến độ, nhận xét và bài tập về nhà; ghi trạng thái buổi PT. Coach không được tự gán Member, quản trị tài khoản, đổi role hoặc quản lý lớp/phòng thay cho Manager.</w:t>
+              <w:t>Coach có Specialty Personal Training được xem lịch PT và học viên được phân công; xem mục tiêu/trình độ trong phạm vi quan hệ Active; tạo hoặc cập nhật Workout Plan; ghi kết quả, tiến độ và nhận xét; ghi trạng thái buổi PT. Coach không được tự gán Member, quản trị tài khoản, đổi role hoặc quản lý lớp/phòng thay cho Manager.</w:t>
             </w:r>
           </w:p>
         </w:tc>

</xml_diff>

<commit_message>
refactor: login with gg without create pw
</commit_message>
<xml_diff>
--- a/docs/SportManagement_BusinessRules_v2.0_updated.docx
+++ b/docs/SportManagement_BusinessRules_v2.0_updated.docx
@@ -1184,7 +1184,7 @@
                 <w:sz w:val="18"/>
                 <w:szCs w:val="18"/>
               </w:rPr>
-              <w:t>Một danh tính Đăng nhập Google chỉ có thể được liên kết với một tài khoản nội bộ đã tồn tại thông qua thao tác “Liên kết tài khoản Google” rõ ràng, được thực hiện khi người dùng đã đăng nhập vào chính tài khoản đó; hệ thống không bao giờ được tự động liên kết hoặc tự động tạo tài khoản chỉ vì email trên hồ sơ Google trùng với email của một tài khoản đã tồn tại (nhằm ngăn chặn chiếm quyền tài khoản trước — pre-hijacking).</w:t>
+              <w:t>Đăng nhập Google tự động liên kết tài khoản theo email: khi email trên hồ sơ Google (đã được Google xác minh) trùng với email của một tài khoản nội bộ đang hoạt động, hệ thống liên kết danh tính Google đó vào chính tài khoản này và cho đăng nhập, không tạo thêm tài khoản mới. Một danh tính Google chỉ liên kết được với một tài khoản; tài khoản đã liên kết với một danh tính Google khác không bị ghi đè; tài khoản bị khóa không được liên kết và không được cấp phiên. Người dùng có thể gỡ liên kết Google trong Cài đặt tài khoản, chỉ khi tài khoản đã có mật khẩu.</w:t>
             </w:r>
           </w:p>
         </w:tc>
@@ -1247,7 +1247,7 @@
                 <w:sz w:val="18"/>
                 <w:szCs w:val="18"/>
               </w:rPr>
-              <w:t>Xem xét Thiết kế v2 — bảo mật Đăng nhập Google (v1.2 draft 3, bổ sung)</w:t>
+              <w:t>Quyết định người dùng — liên kết tài khoản Google tự động theo email đã xác minh (thay quy tắc liên kết thủ công v1.2)</w:t>
             </w:r>
           </w:p>
         </w:tc>
@@ -1296,7 +1296,7 @@
                 <w:sz w:val="18"/>
                 <w:szCs w:val="18"/>
               </w:rPr>
-              <w:t>Khi một người dùng đăng nhập bằng Google lần đầu với email chưa tồn tại, hệ thống tạo tài khoản ở trạng thái chờ thiết lập mật khẩu và bắt buộc chính người dùng nhập, xác nhận một mật khẩu mới đáp ứng chính sách độ mạnh trước khi hoàn tất onboarding và sử dụng các chức năng được bảo vệ. Hệ thống không tự sinh hoặc gửi mật khẩu qua email. Các lần đăng nhập sau cho phép dùng Google hoặc email/mật khẩu. Nếu email Google đã tồn tại nhưng chưa được liên kết, vẫn áp dụng BR-59 và không tự động liên kết tài khoản.</w:t>
+              <w:t>Khi người dùng đăng nhập bằng Google lần đầu với email chưa tồn tại, hệ thống tạo ngay tài khoản Hội viên đang hoạt động với mật khẩu rỗng (password_hash = NULL); không có bước onboarding và không yêu cầu nhập mật khẩu lúc đăng ký. Tài khoản chưa có mật khẩu tạo mật khẩu bằng một trong hai luồng: (A) trong Cài đặt tài khoản, hệ thống gửi mã OTP 6 chữ số tới email của tài khoản (hiệu lực 10 phút, dùng một lần, tối đa 5 lần nhập sai, gửi lại sau 60 giây, lưu ở dạng băm), người dùng nhập mã cùng mật khẩu mới và xác nhận đáp ứng BR-102, không hỏi mật khẩu hiện tại; (B) luồng Quên mật khẩu theo BR-103 từ trang đăng nhập. Từ khi có mật khẩu, tài khoản đăng nhập được bằng cả Google lẫn email/mật khẩu; trước đó không đăng nhập được bằng email/mật khẩu. Hệ thống không tự sinh hoặc gửi mật khẩu qua email.</w:t>
             </w:r>
           </w:p>
         </w:tc>
@@ -1359,7 +1359,7 @@
                 <w:sz w:val="18"/>
                 <w:szCs w:val="18"/>
               </w:rPr>
-              <w:t>Quyết định người dùng — Google login lần đầu tự thiết lập mật khẩu; kế thừa bảo vệ BR-59</w:t>
+              <w:t>Quyết định người dùng — Google đăng ký không onboarding, mật khẩu NULL, tạo mật khẩu bằng OTP hoặc Quên mật khẩu</w:t>
             </w:r>
           </w:p>
         </w:tc>
@@ -1969,7 +1969,7 @@
                 <w:sz w:val="18"/>
                 <w:szCs w:val="18"/>
               </w:rPr>
-              <w:t>Đổi mật khẩu khi đang đăng nhập yêu cầu nhập đúng mật khẩu hiện tại và mật khẩu mới đáp ứng BR-102, khác mật khẩu hiện tại. Sau khi đổi thành công, các phiên khác của tài khoản bị vô hiệu và hệ thống gửi email thông báo. Tài khoản Google chưa từng thiết lập mật khẩu (BR-60) dùng luồng quên mật khẩu BR-103 thay vì nhập mật khẩu hiện tại.</w:t>
+              <w:t>Đổi mật khẩu khi đang đăng nhập yêu cầu nhập đúng mật khẩu hiện tại và mật khẩu mới đáp ứng BR-102, khác mật khẩu hiện tại. Sau khi đổi thành công, các phiên khác của tài khoản bị vô hiệu và hệ thống gửi email thông báo. Tài khoản chưa có mật khẩu (BR-60) không nhập mật khẩu hiện tại mà tạo mật khẩu bằng mã OTP gửi về email (BR-60, luồng A) hoặc luồng Quên mật khẩu BR-103.</w:t>
             </w:r>
           </w:p>
         </w:tc>

</xml_diff>

<commit_message>
chore: hand off non-UIUX work and deployment readiness
</commit_message>
<xml_diff>
--- a/docs/SportManagement_BusinessRules_v2.0_updated.docx
+++ b/docs/SportManagement_BusinessRules_v2.0_updated.docx
@@ -18049,14 +18049,6 @@
     </w:p>
     <w:p>
       <w:pPr>
-        <w:spacing w:before="240" w:after="240"/>
-      </w:pPr>
-      <w:r>
-        <w:t>Bảng sau giúp truy vết các quy tắc cũ không còn áp dụng nguyên văn do đổi phạm vi. Các mã được liệt kê không được dùng làm yêu cầu triển khai theo nội dung cũ.</w:t>
-      </w:r>
-    </w:p>
-    <w:p>
-      <w:pPr>
         <w:keepNext/>
         <w:spacing w:after="100"/>
       </w:pPr>
@@ -19406,6 +19398,1277 @@
       </w:tr>
     </w:tbl>
     <w:p/>
+    <w:p>
+      <w:pPr>
+        <w:pStyle w:val="Heading1"/>
+      </w:pPr>
+      <w:r>
+        <w:rPr/>
+        <w:t>P. Chi tiết luồng Đăng nhập Google, Mật khẩu và Liên kết tài khoản</w:t>
+      </w:r>
+    </w:p>
+    <w:p>
+      <w:pPr/>
+      <w:r>
+        <w:rPr/>
+        <w:t>Mục này mô tả chi tiết các quy tắc BR-59, BR-60, BR-104 đã nêu ở mục A. Các quy tắc BR-78 (OTP đăng ký), BR-102 (chính sách mật khẩu) và BR-103 (quên mật khẩu bằng link) giữ nguyên. Nó thay thế quy tắc cũ (liên kết Google thủ công, onboarding Google bắt buộc nhập mật khẩu).</w:t>
+      </w:r>
+    </w:p>
+    <w:p>
+      <w:pPr>
+        <w:pStyle w:val="Heading2"/>
+      </w:pPr>
+      <w:r>
+        <w:rPr/>
+        <w:t>1. Nguyên tắc</w:t>
+      </w:r>
+    </w:p>
+    <w:p>
+      <w:pPr>
+        <w:pStyle w:val="ListParagraph"/>
+      </w:pPr>
+      <w:r>
+        <w:rPr/>
+        <w:t>• Email trên hồ sơ Google đã được Google xác minh (email_verified = true) nên được tin dùng để nhận ra chủ tài khoản. Token chưa xác minh bị từ chối.</w:t>
+      </w:r>
+    </w:p>
+    <w:p>
+      <w:pPr>
+        <w:pStyle w:val="ListParagraph"/>
+      </w:pPr>
+      <w:r>
+        <w:rPr/>
+        <w:t>• Một tài khoản = một email. Đăng nhập Google và đăng nhập email/mật khẩu cùng trỏ về một tài khoản, không bao giờ tạo hai tài khoản cho một email.</w:t>
+      </w:r>
+    </w:p>
+    <w:p>
+      <w:pPr>
+        <w:pStyle w:val="ListParagraph"/>
+      </w:pPr>
+      <w:r>
+        <w:rPr/>
+        <w:t>• Tài khoản đăng ký bằng Google chưa có mật khẩu: user_credentials.password_hash = NULL. Hệ thống không tự sinh hay gửi mật khẩu.</w:t>
+      </w:r>
+    </w:p>
+    <w:p>
+      <w:pPr>
+        <w:pStyle w:val="Heading2"/>
+      </w:pPr>
+      <w:r>
+        <w:rPr/>
+        <w:t>2. Đăng nhập Google (POST /api/auth/google)</w:t>
+      </w:r>
+    </w:p>
+    <w:p>
+      <w:pPr/>
+      <w:r>
+        <w:rPr/>
+        <w:t>Thứ tự xử lý, dừng ở bước đầu tiên khớp:</w:t>
+      </w:r>
+    </w:p>
+    <w:tbl>
+      <w:tblPr>
+        <w:tblW w:w="10200" w:type="dxa"/>
+        <w:tblBorders>
+          <w:top w:val="single" w:sz="4" w:space="0" w:color="auto"/>
+          <w:left w:val="single" w:sz="4" w:space="0" w:color="auto"/>
+          <w:bottom w:val="single" w:sz="4" w:space="0" w:color="auto"/>
+          <w:right w:val="single" w:sz="4" w:space="0" w:color="auto"/>
+          <w:insideH w:val="single" w:sz="4" w:space="0" w:color="auto"/>
+          <w:insideV w:val="single" w:sz="4" w:space="0" w:color="auto"/>
+        </w:tblBorders>
+        <w:tblCellMar>
+          <w:left w:w="10" w:type="dxa"/>
+          <w:right w:w="10" w:type="dxa"/>
+        </w:tblCellMar>
+        <w:tblLook w:val="04A0" w:firstRow="1" w:lastRow="0" w:firstColumn="1" w:lastColumn="0" w:noHBand="0" w:noVBand="1"/>
+      </w:tblPr>
+      <w:tblGrid>
+        <w:gridCol w:w="1224"/>
+        <w:gridCol w:w="5100"/>
+        <w:gridCol w:w="3876"/>
+      </w:tblGrid>
+      <w:tr>
+        <w:trPr>
+          <w:cantSplit/>
+          <w:tblHeader/>
+        </w:trPr>
+        <w:tc>
+          <w:tcPr>
+            <w:tcW w:w="2" w:type="dxa"/>
+            <w:shd w:val="clear" w:color="auto" w:fill="D9E2F3"/>
+            <w:tcMar>
+              <w:top w:w="60" w:type="dxa"/>
+              <w:left w:w="100" w:type="dxa"/>
+              <w:bottom w:w="60" w:type="dxa"/>
+              <w:right w:w="100" w:type="dxa"/>
+            </w:tcMar>
+            <w:vAlign w:val="center"/>
+          </w:tcPr>
+          <w:p>
+            <w:pPr>
+              <w:keepNext/>
+            </w:pPr>
+            <w:r>
+              <w:rPr>
+                <w:b/>
+                <w:bCs/>
+                <w:sz w:val="18"/>
+                <w:szCs w:val="18"/>
+              </w:rPr>
+              <w:t>#</w:t>
+            </w:r>
+          </w:p>
+        </w:tc>
+        <w:tc>
+          <w:tcPr>
+            <w:tcW w:w="8" w:type="dxa"/>
+            <w:shd w:val="clear" w:color="auto" w:fill="D9E2F3"/>
+            <w:tcMar>
+              <w:top w:w="60" w:type="dxa"/>
+              <w:left w:w="100" w:type="dxa"/>
+              <w:bottom w:w="60" w:type="dxa"/>
+              <w:right w:w="100" w:type="dxa"/>
+            </w:tcMar>
+            <w:vAlign w:val="center"/>
+          </w:tcPr>
+          <w:p>
+            <w:pPr>
+              <w:keepNext/>
+            </w:pPr>
+            <w:r>
+              <w:rPr>
+                <w:b/>
+                <w:bCs/>
+                <w:sz w:val="18"/>
+                <w:szCs w:val="18"/>
+              </w:rPr>
+              <w:t>Điều kiện</w:t>
+            </w:r>
+          </w:p>
+        </w:tc>
+        <w:tc>
+          <w:tcPr>
+            <w:tcW w:w="6" w:type="dxa"/>
+            <w:shd w:val="clear" w:color="auto" w:fill="D9E2F3"/>
+            <w:tcMar>
+              <w:top w:w="60" w:type="dxa"/>
+              <w:left w:w="100" w:type="dxa"/>
+              <w:bottom w:w="60" w:type="dxa"/>
+              <w:right w:w="100" w:type="dxa"/>
+            </w:tcMar>
+            <w:vAlign w:val="center"/>
+          </w:tcPr>
+          <w:p>
+            <w:pPr>
+              <w:keepNext/>
+            </w:pPr>
+            <w:r>
+              <w:rPr>
+                <w:b/>
+                <w:bCs/>
+                <w:sz w:val="18"/>
+                <w:szCs w:val="18"/>
+              </w:rPr>
+              <w:t>Kết quả</w:t>
+            </w:r>
+          </w:p>
+        </w:tc>
+      </w:tr>
+      <w:tr>
+        <w:trPr>
+          <w:cantSplit/>
+        </w:trPr>
+        <w:tc>
+          <w:tcPr>
+            <w:tcW w:w="2" w:type="dxa"/>
+            <w:tcMar>
+              <w:top w:w="60" w:type="dxa"/>
+              <w:left w:w="100" w:type="dxa"/>
+              <w:bottom w:w="60" w:type="dxa"/>
+              <w:right w:w="100" w:type="dxa"/>
+            </w:tcMar>
+            <w:vAlign w:val="center"/>
+          </w:tcPr>
+          <w:p>
+            <w:r>
+              <w:t>1</w:t>
+            </w:r>
+          </w:p>
+        </w:tc>
+        <w:tc>
+          <w:tcPr>
+            <w:tcW w:w="8" w:type="dxa"/>
+            <w:tcMar>
+              <w:top w:w="60" w:type="dxa"/>
+              <w:left w:w="100" w:type="dxa"/>
+              <w:bottom w:w="60" w:type="dxa"/>
+              <w:right w:w="100" w:type="dxa"/>
+            </w:tcMar>
+            <w:vAlign w:val="center"/>
+          </w:tcPr>
+          <w:p>
+            <w:r>
+              <w:rPr>
+                <w:sz w:val="18"/>
+                <w:szCs w:val="18"/>
+              </w:rPr>
+              <w:t>Danh tính Google (sub) đã được liên kết với một tài khoản</w:t>
+            </w:r>
+          </w:p>
+        </w:tc>
+        <w:tc>
+          <w:tcPr>
+            <w:tcW w:w="6" w:type="dxa"/>
+            <w:tcMar>
+              <w:top w:w="60" w:type="dxa"/>
+              <w:left w:w="100" w:type="dxa"/>
+              <w:bottom w:w="60" w:type="dxa"/>
+              <w:right w:w="100" w:type="dxa"/>
+            </w:tcMar>
+            <w:vAlign w:val="center"/>
+          </w:tcPr>
+          <w:p>
+            <w:r>
+              <w:rPr>
+                <w:sz w:val="18"/>
+                <w:szCs w:val="18"/>
+              </w:rPr>
+              <w:t>Đăng nhập tài khoản đó. isNewAccount = false</w:t>
+            </w:r>
+          </w:p>
+        </w:tc>
+      </w:tr>
+      <w:tr>
+        <w:trPr>
+          <w:cantSplit/>
+        </w:trPr>
+        <w:tc>
+          <w:tcPr>
+            <w:tcW w:w="2" w:type="dxa"/>
+            <w:tcMar>
+              <w:top w:w="60" w:type="dxa"/>
+              <w:left w:w="100" w:type="dxa"/>
+              <w:bottom w:w="60" w:type="dxa"/>
+              <w:right w:w="100" w:type="dxa"/>
+            </w:tcMar>
+            <w:vAlign w:val="center"/>
+          </w:tcPr>
+          <w:p>
+            <w:r>
+              <w:t>2</w:t>
+            </w:r>
+          </w:p>
+        </w:tc>
+        <w:tc>
+          <w:tcPr>
+            <w:tcW w:w="8" w:type="dxa"/>
+            <w:tcMar>
+              <w:top w:w="60" w:type="dxa"/>
+              <w:left w:w="100" w:type="dxa"/>
+              <w:bottom w:w="60" w:type="dxa"/>
+              <w:right w:w="100" w:type="dxa"/>
+            </w:tcMar>
+            <w:vAlign w:val="center"/>
+          </w:tcPr>
+          <w:p>
+            <w:r>
+              <w:rPr>
+                <w:sz w:val="18"/>
+                <w:szCs w:val="18"/>
+              </w:rPr>
+              <w:t>Email Google trùng email một tài khoản có sẵn (không phân biệt hoa thường)</w:t>
+            </w:r>
+          </w:p>
+        </w:tc>
+        <w:tc>
+          <w:tcPr>
+            <w:tcW w:w="6" w:type="dxa"/>
+            <w:tcMar>
+              <w:top w:w="60" w:type="dxa"/>
+              <w:left w:w="100" w:type="dxa"/>
+              <w:bottom w:w="60" w:type="dxa"/>
+              <w:right w:w="100" w:type="dxa"/>
+            </w:tcMar>
+            <w:vAlign w:val="center"/>
+          </w:tcPr>
+          <w:p>
+            <w:r>
+              <w:rPr>
+                <w:sz w:val="18"/>
+                <w:szCs w:val="18"/>
+              </w:rPr>
+              <w:t>Tự liên kết danh tính Google vào tài khoản đó rồi đăng nhập. isNewAccount = false</w:t>
+            </w:r>
+          </w:p>
+        </w:tc>
+      </w:tr>
+      <w:tr>
+        <w:trPr>
+          <w:cantSplit/>
+        </w:trPr>
+        <w:tc>
+          <w:tcPr>
+            <w:tcW w:w="2" w:type="dxa"/>
+            <w:tcMar>
+              <w:top w:w="60" w:type="dxa"/>
+              <w:left w:w="100" w:type="dxa"/>
+              <w:bottom w:w="60" w:type="dxa"/>
+              <w:right w:w="100" w:type="dxa"/>
+            </w:tcMar>
+            <w:vAlign w:val="center"/>
+          </w:tcPr>
+          <w:p>
+            <w:r>
+              <w:t>3</w:t>
+            </w:r>
+          </w:p>
+        </w:tc>
+        <w:tc>
+          <w:tcPr>
+            <w:tcW w:w="8" w:type="dxa"/>
+            <w:tcMar>
+              <w:top w:w="60" w:type="dxa"/>
+              <w:left w:w="100" w:type="dxa"/>
+              <w:bottom w:w="60" w:type="dxa"/>
+              <w:right w:w="100" w:type="dxa"/>
+            </w:tcMar>
+            <w:vAlign w:val="center"/>
+          </w:tcPr>
+          <w:p>
+            <w:r>
+              <w:rPr>
+                <w:sz w:val="18"/>
+                <w:szCs w:val="18"/>
+              </w:rPr>
+              <w:t>Email chưa có tài khoản</w:t>
+            </w:r>
+          </w:p>
+        </w:tc>
+        <w:tc>
+          <w:tcPr>
+            <w:tcW w:w="6" w:type="dxa"/>
+            <w:tcMar>
+              <w:top w:w="60" w:type="dxa"/>
+              <w:left w:w="100" w:type="dxa"/>
+              <w:bottom w:w="60" w:type="dxa"/>
+              <w:right w:w="100" w:type="dxa"/>
+            </w:tcMar>
+            <w:vAlign w:val="center"/>
+          </w:tcPr>
+          <w:p>
+            <w:r>
+              <w:rPr>
+                <w:sz w:val="18"/>
+                <w:szCs w:val="18"/>
+              </w:rPr>
+              <w:t>Tạo ngay tài khoản Member Active, password_hash = NULL, họ tên lấy từ Google (thiếu thì lấy phần trước @), số điện thoại trống. isNewAccount = true</w:t>
+            </w:r>
+          </w:p>
+        </w:tc>
+      </w:tr>
+    </w:tbl>
+    <w:p>
+      <w:pPr/>
+      <w:r>
+        <w:rPr/>
+      </w:r>
+    </w:p>
+    <w:p>
+      <w:pPr/>
+      <w:r>
+        <w:rPr/>
+        <w:t>Quy tắc kèm theo:</w:t>
+      </w:r>
+    </w:p>
+    <w:p>
+      <w:pPr>
+        <w:pStyle w:val="ListParagraph"/>
+      </w:pPr>
+      <w:r>
+        <w:rPr/>
+        <w:t>• Tài khoản bị khóa (Banned, Deactivated): không liên kết, không cấp phiên (bước 1 và 2).</w:t>
+      </w:r>
+    </w:p>
+    <w:p>
+      <w:pPr>
+        <w:pStyle w:val="ListParagraph"/>
+      </w:pPr>
+      <w:r>
+        <w:rPr/>
+        <w:t>• Tài khoản ở bước 2 đã liên kết với một danh tính Google khác: trả 409 google_identity_mismatch, không ghi đè.</w:t>
+      </w:r>
+    </w:p>
+    <w:p>
+      <w:pPr>
+        <w:pStyle w:val="ListParagraph"/>
+      </w:pPr>
+      <w:r>
+        <w:rPr/>
+        <w:t>• Hai yêu cầu đăng nhập song song cùng một người mới: chỉ một tài khoản được tạo, yêu cầu còn lại nhận 409 google_login_conflict và thử lại là vào nhánh bước 1.</w:t>
+      </w:r>
+    </w:p>
+    <w:p>
+      <w:pPr>
+        <w:pStyle w:val="ListParagraph"/>
+      </w:pPr>
+      <w:r>
+        <w:rPr/>
+        <w:t>• Không có bước onboarding và không còn endpoint POST /api/auth/google/onboarding. Bảng google_onboarding_tickets đã bị gỡ.</w:t>
+      </w:r>
+    </w:p>
+    <w:p>
+      <w:pPr>
+        <w:pStyle w:val="ListParagraph"/>
+      </w:pPr>
+      <w:r>
+        <w:rPr/>
+        <w:t>• Tài khoản nhân sự (Manager, Receptionist, Coach, Admin) áp dụng cùng quy tắc nếu email Google trùng email tài khoản của họ.</w:t>
+      </w:r>
+    </w:p>
+    <w:p>
+      <w:pPr>
+        <w:pStyle w:val="Heading2"/>
+      </w:pPr>
+      <w:r>
+        <w:rPr/>
+        <w:t>3. Đăng nhập email/mật khẩu với tài khoản chưa có mật khẩu</w:t>
+      </w:r>
+    </w:p>
+    <w:p>
+      <w:pPr/>
+      <w:r>
+        <w:rPr/>
+        <w:t>POST /api/auth/login trả lỗi thông tin đăng nhập chung (401), giống như sai mật khẩu, để không lộ việc email có tồn tại hay đăng ký bằng Google. Người dùng tạo mật khẩu theo Luồng A hoặc Luồng B.</w:t>
+      </w:r>
+    </w:p>
+    <w:p>
+      <w:pPr>
+        <w:pStyle w:val="Heading2"/>
+      </w:pPr>
+      <w:r>
+        <w:rPr/>
+        <w:t>4. Luồng A: Tạo mật khẩu trong Cài đặt tài khoản (khuyên dùng)</w:t>
+      </w:r>
+    </w:p>
+    <w:p>
+      <w:pPr/>
+      <w:r>
+        <w:rPr/>
+        <w:t>Áp dụng khi tài khoản chưa có mật khẩu (hasPassword = false trong GET /api/users/me).</w:t>
+      </w:r>
+    </w:p>
+    <w:p>
+      <w:pPr>
+        <w:pStyle w:val="ListParagraph"/>
+      </w:pPr>
+      <w:r>
+        <w:rPr/>
+        <w:t>1. Giao diện hiển thị khối "Đặt mật khẩu" thay cho "Đổi mật khẩu" (không có ô mật khẩu hiện tại).</w:t>
+      </w:r>
+    </w:p>
+    <w:p>
+      <w:pPr>
+        <w:pStyle w:val="ListParagraph"/>
+      </w:pPr>
+      <w:r>
+        <w:rPr/>
+        <w:t>2. Người dùng bấm "Gửi mã xác nhận": POST /api/users/me/password/otp (cần đăng nhập). Hệ thống gửi mã OTP 6 chữ số tới email của chính tài khoản.</w:t>
+      </w:r>
+    </w:p>
+    <w:p>
+      <w:pPr>
+        <w:pStyle w:val="ListParagraph"/>
+      </w:pPr>
+      <w:r>
+        <w:rPr/>
+        <w:t>3. Người dùng nhập mã, mật khẩu mới và xác nhận mật khẩu mới, rồi gửi POST /api/users/me/password với otpCode, newPassword, confirmNewPassword.</w:t>
+      </w:r>
+    </w:p>
+    <w:p>
+      <w:pPr>
+        <w:pStyle w:val="ListParagraph"/>
+      </w:pPr>
+      <w:r>
+        <w:rPr/>
+        <w:t>4. Thành công: lưu mật khẩu, đổi security stamp (phiên cũ mất hiệu lực), trả JWT mới cho phiên hiện tại. Từ lúc này tài khoản đăng nhập được bằng cả Google lẫn email/mật khẩu.</w:t>
+      </w:r>
+    </w:p>
+    <w:p>
+      <w:pPr/>
+      <w:r>
+        <w:rPr/>
+        <w:t>Ràng buộc của mã OTP (cùng chuẩn với BR-78):</w:t>
+      </w:r>
+    </w:p>
+    <w:p>
+      <w:pPr>
+        <w:pStyle w:val="ListParagraph"/>
+      </w:pPr>
+      <w:r>
+        <w:rPr/>
+        <w:t>• Hiệu lực 10 phút, dùng một lần, chỉ mã mới nhất còn hiệu lực.</w:t>
+      </w:r>
+    </w:p>
+    <w:p>
+      <w:pPr>
+        <w:pStyle w:val="ListParagraph"/>
+      </w:pPr>
+      <w:r>
+        <w:rPr/>
+        <w:t>• Tối đa 5 lần nhập sai; quá ngưỡng phải xin mã mới (otp_attempts_exceeded).</w:t>
+      </w:r>
+    </w:p>
+    <w:p>
+      <w:pPr>
+        <w:pStyle w:val="ListParagraph"/>
+      </w:pPr>
+      <w:r>
+        <w:rPr/>
+        <w:t>• Gửi lại phải chờ ít nhất 60 giây (429 otp_resend_too_soon) và chịu rate limit theo IP (3 lần/phút).</w:t>
+      </w:r>
+    </w:p>
+    <w:p>
+      <w:pPr>
+        <w:pStyle w:val="ListParagraph"/>
+      </w:pPr>
+      <w:r>
+        <w:rPr/>
+        <w:t>• Lưu ở dạng băm SHA-256, không ghi log giá trị rõ. Mã gắn với email của tài khoản đang đăng nhập nên không dùng được cho tài khoản khác.</w:t>
+      </w:r>
+    </w:p>
+    <w:p>
+      <w:pPr>
+        <w:pStyle w:val="ListParagraph"/>
+      </w:pPr>
+      <w:r>
+        <w:rPr/>
+        <w:t>• Mã chỉ bị tiêu khi mật khẩu được lưu thành công. Mật khẩu yếu hoặc xác nhận không khớp bị chặn trước khi kiểm mã nên không làm mất lượt thử.</w:t>
+      </w:r>
+    </w:p>
+    <w:p>
+      <w:pPr/>
+      <w:r>
+        <w:rPr/>
+        <w:t>Lỗi thường gặp:</w:t>
+      </w:r>
+    </w:p>
+    <w:tbl>
+      <w:tblPr>
+        <w:tblW w:w="10200" w:type="dxa"/>
+        <w:tblBorders>
+          <w:top w:val="single" w:sz="4" w:space="0" w:color="auto"/>
+          <w:left w:val="single" w:sz="4" w:space="0" w:color="auto"/>
+          <w:bottom w:val="single" w:sz="4" w:space="0" w:color="auto"/>
+          <w:right w:val="single" w:sz="4" w:space="0" w:color="auto"/>
+          <w:insideH w:val="single" w:sz="4" w:space="0" w:color="auto"/>
+          <w:insideV w:val="single" w:sz="4" w:space="0" w:color="auto"/>
+        </w:tblBorders>
+        <w:tblCellMar>
+          <w:left w:w="10" w:type="dxa"/>
+          <w:right w:w="10" w:type="dxa"/>
+        </w:tblCellMar>
+        <w:tblLook w:val="04A0" w:firstRow="1" w:lastRow="0" w:firstColumn="1" w:lastColumn="0" w:noHBand="0" w:noVBand="1"/>
+      </w:tblPr>
+      <w:tblGrid>
+        <w:gridCol w:w="5100"/>
+        <w:gridCol w:w="5100"/>
+      </w:tblGrid>
+      <w:tr>
+        <w:trPr>
+          <w:cantSplit/>
+          <w:tblHeader/>
+        </w:trPr>
+        <w:tc>
+          <w:tcPr>
+            <w:tcW w:w="8" w:type="dxa"/>
+            <w:shd w:val="clear" w:color="auto" w:fill="D9E2F3"/>
+            <w:tcMar>
+              <w:top w:w="60" w:type="dxa"/>
+              <w:left w:w="100" w:type="dxa"/>
+              <w:bottom w:w="60" w:type="dxa"/>
+              <w:right w:w="100" w:type="dxa"/>
+            </w:tcMar>
+            <w:vAlign w:val="center"/>
+          </w:tcPr>
+          <w:p>
+            <w:pPr>
+              <w:keepNext/>
+            </w:pPr>
+            <w:r>
+              <w:rPr>
+                <w:b/>
+                <w:bCs/>
+                <w:sz w:val="18"/>
+                <w:szCs w:val="18"/>
+              </w:rPr>
+              <w:t>Mã lỗi</w:t>
+            </w:r>
+          </w:p>
+        </w:tc>
+        <w:tc>
+          <w:tcPr>
+            <w:tcW w:w="8" w:type="dxa"/>
+            <w:shd w:val="clear" w:color="auto" w:fill="D9E2F3"/>
+            <w:tcMar>
+              <w:top w:w="60" w:type="dxa"/>
+              <w:left w:w="100" w:type="dxa"/>
+              <w:bottom w:w="60" w:type="dxa"/>
+              <w:right w:w="100" w:type="dxa"/>
+            </w:tcMar>
+            <w:vAlign w:val="center"/>
+          </w:tcPr>
+          <w:p>
+            <w:pPr>
+              <w:keepNext/>
+            </w:pPr>
+            <w:r>
+              <w:rPr>
+                <w:b/>
+                <w:bCs/>
+                <w:sz w:val="18"/>
+                <w:szCs w:val="18"/>
+              </w:rPr>
+              <w:t>Ý nghĩa</w:t>
+            </w:r>
+          </w:p>
+        </w:tc>
+      </w:tr>
+      <w:tr>
+        <w:trPr>
+          <w:cantSplit/>
+        </w:trPr>
+        <w:tc>
+          <w:tcPr>
+            <w:tcW w:w="8" w:type="dxa"/>
+            <w:tcMar>
+              <w:top w:w="60" w:type="dxa"/>
+              <w:left w:w="100" w:type="dxa"/>
+              <w:bottom w:w="60" w:type="dxa"/>
+              <w:right w:w="100" w:type="dxa"/>
+            </w:tcMar>
+            <w:vAlign w:val="center"/>
+          </w:tcPr>
+          <w:p>
+            <w:r>
+              <w:t>otp_required</w:t>
+            </w:r>
+          </w:p>
+        </w:tc>
+        <w:tc>
+          <w:tcPr>
+            <w:tcW w:w="8" w:type="dxa"/>
+            <w:tcMar>
+              <w:top w:w="60" w:type="dxa"/>
+              <w:left w:w="100" w:type="dxa"/>
+              <w:bottom w:w="60" w:type="dxa"/>
+              <w:right w:w="100" w:type="dxa"/>
+            </w:tcMar>
+            <w:vAlign w:val="center"/>
+          </w:tcPr>
+          <w:p>
+            <w:r>
+              <w:rPr>
+                <w:sz w:val="18"/>
+                <w:szCs w:val="18"/>
+              </w:rPr>
+              <w:t>Tài khoản chưa có mật khẩu nhưng không gửi otpCode</w:t>
+            </w:r>
+          </w:p>
+        </w:tc>
+      </w:tr>
+      <w:tr>
+        <w:trPr>
+          <w:cantSplit/>
+        </w:trPr>
+        <w:tc>
+          <w:tcPr>
+            <w:tcW w:w="8" w:type="dxa"/>
+            <w:tcMar>
+              <w:top w:w="60" w:type="dxa"/>
+              <w:left w:w="100" w:type="dxa"/>
+              <w:bottom w:w="60" w:type="dxa"/>
+              <w:right w:w="100" w:type="dxa"/>
+            </w:tcMar>
+            <w:vAlign w:val="center"/>
+          </w:tcPr>
+          <w:p>
+            <w:r>
+              <w:t>otp_invalid</w:t>
+            </w:r>
+          </w:p>
+        </w:tc>
+        <w:tc>
+          <w:tcPr>
+            <w:tcW w:w="8" w:type="dxa"/>
+            <w:tcMar>
+              <w:top w:w="60" w:type="dxa"/>
+              <w:left w:w="100" w:type="dxa"/>
+              <w:bottom w:w="60" w:type="dxa"/>
+              <w:right w:w="100" w:type="dxa"/>
+            </w:tcMar>
+            <w:vAlign w:val="center"/>
+          </w:tcPr>
+          <w:p>
+            <w:r>
+              <w:rPr>
+                <w:sz w:val="18"/>
+                <w:szCs w:val="18"/>
+              </w:rPr>
+              <w:t>Mã sai</w:t>
+            </w:r>
+          </w:p>
+        </w:tc>
+      </w:tr>
+      <w:tr>
+        <w:trPr>
+          <w:cantSplit/>
+        </w:trPr>
+        <w:tc>
+          <w:tcPr>
+            <w:tcW w:w="8" w:type="dxa"/>
+            <w:tcMar>
+              <w:top w:w="60" w:type="dxa"/>
+              <w:left w:w="100" w:type="dxa"/>
+              <w:bottom w:w="60" w:type="dxa"/>
+              <w:right w:w="100" w:type="dxa"/>
+            </w:tcMar>
+            <w:vAlign w:val="center"/>
+          </w:tcPr>
+          <w:p>
+            <w:r>
+              <w:t>otp_expired / otp_already_used / otp_attempts_exceeded</w:t>
+            </w:r>
+          </w:p>
+        </w:tc>
+        <w:tc>
+          <w:tcPr>
+            <w:tcW w:w="8" w:type="dxa"/>
+            <w:tcMar>
+              <w:top w:w="60" w:type="dxa"/>
+              <w:left w:w="100" w:type="dxa"/>
+              <w:bottom w:w="60" w:type="dxa"/>
+              <w:right w:w="100" w:type="dxa"/>
+            </w:tcMar>
+            <w:vAlign w:val="center"/>
+          </w:tcPr>
+          <w:p>
+            <w:r>
+              <w:rPr>
+                <w:sz w:val="18"/>
+                <w:szCs w:val="18"/>
+              </w:rPr>
+              <w:t>Mã hết hạn, đã dùng, hoặc hết lượt thử</w:t>
+            </w:r>
+          </w:p>
+        </w:tc>
+      </w:tr>
+      <w:tr>
+        <w:trPr>
+          <w:cantSplit/>
+        </w:trPr>
+        <w:tc>
+          <w:tcPr>
+            <w:tcW w:w="8" w:type="dxa"/>
+            <w:tcMar>
+              <w:top w:w="60" w:type="dxa"/>
+              <w:left w:w="100" w:type="dxa"/>
+              <w:bottom w:w="60" w:type="dxa"/>
+              <w:right w:w="100" w:type="dxa"/>
+            </w:tcMar>
+            <w:vAlign w:val="center"/>
+          </w:tcPr>
+          <w:p>
+            <w:r>
+              <w:t>password_already_set (409)</w:t>
+            </w:r>
+          </w:p>
+        </w:tc>
+        <w:tc>
+          <w:tcPr>
+            <w:tcW w:w="8" w:type="dxa"/>
+            <w:tcMar>
+              <w:top w:w="60" w:type="dxa"/>
+              <w:left w:w="100" w:type="dxa"/>
+              <w:bottom w:w="60" w:type="dxa"/>
+              <w:right w:w="100" w:type="dxa"/>
+            </w:tcMar>
+            <w:vAlign w:val="center"/>
+          </w:tcPr>
+          <w:p>
+            <w:r>
+              <w:rPr>
+                <w:sz w:val="18"/>
+                <w:szCs w:val="18"/>
+              </w:rPr>
+              <w:t>Xin mã khi tài khoản đã có mật khẩu: hãy dùng đổi mật khẩu</w:t>
+            </w:r>
+          </w:p>
+        </w:tc>
+      </w:tr>
+    </w:tbl>
+    <w:p>
+      <w:pPr/>
+      <w:r>
+        <w:rPr/>
+      </w:r>
+    </w:p>
+    <w:p>
+      <w:pPr>
+        <w:pStyle w:val="Heading2"/>
+      </w:pPr>
+      <w:r>
+        <w:rPr/>
+        <w:t>5. Luồng B: Quên mật khẩu (link email)</w:t>
+      </w:r>
+    </w:p>
+    <w:p>
+      <w:pPr/>
+      <w:r>
+        <w:rPr/>
+        <w:t>Giữ nguyên BR-103. Người dùng ở trang đăng nhập nhập email rồi chọn "Quên mật khẩu": hệ thống gửi link đặt lại (token 256-bit, hiệu lực 10 phút, dùng một lần), người dùng tạo mật khẩu mới. Luồng này dùng được cho tài khoản chưa có mật khẩu (Google) và không hỏi mật khẩu cũ. Phản hồi luôn trung tính, không lộ email nào đã đăng ký.</w:t>
+      </w:r>
+    </w:p>
+    <w:p>
+      <w:pPr>
+        <w:pStyle w:val="Heading2"/>
+      </w:pPr>
+      <w:r>
+        <w:rPr/>
+        <w:t>6. Đổi mật khẩu khi đã có mật khẩu</w:t>
+      </w:r>
+    </w:p>
+    <w:p>
+      <w:pPr/>
+      <w:r>
+        <w:rPr/>
+        <w:t>Giữ nguyên BR-104: nhập đúng mật khẩu hiện tại, mật khẩu mới đáp ứng BR-102 và khác mật khẩu cũ. Trường otpCode bị bỏ qua. Thành công vô hiệu mọi phiên cũ.</w:t>
+      </w:r>
+    </w:p>
+    <w:p>
+      <w:pPr>
+        <w:pStyle w:val="Heading2"/>
+      </w:pPr>
+      <w:r>
+        <w:rPr/>
+        <w:t>7. Gỡ liên kết Google</w:t>
+      </w:r>
+    </w:p>
+    <w:p>
+      <w:pPr/>
+      <w:r>
+        <w:rPr/>
+        <w:t>DELETE /api/auth/google/link chỉ thành công khi tài khoản đã có mật khẩu (password_required_before_unlink), tránh khóa người dùng ra khỏi tài khoản. Liên kết thủ công POST /api/auth/google/link (đã đăng nhập) còn dùng được cho trường hợp email Google khác email tài khoản.</w:t>
+      </w:r>
+    </w:p>
+    <w:p>
+      <w:pPr>
+        <w:pStyle w:val="Heading2"/>
+      </w:pPr>
+      <w:r>
+        <w:rPr/>
+        <w:t>8. Tóm tắt thay đổi so với quy tắc cũ</w:t>
+      </w:r>
+    </w:p>
+    <w:tbl>
+      <w:tblPr>
+        <w:tblW w:w="10200" w:type="dxa"/>
+        <w:tblBorders>
+          <w:top w:val="single" w:sz="4" w:space="0" w:color="auto"/>
+          <w:left w:val="single" w:sz="4" w:space="0" w:color="auto"/>
+          <w:bottom w:val="single" w:sz="4" w:space="0" w:color="auto"/>
+          <w:right w:val="single" w:sz="4" w:space="0" w:color="auto"/>
+          <w:insideH w:val="single" w:sz="4" w:space="0" w:color="auto"/>
+          <w:insideV w:val="single" w:sz="4" w:space="0" w:color="auto"/>
+        </w:tblBorders>
+        <w:tblCellMar>
+          <w:left w:w="10" w:type="dxa"/>
+          <w:right w:w="10" w:type="dxa"/>
+        </w:tblCellMar>
+        <w:tblLook w:val="04A0" w:firstRow="1" w:lastRow="0" w:firstColumn="1" w:lastColumn="0" w:noHBand="0" w:noVBand="1"/>
+      </w:tblPr>
+      <w:tblGrid>
+        <w:gridCol w:w="1224"/>
+        <w:gridCol w:w="5100"/>
+        <w:gridCol w:w="3876"/>
+      </w:tblGrid>
+      <w:tr>
+        <w:trPr>
+          <w:cantSplit/>
+          <w:tblHeader/>
+        </w:trPr>
+        <w:tc>
+          <w:tcPr>
+            <w:tcW w:w="2" w:type="dxa"/>
+            <w:shd w:val="clear" w:color="auto" w:fill="D9E2F3"/>
+            <w:tcMar>
+              <w:top w:w="60" w:type="dxa"/>
+              <w:left w:w="100" w:type="dxa"/>
+              <w:bottom w:w="60" w:type="dxa"/>
+              <w:right w:w="100" w:type="dxa"/>
+            </w:tcMar>
+            <w:vAlign w:val="center"/>
+          </w:tcPr>
+          <w:p>
+            <w:pPr>
+              <w:keepNext/>
+            </w:pPr>
+            <w:r>
+              <w:rPr>
+                <w:b/>
+                <w:bCs/>
+                <w:sz w:val="18"/>
+                <w:szCs w:val="18"/>
+              </w:rPr>
+              <w:t>Chủ đề</w:t>
+            </w:r>
+          </w:p>
+        </w:tc>
+        <w:tc>
+          <w:tcPr>
+            <w:tcW w:w="8" w:type="dxa"/>
+            <w:shd w:val="clear" w:color="auto" w:fill="D9E2F3"/>
+            <w:tcMar>
+              <w:top w:w="60" w:type="dxa"/>
+              <w:left w:w="100" w:type="dxa"/>
+              <w:bottom w:w="60" w:type="dxa"/>
+              <w:right w:w="100" w:type="dxa"/>
+            </w:tcMar>
+            <w:vAlign w:val="center"/>
+          </w:tcPr>
+          <w:p>
+            <w:pPr>
+              <w:keepNext/>
+            </w:pPr>
+            <w:r>
+              <w:rPr>
+                <w:b/>
+                <w:bCs/>
+                <w:sz w:val="18"/>
+                <w:szCs w:val="18"/>
+              </w:rPr>
+              <w:t>Trước</w:t>
+            </w:r>
+          </w:p>
+        </w:tc>
+        <w:tc>
+          <w:tcPr>
+            <w:tcW w:w="6" w:type="dxa"/>
+            <w:shd w:val="clear" w:color="auto" w:fill="D9E2F3"/>
+            <w:tcMar>
+              <w:top w:w="60" w:type="dxa"/>
+              <w:left w:w="100" w:type="dxa"/>
+              <w:bottom w:w="60" w:type="dxa"/>
+              <w:right w:w="100" w:type="dxa"/>
+            </w:tcMar>
+            <w:vAlign w:val="center"/>
+          </w:tcPr>
+          <w:p>
+            <w:pPr>
+              <w:keepNext/>
+            </w:pPr>
+            <w:r>
+              <w:rPr>
+                <w:b/>
+                <w:bCs/>
+                <w:sz w:val="18"/>
+                <w:szCs w:val="18"/>
+              </w:rPr>
+              <w:t>Nay</w:t>
+            </w:r>
+          </w:p>
+        </w:tc>
+      </w:tr>
+      <w:tr>
+        <w:trPr>
+          <w:cantSplit/>
+        </w:trPr>
+        <w:tc>
+          <w:tcPr>
+            <w:tcW w:w="2" w:type="dxa"/>
+            <w:tcMar>
+              <w:top w:w="60" w:type="dxa"/>
+              <w:left w:w="100" w:type="dxa"/>
+              <w:bottom w:w="60" w:type="dxa"/>
+              <w:right w:w="100" w:type="dxa"/>
+            </w:tcMar>
+            <w:vAlign w:val="center"/>
+          </w:tcPr>
+          <w:p>
+            <w:r>
+              <w:t>Email Google trùng tài khoản có sẵn</w:t>
+            </w:r>
+          </w:p>
+        </w:tc>
+        <w:tc>
+          <w:tcPr>
+            <w:tcW w:w="8" w:type="dxa"/>
+            <w:tcMar>
+              <w:top w:w="60" w:type="dxa"/>
+              <w:left w:w="100" w:type="dxa"/>
+              <w:bottom w:w="60" w:type="dxa"/>
+              <w:right w:w="100" w:type="dxa"/>
+            </w:tcMar>
+            <w:vAlign w:val="center"/>
+          </w:tcPr>
+          <w:p>
+            <w:r>
+              <w:rPr>
+                <w:sz w:val="18"/>
+                <w:szCs w:val="18"/>
+              </w:rPr>
+              <w:t>409 google_account_not_linked, phải đăng nhập mật khẩu rồi liên kết thủ công</w:t>
+            </w:r>
+          </w:p>
+        </w:tc>
+        <w:tc>
+          <w:tcPr>
+            <w:tcW w:w="6" w:type="dxa"/>
+            <w:tcMar>
+              <w:top w:w="60" w:type="dxa"/>
+              <w:left w:w="100" w:type="dxa"/>
+              <w:bottom w:w="60" w:type="dxa"/>
+              <w:right w:w="100" w:type="dxa"/>
+            </w:tcMar>
+            <w:vAlign w:val="center"/>
+          </w:tcPr>
+          <w:p>
+            <w:r>
+              <w:rPr>
+                <w:sz w:val="18"/>
+                <w:szCs w:val="18"/>
+              </w:rPr>
+              <w:t>Tự liên kết và đăng nhập</w:t>
+            </w:r>
+          </w:p>
+        </w:tc>
+      </w:tr>
+      <w:tr>
+        <w:trPr>
+          <w:cantSplit/>
+        </w:trPr>
+        <w:tc>
+          <w:tcPr>
+            <w:tcW w:w="2" w:type="dxa"/>
+            <w:tcMar>
+              <w:top w:w="60" w:type="dxa"/>
+              <w:left w:w="100" w:type="dxa"/>
+              <w:bottom w:w="60" w:type="dxa"/>
+              <w:right w:w="100" w:type="dxa"/>
+            </w:tcMar>
+            <w:vAlign w:val="center"/>
+          </w:tcPr>
+          <w:p>
+            <w:r>
+              <w:t>Email Google chưa có tài khoản</w:t>
+            </w:r>
+          </w:p>
+        </w:tc>
+        <w:tc>
+          <w:tcPr>
+            <w:tcW w:w="8" w:type="dxa"/>
+            <w:tcMar>
+              <w:top w:w="60" w:type="dxa"/>
+              <w:left w:w="100" w:type="dxa"/>
+              <w:bottom w:w="60" w:type="dxa"/>
+              <w:right w:w="100" w:type="dxa"/>
+            </w:tcMar>
+            <w:vAlign w:val="center"/>
+          </w:tcPr>
+          <w:p>
+            <w:r>
+              <w:rPr>
+                <w:sz w:val="18"/>
+                <w:szCs w:val="18"/>
+              </w:rPr>
+              <w:t>202 + phiếu onboarding, bắt buộc nhập họ tên, SĐT, mật khẩu</w:t>
+            </w:r>
+          </w:p>
+        </w:tc>
+        <w:tc>
+          <w:tcPr>
+            <w:tcW w:w="6" w:type="dxa"/>
+            <w:tcMar>
+              <w:top w:w="60" w:type="dxa"/>
+              <w:left w:w="100" w:type="dxa"/>
+              <w:bottom w:w="60" w:type="dxa"/>
+              <w:right w:w="100" w:type="dxa"/>
+            </w:tcMar>
+            <w:vAlign w:val="center"/>
+          </w:tcPr>
+          <w:p>
+            <w:r>
+              <w:rPr>
+                <w:sz w:val="18"/>
+                <w:szCs w:val="18"/>
+              </w:rPr>
+              <w:t>Tạo tài khoản ngay, mật khẩu NULL</w:t>
+            </w:r>
+          </w:p>
+        </w:tc>
+      </w:tr>
+      <w:tr>
+        <w:trPr>
+          <w:cantSplit/>
+        </w:trPr>
+        <w:tc>
+          <w:tcPr>
+            <w:tcW w:w="2" w:type="dxa"/>
+            <w:tcMar>
+              <w:top w:w="60" w:type="dxa"/>
+              <w:left w:w="100" w:type="dxa"/>
+              <w:bottom w:w="60" w:type="dxa"/>
+              <w:right w:w="100" w:type="dxa"/>
+            </w:tcMar>
+            <w:vAlign w:val="center"/>
+          </w:tcPr>
+          <w:p>
+            <w:r>
+              <w:t>Tạo mật khẩu cho tài khoản Google</w:t>
+            </w:r>
+          </w:p>
+        </w:tc>
+        <w:tc>
+          <w:tcPr>
+            <w:tcW w:w="8" w:type="dxa"/>
+            <w:tcMar>
+              <w:top w:w="60" w:type="dxa"/>
+              <w:left w:w="100" w:type="dxa"/>
+              <w:bottom w:w="60" w:type="dxa"/>
+              <w:right w:w="100" w:type="dxa"/>
+            </w:tcMar>
+            <w:vAlign w:val="center"/>
+          </w:tcPr>
+          <w:p>
+            <w:r>
+              <w:rPr>
+                <w:sz w:val="18"/>
+                <w:szCs w:val="18"/>
+              </w:rPr>
+              <w:t>Chỉ qua onboarding hoặc Quên mật khẩu</w:t>
+            </w:r>
+          </w:p>
+        </w:tc>
+        <w:tc>
+          <w:tcPr>
+            <w:tcW w:w="6" w:type="dxa"/>
+            <w:tcMar>
+              <w:top w:w="60" w:type="dxa"/>
+              <w:left w:w="100" w:type="dxa"/>
+              <w:bottom w:w="60" w:type="dxa"/>
+              <w:right w:w="100" w:type="dxa"/>
+            </w:tcMar>
+            <w:vAlign w:val="center"/>
+          </w:tcPr>
+          <w:p>
+            <w:r>
+              <w:rPr>
+                <w:sz w:val="18"/>
+                <w:szCs w:val="18"/>
+              </w:rPr>
+              <w:t>Cài đặt tài khoản kèm OTP, hoặc Quên mật khẩu</w:t>
+            </w:r>
+          </w:p>
+        </w:tc>
+      </w:tr>
+      <w:tr>
+        <w:trPr>
+          <w:cantSplit/>
+        </w:trPr>
+        <w:tc>
+          <w:tcPr>
+            <w:tcW w:w="2" w:type="dxa"/>
+            <w:tcMar>
+              <w:top w:w="60" w:type="dxa"/>
+              <w:left w:w="100" w:type="dxa"/>
+              <w:bottom w:w="60" w:type="dxa"/>
+              <w:right w:w="100" w:type="dxa"/>
+            </w:tcMar>
+            <w:vAlign w:val="center"/>
+          </w:tcPr>
+          <w:p>
+            <w:r>
+              <w:t>Bảng/entity</w:t>
+            </w:r>
+          </w:p>
+        </w:tc>
+        <w:tc>
+          <w:tcPr>
+            <w:tcW w:w="8" w:type="dxa"/>
+            <w:tcMar>
+              <w:top w:w="60" w:type="dxa"/>
+              <w:left w:w="100" w:type="dxa"/>
+              <w:bottom w:w="60" w:type="dxa"/>
+              <w:right w:w="100" w:type="dxa"/>
+            </w:tcMar>
+            <w:vAlign w:val="center"/>
+          </w:tcPr>
+          <w:p>
+            <w:r>
+              <w:rPr>
+                <w:sz w:val="18"/>
+                <w:szCs w:val="18"/>
+              </w:rPr>
+              <w:t>google_onboarding_tickets</w:t>
+            </w:r>
+          </w:p>
+        </w:tc>
+        <w:tc>
+          <w:tcPr>
+            <w:tcW w:w="6" w:type="dxa"/>
+            <w:tcMar>
+              <w:top w:w="60" w:type="dxa"/>
+              <w:left w:w="100" w:type="dxa"/>
+              <w:bottom w:w="60" w:type="dxa"/>
+              <w:right w:w="100" w:type="dxa"/>
+            </w:tcMar>
+            <w:vAlign w:val="center"/>
+          </w:tcPr>
+          <w:p>
+            <w:r>
+              <w:rPr>
+                <w:sz w:val="18"/>
+                <w:szCs w:val="18"/>
+              </w:rPr>
+              <w:t>Đã gỡ</w:t>
+            </w:r>
+          </w:p>
+        </w:tc>
+      </w:tr>
+    </w:tbl>
+    <w:p>
+      <w:pPr/>
+      <w:r>
+        <w:rPr/>
+      </w:r>
+    </w:p>
+    <w:p>
+      <w:pPr>
+        <w:pStyle w:val="Heading2"/>
+      </w:pPr>
+      <w:r>
+        <w:rPr/>
+        <w:t>9. Kiểm thử</w:t>
+      </w:r>
+    </w:p>
+    <w:p>
+      <w:pPr>
+        <w:pStyle w:val="ListParagraph"/>
+      </w:pPr>
+      <w:r>
+        <w:rPr/>
+        <w:t>• Backend: SportHub.Security.Tests/Integration/GoogleLoginTests.cs (tự tạo, tự liên kết, khóa, song song, không lộ bí mật) và SetPasswordTests.cs (OTP, hết lượt, gửi lại, tài khoản đã có mật khẩu).</w:t>
+      </w:r>
+    </w:p>
+    <w:p>
+      <w:pPr>
+        <w:pStyle w:val="ListParagraph"/>
+      </w:pPr>
+      <w:r>
+        <w:rPr/>
+        <w:t>• Frontend: frontend/tests/auth-google-account.spec.ts.</w:t>
+      </w:r>
+    </w:p>
     <w:sectPr>
       <w:headerReference w:type="default" r:id="rId7"/>
       <w:footerReference w:type="default" r:id="rId8"/>

</xml_diff>

<commit_message>
feat(member): combine member updates with finance and VNPay
</commit_message>
<xml_diff>
--- a/docs/SportManagement_BusinessRules_v2.0_updated.docx
+++ b/docs/SportManagement_BusinessRules_v2.0_updated.docx
@@ -18049,14 +18049,6 @@
     </w:p>
     <w:p>
       <w:pPr>
-        <w:spacing w:before="240" w:after="240"/>
-      </w:pPr>
-      <w:r>
-        <w:t>Bảng sau giúp truy vết các quy tắc cũ không còn áp dụng nguyên văn do đổi phạm vi. Các mã được liệt kê không được dùng làm yêu cầu triển khai theo nội dung cũ.</w:t>
-      </w:r>
-    </w:p>
-    <w:p>
-      <w:pPr>
         <w:keepNext/>
         <w:spacing w:after="100"/>
       </w:pPr>
@@ -19406,6 +19398,1277 @@
       </w:tr>
     </w:tbl>
     <w:p/>
+    <w:p>
+      <w:pPr>
+        <w:pStyle w:val="Heading1"/>
+      </w:pPr>
+      <w:r>
+        <w:rPr/>
+        <w:t>P. Chi tiết luồng Đăng nhập Google, Mật khẩu và Liên kết tài khoản</w:t>
+      </w:r>
+    </w:p>
+    <w:p>
+      <w:pPr/>
+      <w:r>
+        <w:rPr/>
+        <w:t>Mục này mô tả chi tiết các quy tắc BR-59, BR-60, BR-104 đã nêu ở mục A. Các quy tắc BR-78 (OTP đăng ký), BR-102 (chính sách mật khẩu) và BR-103 (quên mật khẩu bằng link) giữ nguyên. Nó thay thế quy tắc cũ (liên kết Google thủ công, onboarding Google bắt buộc nhập mật khẩu).</w:t>
+      </w:r>
+    </w:p>
+    <w:p>
+      <w:pPr>
+        <w:pStyle w:val="Heading2"/>
+      </w:pPr>
+      <w:r>
+        <w:rPr/>
+        <w:t>1. Nguyên tắc</w:t>
+      </w:r>
+    </w:p>
+    <w:p>
+      <w:pPr>
+        <w:pStyle w:val="ListParagraph"/>
+      </w:pPr>
+      <w:r>
+        <w:rPr/>
+        <w:t>• Email trên hồ sơ Google đã được Google xác minh (email_verified = true) nên được tin dùng để nhận ra chủ tài khoản. Token chưa xác minh bị từ chối.</w:t>
+      </w:r>
+    </w:p>
+    <w:p>
+      <w:pPr>
+        <w:pStyle w:val="ListParagraph"/>
+      </w:pPr>
+      <w:r>
+        <w:rPr/>
+        <w:t>• Một tài khoản = một email. Đăng nhập Google và đăng nhập email/mật khẩu cùng trỏ về một tài khoản, không bao giờ tạo hai tài khoản cho một email.</w:t>
+      </w:r>
+    </w:p>
+    <w:p>
+      <w:pPr>
+        <w:pStyle w:val="ListParagraph"/>
+      </w:pPr>
+      <w:r>
+        <w:rPr/>
+        <w:t>• Tài khoản đăng ký bằng Google chưa có mật khẩu: user_credentials.password_hash = NULL. Hệ thống không tự sinh hay gửi mật khẩu.</w:t>
+      </w:r>
+    </w:p>
+    <w:p>
+      <w:pPr>
+        <w:pStyle w:val="Heading2"/>
+      </w:pPr>
+      <w:r>
+        <w:rPr/>
+        <w:t>2. Đăng nhập Google (POST /api/auth/google)</w:t>
+      </w:r>
+    </w:p>
+    <w:p>
+      <w:pPr/>
+      <w:r>
+        <w:rPr/>
+        <w:t>Thứ tự xử lý, dừng ở bước đầu tiên khớp:</w:t>
+      </w:r>
+    </w:p>
+    <w:tbl>
+      <w:tblPr>
+        <w:tblW w:w="10200" w:type="dxa"/>
+        <w:tblBorders>
+          <w:top w:val="single" w:sz="4" w:space="0" w:color="auto"/>
+          <w:left w:val="single" w:sz="4" w:space="0" w:color="auto"/>
+          <w:bottom w:val="single" w:sz="4" w:space="0" w:color="auto"/>
+          <w:right w:val="single" w:sz="4" w:space="0" w:color="auto"/>
+          <w:insideH w:val="single" w:sz="4" w:space="0" w:color="auto"/>
+          <w:insideV w:val="single" w:sz="4" w:space="0" w:color="auto"/>
+        </w:tblBorders>
+        <w:tblCellMar>
+          <w:left w:w="10" w:type="dxa"/>
+          <w:right w:w="10" w:type="dxa"/>
+        </w:tblCellMar>
+        <w:tblLook w:val="04A0" w:firstRow="1" w:lastRow="0" w:firstColumn="1" w:lastColumn="0" w:noHBand="0" w:noVBand="1"/>
+      </w:tblPr>
+      <w:tblGrid>
+        <w:gridCol w:w="1224"/>
+        <w:gridCol w:w="5100"/>
+        <w:gridCol w:w="3876"/>
+      </w:tblGrid>
+      <w:tr>
+        <w:trPr>
+          <w:cantSplit/>
+          <w:tblHeader/>
+        </w:trPr>
+        <w:tc>
+          <w:tcPr>
+            <w:tcW w:w="2" w:type="dxa"/>
+            <w:shd w:val="clear" w:color="auto" w:fill="D9E2F3"/>
+            <w:tcMar>
+              <w:top w:w="60" w:type="dxa"/>
+              <w:left w:w="100" w:type="dxa"/>
+              <w:bottom w:w="60" w:type="dxa"/>
+              <w:right w:w="100" w:type="dxa"/>
+            </w:tcMar>
+            <w:vAlign w:val="center"/>
+          </w:tcPr>
+          <w:p>
+            <w:pPr>
+              <w:keepNext/>
+            </w:pPr>
+            <w:r>
+              <w:rPr>
+                <w:b/>
+                <w:bCs/>
+                <w:sz w:val="18"/>
+                <w:szCs w:val="18"/>
+              </w:rPr>
+              <w:t>#</w:t>
+            </w:r>
+          </w:p>
+        </w:tc>
+        <w:tc>
+          <w:tcPr>
+            <w:tcW w:w="8" w:type="dxa"/>
+            <w:shd w:val="clear" w:color="auto" w:fill="D9E2F3"/>
+            <w:tcMar>
+              <w:top w:w="60" w:type="dxa"/>
+              <w:left w:w="100" w:type="dxa"/>
+              <w:bottom w:w="60" w:type="dxa"/>
+              <w:right w:w="100" w:type="dxa"/>
+            </w:tcMar>
+            <w:vAlign w:val="center"/>
+          </w:tcPr>
+          <w:p>
+            <w:pPr>
+              <w:keepNext/>
+            </w:pPr>
+            <w:r>
+              <w:rPr>
+                <w:b/>
+                <w:bCs/>
+                <w:sz w:val="18"/>
+                <w:szCs w:val="18"/>
+              </w:rPr>
+              <w:t>Điều kiện</w:t>
+            </w:r>
+          </w:p>
+        </w:tc>
+        <w:tc>
+          <w:tcPr>
+            <w:tcW w:w="6" w:type="dxa"/>
+            <w:shd w:val="clear" w:color="auto" w:fill="D9E2F3"/>
+            <w:tcMar>
+              <w:top w:w="60" w:type="dxa"/>
+              <w:left w:w="100" w:type="dxa"/>
+              <w:bottom w:w="60" w:type="dxa"/>
+              <w:right w:w="100" w:type="dxa"/>
+            </w:tcMar>
+            <w:vAlign w:val="center"/>
+          </w:tcPr>
+          <w:p>
+            <w:pPr>
+              <w:keepNext/>
+            </w:pPr>
+            <w:r>
+              <w:rPr>
+                <w:b/>
+                <w:bCs/>
+                <w:sz w:val="18"/>
+                <w:szCs w:val="18"/>
+              </w:rPr>
+              <w:t>Kết quả</w:t>
+            </w:r>
+          </w:p>
+        </w:tc>
+      </w:tr>
+      <w:tr>
+        <w:trPr>
+          <w:cantSplit/>
+        </w:trPr>
+        <w:tc>
+          <w:tcPr>
+            <w:tcW w:w="2" w:type="dxa"/>
+            <w:tcMar>
+              <w:top w:w="60" w:type="dxa"/>
+              <w:left w:w="100" w:type="dxa"/>
+              <w:bottom w:w="60" w:type="dxa"/>
+              <w:right w:w="100" w:type="dxa"/>
+            </w:tcMar>
+            <w:vAlign w:val="center"/>
+          </w:tcPr>
+          <w:p>
+            <w:r>
+              <w:t>1</w:t>
+            </w:r>
+          </w:p>
+        </w:tc>
+        <w:tc>
+          <w:tcPr>
+            <w:tcW w:w="8" w:type="dxa"/>
+            <w:tcMar>
+              <w:top w:w="60" w:type="dxa"/>
+              <w:left w:w="100" w:type="dxa"/>
+              <w:bottom w:w="60" w:type="dxa"/>
+              <w:right w:w="100" w:type="dxa"/>
+            </w:tcMar>
+            <w:vAlign w:val="center"/>
+          </w:tcPr>
+          <w:p>
+            <w:r>
+              <w:rPr>
+                <w:sz w:val="18"/>
+                <w:szCs w:val="18"/>
+              </w:rPr>
+              <w:t>Danh tính Google (sub) đã được liên kết với một tài khoản</w:t>
+            </w:r>
+          </w:p>
+        </w:tc>
+        <w:tc>
+          <w:tcPr>
+            <w:tcW w:w="6" w:type="dxa"/>
+            <w:tcMar>
+              <w:top w:w="60" w:type="dxa"/>
+              <w:left w:w="100" w:type="dxa"/>
+              <w:bottom w:w="60" w:type="dxa"/>
+              <w:right w:w="100" w:type="dxa"/>
+            </w:tcMar>
+            <w:vAlign w:val="center"/>
+          </w:tcPr>
+          <w:p>
+            <w:r>
+              <w:rPr>
+                <w:sz w:val="18"/>
+                <w:szCs w:val="18"/>
+              </w:rPr>
+              <w:t>Đăng nhập tài khoản đó. isNewAccount = false</w:t>
+            </w:r>
+          </w:p>
+        </w:tc>
+      </w:tr>
+      <w:tr>
+        <w:trPr>
+          <w:cantSplit/>
+        </w:trPr>
+        <w:tc>
+          <w:tcPr>
+            <w:tcW w:w="2" w:type="dxa"/>
+            <w:tcMar>
+              <w:top w:w="60" w:type="dxa"/>
+              <w:left w:w="100" w:type="dxa"/>
+              <w:bottom w:w="60" w:type="dxa"/>
+              <w:right w:w="100" w:type="dxa"/>
+            </w:tcMar>
+            <w:vAlign w:val="center"/>
+          </w:tcPr>
+          <w:p>
+            <w:r>
+              <w:t>2</w:t>
+            </w:r>
+          </w:p>
+        </w:tc>
+        <w:tc>
+          <w:tcPr>
+            <w:tcW w:w="8" w:type="dxa"/>
+            <w:tcMar>
+              <w:top w:w="60" w:type="dxa"/>
+              <w:left w:w="100" w:type="dxa"/>
+              <w:bottom w:w="60" w:type="dxa"/>
+              <w:right w:w="100" w:type="dxa"/>
+            </w:tcMar>
+            <w:vAlign w:val="center"/>
+          </w:tcPr>
+          <w:p>
+            <w:r>
+              <w:rPr>
+                <w:sz w:val="18"/>
+                <w:szCs w:val="18"/>
+              </w:rPr>
+              <w:t>Email Google trùng email một tài khoản có sẵn (không phân biệt hoa thường)</w:t>
+            </w:r>
+          </w:p>
+        </w:tc>
+        <w:tc>
+          <w:tcPr>
+            <w:tcW w:w="6" w:type="dxa"/>
+            <w:tcMar>
+              <w:top w:w="60" w:type="dxa"/>
+              <w:left w:w="100" w:type="dxa"/>
+              <w:bottom w:w="60" w:type="dxa"/>
+              <w:right w:w="100" w:type="dxa"/>
+            </w:tcMar>
+            <w:vAlign w:val="center"/>
+          </w:tcPr>
+          <w:p>
+            <w:r>
+              <w:rPr>
+                <w:sz w:val="18"/>
+                <w:szCs w:val="18"/>
+              </w:rPr>
+              <w:t>Tự liên kết danh tính Google vào tài khoản đó rồi đăng nhập. isNewAccount = false</w:t>
+            </w:r>
+          </w:p>
+        </w:tc>
+      </w:tr>
+      <w:tr>
+        <w:trPr>
+          <w:cantSplit/>
+        </w:trPr>
+        <w:tc>
+          <w:tcPr>
+            <w:tcW w:w="2" w:type="dxa"/>
+            <w:tcMar>
+              <w:top w:w="60" w:type="dxa"/>
+              <w:left w:w="100" w:type="dxa"/>
+              <w:bottom w:w="60" w:type="dxa"/>
+              <w:right w:w="100" w:type="dxa"/>
+            </w:tcMar>
+            <w:vAlign w:val="center"/>
+          </w:tcPr>
+          <w:p>
+            <w:r>
+              <w:t>3</w:t>
+            </w:r>
+          </w:p>
+        </w:tc>
+        <w:tc>
+          <w:tcPr>
+            <w:tcW w:w="8" w:type="dxa"/>
+            <w:tcMar>
+              <w:top w:w="60" w:type="dxa"/>
+              <w:left w:w="100" w:type="dxa"/>
+              <w:bottom w:w="60" w:type="dxa"/>
+              <w:right w:w="100" w:type="dxa"/>
+            </w:tcMar>
+            <w:vAlign w:val="center"/>
+          </w:tcPr>
+          <w:p>
+            <w:r>
+              <w:rPr>
+                <w:sz w:val="18"/>
+                <w:szCs w:val="18"/>
+              </w:rPr>
+              <w:t>Email chưa có tài khoản</w:t>
+            </w:r>
+          </w:p>
+        </w:tc>
+        <w:tc>
+          <w:tcPr>
+            <w:tcW w:w="6" w:type="dxa"/>
+            <w:tcMar>
+              <w:top w:w="60" w:type="dxa"/>
+              <w:left w:w="100" w:type="dxa"/>
+              <w:bottom w:w="60" w:type="dxa"/>
+              <w:right w:w="100" w:type="dxa"/>
+            </w:tcMar>
+            <w:vAlign w:val="center"/>
+          </w:tcPr>
+          <w:p>
+            <w:r>
+              <w:rPr>
+                <w:sz w:val="18"/>
+                <w:szCs w:val="18"/>
+              </w:rPr>
+              <w:t>Tạo ngay tài khoản Member Active, password_hash = NULL, họ tên lấy từ Google (thiếu thì lấy phần trước @), số điện thoại trống. isNewAccount = true</w:t>
+            </w:r>
+          </w:p>
+        </w:tc>
+      </w:tr>
+    </w:tbl>
+    <w:p>
+      <w:pPr/>
+      <w:r>
+        <w:rPr/>
+      </w:r>
+    </w:p>
+    <w:p>
+      <w:pPr/>
+      <w:r>
+        <w:rPr/>
+        <w:t>Quy tắc kèm theo:</w:t>
+      </w:r>
+    </w:p>
+    <w:p>
+      <w:pPr>
+        <w:pStyle w:val="ListParagraph"/>
+      </w:pPr>
+      <w:r>
+        <w:rPr/>
+        <w:t>• Tài khoản bị khóa (Banned, Deactivated): không liên kết, không cấp phiên (bước 1 và 2).</w:t>
+      </w:r>
+    </w:p>
+    <w:p>
+      <w:pPr>
+        <w:pStyle w:val="ListParagraph"/>
+      </w:pPr>
+      <w:r>
+        <w:rPr/>
+        <w:t>• Tài khoản ở bước 2 đã liên kết với một danh tính Google khác: trả 409 google_identity_mismatch, không ghi đè.</w:t>
+      </w:r>
+    </w:p>
+    <w:p>
+      <w:pPr>
+        <w:pStyle w:val="ListParagraph"/>
+      </w:pPr>
+      <w:r>
+        <w:rPr/>
+        <w:t>• Hai yêu cầu đăng nhập song song cùng một người mới: chỉ một tài khoản được tạo, yêu cầu còn lại nhận 409 google_login_conflict và thử lại là vào nhánh bước 1.</w:t>
+      </w:r>
+    </w:p>
+    <w:p>
+      <w:pPr>
+        <w:pStyle w:val="ListParagraph"/>
+      </w:pPr>
+      <w:r>
+        <w:rPr/>
+        <w:t>• Không có bước onboarding và không còn endpoint POST /api/auth/google/onboarding. Bảng google_onboarding_tickets đã bị gỡ.</w:t>
+      </w:r>
+    </w:p>
+    <w:p>
+      <w:pPr>
+        <w:pStyle w:val="ListParagraph"/>
+      </w:pPr>
+      <w:r>
+        <w:rPr/>
+        <w:t>• Tài khoản nhân sự (Manager, Receptionist, Coach, Admin) áp dụng cùng quy tắc nếu email Google trùng email tài khoản của họ.</w:t>
+      </w:r>
+    </w:p>
+    <w:p>
+      <w:pPr>
+        <w:pStyle w:val="Heading2"/>
+      </w:pPr>
+      <w:r>
+        <w:rPr/>
+        <w:t>3. Đăng nhập email/mật khẩu với tài khoản chưa có mật khẩu</w:t>
+      </w:r>
+    </w:p>
+    <w:p>
+      <w:pPr/>
+      <w:r>
+        <w:rPr/>
+        <w:t>POST /api/auth/login trả lỗi thông tin đăng nhập chung (401), giống như sai mật khẩu, để không lộ việc email có tồn tại hay đăng ký bằng Google. Người dùng tạo mật khẩu theo Luồng A hoặc Luồng B.</w:t>
+      </w:r>
+    </w:p>
+    <w:p>
+      <w:pPr>
+        <w:pStyle w:val="Heading2"/>
+      </w:pPr>
+      <w:r>
+        <w:rPr/>
+        <w:t>4. Luồng A: Tạo mật khẩu trong Cài đặt tài khoản (khuyên dùng)</w:t>
+      </w:r>
+    </w:p>
+    <w:p>
+      <w:pPr/>
+      <w:r>
+        <w:rPr/>
+        <w:t>Áp dụng khi tài khoản chưa có mật khẩu (hasPassword = false trong GET /api/users/me).</w:t>
+      </w:r>
+    </w:p>
+    <w:p>
+      <w:pPr>
+        <w:pStyle w:val="ListParagraph"/>
+      </w:pPr>
+      <w:r>
+        <w:rPr/>
+        <w:t>1. Giao diện hiển thị khối "Đặt mật khẩu" thay cho "Đổi mật khẩu" (không có ô mật khẩu hiện tại).</w:t>
+      </w:r>
+    </w:p>
+    <w:p>
+      <w:pPr>
+        <w:pStyle w:val="ListParagraph"/>
+      </w:pPr>
+      <w:r>
+        <w:rPr/>
+        <w:t>2. Người dùng bấm "Gửi mã xác nhận": POST /api/users/me/password/otp (cần đăng nhập). Hệ thống gửi mã OTP 6 chữ số tới email của chính tài khoản.</w:t>
+      </w:r>
+    </w:p>
+    <w:p>
+      <w:pPr>
+        <w:pStyle w:val="ListParagraph"/>
+      </w:pPr>
+      <w:r>
+        <w:rPr/>
+        <w:t>3. Người dùng nhập mã, mật khẩu mới và xác nhận mật khẩu mới, rồi gửi POST /api/users/me/password với otpCode, newPassword, confirmNewPassword.</w:t>
+      </w:r>
+    </w:p>
+    <w:p>
+      <w:pPr>
+        <w:pStyle w:val="ListParagraph"/>
+      </w:pPr>
+      <w:r>
+        <w:rPr/>
+        <w:t>4. Thành công: lưu mật khẩu, đổi security stamp (phiên cũ mất hiệu lực), trả JWT mới cho phiên hiện tại. Từ lúc này tài khoản đăng nhập được bằng cả Google lẫn email/mật khẩu.</w:t>
+      </w:r>
+    </w:p>
+    <w:p>
+      <w:pPr/>
+      <w:r>
+        <w:rPr/>
+        <w:t>Ràng buộc của mã OTP (cùng chuẩn với BR-78):</w:t>
+      </w:r>
+    </w:p>
+    <w:p>
+      <w:pPr>
+        <w:pStyle w:val="ListParagraph"/>
+      </w:pPr>
+      <w:r>
+        <w:rPr/>
+        <w:t>• Hiệu lực 10 phút, dùng một lần, chỉ mã mới nhất còn hiệu lực.</w:t>
+      </w:r>
+    </w:p>
+    <w:p>
+      <w:pPr>
+        <w:pStyle w:val="ListParagraph"/>
+      </w:pPr>
+      <w:r>
+        <w:rPr/>
+        <w:t>• Tối đa 5 lần nhập sai; quá ngưỡng phải xin mã mới (otp_attempts_exceeded).</w:t>
+      </w:r>
+    </w:p>
+    <w:p>
+      <w:pPr>
+        <w:pStyle w:val="ListParagraph"/>
+      </w:pPr>
+      <w:r>
+        <w:rPr/>
+        <w:t>• Gửi lại phải chờ ít nhất 60 giây (429 otp_resend_too_soon) và chịu rate limit theo IP (3 lần/phút).</w:t>
+      </w:r>
+    </w:p>
+    <w:p>
+      <w:pPr>
+        <w:pStyle w:val="ListParagraph"/>
+      </w:pPr>
+      <w:r>
+        <w:rPr/>
+        <w:t>• Lưu ở dạng băm SHA-256, không ghi log giá trị rõ. Mã gắn với email của tài khoản đang đăng nhập nên không dùng được cho tài khoản khác.</w:t>
+      </w:r>
+    </w:p>
+    <w:p>
+      <w:pPr>
+        <w:pStyle w:val="ListParagraph"/>
+      </w:pPr>
+      <w:r>
+        <w:rPr/>
+        <w:t>• Mã chỉ bị tiêu khi mật khẩu được lưu thành công. Mật khẩu yếu hoặc xác nhận không khớp bị chặn trước khi kiểm mã nên không làm mất lượt thử.</w:t>
+      </w:r>
+    </w:p>
+    <w:p>
+      <w:pPr/>
+      <w:r>
+        <w:rPr/>
+        <w:t>Lỗi thường gặp:</w:t>
+      </w:r>
+    </w:p>
+    <w:tbl>
+      <w:tblPr>
+        <w:tblW w:w="10200" w:type="dxa"/>
+        <w:tblBorders>
+          <w:top w:val="single" w:sz="4" w:space="0" w:color="auto"/>
+          <w:left w:val="single" w:sz="4" w:space="0" w:color="auto"/>
+          <w:bottom w:val="single" w:sz="4" w:space="0" w:color="auto"/>
+          <w:right w:val="single" w:sz="4" w:space="0" w:color="auto"/>
+          <w:insideH w:val="single" w:sz="4" w:space="0" w:color="auto"/>
+          <w:insideV w:val="single" w:sz="4" w:space="0" w:color="auto"/>
+        </w:tblBorders>
+        <w:tblCellMar>
+          <w:left w:w="10" w:type="dxa"/>
+          <w:right w:w="10" w:type="dxa"/>
+        </w:tblCellMar>
+        <w:tblLook w:val="04A0" w:firstRow="1" w:lastRow="0" w:firstColumn="1" w:lastColumn="0" w:noHBand="0" w:noVBand="1"/>
+      </w:tblPr>
+      <w:tblGrid>
+        <w:gridCol w:w="5100"/>
+        <w:gridCol w:w="5100"/>
+      </w:tblGrid>
+      <w:tr>
+        <w:trPr>
+          <w:cantSplit/>
+          <w:tblHeader/>
+        </w:trPr>
+        <w:tc>
+          <w:tcPr>
+            <w:tcW w:w="8" w:type="dxa"/>
+            <w:shd w:val="clear" w:color="auto" w:fill="D9E2F3"/>
+            <w:tcMar>
+              <w:top w:w="60" w:type="dxa"/>
+              <w:left w:w="100" w:type="dxa"/>
+              <w:bottom w:w="60" w:type="dxa"/>
+              <w:right w:w="100" w:type="dxa"/>
+            </w:tcMar>
+            <w:vAlign w:val="center"/>
+          </w:tcPr>
+          <w:p>
+            <w:pPr>
+              <w:keepNext/>
+            </w:pPr>
+            <w:r>
+              <w:rPr>
+                <w:b/>
+                <w:bCs/>
+                <w:sz w:val="18"/>
+                <w:szCs w:val="18"/>
+              </w:rPr>
+              <w:t>Mã lỗi</w:t>
+            </w:r>
+          </w:p>
+        </w:tc>
+        <w:tc>
+          <w:tcPr>
+            <w:tcW w:w="8" w:type="dxa"/>
+            <w:shd w:val="clear" w:color="auto" w:fill="D9E2F3"/>
+            <w:tcMar>
+              <w:top w:w="60" w:type="dxa"/>
+              <w:left w:w="100" w:type="dxa"/>
+              <w:bottom w:w="60" w:type="dxa"/>
+              <w:right w:w="100" w:type="dxa"/>
+            </w:tcMar>
+            <w:vAlign w:val="center"/>
+          </w:tcPr>
+          <w:p>
+            <w:pPr>
+              <w:keepNext/>
+            </w:pPr>
+            <w:r>
+              <w:rPr>
+                <w:b/>
+                <w:bCs/>
+                <w:sz w:val="18"/>
+                <w:szCs w:val="18"/>
+              </w:rPr>
+              <w:t>Ý nghĩa</w:t>
+            </w:r>
+          </w:p>
+        </w:tc>
+      </w:tr>
+      <w:tr>
+        <w:trPr>
+          <w:cantSplit/>
+        </w:trPr>
+        <w:tc>
+          <w:tcPr>
+            <w:tcW w:w="8" w:type="dxa"/>
+            <w:tcMar>
+              <w:top w:w="60" w:type="dxa"/>
+              <w:left w:w="100" w:type="dxa"/>
+              <w:bottom w:w="60" w:type="dxa"/>
+              <w:right w:w="100" w:type="dxa"/>
+            </w:tcMar>
+            <w:vAlign w:val="center"/>
+          </w:tcPr>
+          <w:p>
+            <w:r>
+              <w:t>otp_required</w:t>
+            </w:r>
+          </w:p>
+        </w:tc>
+        <w:tc>
+          <w:tcPr>
+            <w:tcW w:w="8" w:type="dxa"/>
+            <w:tcMar>
+              <w:top w:w="60" w:type="dxa"/>
+              <w:left w:w="100" w:type="dxa"/>
+              <w:bottom w:w="60" w:type="dxa"/>
+              <w:right w:w="100" w:type="dxa"/>
+            </w:tcMar>
+            <w:vAlign w:val="center"/>
+          </w:tcPr>
+          <w:p>
+            <w:r>
+              <w:rPr>
+                <w:sz w:val="18"/>
+                <w:szCs w:val="18"/>
+              </w:rPr>
+              <w:t>Tài khoản chưa có mật khẩu nhưng không gửi otpCode</w:t>
+            </w:r>
+          </w:p>
+        </w:tc>
+      </w:tr>
+      <w:tr>
+        <w:trPr>
+          <w:cantSplit/>
+        </w:trPr>
+        <w:tc>
+          <w:tcPr>
+            <w:tcW w:w="8" w:type="dxa"/>
+            <w:tcMar>
+              <w:top w:w="60" w:type="dxa"/>
+              <w:left w:w="100" w:type="dxa"/>
+              <w:bottom w:w="60" w:type="dxa"/>
+              <w:right w:w="100" w:type="dxa"/>
+            </w:tcMar>
+            <w:vAlign w:val="center"/>
+          </w:tcPr>
+          <w:p>
+            <w:r>
+              <w:t>otp_invalid</w:t>
+            </w:r>
+          </w:p>
+        </w:tc>
+        <w:tc>
+          <w:tcPr>
+            <w:tcW w:w="8" w:type="dxa"/>
+            <w:tcMar>
+              <w:top w:w="60" w:type="dxa"/>
+              <w:left w:w="100" w:type="dxa"/>
+              <w:bottom w:w="60" w:type="dxa"/>
+              <w:right w:w="100" w:type="dxa"/>
+            </w:tcMar>
+            <w:vAlign w:val="center"/>
+          </w:tcPr>
+          <w:p>
+            <w:r>
+              <w:rPr>
+                <w:sz w:val="18"/>
+                <w:szCs w:val="18"/>
+              </w:rPr>
+              <w:t>Mã sai</w:t>
+            </w:r>
+          </w:p>
+        </w:tc>
+      </w:tr>
+      <w:tr>
+        <w:trPr>
+          <w:cantSplit/>
+        </w:trPr>
+        <w:tc>
+          <w:tcPr>
+            <w:tcW w:w="8" w:type="dxa"/>
+            <w:tcMar>
+              <w:top w:w="60" w:type="dxa"/>
+              <w:left w:w="100" w:type="dxa"/>
+              <w:bottom w:w="60" w:type="dxa"/>
+              <w:right w:w="100" w:type="dxa"/>
+            </w:tcMar>
+            <w:vAlign w:val="center"/>
+          </w:tcPr>
+          <w:p>
+            <w:r>
+              <w:t>otp_expired / otp_already_used / otp_attempts_exceeded</w:t>
+            </w:r>
+          </w:p>
+        </w:tc>
+        <w:tc>
+          <w:tcPr>
+            <w:tcW w:w="8" w:type="dxa"/>
+            <w:tcMar>
+              <w:top w:w="60" w:type="dxa"/>
+              <w:left w:w="100" w:type="dxa"/>
+              <w:bottom w:w="60" w:type="dxa"/>
+              <w:right w:w="100" w:type="dxa"/>
+            </w:tcMar>
+            <w:vAlign w:val="center"/>
+          </w:tcPr>
+          <w:p>
+            <w:r>
+              <w:rPr>
+                <w:sz w:val="18"/>
+                <w:szCs w:val="18"/>
+              </w:rPr>
+              <w:t>Mã hết hạn, đã dùng, hoặc hết lượt thử</w:t>
+            </w:r>
+          </w:p>
+        </w:tc>
+      </w:tr>
+      <w:tr>
+        <w:trPr>
+          <w:cantSplit/>
+        </w:trPr>
+        <w:tc>
+          <w:tcPr>
+            <w:tcW w:w="8" w:type="dxa"/>
+            <w:tcMar>
+              <w:top w:w="60" w:type="dxa"/>
+              <w:left w:w="100" w:type="dxa"/>
+              <w:bottom w:w="60" w:type="dxa"/>
+              <w:right w:w="100" w:type="dxa"/>
+            </w:tcMar>
+            <w:vAlign w:val="center"/>
+          </w:tcPr>
+          <w:p>
+            <w:r>
+              <w:t>password_already_set (409)</w:t>
+            </w:r>
+          </w:p>
+        </w:tc>
+        <w:tc>
+          <w:tcPr>
+            <w:tcW w:w="8" w:type="dxa"/>
+            <w:tcMar>
+              <w:top w:w="60" w:type="dxa"/>
+              <w:left w:w="100" w:type="dxa"/>
+              <w:bottom w:w="60" w:type="dxa"/>
+              <w:right w:w="100" w:type="dxa"/>
+            </w:tcMar>
+            <w:vAlign w:val="center"/>
+          </w:tcPr>
+          <w:p>
+            <w:r>
+              <w:rPr>
+                <w:sz w:val="18"/>
+                <w:szCs w:val="18"/>
+              </w:rPr>
+              <w:t>Xin mã khi tài khoản đã có mật khẩu: hãy dùng đổi mật khẩu</w:t>
+            </w:r>
+          </w:p>
+        </w:tc>
+      </w:tr>
+    </w:tbl>
+    <w:p>
+      <w:pPr/>
+      <w:r>
+        <w:rPr/>
+      </w:r>
+    </w:p>
+    <w:p>
+      <w:pPr>
+        <w:pStyle w:val="Heading2"/>
+      </w:pPr>
+      <w:r>
+        <w:rPr/>
+        <w:t>5. Luồng B: Quên mật khẩu (link email)</w:t>
+      </w:r>
+    </w:p>
+    <w:p>
+      <w:pPr/>
+      <w:r>
+        <w:rPr/>
+        <w:t>Giữ nguyên BR-103. Người dùng ở trang đăng nhập nhập email rồi chọn "Quên mật khẩu": hệ thống gửi link đặt lại (token 256-bit, hiệu lực 10 phút, dùng một lần), người dùng tạo mật khẩu mới. Luồng này dùng được cho tài khoản chưa có mật khẩu (Google) và không hỏi mật khẩu cũ. Phản hồi luôn trung tính, không lộ email nào đã đăng ký.</w:t>
+      </w:r>
+    </w:p>
+    <w:p>
+      <w:pPr>
+        <w:pStyle w:val="Heading2"/>
+      </w:pPr>
+      <w:r>
+        <w:rPr/>
+        <w:t>6. Đổi mật khẩu khi đã có mật khẩu</w:t>
+      </w:r>
+    </w:p>
+    <w:p>
+      <w:pPr/>
+      <w:r>
+        <w:rPr/>
+        <w:t>Giữ nguyên BR-104: nhập đúng mật khẩu hiện tại, mật khẩu mới đáp ứng BR-102 và khác mật khẩu cũ. Trường otpCode bị bỏ qua. Thành công vô hiệu mọi phiên cũ.</w:t>
+      </w:r>
+    </w:p>
+    <w:p>
+      <w:pPr>
+        <w:pStyle w:val="Heading2"/>
+      </w:pPr>
+      <w:r>
+        <w:rPr/>
+        <w:t>7. Gỡ liên kết Google</w:t>
+      </w:r>
+    </w:p>
+    <w:p>
+      <w:pPr/>
+      <w:r>
+        <w:rPr/>
+        <w:t>DELETE /api/auth/google/link chỉ thành công khi tài khoản đã có mật khẩu (password_required_before_unlink), tránh khóa người dùng ra khỏi tài khoản. Liên kết thủ công POST /api/auth/google/link (đã đăng nhập) còn dùng được cho trường hợp email Google khác email tài khoản.</w:t>
+      </w:r>
+    </w:p>
+    <w:p>
+      <w:pPr>
+        <w:pStyle w:val="Heading2"/>
+      </w:pPr>
+      <w:r>
+        <w:rPr/>
+        <w:t>8. Tóm tắt thay đổi so với quy tắc cũ</w:t>
+      </w:r>
+    </w:p>
+    <w:tbl>
+      <w:tblPr>
+        <w:tblW w:w="10200" w:type="dxa"/>
+        <w:tblBorders>
+          <w:top w:val="single" w:sz="4" w:space="0" w:color="auto"/>
+          <w:left w:val="single" w:sz="4" w:space="0" w:color="auto"/>
+          <w:bottom w:val="single" w:sz="4" w:space="0" w:color="auto"/>
+          <w:right w:val="single" w:sz="4" w:space="0" w:color="auto"/>
+          <w:insideH w:val="single" w:sz="4" w:space="0" w:color="auto"/>
+          <w:insideV w:val="single" w:sz="4" w:space="0" w:color="auto"/>
+        </w:tblBorders>
+        <w:tblCellMar>
+          <w:left w:w="10" w:type="dxa"/>
+          <w:right w:w="10" w:type="dxa"/>
+        </w:tblCellMar>
+        <w:tblLook w:val="04A0" w:firstRow="1" w:lastRow="0" w:firstColumn="1" w:lastColumn="0" w:noHBand="0" w:noVBand="1"/>
+      </w:tblPr>
+      <w:tblGrid>
+        <w:gridCol w:w="1224"/>
+        <w:gridCol w:w="5100"/>
+        <w:gridCol w:w="3876"/>
+      </w:tblGrid>
+      <w:tr>
+        <w:trPr>
+          <w:cantSplit/>
+          <w:tblHeader/>
+        </w:trPr>
+        <w:tc>
+          <w:tcPr>
+            <w:tcW w:w="2" w:type="dxa"/>
+            <w:shd w:val="clear" w:color="auto" w:fill="D9E2F3"/>
+            <w:tcMar>
+              <w:top w:w="60" w:type="dxa"/>
+              <w:left w:w="100" w:type="dxa"/>
+              <w:bottom w:w="60" w:type="dxa"/>
+              <w:right w:w="100" w:type="dxa"/>
+            </w:tcMar>
+            <w:vAlign w:val="center"/>
+          </w:tcPr>
+          <w:p>
+            <w:pPr>
+              <w:keepNext/>
+            </w:pPr>
+            <w:r>
+              <w:rPr>
+                <w:b/>
+                <w:bCs/>
+                <w:sz w:val="18"/>
+                <w:szCs w:val="18"/>
+              </w:rPr>
+              <w:t>Chủ đề</w:t>
+            </w:r>
+          </w:p>
+        </w:tc>
+        <w:tc>
+          <w:tcPr>
+            <w:tcW w:w="8" w:type="dxa"/>
+            <w:shd w:val="clear" w:color="auto" w:fill="D9E2F3"/>
+            <w:tcMar>
+              <w:top w:w="60" w:type="dxa"/>
+              <w:left w:w="100" w:type="dxa"/>
+              <w:bottom w:w="60" w:type="dxa"/>
+              <w:right w:w="100" w:type="dxa"/>
+            </w:tcMar>
+            <w:vAlign w:val="center"/>
+          </w:tcPr>
+          <w:p>
+            <w:pPr>
+              <w:keepNext/>
+            </w:pPr>
+            <w:r>
+              <w:rPr>
+                <w:b/>
+                <w:bCs/>
+                <w:sz w:val="18"/>
+                <w:szCs w:val="18"/>
+              </w:rPr>
+              <w:t>Trước</w:t>
+            </w:r>
+          </w:p>
+        </w:tc>
+        <w:tc>
+          <w:tcPr>
+            <w:tcW w:w="6" w:type="dxa"/>
+            <w:shd w:val="clear" w:color="auto" w:fill="D9E2F3"/>
+            <w:tcMar>
+              <w:top w:w="60" w:type="dxa"/>
+              <w:left w:w="100" w:type="dxa"/>
+              <w:bottom w:w="60" w:type="dxa"/>
+              <w:right w:w="100" w:type="dxa"/>
+            </w:tcMar>
+            <w:vAlign w:val="center"/>
+          </w:tcPr>
+          <w:p>
+            <w:pPr>
+              <w:keepNext/>
+            </w:pPr>
+            <w:r>
+              <w:rPr>
+                <w:b/>
+                <w:bCs/>
+                <w:sz w:val="18"/>
+                <w:szCs w:val="18"/>
+              </w:rPr>
+              <w:t>Nay</w:t>
+            </w:r>
+          </w:p>
+        </w:tc>
+      </w:tr>
+      <w:tr>
+        <w:trPr>
+          <w:cantSplit/>
+        </w:trPr>
+        <w:tc>
+          <w:tcPr>
+            <w:tcW w:w="2" w:type="dxa"/>
+            <w:tcMar>
+              <w:top w:w="60" w:type="dxa"/>
+              <w:left w:w="100" w:type="dxa"/>
+              <w:bottom w:w="60" w:type="dxa"/>
+              <w:right w:w="100" w:type="dxa"/>
+            </w:tcMar>
+            <w:vAlign w:val="center"/>
+          </w:tcPr>
+          <w:p>
+            <w:r>
+              <w:t>Email Google trùng tài khoản có sẵn</w:t>
+            </w:r>
+          </w:p>
+        </w:tc>
+        <w:tc>
+          <w:tcPr>
+            <w:tcW w:w="8" w:type="dxa"/>
+            <w:tcMar>
+              <w:top w:w="60" w:type="dxa"/>
+              <w:left w:w="100" w:type="dxa"/>
+              <w:bottom w:w="60" w:type="dxa"/>
+              <w:right w:w="100" w:type="dxa"/>
+            </w:tcMar>
+            <w:vAlign w:val="center"/>
+          </w:tcPr>
+          <w:p>
+            <w:r>
+              <w:rPr>
+                <w:sz w:val="18"/>
+                <w:szCs w:val="18"/>
+              </w:rPr>
+              <w:t>409 google_account_not_linked, phải đăng nhập mật khẩu rồi liên kết thủ công</w:t>
+            </w:r>
+          </w:p>
+        </w:tc>
+        <w:tc>
+          <w:tcPr>
+            <w:tcW w:w="6" w:type="dxa"/>
+            <w:tcMar>
+              <w:top w:w="60" w:type="dxa"/>
+              <w:left w:w="100" w:type="dxa"/>
+              <w:bottom w:w="60" w:type="dxa"/>
+              <w:right w:w="100" w:type="dxa"/>
+            </w:tcMar>
+            <w:vAlign w:val="center"/>
+          </w:tcPr>
+          <w:p>
+            <w:r>
+              <w:rPr>
+                <w:sz w:val="18"/>
+                <w:szCs w:val="18"/>
+              </w:rPr>
+              <w:t>Tự liên kết và đăng nhập</w:t>
+            </w:r>
+          </w:p>
+        </w:tc>
+      </w:tr>
+      <w:tr>
+        <w:trPr>
+          <w:cantSplit/>
+        </w:trPr>
+        <w:tc>
+          <w:tcPr>
+            <w:tcW w:w="2" w:type="dxa"/>
+            <w:tcMar>
+              <w:top w:w="60" w:type="dxa"/>
+              <w:left w:w="100" w:type="dxa"/>
+              <w:bottom w:w="60" w:type="dxa"/>
+              <w:right w:w="100" w:type="dxa"/>
+            </w:tcMar>
+            <w:vAlign w:val="center"/>
+          </w:tcPr>
+          <w:p>
+            <w:r>
+              <w:t>Email Google chưa có tài khoản</w:t>
+            </w:r>
+          </w:p>
+        </w:tc>
+        <w:tc>
+          <w:tcPr>
+            <w:tcW w:w="8" w:type="dxa"/>
+            <w:tcMar>
+              <w:top w:w="60" w:type="dxa"/>
+              <w:left w:w="100" w:type="dxa"/>
+              <w:bottom w:w="60" w:type="dxa"/>
+              <w:right w:w="100" w:type="dxa"/>
+            </w:tcMar>
+            <w:vAlign w:val="center"/>
+          </w:tcPr>
+          <w:p>
+            <w:r>
+              <w:rPr>
+                <w:sz w:val="18"/>
+                <w:szCs w:val="18"/>
+              </w:rPr>
+              <w:t>202 + phiếu onboarding, bắt buộc nhập họ tên, SĐT, mật khẩu</w:t>
+            </w:r>
+          </w:p>
+        </w:tc>
+        <w:tc>
+          <w:tcPr>
+            <w:tcW w:w="6" w:type="dxa"/>
+            <w:tcMar>
+              <w:top w:w="60" w:type="dxa"/>
+              <w:left w:w="100" w:type="dxa"/>
+              <w:bottom w:w="60" w:type="dxa"/>
+              <w:right w:w="100" w:type="dxa"/>
+            </w:tcMar>
+            <w:vAlign w:val="center"/>
+          </w:tcPr>
+          <w:p>
+            <w:r>
+              <w:rPr>
+                <w:sz w:val="18"/>
+                <w:szCs w:val="18"/>
+              </w:rPr>
+              <w:t>Tạo tài khoản ngay, mật khẩu NULL</w:t>
+            </w:r>
+          </w:p>
+        </w:tc>
+      </w:tr>
+      <w:tr>
+        <w:trPr>
+          <w:cantSplit/>
+        </w:trPr>
+        <w:tc>
+          <w:tcPr>
+            <w:tcW w:w="2" w:type="dxa"/>
+            <w:tcMar>
+              <w:top w:w="60" w:type="dxa"/>
+              <w:left w:w="100" w:type="dxa"/>
+              <w:bottom w:w="60" w:type="dxa"/>
+              <w:right w:w="100" w:type="dxa"/>
+            </w:tcMar>
+            <w:vAlign w:val="center"/>
+          </w:tcPr>
+          <w:p>
+            <w:r>
+              <w:t>Tạo mật khẩu cho tài khoản Google</w:t>
+            </w:r>
+          </w:p>
+        </w:tc>
+        <w:tc>
+          <w:tcPr>
+            <w:tcW w:w="8" w:type="dxa"/>
+            <w:tcMar>
+              <w:top w:w="60" w:type="dxa"/>
+              <w:left w:w="100" w:type="dxa"/>
+              <w:bottom w:w="60" w:type="dxa"/>
+              <w:right w:w="100" w:type="dxa"/>
+            </w:tcMar>
+            <w:vAlign w:val="center"/>
+          </w:tcPr>
+          <w:p>
+            <w:r>
+              <w:rPr>
+                <w:sz w:val="18"/>
+                <w:szCs w:val="18"/>
+              </w:rPr>
+              <w:t>Chỉ qua onboarding hoặc Quên mật khẩu</w:t>
+            </w:r>
+          </w:p>
+        </w:tc>
+        <w:tc>
+          <w:tcPr>
+            <w:tcW w:w="6" w:type="dxa"/>
+            <w:tcMar>
+              <w:top w:w="60" w:type="dxa"/>
+              <w:left w:w="100" w:type="dxa"/>
+              <w:bottom w:w="60" w:type="dxa"/>
+              <w:right w:w="100" w:type="dxa"/>
+            </w:tcMar>
+            <w:vAlign w:val="center"/>
+          </w:tcPr>
+          <w:p>
+            <w:r>
+              <w:rPr>
+                <w:sz w:val="18"/>
+                <w:szCs w:val="18"/>
+              </w:rPr>
+              <w:t>Cài đặt tài khoản kèm OTP, hoặc Quên mật khẩu</w:t>
+            </w:r>
+          </w:p>
+        </w:tc>
+      </w:tr>
+      <w:tr>
+        <w:trPr>
+          <w:cantSplit/>
+        </w:trPr>
+        <w:tc>
+          <w:tcPr>
+            <w:tcW w:w="2" w:type="dxa"/>
+            <w:tcMar>
+              <w:top w:w="60" w:type="dxa"/>
+              <w:left w:w="100" w:type="dxa"/>
+              <w:bottom w:w="60" w:type="dxa"/>
+              <w:right w:w="100" w:type="dxa"/>
+            </w:tcMar>
+            <w:vAlign w:val="center"/>
+          </w:tcPr>
+          <w:p>
+            <w:r>
+              <w:t>Bảng/entity</w:t>
+            </w:r>
+          </w:p>
+        </w:tc>
+        <w:tc>
+          <w:tcPr>
+            <w:tcW w:w="8" w:type="dxa"/>
+            <w:tcMar>
+              <w:top w:w="60" w:type="dxa"/>
+              <w:left w:w="100" w:type="dxa"/>
+              <w:bottom w:w="60" w:type="dxa"/>
+              <w:right w:w="100" w:type="dxa"/>
+            </w:tcMar>
+            <w:vAlign w:val="center"/>
+          </w:tcPr>
+          <w:p>
+            <w:r>
+              <w:rPr>
+                <w:sz w:val="18"/>
+                <w:szCs w:val="18"/>
+              </w:rPr>
+              <w:t>google_onboarding_tickets</w:t>
+            </w:r>
+          </w:p>
+        </w:tc>
+        <w:tc>
+          <w:tcPr>
+            <w:tcW w:w="6" w:type="dxa"/>
+            <w:tcMar>
+              <w:top w:w="60" w:type="dxa"/>
+              <w:left w:w="100" w:type="dxa"/>
+              <w:bottom w:w="60" w:type="dxa"/>
+              <w:right w:w="100" w:type="dxa"/>
+            </w:tcMar>
+            <w:vAlign w:val="center"/>
+          </w:tcPr>
+          <w:p>
+            <w:r>
+              <w:rPr>
+                <w:sz w:val="18"/>
+                <w:szCs w:val="18"/>
+              </w:rPr>
+              <w:t>Đã gỡ</w:t>
+            </w:r>
+          </w:p>
+        </w:tc>
+      </w:tr>
+    </w:tbl>
+    <w:p>
+      <w:pPr/>
+      <w:r>
+        <w:rPr/>
+      </w:r>
+    </w:p>
+    <w:p>
+      <w:pPr>
+        <w:pStyle w:val="Heading2"/>
+      </w:pPr>
+      <w:r>
+        <w:rPr/>
+        <w:t>9. Kiểm thử</w:t>
+      </w:r>
+    </w:p>
+    <w:p>
+      <w:pPr>
+        <w:pStyle w:val="ListParagraph"/>
+      </w:pPr>
+      <w:r>
+        <w:rPr/>
+        <w:t>• Backend: SportHub.Security.Tests/Integration/GoogleLoginTests.cs (tự tạo, tự liên kết, khóa, song song, không lộ bí mật) và SetPasswordTests.cs (OTP, hết lượt, gửi lại, tài khoản đã có mật khẩu).</w:t>
+      </w:r>
+    </w:p>
+    <w:p>
+      <w:pPr>
+        <w:pStyle w:val="ListParagraph"/>
+      </w:pPr>
+      <w:r>
+        <w:rPr/>
+        <w:t>• Frontend: frontend/tests/auth-google-account.spec.ts.</w:t>
+      </w:r>
+    </w:p>
     <w:sectPr>
       <w:headerReference w:type="default" r:id="rId7"/>
       <w:footerReference w:type="default" r:id="rId8"/>

</xml_diff>

<commit_message>
receptionist register for member
</commit_message>
<xml_diff>
--- a/docs/SportManagement_BusinessRules_v2.0_updated.docx
+++ b/docs/SportManagement_BusinessRules_v2.0_updated.docx
@@ -61,7 +61,7 @@
         <w:spacing w:before="240" w:after="240"/>
       </w:pPr>
       <w:r>
-        <w:t>Thuật ngữ: Sport (môn); Class (lớp/khóa học có mã như Cầu lông 01); Session (buổi học); Room (phòng/sân); SeatHold (giữ chỗ tạm thời khi checkout); ClassPackage (gói của một lớp); PointWallet (ví điểm). Năm vai trò hệ thống: System Administrator, Center Manager, Coach, Member, Receptionist. Trung tâm không có huấn luyện viên freelancer và không cho phép gym/huấn luyện viên bên ngoài vào hoạt động; người ngoài muốn thuê sân dùng tài khoản Member bình thường (BR-140).</w:t>
+        <w:t>Thuật ngữ: Sport (môn); Class (lớp/khóa học có mã như Cầu lông 01); Session (buổi học); Room (phòng/sân); SeatHold (giữ chỗ tạm thời khi checkout); ClassPackage (gói của một lớp); PointWallet (ví điểm). Năm vai trò hệ thống: System Administrator, Center Manager, Coach, Member, Receptionist. Requirement gốc chỉ có bốn vai trò (Center Manager, Coach, Member, Receptionist); System Administrator là vai trò bổ sung của dự án và chia việc với Center Manager: Administrator quản lý tài khoản nhân sự, phân quyền (đổi vai trò) và Audit Log thao tác tài khoản; Center Manager giữ phần vận hành trung tâm và Audit Log đầy đủ, nên vai trò Center Manager không còn giống 100% requirement gốc. Guest là người chưa đăng nhập, không phải vai trò lưu trong database; Guest xem được landing page và nội dung công khai (khóa/gói, sân, Coach) nhưng không đọc dữ liệu cá nhân. Trung tâm không có huấn luyện viên freelancer và không cho phép gym/huấn luyện viên bên ngoài vào hoạt động; người ngoài muốn thuê sân dùng tài khoản Member bình thường (BR-140).</w:t>
       </w:r>
     </w:p>
     <w:p>
@@ -287,7 +287,7 @@
                 <w:sz w:val="18"/>
                 <w:szCs w:val="18"/>
               </w:rPr>
-              <w:t>Tài khoản Hội viên có thể tự đăng ký bằng một địa chỉ email duy nhất, hợp lệ và mật khẩu đáp ứng các yêu cầu về độ mạnh của hệ thống.</w:t>
+              <w:t>Tài khoản Hội viên được tạo bằng một trong hai cách: (1) Hội viên tự đăng ký bằng email duy nhất, hợp lệ (xác minh bằng OTP) và mật khẩu đáp ứng yêu cầu độ mạnh, hoặc đăng nhập Google; (2) Receptionist đăng ký Hội viên mới tại quầy bằng họ tên, email (nhập hai lần) và số điện thoại; hệ thống tạo tài khoản Member chưa có mật khẩu, gửi email kích hoạt (link dùng một lần, hiệu lực 24 giờ) để Hội viên tự đặt mật khẩu. Receptionist không đặt mật khẩu hộ và chỉ tạo được tài khoản Member. (Cách 2 là yêu cầu của đặc tả, chưa triển khai.)</w:t>
             </w:r>
           </w:p>
         </w:tc>
@@ -399,7 +399,7 @@
                 <w:sz w:val="18"/>
                 <w:szCs w:val="18"/>
               </w:rPr>
-              <w:t>Chỉ System Administrator được tạo tài khoản nhân sự (System Administrator, Center Manager, Receptionist và Coach kèm CoachSpecialty theo BR-96) và gán hoặc thay đổi vai trò người dùng. Tài khoản nhân sự được tạo không có mật khẩu; hệ thống gửi email kích hoạt (link dùng một lần, hiệu lực 24 giờ) để chính người dùng đặt mật khẩu, System Administrator không đặt mật khẩu hộ. Center Manager không tạo tài khoản Coach và không được gán hoặc đổi vai trò; Center Manager chỉ sửa hồ sơ, chuyên môn của Coach và cấp quyền dịch vụ PT. Đổi vai trò chỉ diễn ra giữa các vai trò nhân sự và tuân theo BR-142. Mỗi tài khoản có đúng một vai trò. System Administrator đầu tiên được khởi tạo khi triển khai. Sau khi đổi vai trò có hiệu lực, request xác thực tiếp theo phải đối chiếu vai trò hiện tại; JWT mang vai trò cũ khác vai trò hiện tại bị từ chối. Đây không phải cam kết thu hồi toàn bộ token hoặc logout-all.</w:t>
+              <w:t>Chỉ System Administrator được tạo tài khoản nhân sự (System Administrator, Center Manager, Receptionist và Coach kèm CoachSpecialty theo BR-96) và gán hoặc thay đổi vai trò người dùng. Tài khoản nhân sự được tạo không có mật khẩu; hệ thống gửi email kích hoạt (link dùng một lần, hiệu lực 24 giờ) để chính người dùng đặt mật khẩu, System Administrator không đặt mật khẩu hộ. Center Manager không tạo tài khoản Coach và không được gán hoặc đổi vai trò; Center Manager chỉ sửa hồ sơ, chuyên môn của Coach và cấp quyền dịch vụ PT. Đổi vai trò chỉ diễn ra giữa các vai trò nhân sự và tuân theo BR-142. Mỗi tài khoản có đúng một vai trò. System Administrator đầu tiên được khởi tạo khi triển khai. Sau khi đổi vai trò có hiệu lực, request xác thực tiếp theo phải đối chiếu vai trò hiện tại; JWT mang vai trò cũ khác vai trò hiện tại bị từ chối. Đây không phải cam kết thu hồi toàn bộ token hoặc logout-all. Việc xác minh email của tài khoản nhân sự và các thao tác gửi lại link, sửa email theo BR-143.</w:t>
             </w:r>
           </w:p>
         </w:tc>
@@ -462,7 +462,7 @@
                 <w:sz w:val="18"/>
                 <w:szCs w:val="18"/>
               </w:rPr>
-              <w:t>BR-06 gốc; Manager tạo và quản lý Coach (feedback giảng viên)</w:t>
+              <w:t>BR-06 gốc; cập nhật 12/10/2026: System Administrator tạo Coach, Center Manager chỉ sửa hồ sơ/chuyên môn và cấp quyền dịch vụ PT</w:t>
             </w:r>
           </w:p>
         </w:tc>
@@ -960,7 +960,7 @@
                 <w:sz w:val="18"/>
                 <w:szCs w:val="18"/>
               </w:rPr>
-              <w:t>Mọi thao tác quản trị và nghiệp vụ quan trọng của System Administrator, Center Manager, Coach và Receptionist phải được ghi Audit Log, gồm người thực hiện, hành động, đối tượng bị tác động và thời điểm. Các nhóm thao tác bắt buộc ghi gồm: CRUD môn thể thao, tạo tài khoản nhân sự (kể cả Coach), khóa tài khoản, tạo/sửa/hủy lớp và lịch, quyết định về ngưỡng hoàn vốn, thuê/hủy sân, cộng/trừ/điều chỉnh điểm. Thao tác khóa hoặc mở khóa tài khoản phải ghi thêm lý do.</w:t>
+              <w:t>Mọi thao tác quản trị và nghiệp vụ quan trọng của System Administrator, Center Manager, Coach và Receptionist phải được ghi Audit Log, gồm người thực hiện, hành động, đối tượng bị tác động và thời điểm. Các nhóm thao tác bắt buộc ghi gồm: CRUD môn thể thao, tạo tài khoản nhân sự (kể cả Coach), khóa tài khoản, gửi lại link kích hoạt (RESEND_STAFF_ACTIVATION), sửa email tài khoản chờ kích hoạt (CHANGE_PENDING_STAFF_EMAIL, ghi email cũ, email mới và lý do), tạo/sửa/hủy lớp và lịch, quyết định về ngưỡng hoàn vốn, thuê/hủy sân, cộng/trừ/điều chỉnh điểm. Thao tác khóa hoặc mở khóa tài khoản phải ghi thêm lý do.</w:t>
             </w:r>
           </w:p>
         </w:tc>
@@ -4849,6 +4849,230 @@
                 <w:szCs w:val="18"/>
               </w:rPr>
               <w:t>Quyết định người dùng 12/10/2026 — Member và nhân sự tách biệt; Admin là người duy nhất tạo Coach</w:t>
+            </w:r>
+          </w:p>
+        </w:tc>
+      </w:tr>
+      <w:tr>
+        <w:trPr>
+          <w:cantSplit/>
+        </w:trPr>
+        <w:tc>
+          <w:tcPr>
+            <w:tcW w:w="900" w:type="dxa"/>
+            <w:tcMar>
+              <w:top w:w="60" w:type="dxa"/>
+              <w:left w:w="100" w:type="dxa"/>
+              <w:bottom w:w="60" w:type="dxa"/>
+              <w:right w:w="100" w:type="dxa"/>
+            </w:tcMar>
+            <w:vAlign w:val="center"/>
+          </w:tcPr>
+          <w:p>
+            <w:r>
+              <w:rPr>
+                <w:b/>
+                <w:bCs/>
+                <w:sz w:val="18"/>
+                <w:szCs w:val="18"/>
+              </w:rPr>
+              <w:t>BR-143</w:t>
+            </w:r>
+          </w:p>
+        </w:tc>
+        <w:tc>
+          <w:tcPr>
+            <w:tcW w:w="5200" w:type="dxa"/>
+            <w:tcMar>
+              <w:top w:w="60" w:type="dxa"/>
+              <w:left w:w="100" w:type="dxa"/>
+              <w:bottom w:w="60" w:type="dxa"/>
+              <w:right w:w="100" w:type="dxa"/>
+            </w:tcMar>
+            <w:vAlign w:val="center"/>
+          </w:tcPr>
+          <w:p>
+            <w:r>
+              <w:rPr>
+                <w:sz w:val="18"/>
+                <w:szCs w:val="18"/>
+              </w:rPr>
+              <w:t>Hệ thống không xác minh được địa chỉ email của tài khoản do quản trị viên tạo là thật hay đúng người, nên việc xác minh là link kích hoạt gửi tới chính email đó. Khi tạo tài khoản nhân sự, System Administrator phải nhập email hai lần và hai lần nhập phải khớp. Tài khoản nhân sự chưa đặt mật khẩu và chưa liên kết Google ở trạng thái "chờ kích hoạt" và được hiển thị như vậy. Với tài khoản chờ kích hoạt, System Administrator được (a) gửi lại link kích hoạt (cách nhau tối thiểu 60 giây; mỗi lần gửi vô hiệu link cũ), và (b) sửa email gõ sai kèm lý do bắt buộc: link gửi tới email cũ bị vô hiệu ngay, link mới gửi tới email mới. Hai thao tác này không áp dụng cho Hội viên hoặc nhân sự đã kích hoạt (HTTP 409 account_not_pending_activation). Tài khoản chờ kích hoạt không đăng nhập được, kể cả bằng Google, cho tới khi người nhận tự đặt mật khẩu qua link.</w:t>
+            </w:r>
+          </w:p>
+        </w:tc>
+        <w:tc>
+          <w:tcPr>
+            <w:tcW w:w="1400" w:type="dxa"/>
+            <w:tcMar>
+              <w:top w:w="60" w:type="dxa"/>
+              <w:left w:w="100" w:type="dxa"/>
+              <w:bottom w:w="60" w:type="dxa"/>
+              <w:right w:w="100" w:type="dxa"/>
+            </w:tcMar>
+            <w:vAlign w:val="center"/>
+          </w:tcPr>
+          <w:p>
+            <w:r>
+              <w:rPr>
+                <w:sz w:val="18"/>
+                <w:szCs w:val="18"/>
+              </w:rPr>
+              <w:t>Ràng buộc</w:t>
+            </w:r>
+          </w:p>
+        </w:tc>
+        <w:tc>
+          <w:tcPr>
+            <w:tcW w:w="1300" w:type="dxa"/>
+            <w:tcMar>
+              <w:top w:w="60" w:type="dxa"/>
+              <w:left w:w="100" w:type="dxa"/>
+              <w:bottom w:w="60" w:type="dxa"/>
+              <w:right w:w="100" w:type="dxa"/>
+            </w:tcMar>
+            <w:vAlign w:val="center"/>
+          </w:tcPr>
+          <w:p>
+            <w:r>
+              <w:rPr>
+                <w:sz w:val="18"/>
+                <w:szCs w:val="18"/>
+              </w:rPr>
+              <w:t>Động</w:t>
+            </w:r>
+          </w:p>
+        </w:tc>
+        <w:tc>
+          <w:tcPr>
+            <w:tcW w:w="2400" w:type="dxa"/>
+            <w:tcMar>
+              <w:top w:w="60" w:type="dxa"/>
+              <w:left w:w="100" w:type="dxa"/>
+              <w:bottom w:w="60" w:type="dxa"/>
+              <w:right w:w="100" w:type="dxa"/>
+            </w:tcMar>
+            <w:vAlign w:val="center"/>
+          </w:tcPr>
+          <w:p>
+            <w:r>
+              <w:rPr>
+                <w:sz w:val="18"/>
+                <w:szCs w:val="18"/>
+              </w:rPr>
+              <w:t>Quyết định người dùng 12/10/2026 — toàn vẹn kích hoạt tài khoản</w:t>
+            </w:r>
+          </w:p>
+        </w:tc>
+      </w:tr>
+      <w:tr>
+        <w:trPr>
+          <w:cantSplit/>
+        </w:trPr>
+        <w:tc>
+          <w:tcPr>
+            <w:tcW w:w="900" w:type="dxa"/>
+            <w:tcMar>
+              <w:top w:w="60" w:type="dxa"/>
+              <w:left w:w="100" w:type="dxa"/>
+              <w:bottom w:w="60" w:type="dxa"/>
+              <w:right w:w="100" w:type="dxa"/>
+            </w:tcMar>
+            <w:vAlign w:val="center"/>
+          </w:tcPr>
+          <w:p>
+            <w:r>
+              <w:rPr>
+                <w:b/>
+                <w:bCs/>
+                <w:sz w:val="18"/>
+                <w:szCs w:val="18"/>
+              </w:rPr>
+              <w:t>BR-144</w:t>
+            </w:r>
+          </w:p>
+        </w:tc>
+        <w:tc>
+          <w:tcPr>
+            <w:tcW w:w="5200" w:type="dxa"/>
+            <w:tcMar>
+              <w:top w:w="60" w:type="dxa"/>
+              <w:left w:w="100" w:type="dxa"/>
+              <w:bottom w:w="60" w:type="dxa"/>
+              <w:right w:w="100" w:type="dxa"/>
+            </w:tcMar>
+            <w:vAlign w:val="center"/>
+          </w:tcPr>
+          <w:p>
+            <w:r>
+              <w:rPr>
+                <w:sz w:val="18"/>
+                <w:szCs w:val="18"/>
+              </w:rPr>
+              <w:t>Người chưa đăng nhập (Guest) xem được landing page giới thiệu trung tâm, ba môn Gym/cầu lông/bóng rổ, đội Coach đang hoạt động và các khóa, gói, sân đã công khai. Guest không đọc được dữ liệu cá nhân, tài khoản, hóa đơn, ví điểm hay lịch của người khác; mua, đăng ký, thuê sân và mọi thao tác ghi dữ liệu yêu cầu đăng nhập bằng tài khoản Member. Lớp DRAFT không hiển thị cho Guest (BR-111).</w:t>
+            </w:r>
+          </w:p>
+        </w:tc>
+        <w:tc>
+          <w:tcPr>
+            <w:tcW w:w="1400" w:type="dxa"/>
+            <w:tcMar>
+              <w:top w:w="60" w:type="dxa"/>
+              <w:left w:w="100" w:type="dxa"/>
+              <w:bottom w:w="60" w:type="dxa"/>
+              <w:right w:w="100" w:type="dxa"/>
+            </w:tcMar>
+            <w:vAlign w:val="center"/>
+          </w:tcPr>
+          <w:p>
+            <w:r>
+              <w:rPr>
+                <w:sz w:val="18"/>
+                <w:szCs w:val="18"/>
+              </w:rPr>
+              <w:t>Ràng buộc</w:t>
+            </w:r>
+          </w:p>
+        </w:tc>
+        <w:tc>
+          <w:tcPr>
+            <w:tcW w:w="1300" w:type="dxa"/>
+            <w:tcMar>
+              <w:top w:w="60" w:type="dxa"/>
+              <w:left w:w="100" w:type="dxa"/>
+              <w:bottom w:w="60" w:type="dxa"/>
+              <w:right w:w="100" w:type="dxa"/>
+            </w:tcMar>
+            <w:vAlign w:val="center"/>
+          </w:tcPr>
+          <w:p>
+            <w:r>
+              <w:rPr>
+                <w:sz w:val="18"/>
+                <w:szCs w:val="18"/>
+              </w:rPr>
+              <w:t>Tĩnh</w:t>
+            </w:r>
+          </w:p>
+        </w:tc>
+        <w:tc>
+          <w:tcPr>
+            <w:tcW w:w="2400" w:type="dxa"/>
+            <w:tcMar>
+              <w:top w:w="60" w:type="dxa"/>
+              <w:left w:w="100" w:type="dxa"/>
+              <w:bottom w:w="60" w:type="dxa"/>
+              <w:right w:w="100" w:type="dxa"/>
+            </w:tcMar>
+            <w:vAlign w:val="center"/>
+          </w:tcPr>
+          <w:p>
+            <w:r>
+              <w:rPr>
+                <w:sz w:val="18"/>
+                <w:szCs w:val="18"/>
+              </w:rPr>
+              <w:t>Quyết định người dùng 12/10/2026 — nội dung công khai cho Guest</w:t>
             </w:r>
           </w:p>
         </w:tc>

</xml_diff>

<commit_message>
docs: receptionist can add point for member without OTP
</commit_message>
<xml_diff>
--- a/docs/SportManagement_BusinessRules_v2.0_updated.docx
+++ b/docs/SportManagement_BusinessRules_v2.0_updated.docx
@@ -4222,7 +4222,7 @@
       <w:tr>
         <w:trPr>
           <w:cantSplit/>
-          <w:ins w:id="9020" w:author="Claude" w:date="2026-10-24T22:45:00Z"/>
+          <w:ins w:id="9022" w:author="Claude" w:date="2026-10-24T22:45:00Z"/>
         </w:trPr>
         <w:tc>
           <w:tcPr>
@@ -4238,10 +4238,10 @@
           <w:p>
             <w:pPr>
               <w:rPr>
-                <w:ins w:id="9021" w:author="Claude" w:date="2026-10-24T22:45:00Z"/>
-              </w:rPr>
-            </w:pPr>
-            <w:ins w:id="9022" w:author="Claude" w:date="2026-10-24T22:45:00Z">
+                <w:ins w:id="9023" w:author="Claude" w:date="2026-10-24T22:45:00Z"/>
+              </w:rPr>
+            </w:pPr>
+            <w:ins w:id="9024" w:author="Claude" w:date="2026-10-24T22:45:00Z">
               <w:r>
                 <w:rPr>
                   <w:b/>
@@ -4268,10 +4268,10 @@
           <w:p>
             <w:pPr>
               <w:rPr>
-                <w:ins w:id="9023" w:author="Claude" w:date="2026-10-24T22:45:00Z"/>
-              </w:rPr>
-            </w:pPr>
-            <w:ins w:id="9024" w:author="Claude" w:date="2026-10-24T22:45:00Z">
+                <w:ins w:id="9025" w:author="Claude" w:date="2026-10-24T22:45:00Z"/>
+              </w:rPr>
+            </w:pPr>
+            <w:ins w:id="9026" w:author="Claude" w:date="2026-10-24T22:45:00Z">
               <w:r>
                 <w:rPr>
                   <w:sz w:val="18"/>
@@ -4296,10 +4296,10 @@
           <w:p>
             <w:pPr>
               <w:rPr>
-                <w:ins w:id="9025" w:author="Claude" w:date="2026-10-24T22:45:00Z"/>
-              </w:rPr>
-            </w:pPr>
-            <w:ins w:id="9026" w:author="Claude" w:date="2026-10-24T22:45:00Z">
+                <w:ins w:id="9027" w:author="Claude" w:date="2026-10-24T22:45:00Z"/>
+              </w:rPr>
+            </w:pPr>
+            <w:ins w:id="9028" w:author="Claude" w:date="2026-10-24T22:45:00Z">
               <w:r>
                 <w:rPr>
                   <w:sz w:val="18"/>
@@ -4324,10 +4324,10 @@
           <w:p>
             <w:pPr>
               <w:rPr>
-                <w:ins w:id="9027" w:author="Claude" w:date="2026-10-24T22:45:00Z"/>
-              </w:rPr>
-            </w:pPr>
-            <w:ins w:id="9028" w:author="Claude" w:date="2026-10-24T22:45:00Z">
+                <w:ins w:id="9029" w:author="Claude" w:date="2026-10-24T22:45:00Z"/>
+              </w:rPr>
+            </w:pPr>
+            <w:ins w:id="9030" w:author="Claude" w:date="2026-10-24T22:45:00Z">
               <w:r>
                 <w:rPr>
                   <w:sz w:val="18"/>
@@ -4352,10 +4352,10 @@
           <w:p>
             <w:pPr>
               <w:rPr>
-                <w:ins w:id="9029" w:author="Claude" w:date="2026-10-24T22:45:00Z"/>
-              </w:rPr>
-            </w:pPr>
-            <w:ins w:id="9030" w:author="Claude" w:date="2026-10-24T22:45:00Z">
+                <w:ins w:id="9031" w:author="Claude" w:date="2026-10-24T22:45:00Z"/>
+              </w:rPr>
+            </w:pPr>
+            <w:ins w:id="9032" w:author="Claude" w:date="2026-10-24T22:45:00Z">
               <w:r>
                 <w:rPr>
                   <w:sz w:val="18"/>
@@ -7086,7 +7086,7 @@
               </w:rPr>
               <w:t xml:space="preserve">Email cảnh báo nêu rõ tên lớp, ngưỡng, số học viên hiện tại, hạn phản hồi (48 giờ, cấu hình được) và ba lựa chọn: (a) chuyển sang lớp khác cùng môn đang PUBLISHED, còn chỗ và chưa bắt đầu — nếu giá lớp mới thấp hơn thì phần chênh được hoàn bằng điểm, nếu cao hơn thì Member thanh toán phần chênh qua checkout (VNPay hoặc điểm) và chỗ ở lớp mới được giữ theo BR-115; </w:t>
             </w:r>
-            <w:del w:id="9240" w:author="Claude" w:date="2026-10-24T22:45:00Z">
+            <w:del w:id="9244" w:author="Claude" w:date="2026-10-24T22:45:00Z">
               <w:r>
                 <w:rPr>
                   <w:sz w:val="18"/>
@@ -7095,7 +7095,7 @@
                 <w:delText xml:space="preserve">(b) hoàn 100% giá trị đã trả bằng điểm theo BR-122;</w:delText>
               </w:r>
             </w:del>
-            <w:ins w:id="9241" w:author="Claude" w:date="2026-10-24T22:45:00Z">
+            <w:ins w:id="9245" w:author="Claude" w:date="2026-10-24T22:45:00Z">
               <w:r>
                 <w:rPr>
                   <w:sz w:val="18"/>
@@ -7111,7 +7111,7 @@
               </w:rPr>
               <w:t xml:space="preserve"> (c) "Chờ đợt sau": hoàn 100% giá trị đã trả bằng điểm theo BR-122, kết thúc ghi danh và tạo đăng ký quan tâm môn đó trong cùng một transaction; lựa chọn này không giữ tiền, không giữ chỗ, không tự ghi danh và không phải Waitlist, và gửi lại cùng phản hồi không hoàn điểm hay tạo đăng ký quan tâm lần hai. Học viên phản hồi qua liên kết bảo mật trong email hoặc trên tài khoản; lựa chọn đã gửi là cuối cùng. Quá hạn mà chưa phản hồi, hệ thống tự hoàn 100% bằng điểm.</w:t>
             </w:r>
-            <w:ins w:id="9242" w:author="Claude" w:date="2026-10-24T22:45:00Z">
+            <w:ins w:id="9246" w:author="Claude" w:date="2026-10-24T22:45:00Z">
               <w:r>
                 <w:rPr>
                   <w:sz w:val="18"/>
@@ -7233,7 +7233,7 @@
               </w:rPr>
               <w:t xml:space="preserve">Sau hạn phản hồi, hệ thống đánh giá lại: nếu số ghi danh CONFIRMED còn lại ≥ BreakEvenThreshold thì lớp tiếp tục; nếu &lt; ngưỡng thì lớp chuyển CANCELLED, các ghi danh còn lại (nếu có) </w:t>
             </w:r>
-            <w:del w:id="9243" w:author="Claude" w:date="2026-10-24T22:45:00Z">
+            <w:del w:id="9247" w:author="Claude" w:date="2026-10-24T22:45:00Z">
               <w:r>
                 <w:rPr>
                   <w:sz w:val="18"/>
@@ -7242,7 +7242,7 @@
                 <w:delText xml:space="preserve">được hoàn 100% bằng điểm và có email thông báo.</w:delText>
               </w:r>
             </w:del>
-            <w:ins w:id="9244" w:author="Claude" w:date="2026-10-24T22:45:00Z">
+            <w:ins w:id="9248" w:author="Claude" w:date="2026-10-24T22:45:00Z">
               <w:r>
                 <w:rPr>
                   <w:sz w:val="18"/>
@@ -7258,7 +7258,7 @@
               </w:rPr>
               <w:t xml:space="preserve"> Trước khi lớp bị hủy, Center Manager có thể chọn "vẫn mở lớp" (ThresholdStatus = WaivedByManager), bắt buộc ghi lý do và Audit Log; khi đó lớp không bị hủy.</w:t>
             </w:r>
-            <w:ins w:id="9245" w:author="Claude" w:date="2026-10-24T22:45:00Z">
+            <w:ins w:id="9249" w:author="Claude" w:date="2026-10-24T22:45:00Z">
               <w:r>
                 <w:rPr>
                   <w:sz w:val="18"/>
@@ -10195,7 +10195,7 @@
               </w:rPr>
               <w:t>Khung giờ sân được hiển thị là còn trống chỉ khi Room tương thích với Sport, nằm trong giờ hoạt động (BR-109), không bị khóa và không có buổi lớp, buổi PT hoặc lượt thuê nào khác (BR-108); các khung giờ lớp cố định theo BR-141 vì vậy không cho thuê. Đơn vị đặt là khối 60 phút.</w:t>
             </w:r>
-            <w:ins w:id="9218" w:author="Claude" w:date="2026-10-24T22:45:00Z">
+            <w:ins w:id="9222" w:author="Claude" w:date="2026-10-24T22:45:00Z">
               <w:r>
                 <w:rPr>
                   <w:sz w:val="18"/>
@@ -10428,7 +10428,7 @@
               </w:rPr>
               <w:t xml:space="preserve">Lượt thuê (CourtRental) gồm Member, Room, ngày và giờ bắt đầu/kết thúc theo bội số 60 phút, tối đa 4 giờ mỗi lượt và </w:t>
             </w:r>
-            <w:del w:id="9219" w:author="Claude" w:date="2026-10-24T22:45:00Z">
+            <w:del w:id="9223" w:author="Claude" w:date="2026-10-24T22:45:00Z">
               <w:r>
                 <w:rPr>
                   <w:sz w:val="18"/>
@@ -10437,7 +10437,7 @@
                 <w:delText xml:space="preserve">đặt trước tối đa 30 ngày (cấu hình được)</w:delText>
               </w:r>
             </w:del>
-            <w:ins w:id="9220" w:author="Claude" w:date="2026-10-24T22:45:00Z">
+            <w:ins w:id="9224" w:author="Claude" w:date="2026-10-24T22:45:00Z">
               <w:r>
                 <w:rPr>
                   <w:sz w:val="18"/>
@@ -10453,7 +10453,7 @@
               </w:rPr>
               <w:t xml:space="preserve">. Member không phải khai báo số người hay mục đích sử dụng và hệ thống không đặt giới hạn số người. Khi checkout, khung giờ được giữ như SeatHold (BR-115); lượt thuê chỉ CONFIRMED sau khi thanh toán thành công bằng VNPay và/hoặc điểm (BR-136).</w:t>
             </w:r>
-            <w:ins w:id="9221" w:author="Claude" w:date="2026-10-24T22:45:00Z">
+            <w:ins w:id="9225" w:author="Claude" w:date="2026-10-24T22:45:00Z">
               <w:r>
                 <w:rPr>
                   <w:sz w:val="18"/>
@@ -10567,7 +10567,7 @@
             <w:vAlign w:val="center"/>
           </w:tcPr>
           <w:p>
-            <w:del w:id="9230" w:author="Claude" w:date="2026-10-24T22:45:00Z">
+            <w:del w:id="9234" w:author="Claude" w:date="2026-10-24T22:45:00Z">
               <w:r>
                 <w:rPr>
                   <w:sz w:val="18"/>
@@ -10576,7 +10576,7 @@
                 <w:delText xml:space="preserve">Member hủy lượt thuê từ 24 giờ trở lên trước giờ bắt đầu được hoàn 100% giá trị thực trả bằng điểm; hủy muộn hơn hoặc không đến thì không được hoàn. Lượt thuê bị trung tâm hủy (BR-130) luôn được hoàn 100% bằng điểm.</w:delText>
               </w:r>
             </w:del>
-            <w:ins w:id="9231" w:author="Claude" w:date="2026-10-24T22:45:00Z">
+            <w:ins w:id="9235" w:author="Claude" w:date="2026-10-24T22:45:00Z">
               <w:r>
                 <w:rPr>
                   <w:sz w:val="18"/>
@@ -10585,7 +10585,7 @@
                 <w:t xml:space="preserve">Member tự hủy lượt thuê sân thì không được hoàn ở mọi thời điểm (kể cả hủy sớm hoặc không đến); khi Member bấm hủy, giao diện hiện pop-up thông báo hủy và không được hoàn tiền, như hủy ghi danh khóa học (BR-122). Lượt thuê bị trung tâm hủy (BR-130) được hoàn 100% giá trị thực trả, Member chọn nhận điểm ngay hoặc hoàn tiền qua Support Request (BR-154).</w:t>
               </w:r>
             </w:ins>
-            <w:ins w:id="9232" w:author="Claude" w:date="2026-10-24T22:45:00Z">
+            <w:ins w:id="9236" w:author="Claude" w:date="2026-10-24T22:45:00Z">
               <w:r>
                 <w:t xml:space="preserve"> Cập nhật 25/10/2026 (quyết định bổ sung của nhóm: hủy Gym, ghi danh hoặc thuê sân đều không hoàn; sự cố phía trung tâm do Member chọn điểm hoặc Support Request).</w:t>
               </w:r>
@@ -10703,7 +10703,7 @@
               </w:rPr>
               <w:t xml:space="preserve">Khi có sự cố (mất điện, hỏng sân, bảo trì khẩn, hỏng hoặc sửa chữa phòng Gym), Center Manager tạo Incident Notice chọn phạm vi (Room và khung giờ, khu vực Gym, hoặc toàn trung tâm) và lý do. Hệ thống khóa khung giờ bị ảnh hưởng (BR-109), gửi email ngay qua outbox cho Coach được phân công, Member có lượt thuê, học viên của lớp bị ảnh hưởng và Member có Membership Gym đang Active vào ngày xảy ra sự cố (BR-138). </w:t>
             </w:r>
-            <w:del w:id="9233" w:author="Claude" w:date="2026-10-24T22:45:00Z">
+            <w:del w:id="9237" w:author="Claude" w:date="2026-10-24T22:45:00Z">
               <w:r>
                 <w:rPr>
                   <w:sz w:val="18"/>
@@ -10712,7 +10712,7 @@
                 <w:delText xml:space="preserve">Lượt thuê bị ảnh hưởng tự động hủy và hoàn 100% bằng điểm, Member được ưu tiên đặt lại khung giờ khác;</w:delText>
               </w:r>
             </w:del>
-            <w:ins w:id="9234" w:author="Claude" w:date="2026-10-24T22:45:00Z">
+            <w:ins w:id="9238" w:author="Claude" w:date="2026-10-24T22:45:00Z">
               <w:r>
                 <w:rPr>
                   <w:sz w:val="18"/>
@@ -10728,7 +10728,7 @@
               </w:rPr>
               <w:t xml:space="preserve"> buổi lớp bị ảnh hưởng được bù vào lịch tiếp theo theo BR-54. </w:t>
             </w:r>
-            <w:del w:id="9296" w:author="Claude" w:date="2026-10-24T22:45:00Z">
+            <w:del w:id="9323" w:author="Claude" w:date="2026-10-24T22:45:00Z">
               <w:r>
                 <w:rPr>
                   <w:sz w:val="18"/>
@@ -10737,7 +10737,7 @@
                 <w:delText xml:space="preserve">Với Gym, mỗi Membership Active được gia hạn EndDate thêm đúng số ngày Gym phải đóng cửa để sửa chữa (Center Manager xác nhận số ngày khi đóng sự cố, ghi Audit Log); sự cố tạm thời không phải căn cứ hoàn điểm.</w:delText>
               </w:r>
             </w:del>
-            <w:ins w:id="9297" w:author="Claude" w:date="2026-10-24T22:45:00Z">
+            <w:ins w:id="9324" w:author="Claude" w:date="2026-10-24T22:45:00Z">
               <w:r>
                 <w:rPr>
                   <w:sz w:val="18"/>
@@ -10753,7 +10753,7 @@
               </w:rPr>
               <w:t xml:space="preserve"> Hoàn do lỗi trung tâm đối với Membership hoặc PT chỉ theo BR-91, tính theo phần chưa sử dụng và không hoàn 100%.</w:t>
             </w:r>
-            <w:ins w:id="9235" w:author="Claude" w:date="2026-10-24T22:45:00Z">
+            <w:ins w:id="9239" w:author="Claude" w:date="2026-10-24T22:45:00Z">
               <w:r>
                 <w:rPr>
                   <w:sz w:val="18"/>
@@ -10762,7 +10762,7 @@
                 <w:t xml:space="preserve"> Cập nhật 25/10/2026 (quyết định bổ sung của nhóm: hủy Gym, ghi danh hoặc thuê sân đều không hoàn; sự cố phía trung tâm do Member chọn điểm hoặc Support Request).</w:t>
               </w:r>
             </w:ins>
-            <w:ins w:id="9298" w:author="Claude" w:date="2026-10-24T22:45:00Z">
+            <w:ins w:id="9325" w:author="Claude" w:date="2026-10-24T22:45:00Z">
               <w:r>
                 <w:rPr>
                   <w:sz w:val="18"/>
@@ -12592,15 +12592,33 @@
                 <w:sz w:val="18"/>
                 <w:szCs w:val="18"/>
               </w:rPr>
-              <w:t xml:space="preserve"> hoặc Center Manager điều chỉnh có lý do và Audit Log.</w:t>
-            </w:r>
-            <w:ins w:id="9010" w:author="Claude" w:date="2026-10-24T22:45:00Z">
+              <w:t xml:space="preserve"> </w:t>
+            </w:r>
+            <w:del w:id="9010" w:author="Claude" w:date="2026-10-24T22:45:00Z">
               <w:r>
                 <w:rPr>
                   <w:sz w:val="18"/>
                   <w:szCs w:val="18"/>
                 </w:rPr>
-                <w:t xml:space="preserve"> Cập nhật 24/10/2026 (Payment-Support-Workflow.md, mục 2 và mục 3; giữ nguyên 1 điểm = 1.000 VND, không hết hạn).</w:t>
+                <w:delText xml:space="preserve">hoặc Center Manager điều chỉnh có lý do và Audit Log.</w:delText>
+              </w:r>
+            </w:del>
+            <w:ins w:id="9011" w:author="Claude" w:date="2026-10-24T22:45:00Z">
+              <w:r>
+                <w:rPr>
+                  <w:sz w:val="18"/>
+                  <w:szCs w:val="18"/>
+                </w:rPr>
+                <w:t xml:space="preserve">Member hoặc Receptionist hộ Member nạp điểm qua VNPay (Add points, BR-157); hoặc Center Manager tặng hoặc điều chỉnh có lý do và Audit Log (BR-156).</w:t>
+              </w:r>
+            </w:ins>
+            <w:ins w:id="9012" w:author="Claude" w:date="2026-10-24T22:45:00Z">
+              <w:r>
+                <w:rPr>
+                  <w:sz w:val="18"/>
+                  <w:szCs w:val="18"/>
+                </w:rPr>
+                <w:t xml:space="preserve"> Cập nhật 24/10/2026 (Payment-Support-Workflow.md, mục 2 và mục 3; giữ nguyên 1 điểm = 1.000 VND, không hết hạn). Cập nhật 25/10/2026 (quyết định bổ sung của nhóm 25/10/2026: Receptionist nạp điểm hộ Member, Center Manager tặng điểm).</w:t>
               </w:r>
             </w:ins>
           </w:p>
@@ -12708,7 +12726,7 @@
             <w:vAlign w:val="center"/>
           </w:tcPr>
           <w:p>
-            <w:del w:id="9011" w:author="Claude" w:date="2026-10-24T22:45:00Z">
+            <w:del w:id="9013" w:author="Claude" w:date="2026-10-24T22:45:00Z">
               <w:r>
                 <w:rPr>
                   <w:sz w:val="18"/>
@@ -12717,7 +12735,7 @@
                 <w:delText xml:space="preserve">Hệ thống không thực hiện hoàn tiền mặt hoặc chuyển khoản trả lại cho bất kỳ giao dịch nào và không gọi VNPay Refund API. Mọi khoản hoàn trả hoặc bồi hoàn của trung tâm cho Member đều thực hiện bằng điểm theo BR-134.</w:delText>
               </w:r>
             </w:del>
-            <w:ins w:id="9012" w:author="Claude" w:date="2026-10-24T22:45:00Z">
+            <w:ins w:id="9014" w:author="Claude" w:date="2026-10-24T22:45:00Z">
               <w:r>
                 <w:rPr>
                   <w:sz w:val="18"/>
@@ -12733,7 +12751,7 @@
               </w:rPr>
               <w:t xml:space="preserve"> Đối soát thanh toán thu tiền (BR-84, BR-85, BR-88) không thay đổi.</w:t>
             </w:r>
-            <w:ins w:id="9013" w:author="Claude" w:date="2026-10-24T22:45:00Z">
+            <w:ins w:id="9015" w:author="Claude" w:date="2026-10-24T22:45:00Z">
               <w:r>
                 <w:rPr>
                   <w:sz w:val="18"/>
@@ -12964,8 +12982,42 @@
                 <w:sz w:val="18"/>
                 <w:szCs w:val="18"/>
               </w:rPr>
-              <w:t>Receptionist được tra cứu số dư và lịch sử điểm của một Member được chọn rõ ràng và được tạo checkout thay cho Member tại quầy, gồm cả thanh toán có dùng điểm. Khi checkout có dùng điểm, hệ thống phải yêu cầu chính Member xác nhận số điểm sẽ dùng trước khi giữ hoặc trừ điểm: Member xác nhận tại quầy bằng mã OTP 6 chữ số gửi tới email của Member (bắt buộc; hiệu lực 5 phút, dùng một lần, tối đa 5 lần nhập sai thì mã bị hủy và phải yêu cầu mã mới); Receptionist nhập mã do Member đọc, không có cách xác nhận nào khác tại quầy. Chưa có xác nhận thì PointsApplied = 0 và không có điểm nào bị giữ hoặc trừ. Receptionist không được tự cộng, trừ, điều chỉnh hoặc chuyển điểm của Member; điểm chỉ thay đổi thông qua một Payment hợp lệ, hoàn trả theo BR-134 hoặc điều chỉnh của Center Manager. Mọi lần tra cứu điểm và giao dịch điểm do Receptionist khởi tạo phải ghi Audit Log, gồm Receptionist, Member, số điểm và Invoice.</w:t>
-            </w:r>
+              <w:t xml:space="preserve">Receptionist được tra cứu số dư và lịch sử điểm của một Member được chọn rõ ràng và được tạo checkout thay cho Member tại quầy, gồm cả thanh toán có dùng điểm. Khi checkout có dùng điểm, hệ thống phải yêu cầu chính Member xác nhận số điểm sẽ dùng trước khi giữ hoặc trừ điểm: Member xác nhận tại quầy bằng mã OTP 6 chữ số gửi tới email của Member (bắt buộc; hiệu lực 5 phút, dùng một lần, tối đa 5 lần nhập sai thì mã bị hủy và phải yêu cầu mã mới); Receptionist nhập mã do Member đọc, không có cách xác nhận nào khác tại quầy. Chưa có xác nhận thì PointsApplied = 0 và không có điểm nào bị giữ hoặc trừ. </w:t>
+            </w:r>
+            <w:del w:id="9318" w:author="Claude" w:date="2026-10-24T22:45:00Z">
+              <w:r>
+                <w:rPr>
+                  <w:sz w:val="18"/>
+                  <w:szCs w:val="18"/>
+                </w:rPr>
+                <w:delText xml:space="preserve">Receptionist không được tự cộng, trừ, điều chỉnh hoặc chuyển điểm của Member; điểm chỉ thay đổi thông qua một Payment hợp lệ, hoàn trả theo BR-134 hoặc điều chỉnh của Center Manager.</w:delText>
+              </w:r>
+            </w:del>
+            <w:ins w:id="9319" w:author="Claude" w:date="2026-10-24T22:45:00Z">
+              <w:r>
+                <w:rPr>
+                  <w:sz w:val="18"/>
+                  <w:szCs w:val="18"/>
+                </w:rPr>
+                <w:t xml:space="preserve">Receptionist không được tự tặng, trừ, điều chỉnh hoặc chuyển điểm của Member, nhưng được nạp điểm hộ Member qua luồng Add points giống Member tự nạp (BR-157); điểm chỉ thay đổi thông qua một Payment hợp lệ (gồm nạp điểm), hoàn trả theo BR-134 hoặc tặng, điều chỉnh của Center Manager (BR-156).</w:t>
+              </w:r>
+            </w:ins>
+            <w:r>
+              <w:rPr>
+                <w:sz w:val="18"/>
+                <w:szCs w:val="18"/>
+              </w:rPr>
+              <w:t xml:space="preserve"> Mọi lần tra cứu điểm và giao dịch điểm do Receptionist khởi tạo phải ghi Audit Log, gồm Receptionist, Member, số điểm và Invoice.</w:t>
+            </w:r>
+            <w:ins w:id="9320" w:author="Claude" w:date="2026-10-24T22:45:00Z">
+              <w:r>
+                <w:rPr>
+                  <w:sz w:val="18"/>
+                  <w:szCs w:val="18"/>
+                </w:rPr>
+                <w:t xml:space="preserve"> Cập nhật 25/10/2026 (quyết định bổ sung của nhóm 25/10/2026: Receptionist nạp điểm hộ Member, Center Manager tặng điểm).</w:t>
+              </w:r>
+            </w:ins>
           </w:p>
         </w:tc>
         <w:tc>
@@ -13079,7 +13131,7 @@
               </w:rPr>
               <w:t xml:space="preserve">Member được tạo RefundRequest cho InvoiceItem của chính mình; Receptionist được tạo hộ nhưng bắt buộc nhập lý do và target Member rõ ràng. Chỉ Center Manager được Approve hoặc Reject; Manager không được nhập số điểm vượt số hệ thống tính theo BR-91, BR-92 và BR-122. </w:t>
             </w:r>
-            <w:del w:id="9014" w:author="Claude" w:date="2026-10-24T22:45:00Z">
+            <w:del w:id="9016" w:author="Claude" w:date="2026-10-24T22:45:00Z">
               <w:r>
                 <w:rPr>
                   <w:sz w:val="18"/>
@@ -13088,13 +13140,13 @@
                 <w:delText xml:space="preserve">Hoàn trả luôn bằng điểm (BR-135) và Receptionist không được tự cộng điểm.</w:delText>
               </w:r>
             </w:del>
-            <w:ins w:id="9015" w:author="Claude" w:date="2026-10-24T22:45:00Z">
+            <w:ins w:id="9017" w:author="Claude" w:date="2026-10-24T22:45:00Z">
               <w:r>
                 <w:rPr>
                   <w:sz w:val="18"/>
                   <w:szCs w:val="18"/>
                 </w:rPr>
-                <w:t xml:space="preserve">Hoàn qua RefundRequest luôn bằng điểm (BR-135); hoàn chuyển khoản không đi qua RefundRequest mà chỉ qua Support Request (BR-150, BR-151). Receptionist không được tự cộng điểm.</w:t>
+                <w:t xml:space="preserve">Hoàn qua RefundRequest luôn bằng điểm (BR-135); hoàn chuyển khoản không đi qua RefundRequest mà chỉ qua Support Request (BR-150, BR-151). Receptionist không tự cộng điểm hoàn (chỉ Center Manager Approve).</w:t>
               </w:r>
             </w:ins>
             <w:r>
@@ -13104,7 +13156,7 @@
               </w:rPr>
               <w:t xml:space="preserve"> Trạng thái: Requested → Approved → Completed, hoặc Requested → Rejected. Các trường hợp do trung tâm gây ra (BR-120, BR-121, BR-129, BR-130) </w:t>
             </w:r>
-            <w:del w:id="9246" w:author="Claude" w:date="2026-10-24T22:45:00Z">
+            <w:del w:id="9250" w:author="Claude" w:date="2026-10-24T22:45:00Z">
               <w:r>
                 <w:rPr>
                   <w:sz w:val="18"/>
@@ -13113,7 +13165,7 @@
                 <w:delText xml:space="preserve">được hệ thống tự hoàn điểm mà không cần RefundRequest, có Audit Log.</w:delText>
               </w:r>
             </w:del>
-            <w:ins w:id="9247" w:author="Claude" w:date="2026-10-24T22:45:00Z">
+            <w:ins w:id="9251" w:author="Claude" w:date="2026-10-24T22:45:00Z">
               <w:r>
                 <w:rPr>
                   <w:sz w:val="18"/>
@@ -13122,7 +13174,7 @@
                 <w:t xml:space="preserve">được hoàn mà không cần RefundRequest: Member chọn nhận điểm ngay (hệ thống cộng điểm, có Audit Log) hoặc hoàn tiền qua Support Request (BR-154).</w:t>
               </w:r>
             </w:ins>
-            <w:ins w:id="9016" w:author="Claude" w:date="2026-10-24T22:45:00Z">
+            <w:ins w:id="9018" w:author="Claude" w:date="2026-10-24T22:45:00Z">
               <w:r>
                 <w:rPr>
                   <w:sz w:val="18"/>
@@ -13131,7 +13183,7 @@
                 <w:t xml:space="preserve"> Cập nhật 24/10/2026 (Payment-Support-Workflow.md, mục 3).</w:t>
               </w:r>
             </w:ins>
-            <w:ins w:id="9248" w:author="Claude" w:date="2026-10-24T22:45:00Z">
+            <w:ins w:id="9252" w:author="Claude" w:date="2026-10-24T22:45:00Z">
               <w:r>
                 <w:rPr>
                   <w:sz w:val="18"/>
@@ -13140,7 +13192,7 @@
                 <w:t xml:space="preserve"> Cập nhật 25/10/2026 (quyết định bổ sung của nhóm: hủy Gym, ghi danh hoặc thuê sân đều không hoàn; sự cố phía trung tâm do Member chọn điểm hoặc Support Request).</w:t>
               </w:r>
             </w:ins>
-            <w:ins w:id="9304" w:author="Claude" w:date="2026-10-24T22:45:00Z">
+            <w:ins w:id="9331" w:author="Claude" w:date="2026-10-24T22:45:00Z">
               <w:r>
                 <w:rPr>
                   <w:sz w:val="18"/>
@@ -13254,7 +13306,7 @@
             <w:vAlign w:val="center"/>
           </w:tcPr>
           <w:p>
-            <w:del w:id="9224" w:author="Claude" w:date="2026-10-24T22:45:00Z">
+            <w:del w:id="9228" w:author="Claude" w:date="2026-10-24T22:45:00Z">
               <w:r>
                 <w:rPr>
                   <w:sz w:val="18"/>
@@ -13263,7 +13315,7 @@
                 <w:delText xml:space="preserve">Một InvoiceItem Membership đủ điều kiện hoàn chuẩn khi tại RefundRequestedDate theo calendar date Việt Nam có RemainingDays × 3 &gt;= TotalDays × 2, trong đó TotalDays = EndDate − StartDate + 1 và RemainingDays = EndDate − RefundRequestedDate + 1. Quy tắc này áp dụng cả khi chưa tới StartDate (gói gia hạn sớm bắt đầu sau EndDate hiện tại); mức hoàn chuẩn tối đa là 50% giá trị thực trả của riêng InvoiceItem đó, quy đổi thành điểm, vì Membership mới mua bắt đầu từ ngày thanh toán nên không có hoàn 100%. Khi còn dưới 2/3 thời hạn hoặc Membership đã Expired thì không hoàn.</w:delText>
               </w:r>
             </w:del>
-            <w:ins w:id="9225" w:author="Claude" w:date="2026-10-24T22:45:00Z">
+            <w:ins w:id="9229" w:author="Claude" w:date="2026-10-24T22:45:00Z">
               <w:r>
                 <w:rPr>
                   <w:sz w:val="18"/>
@@ -13279,7 +13331,7 @@
               </w:rPr>
               <w:t xml:space="preserve"> Sự cố tạm thời của trung tâm (hỏng hoặc sửa chữa phòng Gym) không phải căn cứ hoàn mà </w:t>
             </w:r>
-            <w:del w:id="9302" w:author="Claude" w:date="2026-10-24T22:45:00Z">
+            <w:del w:id="9329" w:author="Claude" w:date="2026-10-24T22:45:00Z">
               <w:r>
                 <w:rPr>
                   <w:sz w:val="18"/>
@@ -13288,7 +13340,7 @@
                 <w:delText xml:space="preserve">được bù bằng gia hạn theo BR-130.</w:delText>
               </w:r>
             </w:del>
-            <w:ins w:id="9303" w:author="Claude" w:date="2026-10-24T22:45:00Z">
+            <w:ins w:id="9330" w:author="Claude" w:date="2026-10-24T22:45:00Z">
               <w:r>
                 <w:rPr>
                   <w:sz w:val="18"/>
@@ -13304,7 +13356,7 @@
               </w:rPr>
               <w:t xml:space="preserve"> Ngoại lệ hoàn do lỗi trung tâm (Center Fault) chỉ dành cho vấn đề khác khiến trung tâm không thể cung cấp dịch vụ, do Center Manager phê duyệt và ghi lý do, căn cứ; mức hoàn tính theo phần chưa sử dụng, không hoàn 100%: Membership theo RemainingDays / TotalDays, PT theo số buổi chưa dùng / TotalQuota, quy đổi thành điểm.</w:t>
             </w:r>
-            <w:ins w:id="9226" w:author="Claude" w:date="2026-10-24T22:45:00Z">
+            <w:ins w:id="9230" w:author="Claude" w:date="2026-10-24T22:45:00Z">
               <w:r>
                 <w:rPr>
                   <w:sz w:val="18"/>
@@ -13425,7 +13477,7 @@
               </w:rPr>
               <w:t xml:space="preserve">Refund được tính tách theo InvoiceItem và không vượt số tiền thực trả của InvoiceItem đó. </w:t>
             </w:r>
-            <w:del w:id="9227" w:author="Claude" w:date="2026-10-24T22:45:00Z">
+            <w:del w:id="9231" w:author="Claude" w:date="2026-10-24T22:45:00Z">
               <w:r>
                 <w:rPr>
                   <w:sz w:val="18"/>
@@ -13434,7 +13486,7 @@
                 <w:delText xml:space="preserve">InvoiceItem PT chưa Active hoặc đã Active nhưng chưa consume session nào chỉ được hoàn 50% giá trị thực trả bằng điểm; khi đã consume ít nhất một session, gồm late cancellation hoặc No-show làm trừ quota, không có hoàn chuẩn.</w:delText>
               </w:r>
             </w:del>
-            <w:ins w:id="9228" w:author="Claude" w:date="2026-10-24T22:45:00Z">
+            <w:ins w:id="9232" w:author="Claude" w:date="2026-10-24T22:45:00Z">
               <w:r>
                 <w:rPr>
                   <w:sz w:val="18"/>
@@ -13450,7 +13502,7 @@
               </w:rPr>
               <w:t xml:space="preserve"> Nếu trung tâm không thể cung cấp dịch vụ, Center Manager có thể duyệt ngoại lệ cho phần chưa sử dụng và phải ghi rõ căn cứ. Phần chưa từng thanh toán không được tính như đã trả.</w:t>
             </w:r>
-            <w:ins w:id="9229" w:author="Claude" w:date="2026-10-24T22:45:00Z">
+            <w:ins w:id="9233" w:author="Claude" w:date="2026-10-24T22:45:00Z">
               <w:r>
                 <w:rPr>
                   <w:sz w:val="18"/>
@@ -13571,7 +13623,7 @@
               </w:rPr>
               <w:t xml:space="preserve">InvoiceItem ClassPackage: </w:t>
             </w:r>
-            <w:del w:id="9215" w:author="Claude" w:date="2026-10-24T22:45:00Z">
+            <w:del w:id="9219" w:author="Claude" w:date="2026-10-24T22:45:00Z">
               <w:r>
                 <w:rPr>
                   <w:sz w:val="18"/>
@@ -13580,7 +13632,7 @@
                 <w:delText xml:space="preserve">Member được tự hủy ghi danh trước khi buổi đầu tiên bắt đầu; còn từ 5 ngày trở lên trước buổi đầu hoàn 100% giá trị thực trả bằng điểm, còn dưới 5 ngày hoàn 50%. Từ buổi đầu tiên trở đi không có hoàn chuẩn; Member gửi đơn và Center Manager quyết định tỷ lệ hoàn, ghi lý do và căn cứ (ví dụ chất lượng giảng dạy). Receptionist và Manager có thể hủy thay Member.</w:delText>
               </w:r>
             </w:del>
-            <w:ins w:id="9216" w:author="Claude" w:date="2026-10-24T22:45:00Z">
+            <w:ins w:id="9220" w:author="Claude" w:date="2026-10-24T22:45:00Z">
               <w:r>
                 <w:rPr>
                   <w:sz w:val="18"/>
@@ -13596,7 +13648,7 @@
               </w:rPr>
               <w:t xml:space="preserve"> Nếu lớp bị trung tâm hủy (BR-121 hoặc Manager hủy lớp), mọi ghi danh </w:t>
             </w:r>
-            <w:del w:id="9236" w:author="Claude" w:date="2026-10-24T22:45:00Z">
+            <w:del w:id="9240" w:author="Claude" w:date="2026-10-24T22:45:00Z">
               <w:r>
                 <w:rPr>
                   <w:sz w:val="18"/>
@@ -13605,7 +13657,7 @@
                 <w:delText xml:space="preserve">được hoàn 100% bằng điểm nếu lớp chưa bắt đầu;</w:delText>
               </w:r>
             </w:del>
-            <w:ins w:id="9237" w:author="Claude" w:date="2026-10-24T22:45:00Z">
+            <w:ins w:id="9241" w:author="Claude" w:date="2026-10-24T22:45:00Z">
               <w:r>
                 <w:rPr>
                   <w:sz w:val="18"/>
@@ -13621,7 +13673,7 @@
               </w:rPr>
               <w:t xml:space="preserve"> nếu lớp bị hủy giữa chừng thì hoàn theo tỷ lệ số buổi chưa diễn ra, làm tròn xuống theo điểm.</w:t>
             </w:r>
-            <w:ins w:id="9238" w:author="Claude" w:date="2026-10-24T22:45:00Z">
+            <w:ins w:id="9242" w:author="Claude" w:date="2026-10-24T22:45:00Z">
               <w:r>
                 <w:rPr>
                   <w:sz w:val="18"/>
@@ -13630,7 +13682,7 @@
                 <w:t xml:space="preserve"> Member được chọn nhận điểm ngay hoặc hoàn tiền qua Support Request (BR-154).</w:t>
               </w:r>
             </w:ins>
-            <w:ins w:id="9217" w:author="Claude" w:date="2026-10-24T22:45:00Z">
+            <w:ins w:id="9221" w:author="Claude" w:date="2026-10-24T22:45:00Z">
               <w:r>
                 <w:rPr>
                   <w:sz w:val="18"/>
@@ -13639,7 +13691,7 @@
                 <w:t xml:space="preserve"> Cập nhật 25/10/2026 (quyết định bổ sung của nhóm: Member tự hủy không hoàn, thay mức hoàn 100% và 50% cũ; Payment-Support-Workflow.md, mục 3 và 10).</w:t>
               </w:r>
             </w:ins>
-            <w:ins w:id="9239" w:author="Claude" w:date="2026-10-24T22:45:00Z">
+            <w:ins w:id="9243" w:author="Claude" w:date="2026-10-24T22:45:00Z">
               <w:r>
                 <w:rPr>
                   <w:sz w:val="18"/>
@@ -13985,7 +14037,7 @@
               </w:rPr>
               <w:t xml:space="preserve">Báo cáo doanh thu dùng cash basis theo vnp_PayDate của Payment thành công. CashCollected là tổng VND thu qua VNPay; PointsRedeemed là giá trị VND quy đổi của điểm đã dùng thanh toán, báo riêng và không tính là tiền thu mới; PointsIssued là điểm phát hành do hoàn trả/bồi hoàn; OutstandingPoints là tổng điểm còn lại của mọi ví. </w:t>
             </w:r>
-            <w:del w:id="9017" w:author="Claude" w:date="2026-10-24T22:45:00Z">
+            <w:del w:id="9019" w:author="Claude" w:date="2026-10-24T22:45:00Z">
               <w:r>
                 <w:rPr>
                   <w:sz w:val="18"/>
@@ -13994,7 +14046,7 @@
                 <w:delText xml:space="preserve">Vì không hoàn tiền mặt nên không có khoản Refunded bằng tiền.</w:delText>
               </w:r>
             </w:del>
-            <w:ins w:id="9018" w:author="Claude" w:date="2026-10-24T22:45:00Z">
+            <w:ins w:id="9020" w:author="Claude" w:date="2026-10-24T22:45:00Z">
               <w:r>
                 <w:rPr>
                   <w:sz w:val="18"/>
@@ -14010,7 +14062,7 @@
               </w:rPr>
               <w:t xml:space="preserve"> Báo cáo phân tách theo môn thể thao và theo nguồn (Membership, PT, ClassPackage, CourtRental). Invoice PendingPayment, Expired, Cancelled và giao dịch thất bại không làm thay đổi doanh thu.</w:t>
             </w:r>
-            <w:ins w:id="9019" w:author="Claude" w:date="2026-10-24T22:45:00Z">
+            <w:ins w:id="9021" w:author="Claude" w:date="2026-10-24T22:45:00Z">
               <w:r>
                 <w:rPr>
                   <w:sz w:val="18"/>
@@ -14088,7 +14140,7 @@
       <w:tr>
         <w:trPr>
           <w:cantSplit/>
-          <w:ins w:id="9031" w:author="Claude" w:date="2026-10-24T22:45:00Z"/>
+          <w:ins w:id="9033" w:author="Claude" w:date="2026-10-24T22:45:00Z"/>
         </w:trPr>
         <w:tc>
           <w:tcPr>
@@ -14104,10 +14156,10 @@
           <w:p>
             <w:pPr>
               <w:rPr>
-                <w:ins w:id="9032" w:author="Claude" w:date="2026-10-24T22:45:00Z"/>
-              </w:rPr>
-            </w:pPr>
-            <w:ins w:id="9033" w:author="Claude" w:date="2026-10-24T22:45:00Z">
+                <w:ins w:id="9034" w:author="Claude" w:date="2026-10-24T22:45:00Z"/>
+              </w:rPr>
+            </w:pPr>
+            <w:ins w:id="9035" w:author="Claude" w:date="2026-10-24T22:45:00Z">
               <w:r>
                 <w:rPr>
                   <w:b/>
@@ -14134,10 +14186,10 @@
           <w:p>
             <w:pPr>
               <w:rPr>
-                <w:ins w:id="9034" w:author="Claude" w:date="2026-10-24T22:45:00Z"/>
-              </w:rPr>
-            </w:pPr>
-            <w:ins w:id="9035" w:author="Claude" w:date="2026-10-24T22:45:00Z">
+                <w:ins w:id="9036" w:author="Claude" w:date="2026-10-24T22:45:00Z"/>
+              </w:rPr>
+            </w:pPr>
+            <w:ins w:id="9037" w:author="Claude" w:date="2026-10-24T22:45:00Z">
               <w:r>
                 <w:rPr>
                   <w:sz w:val="18"/>
@@ -14162,10 +14214,10 @@
           <w:p>
             <w:pPr>
               <w:rPr>
-                <w:ins w:id="9036" w:author="Claude" w:date="2026-10-24T22:45:00Z"/>
-              </w:rPr>
-            </w:pPr>
-            <w:ins w:id="9037" w:author="Claude" w:date="2026-10-24T22:45:00Z">
+                <w:ins w:id="9038" w:author="Claude" w:date="2026-10-24T22:45:00Z"/>
+              </w:rPr>
+            </w:pPr>
+            <w:ins w:id="9039" w:author="Claude" w:date="2026-10-24T22:45:00Z">
               <w:r>
                 <w:rPr>
                   <w:sz w:val="18"/>
@@ -14190,10 +14242,10 @@
           <w:p>
             <w:pPr>
               <w:rPr>
-                <w:ins w:id="9038" w:author="Claude" w:date="2026-10-24T22:45:00Z"/>
-              </w:rPr>
-            </w:pPr>
-            <w:ins w:id="9039" w:author="Claude" w:date="2026-10-24T22:45:00Z">
+                <w:ins w:id="9040" w:author="Claude" w:date="2026-10-24T22:45:00Z"/>
+              </w:rPr>
+            </w:pPr>
+            <w:ins w:id="9041" w:author="Claude" w:date="2026-10-24T22:45:00Z">
               <w:r>
                 <w:rPr>
                   <w:sz w:val="18"/>
@@ -14218,10 +14270,10 @@
           <w:p>
             <w:pPr>
               <w:rPr>
-                <w:ins w:id="9040" w:author="Claude" w:date="2026-10-24T22:45:00Z"/>
-              </w:rPr>
-            </w:pPr>
-            <w:ins w:id="9041" w:author="Claude" w:date="2026-10-24T22:45:00Z">
+                <w:ins w:id="9042" w:author="Claude" w:date="2026-10-24T22:45:00Z"/>
+              </w:rPr>
+            </w:pPr>
+            <w:ins w:id="9043" w:author="Claude" w:date="2026-10-24T22:45:00Z">
               <w:r>
                 <w:rPr>
                   <w:sz w:val="18"/>
@@ -14236,7 +14288,7 @@
       <w:tr>
         <w:trPr>
           <w:cantSplit/>
-          <w:ins w:id="9042" w:author="Claude" w:date="2026-10-24T22:45:00Z"/>
+          <w:ins w:id="9044" w:author="Claude" w:date="2026-10-24T22:45:00Z"/>
         </w:trPr>
         <w:tc>
           <w:tcPr>
@@ -14252,10 +14304,10 @@
           <w:p>
             <w:pPr>
               <w:rPr>
-                <w:ins w:id="9043" w:author="Claude" w:date="2026-10-24T22:45:00Z"/>
-              </w:rPr>
-            </w:pPr>
-            <w:ins w:id="9044" w:author="Claude" w:date="2026-10-24T22:45:00Z">
+                <w:ins w:id="9045" w:author="Claude" w:date="2026-10-24T22:45:00Z"/>
+              </w:rPr>
+            </w:pPr>
+            <w:ins w:id="9046" w:author="Claude" w:date="2026-10-24T22:45:00Z">
               <w:r>
                 <w:rPr>
                   <w:b/>
@@ -14282,16 +14334,16 @@
           <w:p>
             <w:pPr>
               <w:rPr>
-                <w:ins w:id="9045" w:author="Claude" w:date="2026-10-24T22:45:00Z"/>
-              </w:rPr>
-            </w:pPr>
-            <w:ins w:id="9046" w:author="Claude" w:date="2026-10-24T22:45:00Z">
+                <w:ins w:id="9047" w:author="Claude" w:date="2026-10-24T22:45:00Z"/>
+              </w:rPr>
+            </w:pPr>
+            <w:ins w:id="9048" w:author="Claude" w:date="2026-10-24T22:45:00Z">
               <w:r>
                 <w:rPr>
                   <w:sz w:val="18"/>
                   <w:szCs w:val="18"/>
                 </w:rPr>
-                <w:t xml:space="preserve">Member tự gửi Support Request từ trang Trợ giúp (kênh ONLINE); Receptionist vẫn ghi nhận hộ tại quầy (trừ danh mục PAYMENT, BR-150). Mỗi request có hạn phản hồi (SLA) 48 giờ: slaDueAtUtc = thời điểm tạo + 48 giờ; quá hạn mà chưa xong thì bị đánh dấu Overdue. Trạng thái giữ OPEN, ASSIGNED, IN_PROGRESS, CLOSED (kết quả DONE hoặc REJECTED khi đóng). Danh mục request giữ nguyên bộ hiện có (GENERAL, MEMBERSHIP, PAYMENT, FACILITY, COURT, COACH, ACCOUNT, OTHER); các danh mục khác PAYMENT không yêu cầu hóa đơn. Cập nhật 24/10/2026 (Payment-Support-Workflow.md, mục 4).</w:t>
+                <w:t xml:space="preserve">Member tự gửi Support Request từ trang Trợ giúp (kênh ONLINE); Receptionist vẫn ghi nhận hộ tại quầy (kênh COUNTER, PHONE hoặc FANPAGE), kể cả danh mục PAYMENT nhưng chỉ để tạo request cho Center Manager xử lý (BR-150). Mỗi request có hạn phản hồi (SLA) 48 giờ: slaDueAtUtc = thời điểm tạo + 48 giờ; quá hạn mà chưa xong thì bị đánh dấu Overdue. Trạng thái giữ OPEN, ASSIGNED, IN_PROGRESS, CLOSED (kết quả DONE hoặc REJECTED khi đóng). Danh mục request giữ nguyên bộ hiện có (GENERAL, MEMBERSHIP, PAYMENT, FACILITY, COURT, COACH, ACCOUNT, OTHER); các danh mục khác PAYMENT không yêu cầu hóa đơn. Cập nhật 24/10/2026 (Payment-Support-Workflow.md, mục 4).</w:t>
               </w:r>
             </w:ins>
           </w:p>
@@ -14310,10 +14362,10 @@
           <w:p>
             <w:pPr>
               <w:rPr>
-                <w:ins w:id="9047" w:author="Claude" w:date="2026-10-24T22:45:00Z"/>
-              </w:rPr>
-            </w:pPr>
-            <w:ins w:id="9048" w:author="Claude" w:date="2026-10-24T22:45:00Z">
+                <w:ins w:id="9049" w:author="Claude" w:date="2026-10-24T22:45:00Z"/>
+              </w:rPr>
+            </w:pPr>
+            <w:ins w:id="9050" w:author="Claude" w:date="2026-10-24T22:45:00Z">
               <w:r>
                 <w:rPr>
                   <w:sz w:val="18"/>
@@ -14338,10 +14390,10 @@
           <w:p>
             <w:pPr>
               <w:rPr>
-                <w:ins w:id="9049" w:author="Claude" w:date="2026-10-24T22:45:00Z"/>
-              </w:rPr>
-            </w:pPr>
-            <w:ins w:id="9050" w:author="Claude" w:date="2026-10-24T22:45:00Z">
+                <w:ins w:id="9051" w:author="Claude" w:date="2026-10-24T22:45:00Z"/>
+              </w:rPr>
+            </w:pPr>
+            <w:ins w:id="9052" w:author="Claude" w:date="2026-10-24T22:45:00Z">
               <w:r>
                 <w:rPr>
                   <w:sz w:val="18"/>
@@ -14366,10 +14418,10 @@
           <w:p>
             <w:pPr>
               <w:rPr>
-                <w:ins w:id="9051" w:author="Claude" w:date="2026-10-24T22:45:00Z"/>
-              </w:rPr>
-            </w:pPr>
-            <w:ins w:id="9052" w:author="Claude" w:date="2026-10-24T22:45:00Z">
+                <w:ins w:id="9053" w:author="Claude" w:date="2026-10-24T22:45:00Z"/>
+              </w:rPr>
+            </w:pPr>
+            <w:ins w:id="9054" w:author="Claude" w:date="2026-10-24T22:45:00Z">
               <w:r>
                 <w:rPr>
                   <w:sz w:val="18"/>
@@ -14384,7 +14436,7 @@
       <w:tr>
         <w:trPr>
           <w:cantSplit/>
-          <w:ins w:id="9053" w:author="Claude" w:date="2026-10-24T22:45:00Z"/>
+          <w:ins w:id="9055" w:author="Claude" w:date="2026-10-24T22:45:00Z"/>
         </w:trPr>
         <w:tc>
           <w:tcPr>
@@ -14400,10 +14452,10 @@
           <w:p>
             <w:pPr>
               <w:rPr>
-                <w:ins w:id="9054" w:author="Claude" w:date="2026-10-24T22:45:00Z"/>
-              </w:rPr>
-            </w:pPr>
-            <w:ins w:id="9055" w:author="Claude" w:date="2026-10-24T22:45:00Z">
+                <w:ins w:id="9056" w:author="Claude" w:date="2026-10-24T22:45:00Z"/>
+              </w:rPr>
+            </w:pPr>
+            <w:ins w:id="9057" w:author="Claude" w:date="2026-10-24T22:45:00Z">
               <w:r>
                 <w:rPr>
                   <w:b/>
@@ -14430,16 +14482,16 @@
           <w:p>
             <w:pPr>
               <w:rPr>
-                <w:ins w:id="9056" w:author="Claude" w:date="2026-10-24T22:45:00Z"/>
-              </w:rPr>
-            </w:pPr>
-            <w:ins w:id="9057" w:author="Claude" w:date="2026-10-24T22:45:00Z">
+                <w:ins w:id="9058" w:author="Claude" w:date="2026-10-24T22:45:00Z"/>
+              </w:rPr>
+            </w:pPr>
+            <w:ins w:id="9059" w:author="Claude" w:date="2026-10-24T22:45:00Z">
               <w:r>
                 <w:rPr>
                   <w:sz w:val="18"/>
                   <w:szCs w:val="18"/>
                 </w:rPr>
-                <w:t xml:space="preserve">Member chỉ được gửi lại ("Remind us") khi request đã quá 48 giờ chưa xong, và hai lần gửi lại cách nhau tối thiểu 48 giờ (canRemindAtUtc). Trước thời điểm đó nút bị khóa kèm thông báo "You can remind us in about N minutes" và backend từ chối (409 support_remind_too_early). Mỗi lần gửi lại được ghi vào lịch sử request và thông báo cho người được gán, hoặc cho nhóm Center Manager và Receptionist nếu chưa gán (request PAYMENT chỉ báo Center Manager). Receptionist có thể hỗ trợ Member gửi lại request, kể cả request PAYMENT, với cùng điều kiện 48 giờ. Cập nhật 24/10/2026 (Payment-Support-Workflow.md, mục 4 và mục 8).</w:t>
+                <w:t xml:space="preserve">Member chỉ được gửi lại ("Remind us") khi request đã quá 48 giờ chưa xong, và hai lần gửi lại cách nhau tối thiểu 48 giờ (canRemindAtUtc). Trước thời điểm đó nút bị khóa kèm thông báo "You can remind us in about N minutes" và backend từ chối (409 support_remind_too_early). Mỗi lần gửi lại được ghi vào lịch sử request và thông báo cho người được gán, hoặc cho nhóm Center Manager và Receptionist nếu chưa gán (request PAYMENT chỉ báo Center Manager). Với request PAYMENT, Receptionist bấm "Remind manager" giúp Member với cùng điều kiện 48 giờ, cùng bộ đếm canRemindAtUtc; hệ thống ghi sự kiện REMINDED_BY_STAFF và chỉ thông báo Center Manager (người được gán, hoặc tất cả Center Manager nếu chưa gán), không thông báo Receptionist khác. Cập nhật 24/10/2026 (Payment-Support-Workflow.md, mục 4 và mục 8).</w:t>
               </w:r>
             </w:ins>
           </w:p>
@@ -14458,10 +14510,10 @@
           <w:p>
             <w:pPr>
               <w:rPr>
-                <w:ins w:id="9058" w:author="Claude" w:date="2026-10-24T22:45:00Z"/>
-              </w:rPr>
-            </w:pPr>
-            <w:ins w:id="9059" w:author="Claude" w:date="2026-10-24T22:45:00Z">
+                <w:ins w:id="9060" w:author="Claude" w:date="2026-10-24T22:45:00Z"/>
+              </w:rPr>
+            </w:pPr>
+            <w:ins w:id="9061" w:author="Claude" w:date="2026-10-24T22:45:00Z">
               <w:r>
                 <w:rPr>
                   <w:sz w:val="18"/>
@@ -14486,10 +14538,10 @@
           <w:p>
             <w:pPr>
               <w:rPr>
-                <w:ins w:id="9060" w:author="Claude" w:date="2026-10-24T22:45:00Z"/>
-              </w:rPr>
-            </w:pPr>
-            <w:ins w:id="9061" w:author="Claude" w:date="2026-10-24T22:45:00Z">
+                <w:ins w:id="9062" w:author="Claude" w:date="2026-10-24T22:45:00Z"/>
+              </w:rPr>
+            </w:pPr>
+            <w:ins w:id="9063" w:author="Claude" w:date="2026-10-24T22:45:00Z">
               <w:r>
                 <w:rPr>
                   <w:sz w:val="18"/>
@@ -14514,10 +14566,10 @@
           <w:p>
             <w:pPr>
               <w:rPr>
-                <w:ins w:id="9062" w:author="Claude" w:date="2026-10-24T22:45:00Z"/>
-              </w:rPr>
-            </w:pPr>
-            <w:ins w:id="9063" w:author="Claude" w:date="2026-10-24T22:45:00Z">
+                <w:ins w:id="9064" w:author="Claude" w:date="2026-10-24T22:45:00Z"/>
+              </w:rPr>
+            </w:pPr>
+            <w:ins w:id="9065" w:author="Claude" w:date="2026-10-24T22:45:00Z">
               <w:r>
                 <w:rPr>
                   <w:sz w:val="18"/>
@@ -14532,7 +14584,7 @@
       <w:tr>
         <w:trPr>
           <w:cantSplit/>
-          <w:ins w:id="9064" w:author="Claude" w:date="2026-10-24T22:45:00Z"/>
+          <w:ins w:id="9066" w:author="Claude" w:date="2026-10-24T22:45:00Z"/>
         </w:trPr>
         <w:tc>
           <w:tcPr>
@@ -14548,10 +14600,10 @@
           <w:p>
             <w:pPr>
               <w:rPr>
-                <w:ins w:id="9065" w:author="Claude" w:date="2026-10-24T22:45:00Z"/>
-              </w:rPr>
-            </w:pPr>
-            <w:ins w:id="9066" w:author="Claude" w:date="2026-10-24T22:45:00Z">
+                <w:ins w:id="9067" w:author="Claude" w:date="2026-10-24T22:45:00Z"/>
+              </w:rPr>
+            </w:pPr>
+            <w:ins w:id="9068" w:author="Claude" w:date="2026-10-24T22:45:00Z">
               <w:r>
                 <w:rPr>
                   <w:b/>
@@ -14578,10 +14630,10 @@
           <w:p>
             <w:pPr>
               <w:rPr>
-                <w:ins w:id="9067" w:author="Claude" w:date="2026-10-24T22:45:00Z"/>
-              </w:rPr>
-            </w:pPr>
-            <w:ins w:id="9068" w:author="Claude" w:date="2026-10-24T22:45:00Z">
+                <w:ins w:id="9069" w:author="Claude" w:date="2026-10-24T22:45:00Z"/>
+              </w:rPr>
+            </w:pPr>
+            <w:ins w:id="9070" w:author="Claude" w:date="2026-10-24T22:45:00Z">
               <w:r>
                 <w:rPr>
                   <w:sz w:val="18"/>
@@ -14606,10 +14658,10 @@
           <w:p>
             <w:pPr>
               <w:rPr>
-                <w:ins w:id="9069" w:author="Claude" w:date="2026-10-24T22:45:00Z"/>
-              </w:rPr>
-            </w:pPr>
-            <w:ins w:id="9070" w:author="Claude" w:date="2026-10-24T22:45:00Z">
+                <w:ins w:id="9071" w:author="Claude" w:date="2026-10-24T22:45:00Z"/>
+              </w:rPr>
+            </w:pPr>
+            <w:ins w:id="9072" w:author="Claude" w:date="2026-10-24T22:45:00Z">
               <w:r>
                 <w:rPr>
                   <w:sz w:val="18"/>
@@ -14634,10 +14686,10 @@
           <w:p>
             <w:pPr>
               <w:rPr>
-                <w:ins w:id="9071" w:author="Claude" w:date="2026-10-24T22:45:00Z"/>
-              </w:rPr>
-            </w:pPr>
-            <w:ins w:id="9072" w:author="Claude" w:date="2026-10-24T22:45:00Z">
+                <w:ins w:id="9073" w:author="Claude" w:date="2026-10-24T22:45:00Z"/>
+              </w:rPr>
+            </w:pPr>
+            <w:ins w:id="9074" w:author="Claude" w:date="2026-10-24T22:45:00Z">
               <w:r>
                 <w:rPr>
                   <w:sz w:val="18"/>
@@ -14662,10 +14714,10 @@
           <w:p>
             <w:pPr>
               <w:rPr>
-                <w:ins w:id="9073" w:author="Claude" w:date="2026-10-24T22:45:00Z"/>
-              </w:rPr>
-            </w:pPr>
-            <w:ins w:id="9074" w:author="Claude" w:date="2026-10-24T22:45:00Z">
+                <w:ins w:id="9075" w:author="Claude" w:date="2026-10-24T22:45:00Z"/>
+              </w:rPr>
+            </w:pPr>
+            <w:ins w:id="9076" w:author="Claude" w:date="2026-10-24T22:45:00Z">
               <w:r>
                 <w:rPr>
                   <w:sz w:val="18"/>
@@ -14680,7 +14732,7 @@
       <w:tr>
         <w:trPr>
           <w:cantSplit/>
-          <w:ins w:id="9075" w:author="Claude" w:date="2026-10-24T22:45:00Z"/>
+          <w:ins w:id="9077" w:author="Claude" w:date="2026-10-24T22:45:00Z"/>
         </w:trPr>
         <w:tc>
           <w:tcPr>
@@ -14696,10 +14748,10 @@
           <w:p>
             <w:pPr>
               <w:rPr>
-                <w:ins w:id="9076" w:author="Claude" w:date="2026-10-24T22:45:00Z"/>
-              </w:rPr>
-            </w:pPr>
-            <w:ins w:id="9077" w:author="Claude" w:date="2026-10-24T22:45:00Z">
+                <w:ins w:id="9078" w:author="Claude" w:date="2026-10-24T22:45:00Z"/>
+              </w:rPr>
+            </w:pPr>
+            <w:ins w:id="9079" w:author="Claude" w:date="2026-10-24T22:45:00Z">
               <w:r>
                 <w:rPr>
                   <w:b/>
@@ -14726,16 +14778,16 @@
           <w:p>
             <w:pPr>
               <w:rPr>
-                <w:ins w:id="9078" w:author="Claude" w:date="2026-10-24T22:45:00Z"/>
-              </w:rPr>
-            </w:pPr>
-            <w:ins w:id="9079" w:author="Claude" w:date="2026-10-24T22:45:00Z">
+                <w:ins w:id="9080" w:author="Claude" w:date="2026-10-24T22:45:00Z"/>
+              </w:rPr>
+            </w:pPr>
+            <w:ins w:id="9081" w:author="Claude" w:date="2026-10-24T22:45:00Z">
               <w:r>
                 <w:rPr>
                   <w:sz w:val="18"/>
                   <w:szCs w:val="18"/>
                 </w:rPr>
-                <w:t xml:space="preserve">Chỉ khi Member chọn danh mục PAYMENT thì form hiện và bắt buộc đủ các mục sau, thiếu mục nào cũng không gửi được: chọn một hóa đơn đã thanh toán bằng VNPay của chính mình; đính kèm từ 1 đến 3 ảnh minh chứng (JPG, PNG hoặc WebP, tối đa 5 MB mỗi ảnh). Form không yêu cầu nhập số tài khoản, tên ngân hàng hay tên chủ tài khoản. Thiếu hóa đơn hoặc ảnh (hoặc quá 3 ảnh) bị từ chối 400 (payment_request_invoice_required, payment_request_proof_required). Mỗi hóa đơn chỉ có một request PAYMENT đang mở (409 payment_request_already_open). Request vào hàng đợi OPEN với hạn phản hồi 48 giờ theo BR-147. Request PAYMENT không do Receptionist giải quyết: Receptionist chỉ xem được request và hỗ trợ Member gửi lại ("Remind us", BR-148); không tiếp nhận, chuyển, ghi chú hay ghi nhận chuyển khoản. Cập nhật 24/10/2026 (Payment-Support-Workflow.md, mục 5.1 và 5.2).</w:t>
+                <w:t xml:space="preserve">Chỉ khi Member chọn danh mục PAYMENT thì form hiện và bắt buộc đủ các mục sau, thiếu mục nào cũng không gửi được: chọn một hóa đơn đã thanh toán bằng VNPay của chính mình; đính kèm từ 1 đến 3 ảnh minh chứng (JPG, PNG hoặc WebP, tối đa 5 MB mỗi ảnh). Form không yêu cầu nhập số tài khoản, tên ngân hàng hay tên chủ tài khoản. Thiếu hóa đơn hoặc ảnh (hoặc quá 3 ảnh) bị từ chối 400 (payment_request_invoice_required, payment_request_proof_required). Mỗi hóa đơn chỉ có một request PAYMENT đang mở (409 payment_request_already_open). Request vào hàng đợi OPEN với hạn phản hồi 48 giờ theo BR-147. Request PAYMENT không do Receptionist giải quyết: Receptionist xem được request ở chế độ chỉ xem (nhãn "Handled by Manager"), bấm "Remind manager" giúp Member (BR-148) và tạo request PAYMENT hộ Member ở quầy; khi tạo hộ vẫn bắt buộc chọn hóa đơn đã thanh toán bằng VNPay của đúng Member đó, ảnh minh chứng không bắt buộc (Receptionist ghi vào mô tả), request luôn vào OPEN và chỉ được bàn giao cho Center Manager. Receptionist không nhận, gán cho vai trò khác, chuyển, cập nhật tiến độ, đóng, từ chối hay ghi nhận chuyển khoản (403 payment_request_manager_only). Cập nhật 24/10/2026 (Payment-Support-Workflow.md, mục 5.1 và 5.2). Cập nhật 25/10/2026 (quyết định bổ sung của nhóm 25/10/2026: bỏ nhập số tài khoản; Receptionist chỉ xem, tạo hộ và Remind; mục 5.1, 5.2 đã cập nhật).</w:t>
               </w:r>
             </w:ins>
           </w:p>
@@ -14754,10 +14806,10 @@
           <w:p>
             <w:pPr>
               <w:rPr>
-                <w:ins w:id="9080" w:author="Claude" w:date="2026-10-24T22:45:00Z"/>
-              </w:rPr>
-            </w:pPr>
-            <w:ins w:id="9081" w:author="Claude" w:date="2026-10-24T22:45:00Z">
+                <w:ins w:id="9082" w:author="Claude" w:date="2026-10-24T22:45:00Z"/>
+              </w:rPr>
+            </w:pPr>
+            <w:ins w:id="9083" w:author="Claude" w:date="2026-10-24T22:45:00Z">
               <w:r>
                 <w:rPr>
                   <w:sz w:val="18"/>
@@ -14782,10 +14834,10 @@
           <w:p>
             <w:pPr>
               <w:rPr>
-                <w:ins w:id="9082" w:author="Claude" w:date="2026-10-24T22:45:00Z"/>
-              </w:rPr>
-            </w:pPr>
-            <w:ins w:id="9083" w:author="Claude" w:date="2026-10-24T22:45:00Z">
+                <w:ins w:id="9084" w:author="Claude" w:date="2026-10-24T22:45:00Z"/>
+              </w:rPr>
+            </w:pPr>
+            <w:ins w:id="9085" w:author="Claude" w:date="2026-10-24T22:45:00Z">
               <w:r>
                 <w:rPr>
                   <w:sz w:val="18"/>
@@ -14810,10 +14862,10 @@
           <w:p>
             <w:pPr>
               <w:rPr>
-                <w:ins w:id="9084" w:author="Claude" w:date="2026-10-24T22:45:00Z"/>
-              </w:rPr>
-            </w:pPr>
-            <w:ins w:id="9085" w:author="Claude" w:date="2026-10-24T22:45:00Z">
+                <w:ins w:id="9086" w:author="Claude" w:date="2026-10-24T22:45:00Z"/>
+              </w:rPr>
+            </w:pPr>
+            <w:ins w:id="9087" w:author="Claude" w:date="2026-10-24T22:45:00Z">
               <w:r>
                 <w:rPr>
                   <w:sz w:val="18"/>
@@ -14828,7 +14880,7 @@
       <w:tr>
         <w:trPr>
           <w:cantSplit/>
-          <w:ins w:id="9086" w:author="Claude" w:date="2026-10-24T22:45:00Z"/>
+          <w:ins w:id="9088" w:author="Claude" w:date="2026-10-24T22:45:00Z"/>
         </w:trPr>
         <w:tc>
           <w:tcPr>
@@ -14844,10 +14896,10 @@
           <w:p>
             <w:pPr>
               <w:rPr>
-                <w:ins w:id="9087" w:author="Claude" w:date="2026-10-24T22:45:00Z"/>
-              </w:rPr>
-            </w:pPr>
-            <w:ins w:id="9088" w:author="Claude" w:date="2026-10-24T22:45:00Z">
+                <w:ins w:id="9089" w:author="Claude" w:date="2026-10-24T22:45:00Z"/>
+              </w:rPr>
+            </w:pPr>
+            <w:ins w:id="9090" w:author="Claude" w:date="2026-10-24T22:45:00Z">
               <w:r>
                 <w:rPr>
                   <w:b/>
@@ -14874,16 +14926,16 @@
           <w:p>
             <w:pPr>
               <w:rPr>
-                <w:ins w:id="9089" w:author="Claude" w:date="2026-10-24T22:45:00Z"/>
-              </w:rPr>
-            </w:pPr>
-            <w:ins w:id="9090" w:author="Claude" w:date="2026-10-24T22:45:00Z">
+                <w:ins w:id="9091" w:author="Claude" w:date="2026-10-24T22:45:00Z"/>
+              </w:rPr>
+            </w:pPr>
+            <w:ins w:id="9092" w:author="Claude" w:date="2026-10-24T22:45:00Z">
               <w:r>
                 <w:rPr>
                   <w:sz w:val="18"/>
                   <w:szCs w:val="18"/>
                 </w:rPr>
-                <w:t xml:space="preserve">Chỉ Center Manager được ghi nhận chuyển khoản cho request PAYMENT (Receptionist bị từ chối, 403). Khi cần thông tin nhận tiền, Center Manager gọi điện trực tiếp cho Member để trao đổi (hệ thống không thu thập số tài khoản) và ghi chú lại nội dung trao đổi trong request. Center Manager chuyển khoản ngoài hệ thống, rồi chọn "Record payout" và nhập số tiền đã chuyển, đính kèm từ 1 đến 3 ảnh chứng từ chuyển khoản (thiếu ảnh bị từ chối, 400 payout_proof_required) và ghi chú lại việc đã xử lý. Số tiền phải lớn hơn 0 và không vượt phần tiền VNPay đã thu của hóa đơn trừ tổng số đã ghi chuyển khoản cho hóa đơn đó (409 payout_amount_exceeds_paid). Mỗi request chỉ ghi nhận một lần (409 payout_already_recorded); sau khi ghi, request chuyển CLOSED với kết quả DONE. Center Manager cũng có thể Reject request kèm lý do. Sau khi ghi, hệ thống ghi Audit Log SUPPORT_PAYOUT_RECORDED, gửi thông báo trong ứng dụng và email cho Member (email chỉ chứa liên kết vào chi tiết request, cần đăng nhập, không đính kèm ảnh), và đưa số tiền vào báo cáo doanh thu và dashboard của Center Manager dưới dòng riêng "đã hoàn chuyển khoản" (BR-95). Cập nhật 24/10/2026 (Payment-Support-Workflow.md, mục 5.2 và 5.3).</w:t>
+                <w:t xml:space="preserve">Chỉ Center Manager được ghi nhận chuyển khoản cho request PAYMENT (Receptionist bị từ chối, 403). Khi cần thông tin nhận tiền, Center Manager gọi điện trực tiếp cho Member để trao đổi (hệ thống không thu thập số tài khoản) và ghi chú lại nội dung trao đổi trong request. Center Manager chuyển khoản ngoài hệ thống, rồi chọn "Record payout" và nhập số tiền đã chuyển, đính kèm từ 1 đến 3 ảnh chứng từ chuyển khoản (thiếu ảnh bị từ chối, 400 payout_proof_required) và nhập ghi chú bắt buộc tóm tắt cuộc gọi và cách đã hoàn (không ghi số tài khoản đầy đủ; thiếu ghi chú bị từ chối, 400 payout_note_required). Số tiền phải lớn hơn 0 và không vượt phần tiền VNPay đã thu của hóa đơn trừ tổng số đã ghi chuyển khoản cho hóa đơn đó (409 payout_amount_exceeds_paid). Mỗi request chỉ ghi nhận một lần (409 payout_already_recorded); sau khi ghi, request chuyển CLOSED với kết quả DONE. Center Manager cũng có thể Reject request kèm lý do. Sau khi ghi, hệ thống ghi Audit Log SUPPORT_PAYOUT_RECORDED, gửi thông báo trong ứng dụng và email cho Member (email chỉ chứa liên kết vào chi tiết request, cần đăng nhập, không đính kèm ảnh), và đưa số tiền vào báo cáo doanh thu và dashboard của Center Manager dưới dòng riêng "đã hoàn chuyển khoản" (BR-95). Cập nhật 24/10/2026 (Payment-Support-Workflow.md, mục 5.3 và 5.4).</w:t>
               </w:r>
             </w:ins>
           </w:p>
@@ -14902,10 +14954,10 @@
           <w:p>
             <w:pPr>
               <w:rPr>
-                <w:ins w:id="9091" w:author="Claude" w:date="2026-10-24T22:45:00Z"/>
-              </w:rPr>
-            </w:pPr>
-            <w:ins w:id="9092" w:author="Claude" w:date="2026-10-24T22:45:00Z">
+                <w:ins w:id="9093" w:author="Claude" w:date="2026-10-24T22:45:00Z"/>
+              </w:rPr>
+            </w:pPr>
+            <w:ins w:id="9094" w:author="Claude" w:date="2026-10-24T22:45:00Z">
               <w:r>
                 <w:rPr>
                   <w:sz w:val="18"/>
@@ -14930,10 +14982,10 @@
           <w:p>
             <w:pPr>
               <w:rPr>
-                <w:ins w:id="9093" w:author="Claude" w:date="2026-10-24T22:45:00Z"/>
-              </w:rPr>
-            </w:pPr>
-            <w:ins w:id="9094" w:author="Claude" w:date="2026-10-24T22:45:00Z">
+                <w:ins w:id="9095" w:author="Claude" w:date="2026-10-24T22:45:00Z"/>
+              </w:rPr>
+            </w:pPr>
+            <w:ins w:id="9096" w:author="Claude" w:date="2026-10-24T22:45:00Z">
               <w:r>
                 <w:rPr>
                   <w:sz w:val="18"/>
@@ -14958,10 +15010,10 @@
           <w:p>
             <w:pPr>
               <w:rPr>
-                <w:ins w:id="9095" w:author="Claude" w:date="2026-10-24T22:45:00Z"/>
-              </w:rPr>
-            </w:pPr>
-            <w:ins w:id="9096" w:author="Claude" w:date="2026-10-24T22:45:00Z">
+                <w:ins w:id="9097" w:author="Claude" w:date="2026-10-24T22:45:00Z"/>
+              </w:rPr>
+            </w:pPr>
+            <w:ins w:id="9098" w:author="Claude" w:date="2026-10-24T22:45:00Z">
               <w:r>
                 <w:rPr>
                   <w:sz w:val="18"/>
@@ -14976,7 +15028,7 @@
       <w:tr>
         <w:trPr>
           <w:cantSplit/>
-          <w:ins w:id="9097" w:author="Claude" w:date="2026-10-24T22:45:00Z"/>
+          <w:ins w:id="9099" w:author="Claude" w:date="2026-10-24T22:45:00Z"/>
         </w:trPr>
         <w:tc>
           <w:tcPr>
@@ -14992,10 +15044,10 @@
           <w:p>
             <w:pPr>
               <w:rPr>
-                <w:ins w:id="9098" w:author="Claude" w:date="2026-10-24T22:45:00Z"/>
-              </w:rPr>
-            </w:pPr>
-            <w:ins w:id="9099" w:author="Claude" w:date="2026-10-24T22:45:00Z">
+                <w:ins w:id="9100" w:author="Claude" w:date="2026-10-24T22:45:00Z"/>
+              </w:rPr>
+            </w:pPr>
+            <w:ins w:id="9101" w:author="Claude" w:date="2026-10-24T22:45:00Z">
               <w:r>
                 <w:rPr>
                   <w:b/>
@@ -15022,16 +15074,16 @@
           <w:p>
             <w:pPr>
               <w:rPr>
-                <w:ins w:id="9100" w:author="Claude" w:date="2026-10-24T22:45:00Z"/>
-              </w:rPr>
-            </w:pPr>
-            <w:ins w:id="9101" w:author="Claude" w:date="2026-10-24T22:45:00Z">
+                <w:ins w:id="9102" w:author="Claude" w:date="2026-10-24T22:45:00Z"/>
+              </w:rPr>
+            </w:pPr>
+            <w:ins w:id="9103" w:author="Claude" w:date="2026-10-24T22:45:00Z">
               <w:r>
                 <w:rPr>
                   <w:sz w:val="18"/>
                   <w:szCs w:val="18"/>
                 </w:rPr>
-                <w:t xml:space="preserve">Member xem trong chi tiết request số tiền, thời điểm chuyển và ảnh chứng từ do Center Manager đính kèm (chỉ chủ request và Center Manager xem được ảnh chứng từ); bấm "I received it" để xác nhận đã nhận hoặc "Not received" để mở lại request cho Center Manager (request về OPEN, ghi lịch sử, thông báo Center Manager). Nếu Member không bấm gì sau 3 ngày kể từ khi nhận thông báo thì hệ thống tự coi là đã nhận (MEMBER_CONFIRMED_RECEIVED, by = SYSTEM). Bước xác nhận của Member được giữ (đã chốt 24/10/2026). Cập nhật 24/10/2026 (Payment-Support-Workflow.md, mục 5.4 và mục 10).</w:t>
+                <w:t xml:space="preserve">Member xem trong chi tiết request số tiền, thời điểm chuyển và ảnh chứng từ do Center Manager đính kèm (chỉ chủ request và Center Manager xem được ảnh chứng từ); bấm "I received it" để xác nhận đã nhận hoặc "Not received" để mở lại request cho Center Manager (request về OPEN, ghi lịch sử, thông báo Center Manager). Nếu Member không bấm gì sau 3 ngày kể từ khi nhận thông báo thì hệ thống tự coi là đã nhận (MEMBER_CONFIRMED_RECEIVED, by = SYSTEM). Bước xác nhận của Member được giữ (đã chốt 24/10/2026). Cập nhật 24/10/2026 (Payment-Support-Workflow.md, mục 5.5 và mục 10).</w:t>
               </w:r>
             </w:ins>
           </w:p>
@@ -15050,10 +15102,10 @@
           <w:p>
             <w:pPr>
               <w:rPr>
-                <w:ins w:id="9102" w:author="Claude" w:date="2026-10-24T22:45:00Z"/>
-              </w:rPr>
-            </w:pPr>
-            <w:ins w:id="9103" w:author="Claude" w:date="2026-10-24T22:45:00Z">
+                <w:ins w:id="9104" w:author="Claude" w:date="2026-10-24T22:45:00Z"/>
+              </w:rPr>
+            </w:pPr>
+            <w:ins w:id="9105" w:author="Claude" w:date="2026-10-24T22:45:00Z">
               <w:r>
                 <w:rPr>
                   <w:sz w:val="18"/>
@@ -15078,10 +15130,10 @@
           <w:p>
             <w:pPr>
               <w:rPr>
-                <w:ins w:id="9104" w:author="Claude" w:date="2026-10-24T22:45:00Z"/>
-              </w:rPr>
-            </w:pPr>
-            <w:ins w:id="9105" w:author="Claude" w:date="2026-10-24T22:45:00Z">
+                <w:ins w:id="9106" w:author="Claude" w:date="2026-10-24T22:45:00Z"/>
+              </w:rPr>
+            </w:pPr>
+            <w:ins w:id="9107" w:author="Claude" w:date="2026-10-24T22:45:00Z">
               <w:r>
                 <w:rPr>
                   <w:sz w:val="18"/>
@@ -15106,10 +15158,10 @@
           <w:p>
             <w:pPr>
               <w:rPr>
-                <w:ins w:id="9106" w:author="Claude" w:date="2026-10-24T22:45:00Z"/>
-              </w:rPr>
-            </w:pPr>
-            <w:ins w:id="9107" w:author="Claude" w:date="2026-10-24T22:45:00Z">
+                <w:ins w:id="9108" w:author="Claude" w:date="2026-10-24T22:45:00Z"/>
+              </w:rPr>
+            </w:pPr>
+            <w:ins w:id="9109" w:author="Claude" w:date="2026-10-24T22:45:00Z">
               <w:r>
                 <w:rPr>
                   <w:sz w:val="18"/>
@@ -15124,7 +15176,7 @@
       <w:tr>
         <w:trPr>
           <w:cantSplit/>
-          <w:ins w:id="9108" w:author="Claude" w:date="2026-10-24T22:45:00Z"/>
+          <w:ins w:id="9110" w:author="Claude" w:date="2026-10-24T22:45:00Z"/>
         </w:trPr>
         <w:tc>
           <w:tcPr>
@@ -15140,10 +15192,10 @@
           <w:p>
             <w:pPr>
               <w:rPr>
-                <w:ins w:id="9109" w:author="Claude" w:date="2026-10-24T22:45:00Z"/>
-              </w:rPr>
-            </w:pPr>
-            <w:ins w:id="9110" w:author="Claude" w:date="2026-10-24T22:45:00Z">
+                <w:ins w:id="9111" w:author="Claude" w:date="2026-10-24T22:45:00Z"/>
+              </w:rPr>
+            </w:pPr>
+            <w:ins w:id="9112" w:author="Claude" w:date="2026-10-24T22:45:00Z">
               <w:r>
                 <w:rPr>
                   <w:b/>
@@ -15170,16 +15222,16 @@
           <w:p>
             <w:pPr>
               <w:rPr>
-                <w:ins w:id="9111" w:author="Claude" w:date="2026-10-24T22:45:00Z"/>
-              </w:rPr>
-            </w:pPr>
-            <w:ins w:id="9112" w:author="Claude" w:date="2026-10-24T22:45:00Z">
+                <w:ins w:id="9113" w:author="Claude" w:date="2026-10-24T22:45:00Z"/>
+              </w:rPr>
+            </w:pPr>
+            <w:ins w:id="9114" w:author="Claude" w:date="2026-10-24T22:45:00Z">
               <w:r>
                 <w:rPr>
                   <w:sz w:val="18"/>
                   <w:szCs w:val="18"/>
                 </w:rPr>
-                <w:t xml:space="preserve">Request PAYMENT không thu thập và không lưu số tài khoản, tên ngân hàng hay tên chủ tài khoản; thông tin nhận tiền do Center Manager trao đổi trực tiếp với Member qua điện thoại và không được lưu dạng có cấu trúc hay ghi vào log ứng dụng. Giữ toàn bộ ảnh (ảnh Member gửi và ảnh chứng từ của Manager), số tiền, thời điểm và người ghi. Ảnh Member gửi chỉ chủ request, Receptionist và Center Manager xem được; ảnh chứng từ chỉ chủ request và Center Manager xem được. Cập nhật 24/10/2026 (Payment-Support-Workflow.md, mục 5.5).</w:t>
+                <w:t xml:space="preserve">Request PAYMENT không thu thập và không lưu số tài khoản, tên ngân hàng hay tên chủ tài khoản; thông tin nhận tiền do Center Manager trao đổi trực tiếp với Member qua điện thoại và không được lưu dạng có cấu trúc hay ghi vào log ứng dụng. Giữ toàn bộ ảnh (ảnh Member gửi và ảnh chứng từ của Manager), số tiền, thời điểm và người ghi. Ảnh Member gửi chỉ chủ request, Receptionist và Center Manager xem được; ảnh chứng từ payout chỉ chủ request và Center Manager xem được (Receptionist không xem được, 404); Receptionist vẫn xem được số tiền và thời điểm payout. Cập nhật 24/10/2026 (Payment-Support-Workflow.md, mục 5.6).</w:t>
               </w:r>
             </w:ins>
           </w:p>
@@ -15198,10 +15250,10 @@
           <w:p>
             <w:pPr>
               <w:rPr>
-                <w:ins w:id="9113" w:author="Claude" w:date="2026-10-24T22:45:00Z"/>
-              </w:rPr>
-            </w:pPr>
-            <w:ins w:id="9114" w:author="Claude" w:date="2026-10-24T22:45:00Z">
+                <w:ins w:id="9115" w:author="Claude" w:date="2026-10-24T22:45:00Z"/>
+              </w:rPr>
+            </w:pPr>
+            <w:ins w:id="9116" w:author="Claude" w:date="2026-10-24T22:45:00Z">
               <w:r>
                 <w:rPr>
                   <w:sz w:val="18"/>
@@ -15226,10 +15278,10 @@
           <w:p>
             <w:pPr>
               <w:rPr>
-                <w:ins w:id="9115" w:author="Claude" w:date="2026-10-24T22:45:00Z"/>
-              </w:rPr>
-            </w:pPr>
-            <w:ins w:id="9116" w:author="Claude" w:date="2026-10-24T22:45:00Z">
+                <w:ins w:id="9117" w:author="Claude" w:date="2026-10-24T22:45:00Z"/>
+              </w:rPr>
+            </w:pPr>
+            <w:ins w:id="9118" w:author="Claude" w:date="2026-10-24T22:45:00Z">
               <w:r>
                 <w:rPr>
                   <w:sz w:val="18"/>
@@ -15254,16 +15306,16 @@
           <w:p>
             <w:pPr>
               <w:rPr>
-                <w:ins w:id="9117" w:author="Claude" w:date="2026-10-24T22:45:00Z"/>
-              </w:rPr>
-            </w:pPr>
-            <w:ins w:id="9118" w:author="Claude" w:date="2026-10-24T22:45:00Z">
+                <w:ins w:id="9119" w:author="Claude" w:date="2026-10-24T22:45:00Z"/>
+              </w:rPr>
+            </w:pPr>
+            <w:ins w:id="9120" w:author="Claude" w:date="2026-10-24T22:45:00Z">
               <w:r>
                 <w:rPr>
                   <w:sz w:val="18"/>
                   <w:szCs w:val="18"/>
                 </w:rPr>
-                <w:t xml:space="preserve">Quyết định nhóm 25/10/2026 — bỏ nhập số tài khoản; thay quy định mã hóa và xóa sau 90 ngày ở Payment-Support-Workflow.md, mục 5.5</w:t>
+                <w:t xml:space="preserve">Quyết định nhóm 25/10/2026 — bỏ nhập số tài khoản; thay quy định mã hóa và xóa sau 90 ngày ở Payment-Support-Workflow.md, mục 5.6</w:t>
               </w:r>
             </w:ins>
           </w:p>
@@ -15272,7 +15324,7 @@
       <w:tr>
         <w:trPr>
           <w:cantSplit/>
-          <w:ins w:id="9249" w:author="Claude" w:date="2026-10-24T22:45:00Z"/>
+          <w:ins w:id="9253" w:author="Claude" w:date="2026-10-24T22:45:00Z"/>
         </w:trPr>
         <w:tc>
           <w:tcPr>
@@ -15288,10 +15340,10 @@
           <w:p>
             <w:pPr>
               <w:rPr>
-                <w:ins w:id="9250" w:author="Claude" w:date="2026-10-24T22:45:00Z"/>
-              </w:rPr>
-            </w:pPr>
-            <w:ins w:id="9251" w:author="Claude" w:date="2026-10-24T22:45:00Z">
+                <w:ins w:id="9254" w:author="Claude" w:date="2026-10-24T22:45:00Z"/>
+              </w:rPr>
+            </w:pPr>
+            <w:ins w:id="9255" w:author="Claude" w:date="2026-10-24T22:45:00Z">
               <w:r>
                 <w:rPr>
                   <w:b/>
@@ -15318,10 +15370,10 @@
           <w:p>
             <w:pPr>
               <w:rPr>
-                <w:ins w:id="9252" w:author="Claude" w:date="2026-10-24T22:45:00Z"/>
-              </w:rPr>
-            </w:pPr>
-            <w:ins w:id="9253" w:author="Claude" w:date="2026-10-24T22:45:00Z">
+                <w:ins w:id="9256" w:author="Claude" w:date="2026-10-24T22:45:00Z"/>
+              </w:rPr>
+            </w:pPr>
+            <w:ins w:id="9257" w:author="Claude" w:date="2026-10-24T22:45:00Z">
               <w:r>
                 <w:rPr>
                   <w:sz w:val="18"/>
@@ -15346,10 +15398,10 @@
           <w:p>
             <w:pPr>
               <w:rPr>
-                <w:ins w:id="9254" w:author="Claude" w:date="2026-10-24T22:45:00Z"/>
-              </w:rPr>
-            </w:pPr>
-            <w:ins w:id="9255" w:author="Claude" w:date="2026-10-24T22:45:00Z">
+                <w:ins w:id="9258" w:author="Claude" w:date="2026-10-24T22:45:00Z"/>
+              </w:rPr>
+            </w:pPr>
+            <w:ins w:id="9259" w:author="Claude" w:date="2026-10-24T22:45:00Z">
               <w:r>
                 <w:rPr>
                   <w:sz w:val="18"/>
@@ -15374,10 +15426,10 @@
           <w:p>
             <w:pPr>
               <w:rPr>
-                <w:ins w:id="9256" w:author="Claude" w:date="2026-10-24T22:45:00Z"/>
-              </w:rPr>
-            </w:pPr>
-            <w:ins w:id="9257" w:author="Claude" w:date="2026-10-24T22:45:00Z">
+                <w:ins w:id="9260" w:author="Claude" w:date="2026-10-24T22:45:00Z"/>
+              </w:rPr>
+            </w:pPr>
+            <w:ins w:id="9261" w:author="Claude" w:date="2026-10-24T22:45:00Z">
               <w:r>
                 <w:rPr>
                   <w:sz w:val="18"/>
@@ -15402,10 +15454,10 @@
           <w:p>
             <w:pPr>
               <w:rPr>
-                <w:ins w:id="9258" w:author="Claude" w:date="2026-10-24T22:45:00Z"/>
-              </w:rPr>
-            </w:pPr>
-            <w:ins w:id="9259" w:author="Claude" w:date="2026-10-24T22:45:00Z">
+                <w:ins w:id="9262" w:author="Claude" w:date="2026-10-24T22:45:00Z"/>
+              </w:rPr>
+            </w:pPr>
+            <w:ins w:id="9263" w:author="Claude" w:date="2026-10-24T22:45:00Z">
               <w:r>
                 <w:rPr>
                   <w:sz w:val="18"/>
@@ -15420,7 +15472,7 @@
       <w:tr>
         <w:trPr>
           <w:cantSplit/>
-          <w:ins w:id="9314" w:author="Claude" w:date="2026-10-24T22:45:00Z"/>
+          <w:ins w:id="9341" w:author="Claude" w:date="2026-10-24T22:45:00Z"/>
         </w:trPr>
         <w:tc>
           <w:tcPr>
@@ -15436,10 +15488,10 @@
           <w:p>
             <w:pPr>
               <w:rPr>
-                <w:ins w:id="9315" w:author="Claude" w:date="2026-10-24T22:45:00Z"/>
-              </w:rPr>
-            </w:pPr>
-            <w:ins w:id="9316" w:author="Claude" w:date="2026-10-24T22:45:00Z">
+                <w:ins w:id="9342" w:author="Claude" w:date="2026-10-24T22:45:00Z"/>
+              </w:rPr>
+            </w:pPr>
+            <w:ins w:id="9343" w:author="Claude" w:date="2026-10-24T22:45:00Z">
               <w:r>
                 <w:rPr>
                   <w:b/>
@@ -15466,16 +15518,16 @@
           <w:p>
             <w:pPr>
               <w:rPr>
-                <w:ins w:id="9317" w:author="Claude" w:date="2026-10-24T22:45:00Z"/>
-              </w:rPr>
-            </w:pPr>
-            <w:ins w:id="9318" w:author="Claude" w:date="2026-10-24T22:45:00Z">
+                <w:ins w:id="9344" w:author="Claude" w:date="2026-10-24T22:45:00Z"/>
+              </w:rPr>
+            </w:pPr>
+            <w:ins w:id="9345" w:author="Claude" w:date="2026-10-24T22:45:00Z">
               <w:r>
                 <w:rPr>
                   <w:sz w:val="18"/>
                   <w:szCs w:val="18"/>
                 </w:rPr>
-                <w:t xml:space="preserve">Khi Gym đóng cửa tạm thời vì sự cố (BR-130), trung tâm không gia hạn Membership mà tặng điểm cho Member bị ảnh hưởng. Center Manager nhập số điểm tặng cho từng lần tặng (số nguyên dương, không có mức cố định), chọn người hoặc nhóm nhận bằng bộ lọc (từng Member, hoặc nhóm như Member có Membership Gym đang Active vào ngày sự cố) và gửi tặng; chỉ Center Manager được tặng, Receptionist không (BR-139). Hệ thống cộng điểm vào ví của từng người nhận, ghi PointLedger loại Adjustment kèm lý do, người thực hiện và Audit Log (gồm danh sách người nhận và số điểm), rồi thông báo cho người nhận qua email và trong ứng dụng (BR-138). Điểm tặng tuân theo BR-134 (1 điểm = 1.000 VND, không hết hạn). Cập nhật 25/10/2026 (quyết định bổ sung của nhóm; thay gia hạn Membership ở BR-130 cũ).</w:t>
+                <w:t xml:space="preserve">Khi Gym đóng cửa tạm thời vì sự cố (BR-130), trung tâm không gia hạn Membership mà tặng điểm cho Member bị ảnh hưởng. Center Manager nhập số điểm tặng cho từng lần tặng (số nguyên dương, không có mức cố định), chọn người hoặc nhóm nhận bằng bộ lọc (từng Member, hoặc nhóm như Member có Membership Gym đang Active vào ngày sự cố) và gửi tặng; việc tặng điểm tuân theo BR-156. Hệ thống cộng điểm vào ví của từng người nhận, ghi PointLedger loại Adjustment kèm lý do, người thực hiện và Audit Log (gồm danh sách người nhận và số điểm), rồi thông báo cho người nhận qua email và trong ứng dụng (BR-138). Điểm tặng tuân theo BR-134 (1 điểm = 1.000 VND, không hết hạn). Cập nhật 25/10/2026 (quyết định bổ sung của nhóm; thay gia hạn Membership ở BR-130 cũ).</w:t>
               </w:r>
             </w:ins>
           </w:p>
@@ -15494,10 +15546,10 @@
           <w:p>
             <w:pPr>
               <w:rPr>
-                <w:ins w:id="9319" w:author="Claude" w:date="2026-10-24T22:45:00Z"/>
-              </w:rPr>
-            </w:pPr>
-            <w:ins w:id="9320" w:author="Claude" w:date="2026-10-24T22:45:00Z">
+                <w:ins w:id="9346" w:author="Claude" w:date="2026-10-24T22:45:00Z"/>
+              </w:rPr>
+            </w:pPr>
+            <w:ins w:id="9347" w:author="Claude" w:date="2026-10-24T22:45:00Z">
               <w:r>
                 <w:rPr>
                   <w:sz w:val="18"/>
@@ -15522,10 +15574,10 @@
           <w:p>
             <w:pPr>
               <w:rPr>
-                <w:ins w:id="9321" w:author="Claude" w:date="2026-10-24T22:45:00Z"/>
-              </w:rPr>
-            </w:pPr>
-            <w:ins w:id="9322" w:author="Claude" w:date="2026-10-24T22:45:00Z">
+                <w:ins w:id="9348" w:author="Claude" w:date="2026-10-24T22:45:00Z"/>
+              </w:rPr>
+            </w:pPr>
+            <w:ins w:id="9349" w:author="Claude" w:date="2026-10-24T22:45:00Z">
               <w:r>
                 <w:rPr>
                   <w:sz w:val="18"/>
@@ -15550,16 +15602,312 @@
           <w:p>
             <w:pPr>
               <w:rPr>
-                <w:ins w:id="9323" w:author="Claude" w:date="2026-10-24T22:45:00Z"/>
-              </w:rPr>
-            </w:pPr>
-            <w:ins w:id="9324" w:author="Claude" w:date="2026-10-24T22:45:00Z">
+                <w:ins w:id="9350" w:author="Claude" w:date="2026-10-24T22:45:00Z"/>
+              </w:rPr>
+            </w:pPr>
+            <w:ins w:id="9351" w:author="Claude" w:date="2026-10-24T22:45:00Z">
               <w:r>
                 <w:rPr>
                   <w:sz w:val="18"/>
                   <w:szCs w:val="18"/>
                 </w:rPr>
                 <w:t xml:space="preserve">Quyết định nhóm 25/10/2026 — sự cố Gym tạm thời</w:t>
+              </w:r>
+            </w:ins>
+          </w:p>
+        </w:tc>
+      </w:tr>
+      <w:tr>
+        <w:trPr>
+          <w:cantSplit/>
+          <w:ins w:id="9352" w:author="Claude" w:date="2026-10-24T22:45:00Z"/>
+        </w:trPr>
+        <w:tc>
+          <w:tcPr>
+            <w:tcW w:w="900" w:type="dxa"/>
+            <w:tcMar>
+              <w:top w:w="60" w:type="dxa"/>
+              <w:left w:w="100" w:type="dxa"/>
+              <w:bottom w:w="60" w:type="dxa"/>
+              <w:right w:w="100" w:type="dxa"/>
+            </w:tcMar>
+            <w:vAlign w:val="center"/>
+          </w:tcPr>
+          <w:p>
+            <w:pPr>
+              <w:rPr>
+                <w:ins w:id="9353" w:author="Claude" w:date="2026-10-24T22:45:00Z"/>
+              </w:rPr>
+            </w:pPr>
+            <w:ins w:id="9354" w:author="Claude" w:date="2026-10-24T22:45:00Z">
+              <w:r>
+                <w:rPr>
+                  <w:b/>
+                  <w:bCs/>
+                  <w:sz w:val="18"/>
+                  <w:szCs w:val="18"/>
+                </w:rPr>
+                <w:t xml:space="preserve">BR-156</w:t>
+              </w:r>
+            </w:ins>
+          </w:p>
+        </w:tc>
+        <w:tc>
+          <w:tcPr>
+            <w:tcW w:w="5200" w:type="dxa"/>
+            <w:tcMar>
+              <w:top w:w="60" w:type="dxa"/>
+              <w:left w:w="100" w:type="dxa"/>
+              <w:bottom w:w="60" w:type="dxa"/>
+              <w:right w:w="100" w:type="dxa"/>
+            </w:tcMar>
+            <w:vAlign w:val="center"/>
+          </w:tcPr>
+          <w:p>
+            <w:pPr>
+              <w:rPr>
+                <w:ins w:id="9355" w:author="Claude" w:date="2026-10-24T22:45:00Z"/>
+              </w:rPr>
+            </w:pPr>
+            <w:ins w:id="9356" w:author="Claude" w:date="2026-10-24T22:45:00Z">
+              <w:r>
+                <w:rPr>
+                  <w:sz w:val="18"/>
+                  <w:szCs w:val="18"/>
+                </w:rPr>
+                <w:t xml:space="preserve">Chỉ Center Manager được tặng điểm cho Member (ví dụ bồi thường sự cố, khuyến mãi), theo cách tương tự phát voucher. Màn hình tặng điểm giống màn hình Add points của Member nhưng Center Manager phải nhập thêm lý do và dùng bộ lọc để chọn nhóm hoặc từng Member nhận. Center Manager tự nhập số điểm (số nguyên dương) và điều kiện của đợt tặng, xem lại danh sách người nhận và tổng điểm trước khi gửi. Hệ thống cộng điểm vào ví từng người nhận, ghi PointLedger loại Adjustment kèm lý do và người thực hiện, ghi Audit Log (người thực hiện, danh sách người nhận, số điểm, lý do, bộ lọc đã dùng) và thông báo cho người nhận (BR-138). Receptionist không được tặng, trừ hay điều chỉnh điểm (403). Điểm tặng tuân theo BR-134 (1 điểm = 1.000 VND, không hết hạn). Cập nhật 25/10/2026 (quyết định bổ sung của nhóm; mở rộng BR-155 cho mọi lần tặng điểm của Center Manager).</w:t>
+              </w:r>
+            </w:ins>
+          </w:p>
+        </w:tc>
+        <w:tc>
+          <w:tcPr>
+            <w:tcW w:w="1400" w:type="dxa"/>
+            <w:tcMar>
+              <w:top w:w="60" w:type="dxa"/>
+              <w:left w:w="100" w:type="dxa"/>
+              <w:bottom w:w="60" w:type="dxa"/>
+              <w:right w:w="100" w:type="dxa"/>
+            </w:tcMar>
+            <w:vAlign w:val="center"/>
+          </w:tcPr>
+          <w:p>
+            <w:pPr>
+              <w:rPr>
+                <w:ins w:id="9357" w:author="Claude" w:date="2026-10-24T22:45:00Z"/>
+              </w:rPr>
+            </w:pPr>
+            <w:ins w:id="9358" w:author="Claude" w:date="2026-10-24T22:45:00Z">
+              <w:r>
+                <w:rPr>
+                  <w:sz w:val="18"/>
+                  <w:szCs w:val="18"/>
+                </w:rPr>
+                <w:t xml:space="preserve">Kích hoạt Hành động</w:t>
+              </w:r>
+            </w:ins>
+          </w:p>
+        </w:tc>
+        <w:tc>
+          <w:tcPr>
+            <w:tcW w:w="1300" w:type="dxa"/>
+            <w:tcMar>
+              <w:top w:w="60" w:type="dxa"/>
+              <w:left w:w="100" w:type="dxa"/>
+              <w:bottom w:w="60" w:type="dxa"/>
+              <w:right w:w="100" w:type="dxa"/>
+            </w:tcMar>
+            <w:vAlign w:val="center"/>
+          </w:tcPr>
+          <w:p>
+            <w:pPr>
+              <w:rPr>
+                <w:ins w:id="9359" w:author="Claude" w:date="2026-10-24T22:45:00Z"/>
+              </w:rPr>
+            </w:pPr>
+            <w:ins w:id="9360" w:author="Claude" w:date="2026-10-24T22:45:00Z">
+              <w:r>
+                <w:rPr>
+                  <w:sz w:val="18"/>
+                  <w:szCs w:val="18"/>
+                </w:rPr>
+                <w:t xml:space="preserve">Động</w:t>
+              </w:r>
+            </w:ins>
+          </w:p>
+        </w:tc>
+        <w:tc>
+          <w:tcPr>
+            <w:tcW w:w="2400" w:type="dxa"/>
+            <w:tcMar>
+              <w:top w:w="60" w:type="dxa"/>
+              <w:left w:w="100" w:type="dxa"/>
+              <w:bottom w:w="60" w:type="dxa"/>
+              <w:right w:w="100" w:type="dxa"/>
+            </w:tcMar>
+            <w:vAlign w:val="center"/>
+          </w:tcPr>
+          <w:p>
+            <w:pPr>
+              <w:rPr>
+                <w:ins w:id="9361" w:author="Claude" w:date="2026-10-24T22:45:00Z"/>
+              </w:rPr>
+            </w:pPr>
+            <w:ins w:id="9362" w:author="Claude" w:date="2026-10-24T22:45:00Z">
+              <w:r>
+                <w:rPr>
+                  <w:sz w:val="18"/>
+                  <w:szCs w:val="18"/>
+                </w:rPr>
+                <w:t xml:space="preserve">Quyết định nhóm 25/10/2026 — Manager tặng điểm</w:t>
+              </w:r>
+            </w:ins>
+          </w:p>
+        </w:tc>
+      </w:tr>
+      <w:tr>
+        <w:trPr>
+          <w:cantSplit/>
+          <w:ins w:id="9363" w:author="Claude" w:date="2026-10-24T22:45:00Z"/>
+        </w:trPr>
+        <w:tc>
+          <w:tcPr>
+            <w:tcW w:w="900" w:type="dxa"/>
+            <w:tcMar>
+              <w:top w:w="60" w:type="dxa"/>
+              <w:left w:w="100" w:type="dxa"/>
+              <w:bottom w:w="60" w:type="dxa"/>
+              <w:right w:w="100" w:type="dxa"/>
+            </w:tcMar>
+            <w:vAlign w:val="center"/>
+          </w:tcPr>
+          <w:p>
+            <w:pPr>
+              <w:rPr>
+                <w:ins w:id="9364" w:author="Claude" w:date="2026-10-24T22:45:00Z"/>
+              </w:rPr>
+            </w:pPr>
+            <w:ins w:id="9365" w:author="Claude" w:date="2026-10-24T22:45:00Z">
+              <w:r>
+                <w:rPr>
+                  <w:b/>
+                  <w:bCs/>
+                  <w:sz w:val="18"/>
+                  <w:szCs w:val="18"/>
+                </w:rPr>
+                <w:t xml:space="preserve">BR-157</w:t>
+              </w:r>
+            </w:ins>
+          </w:p>
+        </w:tc>
+        <w:tc>
+          <w:tcPr>
+            <w:tcW w:w="5200" w:type="dxa"/>
+            <w:tcMar>
+              <w:top w:w="60" w:type="dxa"/>
+              <w:left w:w="100" w:type="dxa"/>
+              <w:bottom w:w="60" w:type="dxa"/>
+              <w:right w:w="100" w:type="dxa"/>
+            </w:tcMar>
+            <w:vAlign w:val="center"/>
+          </w:tcPr>
+          <w:p>
+            <w:pPr>
+              <w:rPr>
+                <w:ins w:id="9366" w:author="Claude" w:date="2026-10-24T22:45:00Z"/>
+              </w:rPr>
+            </w:pPr>
+            <w:ins w:id="9367" w:author="Claude" w:date="2026-10-24T22:45:00Z">
+              <w:r>
+                <w:rPr>
+                  <w:sz w:val="18"/>
+                  <w:szCs w:val="18"/>
+                </w:rPr>
+                <w:t xml:space="preserve">Member tự nạp điểm (nút Add points ở ví điểm) bằng cách thanh toán VNPay: nhập số tiền từ 10.000 đến 10.000.000 ₫ (bội số của 1.000 ₫, tương ứng 10 đến 10.000 điểm), không dùng điểm để trả khoản nạp. Receptionist được nạp điểm hộ một Member được chọn rõ ràng tại quầy bằng đúng luồng và giới hạn này; điểm cộng vào ví của Member được chọn. Điểm chỉ được cộng một lần sau khi VNPay xác minh đã thu tiền (kể cả thanh toán muộn); mỗi Member chỉ có một khoản nạp đang mở. Mỗi lần nạp hộ ghi Audit Log gồm Receptionist, Member, số điểm và Invoice (BR-139). Cập nhật 25/10/2026 (quyết định bổ sung của nhóm; bổ sung quy tắc nạp điểm còn thiếu).</w:t>
+              </w:r>
+            </w:ins>
+          </w:p>
+        </w:tc>
+        <w:tc>
+          <w:tcPr>
+            <w:tcW w:w="1400" w:type="dxa"/>
+            <w:tcMar>
+              <w:top w:w="60" w:type="dxa"/>
+              <w:left w:w="100" w:type="dxa"/>
+              <w:bottom w:w="60" w:type="dxa"/>
+              <w:right w:w="100" w:type="dxa"/>
+            </w:tcMar>
+            <w:vAlign w:val="center"/>
+          </w:tcPr>
+          <w:p>
+            <w:pPr>
+              <w:rPr>
+                <w:ins w:id="9368" w:author="Claude" w:date="2026-10-24T22:45:00Z"/>
+              </w:rPr>
+            </w:pPr>
+            <w:ins w:id="9369" w:author="Claude" w:date="2026-10-24T22:45:00Z">
+              <w:r>
+                <w:rPr>
+                  <w:sz w:val="18"/>
+                  <w:szCs w:val="18"/>
+                </w:rPr>
+                <w:t xml:space="preserve">Kích hoạt Hành động</w:t>
+              </w:r>
+            </w:ins>
+          </w:p>
+        </w:tc>
+        <w:tc>
+          <w:tcPr>
+            <w:tcW w:w="1300" w:type="dxa"/>
+            <w:tcMar>
+              <w:top w:w="60" w:type="dxa"/>
+              <w:left w:w="100" w:type="dxa"/>
+              <w:bottom w:w="60" w:type="dxa"/>
+              <w:right w:w="100" w:type="dxa"/>
+            </w:tcMar>
+            <w:vAlign w:val="center"/>
+          </w:tcPr>
+          <w:p>
+            <w:pPr>
+              <w:rPr>
+                <w:ins w:id="9370" w:author="Claude" w:date="2026-10-24T22:45:00Z"/>
+              </w:rPr>
+            </w:pPr>
+            <w:ins w:id="9371" w:author="Claude" w:date="2026-10-24T22:45:00Z">
+              <w:r>
+                <w:rPr>
+                  <w:sz w:val="18"/>
+                  <w:szCs w:val="18"/>
+                </w:rPr>
+                <w:t xml:space="preserve">Động</w:t>
+              </w:r>
+            </w:ins>
+          </w:p>
+        </w:tc>
+        <w:tc>
+          <w:tcPr>
+            <w:tcW w:w="2400" w:type="dxa"/>
+            <w:tcMar>
+              <w:top w:w="60" w:type="dxa"/>
+              <w:left w:w="100" w:type="dxa"/>
+              <w:bottom w:w="60" w:type="dxa"/>
+              <w:right w:w="100" w:type="dxa"/>
+            </w:tcMar>
+            <w:vAlign w:val="center"/>
+          </w:tcPr>
+          <w:p>
+            <w:pPr>
+              <w:rPr>
+                <w:ins w:id="9372" w:author="Claude" w:date="2026-10-24T22:45:00Z"/>
+              </w:rPr>
+            </w:pPr>
+            <w:ins w:id="9373" w:author="Claude" w:date="2026-10-24T22:45:00Z">
+              <w:r>
+                <w:rPr>
+                  <w:sz w:val="18"/>
+                  <w:szCs w:val="18"/>
+                </w:rPr>
+                <w:t xml:space="preserve">Quyết định nhóm 25/10/2026 — Receptionist nạp điểm hộ; giới hạn theo api-contract.md</w:t>
               </w:r>
             </w:ins>
           </w:p>
@@ -17850,7 +18198,7 @@
               </w:rPr>
               <w:t xml:space="preserve">Center Manager có thể gửi thông báo thủ công qua email (sự cố, thay đổi vận hành) tới nhóm Coach, Member có lượt thuê trong khung giờ được chọn, Member của lớp được chọn hoặc Member có Membership Gym đang Active. Nội dung và danh sách người nhận được ghi Audit Log; email gửi qua outbox (BR-34) và lỗi gửi không chặn hành động gốc. </w:t>
             </w:r>
-            <w:del w:id="9299" w:author="Claude" w:date="2026-10-24T22:45:00Z">
+            <w:del w:id="9326" w:author="Claude" w:date="2026-10-24T22:45:00Z">
               <w:r>
                 <w:rPr>
                   <w:sz w:val="18"/>
@@ -17859,7 +18207,7 @@
                 <w:delText xml:space="preserve">Với sự cố Gym, Member có Membership Active được email thông báo việc gia hạn EndDate (BR-130).</w:delText>
               </w:r>
             </w:del>
-            <w:ins w:id="9300" w:author="Claude" w:date="2026-10-24T22:45:00Z">
+            <w:ins w:id="9327" w:author="Claude" w:date="2026-10-24T22:45:00Z">
               <w:r>
                 <w:rPr>
                   <w:sz w:val="18"/>
@@ -17868,7 +18216,7 @@
                 <w:t xml:space="preserve">Với sự cố Gym, Member nhận điểm tặng được thông báo qua email và trong ứng dụng về số điểm được tặng (BR-130, BR-155).</w:t>
               </w:r>
             </w:ins>
-            <w:ins w:id="9301" w:author="Claude" w:date="2026-10-24T22:45:00Z">
+            <w:ins w:id="9328" w:author="Claude" w:date="2026-10-24T22:45:00Z">
               <w:r>
                 <w:rPr>
                   <w:sz w:val="18"/>
@@ -20645,7 +20993,7 @@
       <w:tr>
         <w:trPr>
           <w:cantSplit/>
-          <w:ins w:id="9119" w:author="Claude" w:date="2026-10-24T22:45:00Z"/>
+          <w:ins w:id="9121" w:author="Claude" w:date="2026-10-24T22:45:00Z"/>
         </w:trPr>
         <w:tc>
           <w:tcPr>
@@ -20661,10 +21009,10 @@
           <w:p>
             <w:pPr>
               <w:rPr>
-                <w:ins w:id="9120" w:author="Claude" w:date="2026-10-24T22:45:00Z"/>
-              </w:rPr>
-            </w:pPr>
-            <w:ins w:id="9121" w:author="Claude" w:date="2026-10-24T22:45:00Z">
+                <w:ins w:id="9122" w:author="Claude" w:date="2026-10-24T22:45:00Z"/>
+              </w:rPr>
+            </w:pPr>
+            <w:ins w:id="9123" w:author="Claude" w:date="2026-10-24T22:45:00Z">
               <w:r>
                 <w:t xml:space="preserve">member_support_payouts.request_id</w:t>
               </w:r>
@@ -20685,10 +21033,10 @@
           <w:p>
             <w:pPr>
               <w:rPr>
-                <w:ins w:id="9122" w:author="Claude" w:date="2026-10-24T22:45:00Z"/>
-              </w:rPr>
-            </w:pPr>
-            <w:ins w:id="9123" w:author="Claude" w:date="2026-10-24T22:45:00Z">
+                <w:ins w:id="9124" w:author="Claude" w:date="2026-10-24T22:45:00Z"/>
+              </w:rPr>
+            </w:pPr>
+            <w:ins w:id="9125" w:author="Claude" w:date="2026-10-24T22:45:00Z">
               <w:r>
                 <w:rPr>
                   <w:sz w:val="18"/>
@@ -20713,10 +21061,10 @@
           <w:p>
             <w:pPr>
               <w:rPr>
-                <w:ins w:id="9124" w:author="Claude" w:date="2026-10-24T22:45:00Z"/>
-              </w:rPr>
-            </w:pPr>
-            <w:ins w:id="9125" w:author="Claude" w:date="2026-10-24T22:45:00Z">
+                <w:ins w:id="9126" w:author="Claude" w:date="2026-10-24T22:45:00Z"/>
+              </w:rPr>
+            </w:pPr>
+            <w:ins w:id="9127" w:author="Claude" w:date="2026-10-24T22:45:00Z">
               <w:r>
                 <w:rPr>
                   <w:sz w:val="18"/>
@@ -20741,10 +21089,10 @@
           <w:p>
             <w:pPr>
               <w:rPr>
-                <w:ins w:id="9126" w:author="Claude" w:date="2026-10-24T22:45:00Z"/>
-              </w:rPr>
-            </w:pPr>
-            <w:ins w:id="9127" w:author="Claude" w:date="2026-10-24T22:45:00Z">
+                <w:ins w:id="9128" w:author="Claude" w:date="2026-10-24T22:45:00Z"/>
+              </w:rPr>
+            </w:pPr>
+            <w:ins w:id="9129" w:author="Claude" w:date="2026-10-24T22:45:00Z">
               <w:r>
                 <w:rPr>
                   <w:sz w:val="18"/>
@@ -20759,7 +21107,7 @@
       <w:tr>
         <w:trPr>
           <w:cantSplit/>
-          <w:ins w:id="9128" w:author="Claude" w:date="2026-10-24T22:45:00Z"/>
+          <w:ins w:id="9130" w:author="Claude" w:date="2026-10-24T22:45:00Z"/>
         </w:trPr>
         <w:tc>
           <w:tcPr>
@@ -20775,10 +21123,10 @@
           <w:p>
             <w:pPr>
               <w:rPr>
-                <w:ins w:id="9129" w:author="Claude" w:date="2026-10-24T22:45:00Z"/>
-              </w:rPr>
-            </w:pPr>
-            <w:ins w:id="9130" w:author="Claude" w:date="2026-10-24T22:45:00Z">
+                <w:ins w:id="9131" w:author="Claude" w:date="2026-10-24T22:45:00Z"/>
+              </w:rPr>
+            </w:pPr>
+            <w:ins w:id="9132" w:author="Claude" w:date="2026-10-24T22:45:00Z">
               <w:r>
                 <w:t xml:space="preserve">member_support_requests (invoice_id) khi category = PAYMENT và đang mở</w:t>
               </w:r>
@@ -20799,10 +21147,10 @@
           <w:p>
             <w:pPr>
               <w:rPr>
-                <w:ins w:id="9131" w:author="Claude" w:date="2026-10-24T22:45:00Z"/>
-              </w:rPr>
-            </w:pPr>
-            <w:ins w:id="9132" w:author="Claude" w:date="2026-10-24T22:45:00Z">
+                <w:ins w:id="9133" w:author="Claude" w:date="2026-10-24T22:45:00Z"/>
+              </w:rPr>
+            </w:pPr>
+            <w:ins w:id="9134" w:author="Claude" w:date="2026-10-24T22:45:00Z">
               <w:r>
                 <w:rPr>
                   <w:sz w:val="18"/>
@@ -20827,10 +21175,10 @@
           <w:p>
             <w:pPr>
               <w:rPr>
-                <w:ins w:id="9133" w:author="Claude" w:date="2026-10-24T22:45:00Z"/>
-              </w:rPr>
-            </w:pPr>
-            <w:ins w:id="9134" w:author="Claude" w:date="2026-10-24T22:45:00Z">
+                <w:ins w:id="9135" w:author="Claude" w:date="2026-10-24T22:45:00Z"/>
+              </w:rPr>
+            </w:pPr>
+            <w:ins w:id="9136" w:author="Claude" w:date="2026-10-24T22:45:00Z">
               <w:r>
                 <w:rPr>
                   <w:sz w:val="18"/>
@@ -20855,10 +21203,10 @@
           <w:p>
             <w:pPr>
               <w:rPr>
-                <w:ins w:id="9135" w:author="Claude" w:date="2026-10-24T22:45:00Z"/>
-              </w:rPr>
-            </w:pPr>
-            <w:ins w:id="9136" w:author="Claude" w:date="2026-10-24T22:45:00Z">
+                <w:ins w:id="9137" w:author="Claude" w:date="2026-10-24T22:45:00Z"/>
+              </w:rPr>
+            </w:pPr>
+            <w:ins w:id="9138" w:author="Claude" w:date="2026-10-24T22:45:00Z">
               <w:r>
                 <w:rPr>
                   <w:sz w:val="18"/>
@@ -21605,7 +21953,7 @@
               </w:rPr>
               <w:t xml:space="preserve">60 phút; 4 giờ; </w:t>
             </w:r>
-            <w:del w:id="9222" w:author="Claude" w:date="2026-10-24T22:45:00Z">
+            <w:del w:id="9226" w:author="Claude" w:date="2026-10-24T22:45:00Z">
               <w:r>
                 <w:rPr>
                   <w:sz w:val="18"/>
@@ -21614,7 +21962,7 @@
                 <w:delText xml:space="preserve">30 ngày (BR-126, BR-128)</w:delText>
               </w:r>
             </w:del>
-            <w:ins w:id="9223" w:author="Claude" w:date="2026-10-24T22:45:00Z">
+            <w:ins w:id="9227" w:author="Claude" w:date="2026-10-24T22:45:00Z">
               <w:r>
                 <w:rPr>
                   <w:sz w:val="18"/>
@@ -21706,7 +22054,32 @@
                 <w:sz w:val="18"/>
                 <w:szCs w:val="18"/>
               </w:rPr>
-              <w:t>Receptionist tra cứu điểm và tạo thanh toán; Member phải xác nhận trước khi trừ điểm; Receptionist không tự cộng/trừ điểm (BR-139) — đã được người dùng xác nhận</w:t>
+              <w:t xml:space="preserve">Receptionist tra cứu điểm và tạo thanh toán; Member phải xác nhận trước khi trừ điểm; </w:t>
+            </w:r>
+            <w:del w:id="9321" w:author="Claude" w:date="2026-10-24T22:45:00Z">
+              <w:r>
+                <w:rPr>
+                  <w:sz w:val="18"/>
+                  <w:szCs w:val="18"/>
+                </w:rPr>
+                <w:delText xml:space="preserve">Receptionist không tự cộng/trừ điểm (BR-139)</w:delText>
+              </w:r>
+            </w:del>
+            <w:ins w:id="9322" w:author="Claude" w:date="2026-10-24T22:45:00Z">
+              <w:r>
+                <w:rPr>
+                  <w:sz w:val="18"/>
+                  <w:szCs w:val="18"/>
+                </w:rPr>
+                <w:t xml:space="preserve">Receptionist không tự tặng/trừ/điều chỉnh điểm nhưng được nạp điểm hộ qua luồng Add points (BR-139, BR-157)</w:t>
+              </w:r>
+            </w:ins>
+            <w:r>
+              <w:rPr>
+                <w:sz w:val="18"/>
+                <w:szCs w:val="18"/>
+              </w:rPr>
+              <w:t xml:space="preserve"> — đã được người dùng xác nhận</w:t>
             </w:r>
           </w:p>
         </w:tc>
@@ -22246,7 +22619,7 @@
       <w:tr>
         <w:trPr>
           <w:cantSplit/>
-          <w:ins w:id="9137" w:author="Claude" w:date="2026-10-24T22:45:00Z"/>
+          <w:ins w:id="9139" w:author="Claude" w:date="2026-10-24T22:45:00Z"/>
         </w:trPr>
         <w:tc>
           <w:tcPr>
@@ -22262,10 +22635,10 @@
           <w:p>
             <w:pPr>
               <w:rPr>
-                <w:ins w:id="9138" w:author="Claude" w:date="2026-10-24T22:45:00Z"/>
-              </w:rPr>
-            </w:pPr>
-            <w:ins w:id="9139" w:author="Claude" w:date="2026-10-24T22:45:00Z">
+                <w:ins w:id="9140" w:author="Claude" w:date="2026-10-24T22:45:00Z"/>
+              </w:rPr>
+            </w:pPr>
+            <w:ins w:id="9141" w:author="Claude" w:date="2026-10-24T22:45:00Z">
               <w:r>
                 <w:t xml:space="preserve">15</w:t>
               </w:r>
@@ -22286,10 +22659,10 @@
           <w:p>
             <w:pPr>
               <w:rPr>
-                <w:ins w:id="9140" w:author="Claude" w:date="2026-10-24T22:45:00Z"/>
-              </w:rPr>
-            </w:pPr>
-            <w:ins w:id="9141" w:author="Claude" w:date="2026-10-24T22:45:00Z">
+                <w:ins w:id="9142" w:author="Claude" w:date="2026-10-24T22:45:00Z"/>
+              </w:rPr>
+            </w:pPr>
+            <w:ins w:id="9143" w:author="Claude" w:date="2026-10-24T22:45:00Z">
               <w:r>
                 <w:rPr>
                   <w:sz w:val="18"/>
@@ -22314,10 +22687,10 @@
           <w:p>
             <w:pPr>
               <w:rPr>
-                <w:ins w:id="9142" w:author="Claude" w:date="2026-10-24T22:45:00Z"/>
-              </w:rPr>
-            </w:pPr>
-            <w:ins w:id="9143" w:author="Claude" w:date="2026-10-24T22:45:00Z">
+                <w:ins w:id="9144" w:author="Claude" w:date="2026-10-24T22:45:00Z"/>
+              </w:rPr>
+            </w:pPr>
+            <w:ins w:id="9145" w:author="Claude" w:date="2026-10-24T22:45:00Z">
               <w:r>
                 <w:rPr>
                   <w:sz w:val="18"/>
@@ -22342,10 +22715,10 @@
           <w:p>
             <w:pPr>
               <w:rPr>
-                <w:ins w:id="9144" w:author="Claude" w:date="2026-10-24T22:45:00Z"/>
-              </w:rPr>
-            </w:pPr>
-            <w:ins w:id="9145" w:author="Claude" w:date="2026-10-24T22:45:00Z">
+                <w:ins w:id="9146" w:author="Claude" w:date="2026-10-24T22:45:00Z"/>
+              </w:rPr>
+            </w:pPr>
+            <w:ins w:id="9147" w:author="Claude" w:date="2026-10-24T22:45:00Z">
               <w:r>
                 <w:rPr>
                   <w:sz w:val="18"/>
@@ -22360,7 +22733,7 @@
       <w:tr>
         <w:trPr>
           <w:cantSplit/>
-          <w:ins w:id="9146" w:author="Claude" w:date="2026-10-24T22:45:00Z"/>
+          <w:ins w:id="9148" w:author="Claude" w:date="2026-10-24T22:45:00Z"/>
         </w:trPr>
         <w:tc>
           <w:tcPr>
@@ -22376,10 +22749,10 @@
           <w:p>
             <w:pPr>
               <w:rPr>
-                <w:ins w:id="9147" w:author="Claude" w:date="2026-10-24T22:45:00Z"/>
-              </w:rPr>
-            </w:pPr>
-            <w:ins w:id="9148" w:author="Claude" w:date="2026-10-24T22:45:00Z">
+                <w:ins w:id="9149" w:author="Claude" w:date="2026-10-24T22:45:00Z"/>
+              </w:rPr>
+            </w:pPr>
+            <w:ins w:id="9150" w:author="Claude" w:date="2026-10-24T22:45:00Z">
               <w:r>
                 <w:t xml:space="preserve">16</w:t>
               </w:r>
@@ -22400,10 +22773,10 @@
           <w:p>
             <w:pPr>
               <w:rPr>
-                <w:ins w:id="9149" w:author="Claude" w:date="2026-10-24T22:45:00Z"/>
-              </w:rPr>
-            </w:pPr>
-            <w:ins w:id="9150" w:author="Claude" w:date="2026-10-24T22:45:00Z">
+                <w:ins w:id="9151" w:author="Claude" w:date="2026-10-24T22:45:00Z"/>
+              </w:rPr>
+            </w:pPr>
+            <w:ins w:id="9152" w:author="Claude" w:date="2026-10-24T22:45:00Z">
               <w:r>
                 <w:rPr>
                   <w:sz w:val="18"/>
@@ -22428,10 +22801,10 @@
           <w:p>
             <w:pPr>
               <w:rPr>
-                <w:ins w:id="9151" w:author="Claude" w:date="2026-10-24T22:45:00Z"/>
-              </w:rPr>
-            </w:pPr>
-            <w:ins w:id="9152" w:author="Claude" w:date="2026-10-24T22:45:00Z">
+                <w:ins w:id="9153" w:author="Claude" w:date="2026-10-24T22:45:00Z"/>
+              </w:rPr>
+            </w:pPr>
+            <w:ins w:id="9154" w:author="Claude" w:date="2026-10-24T22:45:00Z">
               <w:r>
                 <w:rPr>
                   <w:sz w:val="18"/>
@@ -22456,10 +22829,10 @@
           <w:p>
             <w:pPr>
               <w:rPr>
-                <w:ins w:id="9153" w:author="Claude" w:date="2026-10-24T22:45:00Z"/>
-              </w:rPr>
-            </w:pPr>
-            <w:ins w:id="9154" w:author="Claude" w:date="2026-10-24T22:45:00Z">
+                <w:ins w:id="9155" w:author="Claude" w:date="2026-10-24T22:45:00Z"/>
+              </w:rPr>
+            </w:pPr>
+            <w:ins w:id="9156" w:author="Claude" w:date="2026-10-24T22:45:00Z">
               <w:r>
                 <w:rPr>
                   <w:sz w:val="18"/>
@@ -22474,7 +22847,7 @@
       <w:tr>
         <w:trPr>
           <w:cantSplit/>
-          <w:ins w:id="9155" w:author="Claude" w:date="2026-10-24T22:45:00Z"/>
+          <w:ins w:id="9157" w:author="Claude" w:date="2026-10-24T22:45:00Z"/>
         </w:trPr>
         <w:tc>
           <w:tcPr>
@@ -22490,10 +22863,10 @@
           <w:p>
             <w:pPr>
               <w:rPr>
-                <w:ins w:id="9156" w:author="Claude" w:date="2026-10-24T22:45:00Z"/>
-              </w:rPr>
-            </w:pPr>
-            <w:ins w:id="9157" w:author="Claude" w:date="2026-10-24T22:45:00Z">
+                <w:ins w:id="9158" w:author="Claude" w:date="2026-10-24T22:45:00Z"/>
+              </w:rPr>
+            </w:pPr>
+            <w:ins w:id="9159" w:author="Claude" w:date="2026-10-24T22:45:00Z">
               <w:r>
                 <w:t xml:space="preserve">17</w:t>
               </w:r>
@@ -22514,10 +22887,10 @@
           <w:p>
             <w:pPr>
               <w:rPr>
-                <w:ins w:id="9158" w:author="Claude" w:date="2026-10-24T22:45:00Z"/>
-              </w:rPr>
-            </w:pPr>
-            <w:ins w:id="9159" w:author="Claude" w:date="2026-10-24T22:45:00Z">
+                <w:ins w:id="9160" w:author="Claude" w:date="2026-10-24T22:45:00Z"/>
+              </w:rPr>
+            </w:pPr>
+            <w:ins w:id="9161" w:author="Claude" w:date="2026-10-24T22:45:00Z">
               <w:r>
                 <w:rPr>
                   <w:sz w:val="18"/>
@@ -22542,10 +22915,10 @@
           <w:p>
             <w:pPr>
               <w:rPr>
-                <w:ins w:id="9160" w:author="Claude" w:date="2026-10-24T22:45:00Z"/>
-              </w:rPr>
-            </w:pPr>
-            <w:ins w:id="9161" w:author="Claude" w:date="2026-10-24T22:45:00Z">
+                <w:ins w:id="9162" w:author="Claude" w:date="2026-10-24T22:45:00Z"/>
+              </w:rPr>
+            </w:pPr>
+            <w:ins w:id="9163" w:author="Claude" w:date="2026-10-24T22:45:00Z">
               <w:r>
                 <w:rPr>
                   <w:sz w:val="18"/>
@@ -22570,10 +22943,10 @@
           <w:p>
             <w:pPr>
               <w:rPr>
-                <w:ins w:id="9162" w:author="Claude" w:date="2026-10-24T22:45:00Z"/>
-              </w:rPr>
-            </w:pPr>
-            <w:ins w:id="9163" w:author="Claude" w:date="2026-10-24T22:45:00Z">
+                <w:ins w:id="9164" w:author="Claude" w:date="2026-10-24T22:45:00Z"/>
+              </w:rPr>
+            </w:pPr>
+            <w:ins w:id="9165" w:author="Claude" w:date="2026-10-24T22:45:00Z">
               <w:r>
                 <w:rPr>
                   <w:sz w:val="18"/>
@@ -22588,7 +22961,7 @@
       <w:tr>
         <w:trPr>
           <w:cantSplit/>
-          <w:ins w:id="9164" w:author="Claude" w:date="2026-10-24T22:45:00Z"/>
+          <w:ins w:id="9166" w:author="Claude" w:date="2026-10-24T22:45:00Z"/>
         </w:trPr>
         <w:tc>
           <w:tcPr>
@@ -22604,10 +22977,10 @@
           <w:p>
             <w:pPr>
               <w:rPr>
-                <w:ins w:id="9165" w:author="Claude" w:date="2026-10-24T22:45:00Z"/>
-              </w:rPr>
-            </w:pPr>
-            <w:ins w:id="9166" w:author="Claude" w:date="2026-10-24T22:45:00Z">
+                <w:ins w:id="9167" w:author="Claude" w:date="2026-10-24T22:45:00Z"/>
+              </w:rPr>
+            </w:pPr>
+            <w:ins w:id="9168" w:author="Claude" w:date="2026-10-24T22:45:00Z">
               <w:r>
                 <w:t xml:space="preserve">18</w:t>
               </w:r>
@@ -22628,10 +23001,10 @@
           <w:p>
             <w:pPr>
               <w:rPr>
-                <w:ins w:id="9167" w:author="Claude" w:date="2026-10-24T22:45:00Z"/>
-              </w:rPr>
-            </w:pPr>
-            <w:ins w:id="9168" w:author="Claude" w:date="2026-10-24T22:45:00Z">
+                <w:ins w:id="9169" w:author="Claude" w:date="2026-10-24T22:45:00Z"/>
+              </w:rPr>
+            </w:pPr>
+            <w:ins w:id="9170" w:author="Claude" w:date="2026-10-24T22:45:00Z">
               <w:r>
                 <w:rPr>
                   <w:sz w:val="18"/>
@@ -22656,10 +23029,10 @@
           <w:p>
             <w:pPr>
               <w:rPr>
-                <w:ins w:id="9169" w:author="Claude" w:date="2026-10-24T22:45:00Z"/>
-              </w:rPr>
-            </w:pPr>
-            <w:ins w:id="9170" w:author="Claude" w:date="2026-10-24T22:45:00Z">
+                <w:ins w:id="9171" w:author="Claude" w:date="2026-10-24T22:45:00Z"/>
+              </w:rPr>
+            </w:pPr>
+            <w:ins w:id="9172" w:author="Claude" w:date="2026-10-24T22:45:00Z">
               <w:r>
                 <w:rPr>
                   <w:sz w:val="18"/>
@@ -22684,10 +23057,10 @@
           <w:p>
             <w:pPr>
               <w:rPr>
-                <w:ins w:id="9171" w:author="Claude" w:date="2026-10-24T22:45:00Z"/>
-              </w:rPr>
-            </w:pPr>
-            <w:ins w:id="9172" w:author="Claude" w:date="2026-10-24T22:45:00Z">
+                <w:ins w:id="9173" w:author="Claude" w:date="2026-10-24T22:45:00Z"/>
+              </w:rPr>
+            </w:pPr>
+            <w:ins w:id="9174" w:author="Claude" w:date="2026-10-24T22:45:00Z">
               <w:r>
                 <w:rPr>
                   <w:sz w:val="18"/>
@@ -22702,7 +23075,7 @@
       <w:tr>
         <w:trPr>
           <w:cantSplit/>
-          <w:ins w:id="9173" w:author="Claude" w:date="2026-10-24T22:45:00Z"/>
+          <w:ins w:id="9175" w:author="Claude" w:date="2026-10-24T22:45:00Z"/>
         </w:trPr>
         <w:tc>
           <w:tcPr>
@@ -22718,10 +23091,10 @@
           <w:p>
             <w:pPr>
               <w:rPr>
-                <w:ins w:id="9174" w:author="Claude" w:date="2026-10-24T22:45:00Z"/>
-              </w:rPr>
-            </w:pPr>
-            <w:ins w:id="9175" w:author="Claude" w:date="2026-10-24T22:45:00Z">
+                <w:ins w:id="9176" w:author="Claude" w:date="2026-10-24T22:45:00Z"/>
+              </w:rPr>
+            </w:pPr>
+            <w:ins w:id="9177" w:author="Claude" w:date="2026-10-24T22:45:00Z">
               <w:r>
                 <w:t xml:space="preserve">19</w:t>
               </w:r>
@@ -22742,10 +23115,10 @@
           <w:p>
             <w:pPr>
               <w:rPr>
-                <w:ins w:id="9176" w:author="Claude" w:date="2026-10-24T22:45:00Z"/>
-              </w:rPr>
-            </w:pPr>
-            <w:ins w:id="9177" w:author="Claude" w:date="2026-10-24T22:45:00Z">
+                <w:ins w:id="9178" w:author="Claude" w:date="2026-10-24T22:45:00Z"/>
+              </w:rPr>
+            </w:pPr>
+            <w:ins w:id="9179" w:author="Claude" w:date="2026-10-24T22:45:00Z">
               <w:r>
                 <w:rPr>
                   <w:sz w:val="18"/>
@@ -22770,10 +23143,10 @@
           <w:p>
             <w:pPr>
               <w:rPr>
-                <w:ins w:id="9178" w:author="Claude" w:date="2026-10-24T22:45:00Z"/>
-              </w:rPr>
-            </w:pPr>
-            <w:ins w:id="9179" w:author="Claude" w:date="2026-10-24T22:45:00Z">
+                <w:ins w:id="9180" w:author="Claude" w:date="2026-10-24T22:45:00Z"/>
+              </w:rPr>
+            </w:pPr>
+            <w:ins w:id="9181" w:author="Claude" w:date="2026-10-24T22:45:00Z">
               <w:r>
                 <w:rPr>
                   <w:sz w:val="18"/>
@@ -22798,10 +23171,10 @@
           <w:p>
             <w:pPr>
               <w:rPr>
-                <w:ins w:id="9180" w:author="Claude" w:date="2026-10-24T22:45:00Z"/>
-              </w:rPr>
-            </w:pPr>
-            <w:ins w:id="9181" w:author="Claude" w:date="2026-10-24T22:45:00Z">
+                <w:ins w:id="9182" w:author="Claude" w:date="2026-10-24T22:45:00Z"/>
+              </w:rPr>
+            </w:pPr>
+            <w:ins w:id="9183" w:author="Claude" w:date="2026-10-24T22:45:00Z">
               <w:r>
                 <w:rPr>
                   <w:sz w:val="18"/>
@@ -22816,7 +23189,7 @@
       <w:tr>
         <w:trPr>
           <w:cantSplit/>
-          <w:ins w:id="9182" w:author="Claude" w:date="2026-10-24T22:45:00Z"/>
+          <w:ins w:id="9184" w:author="Claude" w:date="2026-10-24T22:45:00Z"/>
         </w:trPr>
         <w:tc>
           <w:tcPr>
@@ -22832,10 +23205,10 @@
           <w:p>
             <w:pPr>
               <w:rPr>
-                <w:ins w:id="9183" w:author="Claude" w:date="2026-10-24T22:45:00Z"/>
-              </w:rPr>
-            </w:pPr>
-            <w:ins w:id="9184" w:author="Claude" w:date="2026-10-24T22:45:00Z">
+                <w:ins w:id="9185" w:author="Claude" w:date="2026-10-24T22:45:00Z"/>
+              </w:rPr>
+            </w:pPr>
+            <w:ins w:id="9186" w:author="Claude" w:date="2026-10-24T22:45:00Z">
               <w:r>
                 <w:t xml:space="preserve">20</w:t>
               </w:r>
@@ -22856,10 +23229,10 @@
           <w:p>
             <w:pPr>
               <w:rPr>
-                <w:ins w:id="9185" w:author="Claude" w:date="2026-10-24T22:45:00Z"/>
-              </w:rPr>
-            </w:pPr>
-            <w:ins w:id="9186" w:author="Claude" w:date="2026-10-24T22:45:00Z">
+                <w:ins w:id="9187" w:author="Claude" w:date="2026-10-24T22:45:00Z"/>
+              </w:rPr>
+            </w:pPr>
+            <w:ins w:id="9188" w:author="Claude" w:date="2026-10-24T22:45:00Z">
               <w:r>
                 <w:rPr>
                   <w:sz w:val="18"/>
@@ -22884,10 +23257,10 @@
           <w:p>
             <w:pPr>
               <w:rPr>
-                <w:ins w:id="9187" w:author="Claude" w:date="2026-10-24T22:45:00Z"/>
-              </w:rPr>
-            </w:pPr>
-            <w:ins w:id="9188" w:author="Claude" w:date="2026-10-24T22:45:00Z">
+                <w:ins w:id="9189" w:author="Claude" w:date="2026-10-24T22:45:00Z"/>
+              </w:rPr>
+            </w:pPr>
+            <w:ins w:id="9190" w:author="Claude" w:date="2026-10-24T22:45:00Z">
               <w:r>
                 <w:rPr>
                   <w:sz w:val="18"/>
@@ -22912,10 +23285,10 @@
           <w:p>
             <w:pPr>
               <w:rPr>
-                <w:ins w:id="9189" w:author="Claude" w:date="2026-10-24T22:45:00Z"/>
-              </w:rPr>
-            </w:pPr>
-            <w:ins w:id="9190" w:author="Claude" w:date="2026-10-24T22:45:00Z">
+                <w:ins w:id="9191" w:author="Claude" w:date="2026-10-24T22:45:00Z"/>
+              </w:rPr>
+            </w:pPr>
+            <w:ins w:id="9192" w:author="Claude" w:date="2026-10-24T22:45:00Z">
               <w:r>
                 <w:rPr>
                   <w:sz w:val="18"/>
@@ -22930,7 +23303,7 @@
       <w:tr>
         <w:trPr>
           <w:cantSplit/>
-          <w:ins w:id="9260" w:author="Claude" w:date="2026-10-24T22:45:00Z"/>
+          <w:ins w:id="9264" w:author="Claude" w:date="2026-10-24T22:45:00Z"/>
         </w:trPr>
         <w:tc>
           <w:tcPr>
@@ -22946,10 +23319,10 @@
           <w:p>
             <w:pPr>
               <w:rPr>
-                <w:ins w:id="9261" w:author="Claude" w:date="2026-10-24T22:45:00Z"/>
-              </w:rPr>
-            </w:pPr>
-            <w:ins w:id="9262" w:author="Claude" w:date="2026-10-24T22:45:00Z">
+                <w:ins w:id="9265" w:author="Claude" w:date="2026-10-24T22:45:00Z"/>
+              </w:rPr>
+            </w:pPr>
+            <w:ins w:id="9266" w:author="Claude" w:date="2026-10-24T22:45:00Z">
               <w:r>
                 <w:t xml:space="preserve">21</w:t>
               </w:r>
@@ -22970,10 +23343,10 @@
           <w:p>
             <w:pPr>
               <w:rPr>
-                <w:ins w:id="9263" w:author="Claude" w:date="2026-10-24T22:45:00Z"/>
-              </w:rPr>
-            </w:pPr>
-            <w:ins w:id="9264" w:author="Claude" w:date="2026-10-24T22:45:00Z">
+                <w:ins w:id="9267" w:author="Claude" w:date="2026-10-24T22:45:00Z"/>
+              </w:rPr>
+            </w:pPr>
+            <w:ins w:id="9268" w:author="Claude" w:date="2026-10-24T22:45:00Z">
               <w:r>
                 <w:rPr>
                   <w:sz w:val="18"/>
@@ -22998,10 +23371,10 @@
           <w:p>
             <w:pPr>
               <w:rPr>
-                <w:ins w:id="9265" w:author="Claude" w:date="2026-10-24T22:45:00Z"/>
-              </w:rPr>
-            </w:pPr>
-            <w:ins w:id="9266" w:author="Claude" w:date="2026-10-24T22:45:00Z">
+                <w:ins w:id="9269" w:author="Claude" w:date="2026-10-24T22:45:00Z"/>
+              </w:rPr>
+            </w:pPr>
+            <w:ins w:id="9270" w:author="Claude" w:date="2026-10-24T22:45:00Z">
               <w:r>
                 <w:rPr>
                   <w:sz w:val="18"/>
@@ -23026,10 +23399,10 @@
           <w:p>
             <w:pPr>
               <w:rPr>
-                <w:ins w:id="9267" w:author="Claude" w:date="2026-10-24T22:45:00Z"/>
-              </w:rPr>
-            </w:pPr>
-            <w:ins w:id="9268" w:author="Claude" w:date="2026-10-24T22:45:00Z">
+                <w:ins w:id="9271" w:author="Claude" w:date="2026-10-24T22:45:00Z"/>
+              </w:rPr>
+            </w:pPr>
+            <w:ins w:id="9272" w:author="Claude" w:date="2026-10-24T22:45:00Z">
               <w:r>
                 <w:rPr>
                   <w:sz w:val="18"/>
@@ -23044,7 +23417,7 @@
       <w:tr>
         <w:trPr>
           <w:cantSplit/>
-          <w:ins w:id="9269" w:author="Claude" w:date="2026-10-24T22:45:00Z"/>
+          <w:ins w:id="9273" w:author="Claude" w:date="2026-10-24T22:45:00Z"/>
         </w:trPr>
         <w:tc>
           <w:tcPr>
@@ -23060,10 +23433,10 @@
           <w:p>
             <w:pPr>
               <w:rPr>
-                <w:ins w:id="9270" w:author="Claude" w:date="2026-10-24T22:45:00Z"/>
-              </w:rPr>
-            </w:pPr>
-            <w:ins w:id="9271" w:author="Claude" w:date="2026-10-24T22:45:00Z">
+                <w:ins w:id="9274" w:author="Claude" w:date="2026-10-24T22:45:00Z"/>
+              </w:rPr>
+            </w:pPr>
+            <w:ins w:id="9275" w:author="Claude" w:date="2026-10-24T22:45:00Z">
               <w:r>
                 <w:t xml:space="preserve">22</w:t>
               </w:r>
@@ -23084,10 +23457,10 @@
           <w:p>
             <w:pPr>
               <w:rPr>
-                <w:ins w:id="9272" w:author="Claude" w:date="2026-10-24T22:45:00Z"/>
-              </w:rPr>
-            </w:pPr>
-            <w:ins w:id="9273" w:author="Claude" w:date="2026-10-24T22:45:00Z">
+                <w:ins w:id="9276" w:author="Claude" w:date="2026-10-24T22:45:00Z"/>
+              </w:rPr>
+            </w:pPr>
+            <w:ins w:id="9277" w:author="Claude" w:date="2026-10-24T22:45:00Z">
               <w:r>
                 <w:rPr>
                   <w:sz w:val="18"/>
@@ -23112,10 +23485,10 @@
           <w:p>
             <w:pPr>
               <w:rPr>
-                <w:ins w:id="9274" w:author="Claude" w:date="2026-10-24T22:45:00Z"/>
-              </w:rPr>
-            </w:pPr>
-            <w:ins w:id="9275" w:author="Claude" w:date="2026-10-24T22:45:00Z">
+                <w:ins w:id="9278" w:author="Claude" w:date="2026-10-24T22:45:00Z"/>
+              </w:rPr>
+            </w:pPr>
+            <w:ins w:id="9279" w:author="Claude" w:date="2026-10-24T22:45:00Z">
               <w:r>
                 <w:rPr>
                   <w:sz w:val="18"/>
@@ -23140,10 +23513,10 @@
           <w:p>
             <w:pPr>
               <w:rPr>
-                <w:ins w:id="9276" w:author="Claude" w:date="2026-10-24T22:45:00Z"/>
-              </w:rPr>
-            </w:pPr>
-            <w:ins w:id="9277" w:author="Claude" w:date="2026-10-24T22:45:00Z">
+                <w:ins w:id="9280" w:author="Claude" w:date="2026-10-24T22:45:00Z"/>
+              </w:rPr>
+            </w:pPr>
+            <w:ins w:id="9281" w:author="Claude" w:date="2026-10-24T22:45:00Z">
               <w:r>
                 <w:rPr>
                   <w:sz w:val="18"/>
@@ -23158,7 +23531,7 @@
       <w:tr>
         <w:trPr>
           <w:cantSplit/>
-          <w:ins w:id="9278" w:author="Claude" w:date="2026-10-24T22:45:00Z"/>
+          <w:ins w:id="9282" w:author="Claude" w:date="2026-10-24T22:45:00Z"/>
         </w:trPr>
         <w:tc>
           <w:tcPr>
@@ -23174,10 +23547,10 @@
           <w:p>
             <w:pPr>
               <w:rPr>
-                <w:ins w:id="9279" w:author="Claude" w:date="2026-10-24T22:45:00Z"/>
-              </w:rPr>
-            </w:pPr>
-            <w:ins w:id="9280" w:author="Claude" w:date="2026-10-24T22:45:00Z">
+                <w:ins w:id="9283" w:author="Claude" w:date="2026-10-24T22:45:00Z"/>
+              </w:rPr>
+            </w:pPr>
+            <w:ins w:id="9284" w:author="Claude" w:date="2026-10-24T22:45:00Z">
               <w:r>
                 <w:t xml:space="preserve">23</w:t>
               </w:r>
@@ -23198,10 +23571,10 @@
           <w:p>
             <w:pPr>
               <w:rPr>
-                <w:ins w:id="9281" w:author="Claude" w:date="2026-10-24T22:45:00Z"/>
-              </w:rPr>
-            </w:pPr>
-            <w:ins w:id="9282" w:author="Claude" w:date="2026-10-24T22:45:00Z">
+                <w:ins w:id="9285" w:author="Claude" w:date="2026-10-24T22:45:00Z"/>
+              </w:rPr>
+            </w:pPr>
+            <w:ins w:id="9286" w:author="Claude" w:date="2026-10-24T22:45:00Z">
               <w:r>
                 <w:rPr>
                   <w:sz w:val="18"/>
@@ -23226,10 +23599,10 @@
           <w:p>
             <w:pPr>
               <w:rPr>
-                <w:ins w:id="9283" w:author="Claude" w:date="2026-10-24T22:45:00Z"/>
-              </w:rPr>
-            </w:pPr>
-            <w:ins w:id="9284" w:author="Claude" w:date="2026-10-24T22:45:00Z">
+                <w:ins w:id="9287" w:author="Claude" w:date="2026-10-24T22:45:00Z"/>
+              </w:rPr>
+            </w:pPr>
+            <w:ins w:id="9288" w:author="Claude" w:date="2026-10-24T22:45:00Z">
               <w:r>
                 <w:rPr>
                   <w:sz w:val="18"/>
@@ -23254,10 +23627,10 @@
           <w:p>
             <w:pPr>
               <w:rPr>
-                <w:ins w:id="9285" w:author="Claude" w:date="2026-10-24T22:45:00Z"/>
-              </w:rPr>
-            </w:pPr>
-            <w:ins w:id="9286" w:author="Claude" w:date="2026-10-24T22:45:00Z">
+                <w:ins w:id="9289" w:author="Claude" w:date="2026-10-24T22:45:00Z"/>
+              </w:rPr>
+            </w:pPr>
+            <w:ins w:id="9290" w:author="Claude" w:date="2026-10-24T22:45:00Z">
               <w:r>
                 <w:rPr>
                   <w:sz w:val="18"/>
@@ -23272,7 +23645,7 @@
       <w:tr>
         <w:trPr>
           <w:cantSplit/>
-          <w:ins w:id="9287" w:author="Claude" w:date="2026-10-24T22:45:00Z"/>
+          <w:ins w:id="9291" w:author="Claude" w:date="2026-10-24T22:45:00Z"/>
         </w:trPr>
         <w:tc>
           <w:tcPr>
@@ -23288,10 +23661,10 @@
           <w:p>
             <w:pPr>
               <w:rPr>
-                <w:ins w:id="9288" w:author="Claude" w:date="2026-10-24T22:45:00Z"/>
-              </w:rPr>
-            </w:pPr>
-            <w:ins w:id="9289" w:author="Claude" w:date="2026-10-24T22:45:00Z">
+                <w:ins w:id="9292" w:author="Claude" w:date="2026-10-24T22:45:00Z"/>
+              </w:rPr>
+            </w:pPr>
+            <w:ins w:id="9293" w:author="Claude" w:date="2026-10-24T22:45:00Z">
               <w:r>
                 <w:t xml:space="preserve">24</w:t>
               </w:r>
@@ -23312,10 +23685,10 @@
           <w:p>
             <w:pPr>
               <w:rPr>
-                <w:ins w:id="9290" w:author="Claude" w:date="2026-10-24T22:45:00Z"/>
-              </w:rPr>
-            </w:pPr>
-            <w:ins w:id="9291" w:author="Claude" w:date="2026-10-24T22:45:00Z">
+                <w:ins w:id="9294" w:author="Claude" w:date="2026-10-24T22:45:00Z"/>
+              </w:rPr>
+            </w:pPr>
+            <w:ins w:id="9295" w:author="Claude" w:date="2026-10-24T22:45:00Z">
               <w:r>
                 <w:rPr>
                   <w:sz w:val="18"/>
@@ -23340,16 +23713,16 @@
           <w:p>
             <w:pPr>
               <w:rPr>
-                <w:ins w:id="9292" w:author="Claude" w:date="2026-10-24T22:45:00Z"/>
-              </w:rPr>
-            </w:pPr>
-            <w:ins w:id="9293" w:author="Claude" w:date="2026-10-24T22:45:00Z">
+                <w:ins w:id="9296" w:author="Claude" w:date="2026-10-24T22:45:00Z"/>
+              </w:rPr>
+            </w:pPr>
+            <w:ins w:id="9297" w:author="Claude" w:date="2026-10-24T22:45:00Z">
               <w:r>
                 <w:rPr>
                   <w:sz w:val="18"/>
                   <w:szCs w:val="18"/>
                 </w:rPr>
-                <w:t xml:space="preserve">Chỉ xem và hỗ trợ Member gửi lại (Remind us); không tiếp nhận, chuyển, ghi chú hay ghi nhận chuyển khoản (BR-148, BR-150) — đã chốt 25/10/2026</w:t>
+                <w:t xml:space="preserve">Chỉ xem, tạo hộ Member ở quầy và bấm Remind giúp Member (nhắc Center Manager); không nhận, gán, đóng, ghi chú xử lý hay ghi nhận chuyển khoản (BR-148, BR-150) — đã chốt 25/10/2026</w:t>
               </w:r>
             </w:ins>
           </w:p>
@@ -23368,10 +23741,238 @@
           <w:p>
             <w:pPr>
               <w:rPr>
-                <w:ins w:id="9294" w:author="Claude" w:date="2026-10-24T22:45:00Z"/>
-              </w:rPr>
-            </w:pPr>
-            <w:ins w:id="9295" w:author="Claude" w:date="2026-10-24T22:45:00Z">
+                <w:ins w:id="9298" w:author="Claude" w:date="2026-10-24T22:45:00Z"/>
+              </w:rPr>
+            </w:pPr>
+            <w:ins w:id="9299" w:author="Claude" w:date="2026-10-24T22:45:00Z">
+              <w:r>
+                <w:rPr>
+                  <w:sz w:val="18"/>
+                  <w:szCs w:val="18"/>
+                </w:rPr>
+                <w:t xml:space="preserve">Đã chốt</w:t>
+              </w:r>
+            </w:ins>
+          </w:p>
+        </w:tc>
+      </w:tr>
+      <w:tr>
+        <w:trPr>
+          <w:cantSplit/>
+          <w:ins w:id="9300" w:author="Claude" w:date="2026-10-24T22:45:00Z"/>
+        </w:trPr>
+        <w:tc>
+          <w:tcPr>
+            <w:tcW w:w="500" w:type="dxa"/>
+            <w:tcMar>
+              <w:top w:w="60" w:type="dxa"/>
+              <w:left w:w="100" w:type="dxa"/>
+              <w:bottom w:w="60" w:type="dxa"/>
+              <w:right w:w="100" w:type="dxa"/>
+            </w:tcMar>
+            <w:vAlign w:val="center"/>
+          </w:tcPr>
+          <w:p>
+            <w:pPr>
+              <w:rPr>
+                <w:ins w:id="9301" w:author="Claude" w:date="2026-10-24T22:45:00Z"/>
+              </w:rPr>
+            </w:pPr>
+            <w:ins w:id="9302" w:author="Claude" w:date="2026-10-24T22:45:00Z">
+              <w:r>
+                <w:t xml:space="preserve">25</w:t>
+              </w:r>
+            </w:ins>
+          </w:p>
+        </w:tc>
+        <w:tc>
+          <w:tcPr>
+            <w:tcW w:w="3600" w:type="dxa"/>
+            <w:tcMar>
+              <w:top w:w="60" w:type="dxa"/>
+              <w:left w:w="100" w:type="dxa"/>
+              <w:bottom w:w="60" w:type="dxa"/>
+              <w:right w:w="100" w:type="dxa"/>
+            </w:tcMar>
+            <w:vAlign w:val="center"/>
+          </w:tcPr>
+          <w:p>
+            <w:pPr>
+              <w:rPr>
+                <w:ins w:id="9303" w:author="Claude" w:date="2026-10-24T22:45:00Z"/>
+              </w:rPr>
+            </w:pPr>
+            <w:ins w:id="9304" w:author="Claude" w:date="2026-10-24T22:45:00Z">
+              <w:r>
+                <w:rPr>
+                  <w:sz w:val="18"/>
+                  <w:szCs w:val="18"/>
+                </w:rPr>
+                <w:t xml:space="preserve">Nạp điểm (Add points) tại quầy</w:t>
+              </w:r>
+            </w:ins>
+          </w:p>
+        </w:tc>
+        <w:tc>
+          <w:tcPr>
+            <w:tcW w:w="3800" w:type="dxa"/>
+            <w:tcMar>
+              <w:top w:w="60" w:type="dxa"/>
+              <w:left w:w="100" w:type="dxa"/>
+              <w:bottom w:w="60" w:type="dxa"/>
+              <w:right w:w="100" w:type="dxa"/>
+            </w:tcMar>
+            <w:vAlign w:val="center"/>
+          </w:tcPr>
+          <w:p>
+            <w:pPr>
+              <w:rPr>
+                <w:ins w:id="9305" w:author="Claude" w:date="2026-10-24T22:45:00Z"/>
+              </w:rPr>
+            </w:pPr>
+            <w:ins w:id="9306" w:author="Claude" w:date="2026-10-24T22:45:00Z">
+              <w:r>
+                <w:rPr>
+                  <w:sz w:val="18"/>
+                  <w:szCs w:val="18"/>
+                </w:rPr>
+                <w:t xml:space="preserve">Receptionist nạp điểm hộ Member theo cùng luồng Member tự nạp (VNPay, cùng giới hạn); không được tự tặng, trừ hay điều chỉnh điểm (BR-139, BR-157) — đã chốt 25/10/2026</w:t>
+              </w:r>
+            </w:ins>
+          </w:p>
+        </w:tc>
+        <w:tc>
+          <w:tcPr>
+            <w:tcW w:w="1500" w:type="dxa"/>
+            <w:tcMar>
+              <w:top w:w="60" w:type="dxa"/>
+              <w:left w:w="100" w:type="dxa"/>
+              <w:bottom w:w="60" w:type="dxa"/>
+              <w:right w:w="100" w:type="dxa"/>
+            </w:tcMar>
+            <w:vAlign w:val="center"/>
+          </w:tcPr>
+          <w:p>
+            <w:pPr>
+              <w:rPr>
+                <w:ins w:id="9307" w:author="Claude" w:date="2026-10-24T22:45:00Z"/>
+              </w:rPr>
+            </w:pPr>
+            <w:ins w:id="9308" w:author="Claude" w:date="2026-10-24T22:45:00Z">
+              <w:r>
+                <w:rPr>
+                  <w:sz w:val="18"/>
+                  <w:szCs w:val="18"/>
+                </w:rPr>
+                <w:t xml:space="preserve">Đã chốt</w:t>
+              </w:r>
+            </w:ins>
+          </w:p>
+        </w:tc>
+      </w:tr>
+      <w:tr>
+        <w:trPr>
+          <w:cantSplit/>
+          <w:ins w:id="9309" w:author="Claude" w:date="2026-10-24T22:45:00Z"/>
+        </w:trPr>
+        <w:tc>
+          <w:tcPr>
+            <w:tcW w:w="500" w:type="dxa"/>
+            <w:tcMar>
+              <w:top w:w="60" w:type="dxa"/>
+              <w:left w:w="100" w:type="dxa"/>
+              <w:bottom w:w="60" w:type="dxa"/>
+              <w:right w:w="100" w:type="dxa"/>
+            </w:tcMar>
+            <w:vAlign w:val="center"/>
+          </w:tcPr>
+          <w:p>
+            <w:pPr>
+              <w:rPr>
+                <w:ins w:id="9310" w:author="Claude" w:date="2026-10-24T22:45:00Z"/>
+              </w:rPr>
+            </w:pPr>
+            <w:ins w:id="9311" w:author="Claude" w:date="2026-10-24T22:45:00Z">
+              <w:r>
+                <w:t xml:space="preserve">26</w:t>
+              </w:r>
+            </w:ins>
+          </w:p>
+        </w:tc>
+        <w:tc>
+          <w:tcPr>
+            <w:tcW w:w="3600" w:type="dxa"/>
+            <w:tcMar>
+              <w:top w:w="60" w:type="dxa"/>
+              <w:left w:w="100" w:type="dxa"/>
+              <w:bottom w:w="60" w:type="dxa"/>
+              <w:right w:w="100" w:type="dxa"/>
+            </w:tcMar>
+            <w:vAlign w:val="center"/>
+          </w:tcPr>
+          <w:p>
+            <w:pPr>
+              <w:rPr>
+                <w:ins w:id="9312" w:author="Claude" w:date="2026-10-24T22:45:00Z"/>
+              </w:rPr>
+            </w:pPr>
+            <w:ins w:id="9313" w:author="Claude" w:date="2026-10-24T22:45:00Z">
+              <w:r>
+                <w:rPr>
+                  <w:sz w:val="18"/>
+                  <w:szCs w:val="18"/>
+                </w:rPr>
+                <w:t xml:space="preserve">Tặng điểm của Center Manager</w:t>
+              </w:r>
+            </w:ins>
+          </w:p>
+        </w:tc>
+        <w:tc>
+          <w:tcPr>
+            <w:tcW w:w="3800" w:type="dxa"/>
+            <w:tcMar>
+              <w:top w:w="60" w:type="dxa"/>
+              <w:left w:w="100" w:type="dxa"/>
+              <w:bottom w:w="60" w:type="dxa"/>
+              <w:right w:w="100" w:type="dxa"/>
+            </w:tcMar>
+            <w:vAlign w:val="center"/>
+          </w:tcPr>
+          <w:p>
+            <w:pPr>
+              <w:rPr>
+                <w:ins w:id="9314" w:author="Claude" w:date="2026-10-24T22:45:00Z"/>
+              </w:rPr>
+            </w:pPr>
+            <w:ins w:id="9315" w:author="Claude" w:date="2026-10-24T22:45:00Z">
+              <w:r>
+                <w:rPr>
+                  <w:sz w:val="18"/>
+                  <w:szCs w:val="18"/>
+                </w:rPr>
+                <w:t xml:space="preserve">Chỉ Center Manager tặng điểm cho Member (người hoặc nhóm chọn bằng bộ lọc), bắt buộc nhập lý do và số điểm, có Audit Log; màn hình giống Add points của Member (BR-155, BR-156) — đã chốt 25/10/2026</w:t>
+              </w:r>
+            </w:ins>
+          </w:p>
+        </w:tc>
+        <w:tc>
+          <w:tcPr>
+            <w:tcW w:w="1500" w:type="dxa"/>
+            <w:tcMar>
+              <w:top w:w="60" w:type="dxa"/>
+              <w:left w:w="100" w:type="dxa"/>
+              <w:bottom w:w="60" w:type="dxa"/>
+              <w:right w:w="100" w:type="dxa"/>
+            </w:tcMar>
+            <w:vAlign w:val="center"/>
+          </w:tcPr>
+          <w:p>
+            <w:pPr>
+              <w:rPr>
+                <w:ins w:id="9316" w:author="Claude" w:date="2026-10-24T22:45:00Z"/>
+              </w:rPr>
+            </w:pPr>
+            <w:ins w:id="9317" w:author="Claude" w:date="2026-10-24T22:45:00Z">
               <w:r>
                 <w:rPr>
                   <w:sz w:val="18"/>
@@ -24803,7 +25404,7 @@
               </w:rPr>
               <w:t>Tự đăng ký/đăng nhập, quản lý hồ sơ, mật khẩu, ảnh đại diện, hồ sơ tập luyện; xem và mua/gia hạn gói của chính mình.</w:t>
             </w:r>
-            <w:ins w:id="9191" w:author="Claude" w:date="2026-10-24T22:45:00Z">
+            <w:ins w:id="9193" w:author="Claude" w:date="2026-10-24T22:45:00Z">
               <w:r>
                 <w:rPr>
                   <w:sz w:val="18"/>
@@ -24812,6 +25413,15 @@
                 <w:t xml:space="preserve"> Gửi Support Request từ trang Trợ giúp, gồm yêu cầu hoàn chuyển khoản cho hóa đơn đã thanh toán (BR-147, BR-150).</w:t>
               </w:r>
             </w:ins>
+            <w:ins w:id="9194" w:author="Claude" w:date="2026-10-24T22:45:00Z">
+              <w:r>
+                <w:rPr>
+                  <w:sz w:val="18"/>
+                  <w:szCs w:val="18"/>
+                </w:rPr>
+                <w:t xml:space="preserve"> Tự nạp điểm (Add points) qua VNPay (BR-157).</w:t>
+              </w:r>
+            </w:ins>
           </w:p>
         </w:tc>
       </w:tr>
@@ -24865,7 +25475,7 @@
               </w:rPr>
               <w:t xml:space="preserve">Tra cứu Member, đăng ký Member tại quầy, gửi lại link/sửa email chờ kích hoạt, mua/gia hạn gói hộ, xem gói và hạn, </w:t>
             </w:r>
-            <w:del w:id="9192" w:author="Claude" w:date="2026-10-24T22:45:00Z">
+            <w:del w:id="9196" w:author="Claude" w:date="2026-10-24T22:45:00Z">
               <w:r>
                 <w:rPr>
                   <w:sz w:val="18"/>
@@ -24874,13 +25484,22 @@
                 <w:delText xml:space="preserve">ghi nhận yêu cầu hỗ trợ.</w:delText>
               </w:r>
             </w:del>
-            <w:ins w:id="9193" w:author="Claude" w:date="2026-10-24T22:45:00Z">
+            <w:ins w:id="9197" w:author="Claude" w:date="2026-10-24T22:45:00Z">
               <w:r>
                 <w:rPr>
                   <w:sz w:val="18"/>
                   <w:szCs w:val="18"/>
                 </w:rPr>
-                <w:t xml:space="preserve">ghi nhận yêu cầu hỗ trợ (request PAYMENT chỉ xem và hỗ trợ Member gửi lại, BR-150).</w:t>
+                <w:t xml:space="preserve">ghi nhận yêu cầu hỗ trợ (request PAYMENT: tạo hộ, xem và bấm Remind giúp Member, không xử lý, BR-150).</w:t>
+              </w:r>
+            </w:ins>
+            <w:ins w:id="9195" w:author="Claude" w:date="2026-10-24T22:45:00Z">
+              <w:r>
+                <w:rPr>
+                  <w:sz w:val="18"/>
+                  <w:szCs w:val="18"/>
+                </w:rPr>
+                <w:t xml:space="preserve"> Nạp điểm hộ Member qua luồng Add points (BR-157); không tự tặng, trừ hay điều chỉnh điểm (BR-139).</w:t>
               </w:r>
             </w:ins>
           </w:p>
@@ -24936,13 +25555,13 @@
               </w:rPr>
               <w:t>Cùng quyền quầy (FrontDesk), quản lý danh mục gói, xem báo cáo hội viên, sửa hồ sơ/chuyên môn Coach, xử lý báo cáo ảnh đại diện, xem Audit Log đầy đủ.</w:t>
             </w:r>
-            <w:ins w:id="9194" w:author="Claude" w:date="2026-10-24T22:45:00Z">
+            <w:ins w:id="9198" w:author="Claude" w:date="2026-10-24T22:45:00Z">
               <w:r>
                 <w:rPr>
                   <w:sz w:val="18"/>
                   <w:szCs w:val="18"/>
                 </w:rPr>
-                <w:t xml:space="preserve"> Xử lý request PAYMENT: liên hệ Member qua điện thoại, ghi chú và ghi nhận chuyển khoản (BR-151).</w:t>
+                <w:t xml:space="preserve"> Xử lý request PAYMENT: liên hệ Member qua điện thoại, ghi chú và ghi nhận chuyển khoản (BR-151). Tặng điểm cho Member (người hoặc nhóm, kèm lý do, có Audit Log) theo BR-156.</w:t>
               </w:r>
             </w:ins>
           </w:p>
@@ -28394,7 +29013,7 @@
             <w:pPr>
               <w:spacing w:after="40"/>
             </w:pPr>
-            <w:del w:id="9195" w:author="Claude" w:date="2026-10-24T22:45:00Z">
+            <w:del w:id="9199" w:author="Claude" w:date="2026-10-24T22:45:00Z">
               <w:r>
                 <w:rPr>
                   <w:sz w:val="18"/>
@@ -28403,7 +29022,7 @@
                 <w:delText xml:space="preserve">Ghi nhận yêu cầu hỗ trợ của Member tại quầy,</w:delText>
               </w:r>
             </w:del>
-            <w:ins w:id="9196" w:author="Claude" w:date="2026-10-24T22:45:00Z">
+            <w:ins w:id="9200" w:author="Claude" w:date="2026-10-24T22:45:00Z">
               <w:r>
                 <w:rPr>
                   <w:sz w:val="18"/>
@@ -28419,16 +29038,16 @@
               </w:rPr>
               <w:t xml:space="preserve"> xem 50 yêu cầu gần nhất của một Member, phân công, cập nhật tiến độ và đóng yêu cầu (có Audit Log). Mọi nhân sự quầy đều được cập nhật hoặc đóng yêu cầu của người khác; đây là chủ đích, không có ràng buộc chỉ người được phân công.</w:t>
             </w:r>
-            <w:ins w:id="9197" w:author="Claude" w:date="2026-10-24T22:45:00Z">
+            <w:ins w:id="9201" w:author="Claude" w:date="2026-10-24T22:45:00Z">
               <w:r>
                 <w:rPr>
                   <w:sz w:val="18"/>
                   <w:szCs w:val="18"/>
                 </w:rPr>
-                <w:t xml:space="preserve"> Request PAYMENT: Member chọn hóa đơn đã thanh toán và đính kèm ảnh minh chứng, không nhập số tài khoản (BR-150); Receptionist chỉ xem và hỗ trợ Member gửi lại, không xử lý; Center Manager liên hệ Member qua điện thoại, ghi chú và ghi nhận chuyển khoản (BR-151); Member xác nhận đã nhận (BR-152).</w:t>
+                <w:t xml:space="preserve"> Request PAYMENT: Member chọn hóa đơn đã thanh toán và đính kèm ảnh minh chứng, không nhập số tài khoản (BR-150); Receptionist chỉ xem, tạo hộ và bấm Remind giúp Member, không xử lý; Center Manager liên hệ Member qua điện thoại, ghi chú và ghi nhận chuyển khoản (BR-151); Member xác nhận đã nhận (BR-152).</w:t>
               </w:r>
             </w:ins>
-            <w:ins w:id="9198" w:author="Claude" w:date="2026-10-24T22:45:00Z">
+            <w:ins w:id="9202" w:author="Claude" w:date="2026-10-24T22:45:00Z">
               <w:r>
                 <w:rPr>
                   <w:sz w:val="18"/>
@@ -28453,7 +29072,7 @@
             <w:pPr>
               <w:spacing w:after="40"/>
             </w:pPr>
-            <w:del w:id="9199" w:author="Claude" w:date="2026-10-24T22:45:00Z">
+            <w:del w:id="9203" w:author="Claude" w:date="2026-10-24T22:45:00Z">
               <w:r>
                 <w:rPr>
                   <w:sz w:val="18"/>
@@ -28462,7 +29081,7 @@
                 <w:delText xml:space="preserve">Receptionist, Center Manager</w:delText>
               </w:r>
             </w:del>
-            <w:ins w:id="9200" w:author="Claude" w:date="2026-10-24T22:45:00Z">
+            <w:ins w:id="9204" w:author="Claude" w:date="2026-10-24T22:45:00Z">
               <w:r>
                 <w:rPr>
                   <w:sz w:val="18"/>
@@ -28494,7 +29113,7 @@
               </w:rPr>
               <w:t>Đặc tả Lễ tân</w:t>
             </w:r>
-            <w:ins w:id="9201" w:author="Claude" w:date="2026-10-24T22:45:00Z">
+            <w:ins w:id="9205" w:author="Claude" w:date="2026-10-24T22:45:00Z">
               <w:r>
                 <w:rPr>
                   <w:sz w:val="18"/>
@@ -28526,7 +29145,7 @@
               </w:rPr>
               <w:t>GET/POST /api/member-support-requests</w:t>
             </w:r>
-            <w:ins w:id="9202" w:author="Claude" w:date="2026-10-24T22:45:00Z">
+            <w:ins w:id="9206" w:author="Claude" w:date="2026-10-24T22:45:00Z">
               <w:r>
                 <w:rPr>
                   <w:sz w:val="18"/>
@@ -28551,7 +29170,7 @@
             <w:pPr>
               <w:spacing w:after="40"/>
             </w:pPr>
-            <w:del w:id="9203" w:author="Claude" w:date="2026-10-24T22:45:00Z">
+            <w:del w:id="9207" w:author="Claude" w:date="2026-10-24T22:45:00Z">
               <w:r>
                 <w:rPr>
                   <w:sz w:val="18"/>
@@ -28560,7 +29179,7 @@
                 <w:delText xml:space="preserve">Đã có</w:delText>
               </w:r>
             </w:del>
-            <w:ins w:id="9204" w:author="Claude" w:date="2026-10-24T22:45:00Z">
+            <w:ins w:id="9208" w:author="Claude" w:date="2026-10-24T22:45:00Z">
               <w:r>
                 <w:rPr>
                   <w:sz w:val="18"/>
@@ -29058,7 +29677,7 @@
               </w:rPr>
               <w:t xml:space="preserve">Vé Gym 1 ngày: 50.000 VND, </w:t>
             </w:r>
-            <w:del w:id="9205" w:author="Claude" w:date="2026-10-24T22:45:00Z">
+            <w:del w:id="9209" w:author="Claude" w:date="2026-10-24T22:45:00Z">
               <w:r>
                 <w:rPr>
                   <w:sz w:val="18"/>
@@ -29067,7 +29686,7 @@
                 <w:delText xml:space="preserve">có hiệu lực trong ngày thanh toán (giờ Việt Nam), mỗi Member một vé còn hiệu lực mỗi ngày, không bán khi Gym đang đóng cửa.</w:delText>
               </w:r>
             </w:del>
-            <w:ins w:id="9206" w:author="Claude" w:date="2026-10-24T22:45:00Z">
+            <w:ins w:id="9210" w:author="Claude" w:date="2026-10-24T22:45:00Z">
               <w:r>
                 <w:rPr>
                   <w:sz w:val="18"/>
@@ -29076,7 +29695,7 @@
                 <w:t xml:space="preserve">chỉ bán từ 06:00 đến trước 22:00 giờ Việt Nam, hết hạn 22:00 cùng ngày mua; trong 60 phút cuối trước giờ đóng cửa 22:00 báo Member ngay lúc đặt ghi chú Gym đóng cửa; mỗi Member một vé còn hiệu lực mỗi ngày, không bán khi Gym đóng cửa vì sự cố; thanh toán thành công sau 22:00 không tự cấp vé (BR-88).</w:t>
               </w:r>
             </w:ins>
-            <w:ins w:id="9207" w:author="Claude" w:date="2026-10-24T22:45:00Z">
+            <w:ins w:id="9211" w:author="Claude" w:date="2026-10-24T22:45:00Z">
               <w:r>
                 <w:rPr>
                   <w:sz w:val="18"/>
@@ -29131,7 +29750,7 @@
               </w:rPr>
               <w:t>Quyết định chủ sản phẩm</w:t>
             </w:r>
-            <w:ins w:id="9208" w:author="Claude" w:date="2026-10-24T22:45:00Z">
+            <w:ins w:id="9212" w:author="Claude" w:date="2026-10-24T22:45:00Z">
               <w:r>
                 <w:rPr>
                   <w:sz w:val="18"/>
@@ -29163,7 +29782,7 @@
               </w:rPr>
               <w:t>Cùng endpoint checkout; hằng số DayPass.PackageId = 50000</w:t>
             </w:r>
-            <w:ins w:id="9209" w:author="Claude" w:date="2026-10-24T22:45:00Z">
+            <w:ins w:id="9213" w:author="Claude" w:date="2026-10-24T22:45:00Z">
               <w:r>
                 <w:rPr>
                   <w:sz w:val="18"/>
@@ -29188,7 +29807,7 @@
             <w:pPr>
               <w:spacing w:after="40"/>
             </w:pPr>
-            <w:del w:id="9210" w:author="Claude" w:date="2026-10-24T22:45:00Z">
+            <w:del w:id="9214" w:author="Claude" w:date="2026-10-24T22:45:00Z">
               <w:r>
                 <w:rPr>
                   <w:sz w:val="18"/>
@@ -29197,7 +29816,7 @@
                 <w:delText xml:space="preserve">Đã có</w:delText>
               </w:r>
             </w:del>
-            <w:ins w:id="9211" w:author="Claude" w:date="2026-10-24T22:45:00Z">
+            <w:ins w:id="9215" w:author="Claude" w:date="2026-10-24T22:45:00Z">
               <w:r>
                 <w:rPr>
                   <w:sz w:val="18"/>
@@ -29542,7 +30161,7 @@
             <w:pPr>
               <w:spacing w:after="40"/>
             </w:pPr>
-            <w:del w:id="9305" w:author="Claude" w:date="2026-10-24T22:45:00Z">
+            <w:del w:id="9332" w:author="Claude" w:date="2026-10-24T22:45:00Z">
               <w:r>
                 <w:rPr>
                   <w:sz w:val="18"/>
@@ -29551,7 +30170,7 @@
                 <w:delText xml:space="preserve">Gia hạn Membership đang Active thêm số ngày Gym đóng cửa do sự cố (không áp dụng vé ngày).</w:delText>
               </w:r>
             </w:del>
-            <w:ins w:id="9306" w:author="Claude" w:date="2026-10-24T22:45:00Z">
+            <w:ins w:id="9333" w:author="Claude" w:date="2026-10-24T22:45:00Z">
               <w:r>
                 <w:rPr>
                   <w:sz w:val="18"/>
@@ -29560,7 +30179,7 @@
                 <w:t xml:space="preserve">Center Manager tặng điểm cho Member khi Gym đóng cửa do sự cố, thay cho gia hạn Membership: tự nhập số điểm, chọn người hoặc nhóm nhận bằng bộ lọc (BR-130, BR-155).</w:t>
               </w:r>
             </w:ins>
-            <w:ins w:id="9307" w:author="Claude" w:date="2026-10-24T22:45:00Z">
+            <w:ins w:id="9334" w:author="Claude" w:date="2026-10-24T22:45:00Z">
               <w:r>
                 <w:t xml:space="preserve"> Cập nhật 25/10/2026 (quyết định bổ sung của nhóm: sự cố Gym tạm thời tặng điểm do Center Manager quyết định, thay cho gia hạn Membership).</w:t>
               </w:r>
@@ -29581,7 +30200,7 @@
             <w:pPr>
               <w:spacing w:after="40"/>
             </w:pPr>
-            <w:del w:id="9308" w:author="Claude" w:date="2026-10-24T22:45:00Z">
+            <w:del w:id="9335" w:author="Claude" w:date="2026-10-24T22:45:00Z">
               <w:r>
                 <w:rPr>
                   <w:sz w:val="18"/>
@@ -29590,7 +30209,7 @@
                 <w:delText xml:space="preserve">Hệ thống (Flow 2 gọi)</w:delText>
               </w:r>
             </w:del>
-            <w:ins w:id="9309" w:author="Claude" w:date="2026-10-24T22:45:00Z">
+            <w:ins w:id="9336" w:author="Claude" w:date="2026-10-24T22:45:00Z">
               <w:r>
                 <w:rPr>
                   <w:sz w:val="18"/>
@@ -29622,7 +30241,7 @@
               </w:rPr>
               <w:t>BR-130, 138</w:t>
             </w:r>
-            <w:ins w:id="9310" w:author="Claude" w:date="2026-10-24T22:45:00Z">
+            <w:ins w:id="9337" w:author="Claude" w:date="2026-10-24T22:45:00Z">
               <w:r>
                 <w:rPr>
                   <w:sz w:val="18"/>
@@ -29654,7 +30273,7 @@
               </w:rPr>
               <w:t>IMembershipClosureExtension</w:t>
             </w:r>
-            <w:ins w:id="9311" w:author="Claude" w:date="2026-10-24T22:45:00Z">
+            <w:ins w:id="9338" w:author="Claude" w:date="2026-10-24T22:45:00Z">
               <w:r>
                 <w:rPr>
                   <w:sz w:val="18"/>
@@ -29679,7 +30298,7 @@
             <w:pPr>
               <w:spacing w:after="40"/>
             </w:pPr>
-            <w:del w:id="9312" w:author="Claude" w:date="2026-10-24T22:45:00Z">
+            <w:del w:id="9339" w:author="Claude" w:date="2026-10-24T22:45:00Z">
               <w:r>
                 <w:rPr>
                   <w:sz w:val="18"/>
@@ -29688,7 +30307,7 @@
                 <w:delText xml:space="preserve">Đã có</w:delText>
               </w:r>
             </w:del>
-            <w:ins w:id="9313" w:author="Claude" w:date="2026-10-24T22:45:00Z">
+            <w:ins w:id="9340" w:author="Claude" w:date="2026-10-24T22:45:00Z">
               <w:r>
                 <w:rPr>
                   <w:sz w:val="18"/>
@@ -31297,7 +31916,7 @@
               </w:rPr>
               <w:t xml:space="preserve">Lưu UTC; ngày hiệu lực Membership tính theo ngày lịch Việt Nam, hai đầu inclusive; </w:t>
             </w:r>
-            <w:del w:id="9212" w:author="Claude" w:date="2026-10-24T22:45:00Z">
+            <w:del w:id="9216" w:author="Claude" w:date="2026-10-24T22:45:00Z">
               <w:r>
                 <w:rPr>
                   <w:sz w:val="18"/>
@@ -31306,7 +31925,7 @@
                 <w:delText xml:space="preserve">vé ngày hết hạn cuối ngày;</w:delText>
               </w:r>
             </w:del>
-            <w:ins w:id="9213" w:author="Claude" w:date="2026-10-24T22:45:00Z">
+            <w:ins w:id="9217" w:author="Claude" w:date="2026-10-24T22:45:00Z">
               <w:r>
                 <w:rPr>
                   <w:sz w:val="18"/>
@@ -31322,7 +31941,7 @@
               </w:rPr>
               <w:t xml:space="preserve"> job chạy mỗi 15 phút.</w:t>
             </w:r>
-            <w:ins w:id="9214" w:author="Claude" w:date="2026-10-24T22:45:00Z">
+            <w:ins w:id="9218" w:author="Claude" w:date="2026-10-24T22:45:00Z">
               <w:r>
                 <w:rPr>
                   <w:sz w:val="18"/>

</xml_diff>

<commit_message>
wip(refunds): checkpoint center cancellation and operations changes
- Self-cancel membership/class/rental without automatic point refund; add member choice and scheduled point credit for center-cancelled class/rental items.

- Start splitting hybrid VNPay/point support payouts; adjust refund guards, calculations, and related UI/tests.

- Add court booking hour/window limits, receptionist check-in/no-show flow, and audited attendance corrections.

- Update workflow, API contract, business rules, and design docs; remove obsolete SRS and team handoff files.

Incomplete: refund and incident business flows remain in progress. Tests and end-to-end behavior have not been fully verified; review before merging.
</commit_message>
<xml_diff>
--- a/docs/SportManagement_BusinessRules_v2.0_updated.docx
+++ b/docs/SportManagement_BusinessRules_v2.0_updated.docx
@@ -7563,8 +7563,26 @@
                 <w:sz w:val="18"/>
                 <w:szCs w:val="18"/>
               </w:rPr>
-              <w:t>Buổi PT mà Member đã đặt nhưng không tham gia và không hủy đúng hạn theo BR-76 được ghi nhận No-show và consume 1 PT session theo BR-77; hệ thống phải lưu lịch sử No-show. Buổi PT đã hủy đúng hạn không được tính là No-show. Trạng thái No-show không áp dụng cho buổi lớp nhóm.</w:t>
-            </w:r>
+              <w:t xml:space="preserve">Buổi PT mà Member đã đặt nhưng không tham gia và không hủy đúng hạn theo BR-76 được ghi nhận No-show và consume 1 PT session theo BR-77; hệ thống phải lưu lịch sử No-show. Buổi PT đã hủy đúng hạn không được tính là No-show. </w:t>
+            </w:r>
+            <w:del w:id="9412" w:author="Claude" w:date="2026-10-24T22:45:00Z">
+              <w:r>
+                <w:rPr>
+                  <w:sz w:val="18"/>
+                  <w:szCs w:val="18"/>
+                </w:rPr>
+                <w:delText xml:space="preserve">Trạng thái No-show không áp dụng cho buổi lớp nhóm.</w:delText>
+              </w:r>
+            </w:del>
+            <w:ins w:id="9413" w:author="Claude" w:date="2026-10-24T22:45:00Z">
+              <w:r>
+                <w:rPr>
+                  <w:sz w:val="18"/>
+                  <w:szCs w:val="18"/>
+                </w:rPr>
+                <w:t xml:space="preserve">Trạng thái No-show không áp dụng cho buổi lớp nhóm; lượt thuê sân có trạng thái No-show riêng theo BR-159 và không consume PT session.</w:t>
+              </w:r>
+            </w:ins>
           </w:p>
         </w:tc>
         <w:tc>
@@ -7677,6 +7695,15 @@
               </w:rPr>
               <w:t>Mỗi ghi danh (Enrollment) có tối đa một Attendance record cho mỗi buổi (Session). Trạng thái Attendance của buổi lớp nhóm là Present hoặc Absent; của buổi PT là Present, Absent hoặc No-show.</w:t>
             </w:r>
+            <w:ins w:id="9411" w:author="Claude" w:date="2026-10-24T22:45:00Z">
+              <w:r>
+                <w:rPr>
+                  <w:sz w:val="18"/>
+                  <w:szCs w:val="18"/>
+                </w:rPr>
+                <w:t xml:space="preserve"> Lượt thuê sân không dùng Attendance mà có trạng thái check-in riêng (BR-159).</w:t>
+              </w:r>
+            </w:ins>
           </w:p>
         </w:tc>
         <w:tc>
@@ -7782,13 +7809,29 @@
             <w:vAlign w:val="center"/>
           </w:tcPr>
           <w:p>
-            <w:r>
-              <w:rPr>
-                <w:sz w:val="18"/>
-                <w:szCs w:val="18"/>
-              </w:rPr>
-              <w:t>Receptionist chịu trách nhiệm ghi Present hoặc Absent cho từng học viên có ghi danh CONFIRMED trong buổi lớp nhóm (Cầu lông, Bóng rổ); được sửa bản ghi trong 24 giờ sau khi buổi kết thúc và mọi sửa đổi phải có Audit Log. Với lớp nhóm chỉ ghi điểm danh, không ghi kết quả tập luyện (BR-24). Coach không có quyền điểm danh lớp nhóm; Center Manager không mặc nhiên có quyền điểm danh.</w:t>
-            </w:r>
+            <w:del w:id="9408" w:author="Claude" w:date="2026-10-24T22:45:00Z">
+              <w:r>
+                <w:rPr>
+                  <w:sz w:val="18"/>
+                  <w:szCs w:val="18"/>
+                </w:rPr>
+                <w:delText xml:space="preserve">Receptionist chịu trách nhiệm ghi Present hoặc Absent cho từng học viên có ghi danh CONFIRMED trong buổi lớp nhóm (Cầu lông, Bóng rổ); được sửa bản ghi trong 24 giờ sau khi buổi kết thúc và mọi sửa đổi phải có Audit Log. Với lớp nhóm chỉ ghi điểm danh, không ghi kết quả tập luyện (BR-24). Coach không có quyền điểm danh lớp nhóm; Center Manager không mặc nhiên có quyền điểm danh.</w:delText>
+              </w:r>
+            </w:del>
+            <w:ins w:id="9409" w:author="Claude" w:date="2026-10-24T22:45:00Z">
+              <w:r>
+                <w:rPr>
+                  <w:sz w:val="18"/>
+                  <w:szCs w:val="18"/>
+                </w:rPr>
+                <w:t xml:space="preserve">Coach phụ trách lớp nhóm (Cầu lông, Bóng rổ) ghi Present hoặc Absent cho từng học viên có ghi danh CONFIRMED trong buổi lớp mình phụ trách; Coach được sửa bản ghi của mình trong 24 giờ sau khi buổi kết thúc. Khi Coach điểm danh sai và Member kiến nghị, Receptionist được chỉnh sửa bản ghi điểm danh đó; bắt buộc nhập lý do và ghi nhận Member đã kiến nghị. Receptionist chỉ chỉnh sửa theo kiến nghị, không điểm danh thay Coach. Mọi sửa đổi (của Coach hay Receptionist) phải có Audit Log gồm người sửa, giá trị cũ và mới, lý do và thời điểm. Với lớp nhóm chỉ ghi điểm danh, không ghi kết quả tập luyện (BR-24). Center Manager không mặc nhiên có quyền điểm danh.</w:t>
+              </w:r>
+            </w:ins>
+            <w:ins w:id="9410" w:author="Claude" w:date="2026-10-24T22:45:00Z">
+              <w:r>
+                <w:t xml:space="preserve"> Cập nhật 25/10/2026 (quyết định bổ sung của nhóm: Coach điểm danh lớp, Receptionist chỉnh khi Member kiến nghị; Receptionist đánh dấu check-in hoặc no-show lượt thuê sân; khung giờ thuê sân áp dụng cả khi Receptionist đặt hộ).</w:t>
+              </w:r>
+            </w:ins>
           </w:p>
         </w:tc>
         <w:tc>
@@ -10201,7 +10244,7 @@
                   <w:sz w:val="18"/>
                   <w:szCs w:val="18"/>
                 </w:rPr>
-                <w:t xml:space="preserve"> Với Member, chỉ hiển thị các khung giờ sân trong 3 ngày lịch tính từ ngày hiện tại (hôm nay và 2 ngày kế tiếp); ngày xa hơn không hiển thị và không đặt được. Quy tắc này chỉ áp dụng cho Member, không đổi Lịch sân của Center Manager và Receptionist (BR-131). Cập nhật 25/10/2026 (quyết định bổ sung của nhóm, chưa ghi trong Payment-Support-Workflow.md).</w:t>
+                <w:t xml:space="preserve"> Member tự thuê và Receptionist đặt hộ Member chỉ thuê sân trong khung giờ 06:00 đến trước 22:00 giờ Việt Nam (Asia/Ho_Chi_Minh); từ 22:00 đến 06:00 sáng hôm sau không thuê hoặc đặt hộ được sân. Với Member (và khi Receptionist đặt hộ), chỉ hiển thị và đặt được các khung giờ sân trong 3 ngày lịch tính từ ngày hiện tại (hôm nay và 2 ngày kế tiếp); cửa sổ ngày chuyển sang ngày mới lúc 06:00 sáng chứ không phải 00:00. Ví dụ từ 06:00 ngày 26 Member thuê được ngày 26, 27 và 28; từ 06:00 ngày 27 là ngày 27, 28 và 29; ngày xa hơn không hiển thị và không đặt được. Quy tắc này áp dụng cho cả Member tự thuê và Receptionist đặt hộ Member tại quầy (cùng khung giờ và cùng cửa sổ 3 ngày lịch); Lịch sân mà Center Manager và Receptionist xem (BR-131) không bị giới hạn bởi cửa sổ này. Cập nhật 25/10/2026 (quyết định bổ sung của nhóm, chưa ghi trong Payment-Support-Workflow.md).</w:t>
               </w:r>
             </w:ins>
           </w:p>
@@ -10443,7 +10486,7 @@
                   <w:sz w:val="18"/>
                   <w:szCs w:val="18"/>
                 </w:rPr>
-                <w:t xml:space="preserve">chỉ đặt được trong 3 ngày lịch tính từ ngày hiện tại (BR-126)</w:t>
+                <w:t xml:space="preserve">chỉ đặt được trong 3 ngày lịch tính từ ngày hiện tại và trong khung giờ 06:00 đến trước 22:00 (BR-126)</w:t>
               </w:r>
             </w:ins>
             <w:r>
@@ -10881,8 +10924,42 @@
                 <w:sz w:val="18"/>
                 <w:szCs w:val="18"/>
               </w:rPr>
-              <w:t>Center Manager và Receptionist xem Lịch sân (Court Schedule) theo ngày/tuần/Room; mỗi khung giờ hiển thị chủ thể sử dụng (lớp và Coach, PT và Coach, Member thuê, bảo trì). Với lớp nhóm và PT hiển thị danh sách học viên (họ tên, tình trạng điểm danh); với lượt thuê sân chỉ hiển thị Member đã thuê, không quản lý người đi cùng và không điểm danh (Receptionist và Coach không điểm danh cho lượt thuê sân). Coach chỉ xem Lịch sân liên quan đến lớp mình phụ trách.</w:t>
-            </w:r>
+              <w:t xml:space="preserve">Center Manager và Receptionist xem Lịch sân (Court Schedule) theo ngày/tuần/Room; mỗi khung giờ hiển thị chủ thể sử dụng (lớp và Coach, PT và Coach, Member thuê, bảo trì). Với lớp nhóm và PT hiển thị danh sách học viên (họ tên, tình trạng điểm danh); với lượt thuê sân chỉ hiển thị Member đã thuê, không quản lý người đi cùng </w:t>
+            </w:r>
+            <w:del w:id="9414" w:author="Claude" w:date="2026-10-24T22:45:00Z">
+              <w:r>
+                <w:rPr>
+                  <w:sz w:val="18"/>
+                  <w:szCs w:val="18"/>
+                </w:rPr>
+                <w:delText xml:space="preserve">và không điểm danh (Receptionist và Coach không điểm danh cho lượt thuê sân)</w:delText>
+              </w:r>
+            </w:del>
+            <w:ins w:id="9415" w:author="Claude" w:date="2026-10-24T22:45:00Z">
+              <w:r>
+                <w:rPr>
+                  <w:sz w:val="18"/>
+                  <w:szCs w:val="18"/>
+                </w:rPr>
+                <w:t xml:space="preserve">và không điểm danh người đi cùng; trạng thái check-in của lượt thuê do Receptionist đánh dấu (BR-159), Coach không đánh dấu</w:t>
+              </w:r>
+            </w:ins>
+            <w:r>
+              <w:rPr>
+                <w:sz w:val="18"/>
+                <w:szCs w:val="18"/>
+              </w:rPr>
+              <w:t xml:space="preserve">. Coach chỉ xem Lịch sân liên quan đến lớp mình phụ trách.</w:t>
+            </w:r>
+            <w:ins w:id="9416" w:author="Claude" w:date="2026-10-24T22:45:00Z">
+              <w:r>
+                <w:rPr>
+                  <w:sz w:val="18"/>
+                  <w:szCs w:val="18"/>
+                </w:rPr>
+                <w:t xml:space="preserve"> Cập nhật 25/10/2026 (quyết định bổ sung của nhóm: Coach điểm danh lớp, Receptionist chỉnh khi Member kiến nghị; Receptionist đánh dấu check-in hoặc no-show lượt thuê sân; khung giờ thuê sân áp dụng cả khi Receptionist đặt hộ).</w:t>
+              </w:r>
+            </w:ins>
           </w:p>
         </w:tc>
         <w:tc>
@@ -10946,6 +11023,154 @@
               </w:rPr>
               <w:t>Feedback giảng viên — liệt kê coach nắm sân nào ở thời điểm nào, thông tin học viên</w:t>
             </w:r>
+          </w:p>
+        </w:tc>
+      </w:tr>
+      <w:tr>
+        <w:trPr>
+          <w:cantSplit/>
+          <w:ins w:id="9424" w:author="Claude" w:date="2026-10-24T22:45:00Z"/>
+        </w:trPr>
+        <w:tc>
+          <w:tcPr>
+            <w:tcW w:w="900" w:type="dxa"/>
+            <w:tcMar>
+              <w:top w:w="60" w:type="dxa"/>
+              <w:left w:w="100" w:type="dxa"/>
+              <w:bottom w:w="60" w:type="dxa"/>
+              <w:right w:w="100" w:type="dxa"/>
+            </w:tcMar>
+            <w:vAlign w:val="center"/>
+          </w:tcPr>
+          <w:p>
+            <w:pPr>
+              <w:rPr>
+                <w:ins w:id="9425" w:author="Claude" w:date="2026-10-24T22:45:00Z"/>
+              </w:rPr>
+            </w:pPr>
+            <w:ins w:id="9426" w:author="Claude" w:date="2026-10-24T22:45:00Z">
+              <w:r>
+                <w:rPr>
+                  <w:b/>
+                  <w:bCs/>
+                  <w:sz w:val="18"/>
+                  <w:szCs w:val="18"/>
+                </w:rPr>
+                <w:t xml:space="preserve">BR-159</w:t>
+              </w:r>
+            </w:ins>
+          </w:p>
+        </w:tc>
+        <w:tc>
+          <w:tcPr>
+            <w:tcW w:w="5200" w:type="dxa"/>
+            <w:tcMar>
+              <w:top w:w="60" w:type="dxa"/>
+              <w:left w:w="100" w:type="dxa"/>
+              <w:bottom w:w="60" w:type="dxa"/>
+              <w:right w:w="100" w:type="dxa"/>
+            </w:tcMar>
+            <w:vAlign w:val="center"/>
+          </w:tcPr>
+          <w:p>
+            <w:pPr>
+              <w:rPr>
+                <w:ins w:id="9427" w:author="Claude" w:date="2026-10-24T22:45:00Z"/>
+              </w:rPr>
+            </w:pPr>
+            <w:ins w:id="9428" w:author="Claude" w:date="2026-10-24T22:45:00Z">
+              <w:r>
+                <w:rPr>
+                  <w:sz w:val="18"/>
+                  <w:szCs w:val="18"/>
+                </w:rPr>
+                <w:t xml:space="preserve">Mỗi lượt thuê sân CONFIRMED có trạng thái sử dụng: Chưa check-in (mặc định), Checked-in hoặc No-show. Chỉ Receptionist đánh dấu Checked-in hoặc No-show cho từng lượt thuê, tùy Member có đến hay không; Member, Coach và Center Manager không đánh dấu. Hết giờ thuê (giờ kết thúc của lượt) mà Receptionist chưa đánh dấu thì hệ thống tự động ghi No-show. Mỗi lần ghi lưu người ghi (hoặc System khi tự động) và thời điểm; việc sửa trạng thái đã ghi, kể cả No-show tự động, cần lý do và Audit Log. Trạng thái này chỉ để theo dõi sử dụng: No-show không đổi Invoice, không hoàn tiền hay điểm (BR-129) và không consume PT session (BR-20). Cập nhật 25/10/2026 (quyết định bổ sung của nhóm: Coach điểm danh lớp, Receptionist chỉnh khi Member kiến nghị; Receptionist đánh dấu check-in hoặc no-show lượt thuê sân; khung giờ thuê sân áp dụng cả khi Receptionist đặt hộ).</w:t>
+              </w:r>
+            </w:ins>
+          </w:p>
+        </w:tc>
+        <w:tc>
+          <w:tcPr>
+            <w:tcW w:w="1400" w:type="dxa"/>
+            <w:tcMar>
+              <w:top w:w="60" w:type="dxa"/>
+              <w:left w:w="100" w:type="dxa"/>
+              <w:bottom w:w="60" w:type="dxa"/>
+              <w:right w:w="100" w:type="dxa"/>
+            </w:tcMar>
+            <w:vAlign w:val="center"/>
+          </w:tcPr>
+          <w:p>
+            <w:pPr>
+              <w:rPr>
+                <w:ins w:id="9429" w:author="Claude" w:date="2026-10-24T22:45:00Z"/>
+              </w:rPr>
+            </w:pPr>
+            <w:ins w:id="9430" w:author="Claude" w:date="2026-10-24T22:45:00Z">
+              <w:r>
+                <w:rPr>
+                  <w:sz w:val="18"/>
+                  <w:szCs w:val="18"/>
+                </w:rPr>
+                <w:t xml:space="preserve">Ràng buộc</w:t>
+              </w:r>
+            </w:ins>
+          </w:p>
+        </w:tc>
+        <w:tc>
+          <w:tcPr>
+            <w:tcW w:w="1300" w:type="dxa"/>
+            <w:tcMar>
+              <w:top w:w="60" w:type="dxa"/>
+              <w:left w:w="100" w:type="dxa"/>
+              <w:bottom w:w="60" w:type="dxa"/>
+              <w:right w:w="100" w:type="dxa"/>
+            </w:tcMar>
+            <w:vAlign w:val="center"/>
+          </w:tcPr>
+          <w:p>
+            <w:pPr>
+              <w:rPr>
+                <w:ins w:id="9431" w:author="Claude" w:date="2026-10-24T22:45:00Z"/>
+              </w:rPr>
+            </w:pPr>
+            <w:ins w:id="9432" w:author="Claude" w:date="2026-10-24T22:45:00Z">
+              <w:r>
+                <w:rPr>
+                  <w:sz w:val="18"/>
+                  <w:szCs w:val="18"/>
+                </w:rPr>
+                <w:t xml:space="preserve">Động</w:t>
+              </w:r>
+            </w:ins>
+          </w:p>
+        </w:tc>
+        <w:tc>
+          <w:tcPr>
+            <w:tcW w:w="2400" w:type="dxa"/>
+            <w:tcMar>
+              <w:top w:w="60" w:type="dxa"/>
+              <w:left w:w="100" w:type="dxa"/>
+              <w:bottom w:w="60" w:type="dxa"/>
+              <w:right w:w="100" w:type="dxa"/>
+            </w:tcMar>
+            <w:vAlign w:val="center"/>
+          </w:tcPr>
+          <w:p>
+            <w:pPr>
+              <w:rPr>
+                <w:ins w:id="9433" w:author="Claude" w:date="2026-10-24T22:45:00Z"/>
+              </w:rPr>
+            </w:pPr>
+            <w:ins w:id="9434" w:author="Claude" w:date="2026-10-24T22:45:00Z">
+              <w:r>
+                <w:rPr>
+                  <w:sz w:val="18"/>
+                  <w:szCs w:val="18"/>
+                </w:rPr>
+                <w:t xml:space="preserve">Quyết định nhóm 25/10/2026 — check-in sân thuê và tự động No-show</w:t>
+              </w:r>
+            </w:ins>
           </w:p>
         </w:tc>
       </w:tr>
@@ -11411,8 +11636,42 @@
                 <w:sz w:val="18"/>
                 <w:szCs w:val="18"/>
               </w:rPr>
-              <w:t>Member được tự checkout gói cho chính mình; Receptionist được checkout thay cho một Member được chọn rõ ràng (kể cả có dùng điểm theo BR-139); Member tự checkout lượt thuê sân của chính mình. Hệ thống phải lưu riêng người thụ hưởng dịch vụ và người khởi tạo checkout. Center Manager được xem giao dịch và xử lý ngoại lệ nhưng System Administrator không mặc nhiên có quyền Payment hoặc Revenue.</w:t>
-            </w:r>
+              <w:t xml:space="preserve">Member được tự checkout gói cho chính mình; Receptionist được checkout thay cho một Member được chọn rõ ràng (kể cả có dùng điểm theo BR-139); </w:t>
+            </w:r>
+            <w:del w:id="9417" w:author="Claude" w:date="2026-10-24T22:45:00Z">
+              <w:r>
+                <w:rPr>
+                  <w:sz w:val="18"/>
+                  <w:szCs w:val="18"/>
+                </w:rPr>
+                <w:delText xml:space="preserve">Member tự checkout lượt thuê sân của chính mình.</w:delText>
+              </w:r>
+            </w:del>
+            <w:ins w:id="9418" w:author="Claude" w:date="2026-10-24T22:45:00Z">
+              <w:r>
+                <w:rPr>
+                  <w:sz w:val="18"/>
+                  <w:szCs w:val="18"/>
+                </w:rPr>
+                <w:t xml:space="preserve">Member tự checkout lượt thuê sân của chính mình; Receptionist cũng được đặt và checkout lượt thuê sân thay cho Member được chọn rõ ràng, theo cùng khung giờ và cửa sổ ngày của BR-126.</w:t>
+              </w:r>
+            </w:ins>
+            <w:r>
+              <w:rPr>
+                <w:sz w:val="18"/>
+                <w:szCs w:val="18"/>
+              </w:rPr>
+              <w:t xml:space="preserve"> Hệ thống phải lưu riêng người thụ hưởng dịch vụ và người khởi tạo checkout. Center Manager được xem giao dịch và xử lý ngoại lệ nhưng System Administrator không mặc nhiên có quyền Payment hoặc Revenue.</w:t>
+            </w:r>
+            <w:ins w:id="9419" w:author="Claude" w:date="2026-10-24T22:45:00Z">
+              <w:r>
+                <w:rPr>
+                  <w:sz w:val="18"/>
+                  <w:szCs w:val="18"/>
+                </w:rPr>
+                <w:t xml:space="preserve"> Cập nhật 25/10/2026 (quyết định bổ sung của nhóm: Coach điểm danh lớp, Receptionist chỉnh khi Member kiến nghị; Receptionist đánh dấu check-in hoặc no-show lượt thuê sân; khung giờ thuê sân áp dụng cả khi Receptionist đặt hộ).</w:t>
+              </w:r>
+            </w:ins>
           </w:p>
         </w:tc>
         <w:tc>
@@ -15908,6 +16167,154 @@
                   <w:szCs w:val="18"/>
                 </w:rPr>
                 <w:t xml:space="preserve">Quyết định nhóm 25/10/2026 — Receptionist nạp điểm hộ; giới hạn theo api-contract.md</w:t>
+              </w:r>
+            </w:ins>
+          </w:p>
+        </w:tc>
+      </w:tr>
+      <w:tr>
+        <w:trPr>
+          <w:cantSplit/>
+          <w:ins w:id="9397" w:author="Claude" w:date="2026-10-24T22:45:00Z"/>
+        </w:trPr>
+        <w:tc>
+          <w:tcPr>
+            <w:tcW w:w="900" w:type="dxa"/>
+            <w:tcMar>
+              <w:top w:w="60" w:type="dxa"/>
+              <w:left w:w="100" w:type="dxa"/>
+              <w:bottom w:w="60" w:type="dxa"/>
+              <w:right w:w="100" w:type="dxa"/>
+            </w:tcMar>
+            <w:vAlign w:val="center"/>
+          </w:tcPr>
+          <w:p>
+            <w:pPr>
+              <w:rPr>
+                <w:ins w:id="9398" w:author="Claude" w:date="2026-10-24T22:45:00Z"/>
+              </w:rPr>
+            </w:pPr>
+            <w:ins w:id="9399" w:author="Claude" w:date="2026-10-24T22:45:00Z">
+              <w:r>
+                <w:rPr>
+                  <w:b/>
+                  <w:bCs/>
+                  <w:sz w:val="18"/>
+                  <w:szCs w:val="18"/>
+                </w:rPr>
+                <w:t xml:space="preserve">BR-158</w:t>
+              </w:r>
+            </w:ins>
+          </w:p>
+        </w:tc>
+        <w:tc>
+          <w:tcPr>
+            <w:tcW w:w="5200" w:type="dxa"/>
+            <w:tcMar>
+              <w:top w:w="60" w:type="dxa"/>
+              <w:left w:w="100" w:type="dxa"/>
+              <w:bottom w:w="60" w:type="dxa"/>
+              <w:right w:w="100" w:type="dxa"/>
+            </w:tcMar>
+            <w:vAlign w:val="center"/>
+          </w:tcPr>
+          <w:p>
+            <w:pPr>
+              <w:rPr>
+                <w:ins w:id="9400" w:author="Claude" w:date="2026-10-24T22:45:00Z"/>
+              </w:rPr>
+            </w:pPr>
+            <w:ins w:id="9401" w:author="Claude" w:date="2026-10-24T22:45:00Z">
+              <w:r>
+                <w:rPr>
+                  <w:sz w:val="18"/>
+                  <w:szCs w:val="18"/>
+                </w:rPr>
+                <w:t xml:space="preserve">Khi Gym đóng cửa tạm thời vì sự cố (BR-130): (a) không bán thêm Gym day pass trong thời gian đóng, yêu cầu mua vé bị từ chối 409 gym_closed_today; (b) không cho check-in trong thời gian đóng, kể cả Member đã mua vé, hệ thống trả 409 gym_closed; (c) vé đã mua vẫn hết hạn lúc 22:00 cùng ngày (BR-145), không được gia hạn và không được hoàn bằng điểm qua luồng hoàn hiện có; (d) Center Manager có thể gửi thông báo email (BR-138) cho những Member đã mua day pass vào ngày xảy ra sự cố; nếu Member đồng ý nhận điểm thì Center Manager tặng điểm theo BR-155 và BR-156, nếu không thì Member gửi Support Request (BR-147). Cập nhật 25/10/2026 (quyết định bổ sung của nhóm: Gym day pass khi Gym đóng vì sự cố).</w:t>
+              </w:r>
+            </w:ins>
+          </w:p>
+        </w:tc>
+        <w:tc>
+          <w:tcPr>
+            <w:tcW w:w="1400" w:type="dxa"/>
+            <w:tcMar>
+              <w:top w:w="60" w:type="dxa"/>
+              <w:left w:w="100" w:type="dxa"/>
+              <w:bottom w:w="60" w:type="dxa"/>
+              <w:right w:w="100" w:type="dxa"/>
+            </w:tcMar>
+            <w:vAlign w:val="center"/>
+          </w:tcPr>
+          <w:p>
+            <w:pPr>
+              <w:rPr>
+                <w:ins w:id="9402" w:author="Claude" w:date="2026-10-24T22:45:00Z"/>
+              </w:rPr>
+            </w:pPr>
+            <w:ins w:id="9403" w:author="Claude" w:date="2026-10-24T22:45:00Z">
+              <w:r>
+                <w:rPr>
+                  <w:sz w:val="18"/>
+                  <w:szCs w:val="18"/>
+                </w:rPr>
+                <w:t xml:space="preserve">Ràng buộc</w:t>
+              </w:r>
+            </w:ins>
+          </w:p>
+        </w:tc>
+        <w:tc>
+          <w:tcPr>
+            <w:tcW w:w="1300" w:type="dxa"/>
+            <w:tcMar>
+              <w:top w:w="60" w:type="dxa"/>
+              <w:left w:w="100" w:type="dxa"/>
+              <w:bottom w:w="60" w:type="dxa"/>
+              <w:right w:w="100" w:type="dxa"/>
+            </w:tcMar>
+            <w:vAlign w:val="center"/>
+          </w:tcPr>
+          <w:p>
+            <w:pPr>
+              <w:rPr>
+                <w:ins w:id="9404" w:author="Claude" w:date="2026-10-24T22:45:00Z"/>
+              </w:rPr>
+            </w:pPr>
+            <w:ins w:id="9405" w:author="Claude" w:date="2026-10-24T22:45:00Z">
+              <w:r>
+                <w:rPr>
+                  <w:sz w:val="18"/>
+                  <w:szCs w:val="18"/>
+                </w:rPr>
+                <w:t xml:space="preserve">Động</w:t>
+              </w:r>
+            </w:ins>
+          </w:p>
+        </w:tc>
+        <w:tc>
+          <w:tcPr>
+            <w:tcW w:w="2400" w:type="dxa"/>
+            <w:tcMar>
+              <w:top w:w="60" w:type="dxa"/>
+              <w:left w:w="100" w:type="dxa"/>
+              <w:bottom w:w="60" w:type="dxa"/>
+              <w:right w:w="100" w:type="dxa"/>
+            </w:tcMar>
+            <w:vAlign w:val="center"/>
+          </w:tcPr>
+          <w:p>
+            <w:pPr>
+              <w:rPr>
+                <w:ins w:id="9406" w:author="Claude" w:date="2026-10-24T22:45:00Z"/>
+              </w:rPr>
+            </w:pPr>
+            <w:ins w:id="9407" w:author="Claude" w:date="2026-10-24T22:45:00Z">
+              <w:r>
+                <w:rPr>
+                  <w:sz w:val="18"/>
+                  <w:szCs w:val="18"/>
+                </w:rPr>
+                <w:t xml:space="preserve">Quyết định nhóm 25/10/2026 — Gym day pass khi Gym đóng vì sự cố; mã lỗi theo Payment-Support-Workflow.md và api-contract.md</w:t>
               </w:r>
             </w:ins>
           </w:p>
@@ -21783,6 +22190,15 @@
               </w:rPr>
               <w:t>Center Manager (theo câu trả lời mới nhất; feedback gốc ghi "admin") — nếu muốn System Administrator thì sửa BR-106 và BR-39</w:t>
             </w:r>
+            <w:ins w:id="9374" w:author="Claude" w:date="2026-10-24T22:45:00Z">
+              <w:r>
+                <w:rPr>
+                  <w:sz w:val="18"/>
+                  <w:szCs w:val="18"/>
+                </w:rPr>
+                <w:t xml:space="preserve"> — đã chốt 25/10/2026</w:t>
+              </w:r>
+            </w:ins>
           </w:p>
         </w:tc>
         <w:tc>
@@ -21797,13 +22213,24 @@
             <w:vAlign w:val="center"/>
           </w:tcPr>
           <w:p>
-            <w:r>
-              <w:rPr>
-                <w:sz w:val="18"/>
-                <w:szCs w:val="18"/>
-              </w:rPr>
-              <w:t>Nhóm</w:t>
-            </w:r>
+            <w:del w:id="9375" w:author="Claude" w:date="2026-10-24T22:45:00Z">
+              <w:r>
+                <w:rPr>
+                  <w:sz w:val="18"/>
+                  <w:szCs w:val="18"/>
+                </w:rPr>
+                <w:delText xml:space="preserve">Nhóm</w:delText>
+              </w:r>
+            </w:del>
+            <w:ins w:id="9376" w:author="Claude" w:date="2026-10-24T22:45:00Z">
+              <w:r>
+                <w:rPr>
+                  <w:sz w:val="18"/>
+                  <w:szCs w:val="18"/>
+                </w:rPr>
+                <w:t xml:space="preserve">Đã chốt</w:t>
+              </w:r>
+            </w:ins>
           </w:p>
         </w:tc>
       </w:tr>
@@ -21968,7 +22395,7 @@
                   <w:sz w:val="18"/>
                   <w:szCs w:val="18"/>
                 </w:rPr>
-                <w:t xml:space="preserve">3 ngày lịch tính từ ngày hiện tại, chỉ hiển thị cho Member (BR-126, BR-128) — cập nhật 25/10/2026</w:t>
+                <w:t xml:space="preserve">3 ngày lịch tính từ ngày hiện tại, áp dụng cho Member tự thuê và Receptionist đặt hộ; chỉ thuê trong khung 06:00 đến trước 22:00, ngày mới mở lúc 06:00 (BR-126, BR-128) — cập nhật 25/10/2026</w:t>
               </w:r>
             </w:ins>
           </w:p>
@@ -22167,6 +22594,15 @@
               </w:rPr>
               <w:t>Có — theo đúng đề bài, khác BR-97 cũ (BR-97)</w:t>
             </w:r>
+            <w:ins w:id="9377" w:author="Claude" w:date="2026-10-24T22:45:00Z">
+              <w:r>
+                <w:rPr>
+                  <w:sz w:val="18"/>
+                  <w:szCs w:val="18"/>
+                </w:rPr>
+                <w:t xml:space="preserve"> — đã chốt 25/10/2026</w:t>
+              </w:r>
+            </w:ins>
           </w:p>
         </w:tc>
         <w:tc>
@@ -22181,13 +22617,24 @@
             <w:vAlign w:val="center"/>
           </w:tcPr>
           <w:p>
-            <w:r>
-              <w:rPr>
-                <w:sz w:val="18"/>
-                <w:szCs w:val="18"/>
-              </w:rPr>
-              <w:t>Nhóm</w:t>
-            </w:r>
+            <w:del w:id="9378" w:author="Claude" w:date="2026-10-24T22:45:00Z">
+              <w:r>
+                <w:rPr>
+                  <w:sz w:val="18"/>
+                  <w:szCs w:val="18"/>
+                </w:rPr>
+                <w:delText xml:space="preserve">Nhóm</w:delText>
+              </w:r>
+            </w:del>
+            <w:ins w:id="9379" w:author="Claude" w:date="2026-10-24T22:45:00Z">
+              <w:r>
+                <w:rPr>
+                  <w:sz w:val="18"/>
+                  <w:szCs w:val="18"/>
+                </w:rPr>
+                <w:t xml:space="preserve">Đã chốt</w:t>
+              </w:r>
+            </w:ins>
           </w:p>
         </w:tc>
       </w:tr>
@@ -22330,13 +22777,24 @@
             <w:vAlign w:val="center"/>
           </w:tcPr>
           <w:p>
-            <w:r>
-              <w:rPr>
-                <w:sz w:val="18"/>
-                <w:szCs w:val="18"/>
-              </w:rPr>
-              <w:t>Hoãn, chưa có rule (theo yêu cầu "bỏ qua phần này trước")</w:t>
-            </w:r>
+            <w:del w:id="9380" w:author="Claude" w:date="2026-10-24T22:45:00Z">
+              <w:r>
+                <w:rPr>
+                  <w:sz w:val="18"/>
+                  <w:szCs w:val="18"/>
+                </w:rPr>
+                <w:delText xml:space="preserve">Hoãn, chưa có rule (theo yêu cầu "bỏ qua phần này trước")</w:delText>
+              </w:r>
+            </w:del>
+            <w:ins w:id="9381" w:author="Claude" w:date="2026-10-24T22:45:00Z">
+              <w:r>
+                <w:rPr>
+                  <w:sz w:val="18"/>
+                  <w:szCs w:val="18"/>
+                </w:rPr>
+                <w:t xml:space="preserve">Bù quyền lợi khi sự cố, đã chốt 25/10/2026: buổi lớp dời hoặc bù vào lịch tiếp theo (BR-54); thuê sân hoàn 100%, Member chọn điểm hoặc Support Request (BR-130, BR-154); Membership Gym không bù thêm ngày mà Center Manager tặng điểm (BR-155, BR-156); Gym day pass không bán và không check-in khi Gym đóng, vé vẫn hết hạn 22:00 và không hoàn tự động, Center Manager email báo người bị ảnh hưởng rồi tặng điểm nếu họ đồng ý, nếu không thì Member gửi Support Request (BR-158)</w:t>
+              </w:r>
+            </w:ins>
           </w:p>
         </w:tc>
         <w:tc>
@@ -22351,13 +22809,138 @@
             <w:vAlign w:val="center"/>
           </w:tcPr>
           <w:p>
-            <w:r>
-              <w:rPr>
-                <w:sz w:val="18"/>
-                <w:szCs w:val="18"/>
-              </w:rPr>
-              <w:t>Nhóm</w:t>
-            </w:r>
+            <w:del w:id="9382" w:author="Claude" w:date="2026-10-24T22:45:00Z">
+              <w:r>
+                <w:rPr>
+                  <w:sz w:val="18"/>
+                  <w:szCs w:val="18"/>
+                </w:rPr>
+                <w:delText xml:space="preserve">Nhóm</w:delText>
+              </w:r>
+            </w:del>
+            <w:ins w:id="9383" w:author="Claude" w:date="2026-10-24T22:45:00Z">
+              <w:r>
+                <w:rPr>
+                  <w:sz w:val="18"/>
+                  <w:szCs w:val="18"/>
+                </w:rPr>
+                <w:t xml:space="preserve">Đã chốt</w:t>
+              </w:r>
+            </w:ins>
+          </w:p>
+        </w:tc>
+      </w:tr>
+      <w:tr>
+        <w:trPr>
+          <w:cantSplit/>
+          <w:del w:id="9384" w:author="Claude" w:date="2026-10-24T22:45:00Z"/>
+        </w:trPr>
+        <w:tc>
+          <w:tcPr>
+            <w:tcW w:w="500" w:type="dxa"/>
+            <w:tcMar>
+              <w:top w:w="60" w:type="dxa"/>
+              <w:left w:w="100" w:type="dxa"/>
+              <w:bottom w:w="60" w:type="dxa"/>
+              <w:right w:w="100" w:type="dxa"/>
+            </w:tcMar>
+            <w:vAlign w:val="center"/>
+          </w:tcPr>
+          <w:p>
+            <w:pPr>
+              <w:rPr>
+                <w:del w:id="9385" w:author="Claude" w:date="2026-10-24T22:45:00Z"/>
+              </w:rPr>
+            </w:pPr>
+            <w:del w:id="9386" w:author="Claude" w:date="2026-10-24T22:45:00Z">
+              <w:r>
+                <w:delText xml:space="preserve">12</w:delText>
+              </w:r>
+            </w:del>
+          </w:p>
+        </w:tc>
+        <w:tc>
+          <w:tcPr>
+            <w:tcW w:w="3600" w:type="dxa"/>
+            <w:tcMar>
+              <w:top w:w="60" w:type="dxa"/>
+              <w:left w:w="100" w:type="dxa"/>
+              <w:bottom w:w="60" w:type="dxa"/>
+              <w:right w:w="100" w:type="dxa"/>
+            </w:tcMar>
+            <w:vAlign w:val="center"/>
+          </w:tcPr>
+          <w:p>
+            <w:pPr>
+              <w:rPr>
+                <w:del w:id="9387" w:author="Claude" w:date="2026-10-24T22:45:00Z"/>
+              </w:rPr>
+            </w:pPr>
+            <w:del w:id="9388" w:author="Claude" w:date="2026-10-24T22:45:00Z">
+              <w:r>
+                <w:rPr>
+                  <w:sz w:val="18"/>
+                  <w:szCs w:val="18"/>
+                </w:rPr>
+                <w:delText xml:space="preserve">Mỗi lớp có đúng một gói lớp (một giá)</w:delText>
+              </w:r>
+            </w:del>
+          </w:p>
+        </w:tc>
+        <w:tc>
+          <w:tcPr>
+            <w:tcW w:w="3800" w:type="dxa"/>
+            <w:tcMar>
+              <w:top w:w="60" w:type="dxa"/>
+              <w:left w:w="100" w:type="dxa"/>
+              <w:bottom w:w="60" w:type="dxa"/>
+              <w:right w:w="100" w:type="dxa"/>
+            </w:tcMar>
+            <w:vAlign w:val="center"/>
+          </w:tcPr>
+          <w:p>
+            <w:pPr>
+              <w:rPr>
+                <w:del w:id="9389" w:author="Claude" w:date="2026-10-24T22:45:00Z"/>
+              </w:rPr>
+            </w:pPr>
+            <w:del w:id="9390" w:author="Claude" w:date="2026-10-24T22:45:00Z">
+              <w:r>
+                <w:rPr>
+                  <w:sz w:val="18"/>
+                  <w:szCs w:val="18"/>
+                </w:rPr>
+                <w:delText xml:space="preserve">Một Class : một ClassPackage (BR-110)</w:delText>
+              </w:r>
+            </w:del>
+          </w:p>
+        </w:tc>
+        <w:tc>
+          <w:tcPr>
+            <w:tcW w:w="1500" w:type="dxa"/>
+            <w:tcMar>
+              <w:top w:w="60" w:type="dxa"/>
+              <w:left w:w="100" w:type="dxa"/>
+              <w:bottom w:w="60" w:type="dxa"/>
+              <w:right w:w="100" w:type="dxa"/>
+            </w:tcMar>
+            <w:vAlign w:val="center"/>
+          </w:tcPr>
+          <w:p>
+            <w:pPr>
+              <w:rPr>
+                <w:del w:id="9391" w:author="Claude" w:date="2026-10-24T22:45:00Z"/>
+              </w:rPr>
+            </w:pPr>
+            <w:del w:id="9392" w:author="Claude" w:date="2026-10-24T22:45:00Z">
+              <w:r>
+                <w:rPr>
+                  <w:sz w:val="18"/>
+                  <w:szCs w:val="18"/>
+                </w:rPr>
+                <w:delText xml:space="preserve">Nhóm</w:delText>
+              </w:r>
+            </w:del>
           </w:p>
         </w:tc>
       </w:tr>
@@ -22377,9 +22960,16 @@
             <w:vAlign w:val="center"/>
           </w:tcPr>
           <w:p>
-            <w:r>
-              <w:t>12</w:t>
-            </w:r>
+            <w:del w:id="9393" w:author="Claude" w:date="2026-10-24T22:45:00Z">
+              <w:r>
+                <w:delText xml:space="preserve">13</w:delText>
+              </w:r>
+            </w:del>
+            <w:ins w:id="9394" w:author="Claude" w:date="2026-10-24T22:45:00Z">
+              <w:r>
+                <w:t xml:space="preserve">12</w:t>
+              </w:r>
+            </w:ins>
           </w:p>
         </w:tc>
         <w:tc>
@@ -22399,7 +22989,7 @@
                 <w:sz w:val="18"/>
                 <w:szCs w:val="18"/>
               </w:rPr>
-              <w:t>Mỗi lớp có đúng một gói lớp (một giá)</w:t>
+              <w:t>Người đi cùng khi Member thuê sân</w:t>
             </w:r>
           </w:p>
         </w:tc>
@@ -22420,7 +23010,32 @@
                 <w:sz w:val="18"/>
                 <w:szCs w:val="18"/>
               </w:rPr>
-              <w:t>Một Class : một ClassPackage (BR-110)</w:t>
+              <w:t xml:space="preserve">Không khai báo, </w:t>
+            </w:r>
+            <w:del w:id="9420" w:author="Claude" w:date="2026-10-24T22:45:00Z">
+              <w:r>
+                <w:rPr>
+                  <w:sz w:val="18"/>
+                  <w:szCs w:val="18"/>
+                </w:rPr>
+                <w:delText xml:space="preserve">không quản lý, không điểm danh, không giới hạn số người (BR-128, BR-131)</w:delText>
+              </w:r>
+            </w:del>
+            <w:ins w:id="9421" w:author="Claude" w:date="2026-10-24T22:45:00Z">
+              <w:r>
+                <w:rPr>
+                  <w:sz w:val="18"/>
+                  <w:szCs w:val="18"/>
+                </w:rPr>
+                <w:t xml:space="preserve">không quản lý, không điểm danh người đi cùng, không giới hạn số người (BR-128, BR-131); trạng thái check-in của lượt thuê do Receptionist đánh dấu (BR-159)</w:t>
+              </w:r>
+            </w:ins>
+            <w:r>
+              <w:rPr>
+                <w:sz w:val="18"/>
+                <w:szCs w:val="18"/>
+              </w:rPr>
+              <w:t xml:space="preserve"> — đã chốt</w:t>
             </w:r>
           </w:p>
         </w:tc>
@@ -22441,7 +23056,7 @@
                 <w:sz w:val="18"/>
                 <w:szCs w:val="18"/>
               </w:rPr>
-              <w:t>Nhóm</w:t>
+              <w:t>Đã chốt</w:t>
             </w:r>
           </w:p>
         </w:tc>
@@ -22462,94 +23077,16 @@
             <w:vAlign w:val="center"/>
           </w:tcPr>
           <w:p>
-            <w:r>
-              <w:t>13</w:t>
-            </w:r>
-          </w:p>
-        </w:tc>
-        <w:tc>
-          <w:tcPr>
-            <w:tcW w:w="3600" w:type="dxa"/>
-            <w:tcMar>
-              <w:top w:w="60" w:type="dxa"/>
-              <w:left w:w="100" w:type="dxa"/>
-              <w:bottom w:w="60" w:type="dxa"/>
-              <w:right w:w="100" w:type="dxa"/>
-            </w:tcMar>
-            <w:vAlign w:val="center"/>
-          </w:tcPr>
-          <w:p>
-            <w:r>
-              <w:rPr>
-                <w:sz w:val="18"/>
-                <w:szCs w:val="18"/>
-              </w:rPr>
-              <w:t>Người đi cùng khi Member thuê sân</w:t>
-            </w:r>
-          </w:p>
-        </w:tc>
-        <w:tc>
-          <w:tcPr>
-            <w:tcW w:w="3800" w:type="dxa"/>
-            <w:tcMar>
-              <w:top w:w="60" w:type="dxa"/>
-              <w:left w:w="100" w:type="dxa"/>
-              <w:bottom w:w="60" w:type="dxa"/>
-              <w:right w:w="100" w:type="dxa"/>
-            </w:tcMar>
-            <w:vAlign w:val="center"/>
-          </w:tcPr>
-          <w:p>
-            <w:r>
-              <w:rPr>
-                <w:sz w:val="18"/>
-                <w:szCs w:val="18"/>
-              </w:rPr>
-              <w:t>Không khai báo, không quản lý, không điểm danh, không giới hạn số người (BR-128, BR-131) — đã chốt</w:t>
-            </w:r>
-          </w:p>
-        </w:tc>
-        <w:tc>
-          <w:tcPr>
-            <w:tcW w:w="1500" w:type="dxa"/>
-            <w:tcMar>
-              <w:top w:w="60" w:type="dxa"/>
-              <w:left w:w="100" w:type="dxa"/>
-              <w:bottom w:w="60" w:type="dxa"/>
-              <w:right w:w="100" w:type="dxa"/>
-            </w:tcMar>
-            <w:vAlign w:val="center"/>
-          </w:tcPr>
-          <w:p>
-            <w:r>
-              <w:rPr>
-                <w:sz w:val="18"/>
-                <w:szCs w:val="18"/>
-              </w:rPr>
-              <w:t>Đã chốt</w:t>
-            </w:r>
-          </w:p>
-        </w:tc>
-      </w:tr>
-      <w:tr>
-        <w:trPr>
-          <w:cantSplit/>
-        </w:trPr>
-        <w:tc>
-          <w:tcPr>
-            <w:tcW w:w="500" w:type="dxa"/>
-            <w:tcMar>
-              <w:top w:w="60" w:type="dxa"/>
-              <w:left w:w="100" w:type="dxa"/>
-              <w:bottom w:w="60" w:type="dxa"/>
-              <w:right w:w="100" w:type="dxa"/>
-            </w:tcMar>
-            <w:vAlign w:val="center"/>
-          </w:tcPr>
-          <w:p>
-            <w:r>
-              <w:t>14</w:t>
-            </w:r>
+            <w:del w:id="9395" w:author="Claude" w:date="2026-10-24T22:45:00Z">
+              <w:r>
+                <w:delText xml:space="preserve">14</w:delText>
+              </w:r>
+            </w:del>
+            <w:ins w:id="9396" w:author="Claude" w:date="2026-10-24T22:45:00Z">
+              <w:r>
+                <w:t xml:space="preserve">13</w:t>
+              </w:r>
+            </w:ins>
           </w:p>
         </w:tc>
         <w:tc>
@@ -22640,7 +23177,7 @@
             </w:pPr>
             <w:ins w:id="9141" w:author="Claude" w:date="2026-10-24T22:45:00Z">
               <w:r>
-                <w:t xml:space="preserve">15</w:t>
+                <w:t xml:space="preserve">14</w:t>
               </w:r>
             </w:ins>
           </w:p>
@@ -22754,7 +23291,7 @@
             </w:pPr>
             <w:ins w:id="9150" w:author="Claude" w:date="2026-10-24T22:45:00Z">
               <w:r>
-                <w:t xml:space="preserve">16</w:t>
+                <w:t xml:space="preserve">15</w:t>
               </w:r>
             </w:ins>
           </w:p>
@@ -22868,7 +23405,7 @@
             </w:pPr>
             <w:ins w:id="9159" w:author="Claude" w:date="2026-10-24T22:45:00Z">
               <w:r>
-                <w:t xml:space="preserve">17</w:t>
+                <w:t xml:space="preserve">16</w:t>
               </w:r>
             </w:ins>
           </w:p>
@@ -22982,7 +23519,7 @@
             </w:pPr>
             <w:ins w:id="9168" w:author="Claude" w:date="2026-10-24T22:45:00Z">
               <w:r>
-                <w:t xml:space="preserve">18</w:t>
+                <w:t xml:space="preserve">17</w:t>
               </w:r>
             </w:ins>
           </w:p>
@@ -23096,7 +23633,7 @@
             </w:pPr>
             <w:ins w:id="9177" w:author="Claude" w:date="2026-10-24T22:45:00Z">
               <w:r>
-                <w:t xml:space="preserve">19</w:t>
+                <w:t xml:space="preserve">18</w:t>
               </w:r>
             </w:ins>
           </w:p>
@@ -23210,7 +23747,7 @@
             </w:pPr>
             <w:ins w:id="9186" w:author="Claude" w:date="2026-10-24T22:45:00Z">
               <w:r>
-                <w:t xml:space="preserve">20</w:t>
+                <w:t xml:space="preserve">19</w:t>
               </w:r>
             </w:ins>
           </w:p>
@@ -23324,7 +23861,7 @@
             </w:pPr>
             <w:ins w:id="9266" w:author="Claude" w:date="2026-10-24T22:45:00Z">
               <w:r>
-                <w:t xml:space="preserve">21</w:t>
+                <w:t xml:space="preserve">20</w:t>
               </w:r>
             </w:ins>
           </w:p>
@@ -23438,7 +23975,7 @@
             </w:pPr>
             <w:ins w:id="9275" w:author="Claude" w:date="2026-10-24T22:45:00Z">
               <w:r>
-                <w:t xml:space="preserve">22</w:t>
+                <w:t xml:space="preserve">21</w:t>
               </w:r>
             </w:ins>
           </w:p>
@@ -23552,7 +24089,7 @@
             </w:pPr>
             <w:ins w:id="9284" w:author="Claude" w:date="2026-10-24T22:45:00Z">
               <w:r>
-                <w:t xml:space="preserve">23</w:t>
+                <w:t xml:space="preserve">22</w:t>
               </w:r>
             </w:ins>
           </w:p>
@@ -23666,7 +24203,7 @@
             </w:pPr>
             <w:ins w:id="9293" w:author="Claude" w:date="2026-10-24T22:45:00Z">
               <w:r>
-                <w:t xml:space="preserve">24</w:t>
+                <w:t xml:space="preserve">23</w:t>
               </w:r>
             </w:ins>
           </w:p>
@@ -23780,7 +24317,7 @@
             </w:pPr>
             <w:ins w:id="9302" w:author="Claude" w:date="2026-10-24T22:45:00Z">
               <w:r>
-                <w:t xml:space="preserve">25</w:t>
+                <w:t xml:space="preserve">24</w:t>
               </w:r>
             </w:ins>
           </w:p>
@@ -23894,7 +24431,7 @@
             </w:pPr>
             <w:ins w:id="9311" w:author="Claude" w:date="2026-10-24T22:45:00Z">
               <w:r>
-                <w:t xml:space="preserve">26</w:t>
+                <w:t xml:space="preserve">25</w:t>
               </w:r>
             </w:ins>
           </w:p>
@@ -25502,6 +26039,15 @@
                 <w:t xml:space="preserve"> Nạp điểm hộ Member qua luồng Add points (BR-157); không tự tặng, trừ hay điều chỉnh điểm (BR-139).</w:t>
               </w:r>
             </w:ins>
+            <w:ins w:id="9423" w:author="Claude" w:date="2026-10-24T22:45:00Z">
+              <w:r>
+                <w:rPr>
+                  <w:sz w:val="18"/>
+                  <w:szCs w:val="18"/>
+                </w:rPr>
+                <w:t xml:space="preserve"> Chỉnh sửa điểm danh lớp khi Coach ghi sai và Member kiến nghị (BR-98); đặt hộ lượt thuê sân cho Member (BR-126) và đánh dấu check-in hoặc no-show cho lượt thuê (BR-159).</w:t>
+              </w:r>
+            </w:ins>
           </w:p>
         </w:tc>
       </w:tr>
@@ -25670,6 +26216,15 @@
               </w:rPr>
               <w:t>Chỉ đọc hồ sơ/gói/hồ sơ tập luyện của Member đang có quan hệ huấn luyện Active; tự quản lý hồ sơ cá nhân của mình.</w:t>
             </w:r>
+            <w:ins w:id="9422" w:author="Claude" w:date="2026-10-24T22:45:00Z">
+              <w:r>
+                <w:rPr>
+                  <w:sz w:val="18"/>
+                  <w:szCs w:val="18"/>
+                </w:rPr>
+                <w:t xml:space="preserve"> Điểm danh (Present hoặc Absent) học viên các buổi lớp nhóm mình phụ trách (BR-98).</w:t>
+              </w:r>
+            </w:ins>
           </w:p>
         </w:tc>
       </w:tr>

</xml_diff>

<commit_message>
refactor(accounts): unify statuses and support admin avatars
</commit_message>
<xml_diff>
--- a/docs/SportManagement_BusinessRules_v2.0_updated.docx
+++ b/docs/SportManagement_BusinessRules_v2.0_updated.docx
@@ -848,7 +848,7 @@
                 <w:sz w:val="18"/>
                 <w:szCs w:val="18"/>
               </w:rPr>
-              <w:t>Chỉ System Administrator được khóa, mở khóa hoặc vô hiệu hóa (Deactivated) tài khoản, và phải nhập lý do. Tài khoản bị khóa hoặc vô hiệu hóa không được đăng nhập hoặc tiếp tục sử dụng các chức năng yêu cầu xác thực (hiệu lực từ request kế tiếp). Không được tự khóa tài khoản hoặc khóa System Administrator hoạt động cuối cùng.</w:t>
+              <w:t>Chỉ System Administrator được Activate (ACTIVE) hoặc Deactivate (DEACTIVATED) tài khoản, kèm lý do bắt buộc. Đây là hai trạng thái tài khoản duy nhất. Tài khoản Deactivated không được đăng nhập hoặc tiếp tục dùng chức năng cần xác thực, từ request kế tiếp. Không tự Deactivate hoặc Deactivate Admin Active cuối cùng. Activate không thay bước xác minh email/đặt mật khẩu của lời mời.</w:t>
             </w:r>
           </w:p>
         </w:tc>
@@ -960,7 +960,7 @@
                 <w:sz w:val="18"/>
                 <w:szCs w:val="18"/>
               </w:rPr>
-              <w:t>Mọi thao tác quản trị và nghiệp vụ quan trọng của System Administrator, Center Manager, Coach và Receptionist phải được ghi Audit Log, gồm người thực hiện, hành động, đối tượng bị tác động và thời điểm. Các nhóm thao tác bắt buộc ghi gồm: CRUD môn thể thao, tạo tài khoản nhân sự (kể cả Coach), đăng ký Member tại quầy (FRONT_DESK_CREATE_MEMBER), đổi vai trò (CHANGE_USER_ROLE), khóa/mở khóa/vô hiệu hóa tài khoản, gửi lại link kích hoạt (RESEND_STAFF_ACTIVATION, RESEND_MEMBER_ACTIVATION), sửa email tài khoản chờ kích hoạt (CHANGE_PENDING_STAFF_EMAIL, CHANGE_PENDING_MEMBER_EMAIL, ghi email cũ, email mới và lý do), tạo/sửa/ngừng/bán lại gói thành viên và kích hoạt gói đã bán (ACTIVATE_MEMBER_PACKAGE), tạo/sửa/hủy lớp và lịch, quyết định về ngưỡng hoàn vốn, thuê/hủy sân, cộng/trừ/điều chỉnh điểm. Thao tác khóa hoặc mở khóa tài khoản phải ghi thêm lý do.</w:t>
+              <w:t>Mọi thao tác quản trị và nghiệp vụ quan trọng của System Administrator, Center Manager, Coach và Receptionist phải được ghi Audit Log, gồm người thực hiện, hành động, đối tượng bị tác động và thời điểm. Các nhóm thao tác bắt buộc ghi gồm: CRUD môn thể thao, tạo tài khoản nhân sự (kể cả Coach), đăng ký Member tại quầy (FRONT_DESK_CREATE_MEMBER), đổi vai trò (CHANGE_USER_ROLE), Activate/Deactivate tài khoản (ACTIVATE_USER_ACCOUNT, DEACTIVATE_USER_ACCOUNT), gửi lại link kích hoạt (RESEND_STAFF_ACTIVATION, RESEND_MEMBER_ACTIVATION), sửa email tài khoản chờ kích hoạt (CHANGE_PENDING_STAFF_EMAIL, CHANGE_PENDING_MEMBER_EMAIL, ghi email cũ, email mới và lý do), tạo/sửa/ngừng/bán lại gói thành viên và kích hoạt gói đã bán (ACTIVATE_MEMBER_PACKAGE), tạo/sửa/hủy lớp và lịch, quyết định về ngưỡng hoàn vốn, thuê/hủy sân, cộng/trừ/điều chỉnh điểm. Thao tác Activate hoặc Deactivate tài khoản phải ghi thêm lý do.</w:t>
             </w:r>
           </w:p>
         </w:tc>
@@ -11330,7 +11330,7 @@
                 <w:sz w:val="18"/>
                 <w:szCs w:val="18"/>
               </w:rPr>
-              <w:t>Một Member không được có hai lượt thuê giao thời gian nhau; mỗi khung giờ của mỗi Room chỉ thuộc một lượt thuê (BR-108). Member bị khóa tài khoản không được đặt mới; lượt thuê đã CONFIRMED vẫn xử lý theo BR-129.</w:t>
+              <w:t>Một Member không được có hai lượt thuê giao thời gian nhau; mỗi khung giờ của mỗi Room chỉ thuộc một lượt thuê (BR-108). Member có tài khoản Deactivated không được đặt mới; lượt thuê đã CONFIRMED vẫn xử lý theo BR-129.</w:t>
             </w:r>
           </w:p>
         </w:tc>
@@ -24894,7 +24894,7 @@
         <w:pStyle w:val="oancuaDanhsach"/>
       </w:pPr>
       <w:r>
-        <w:t>• Tài khoản bị khóa (Banned, Deactivated): không liên kết, không cấp phiên (bước 1 và 2).</w:t>
+        <w:t>• Tài khoản Deactivated: không liên kết, không cấp phiên (bước 1 và 2).</w:t>
       </w:r>
     </w:p>
     <w:p>
@@ -26161,7 +26161,7 @@
                 <w:sz w:val="18"/>
                 <w:szCs w:val="18"/>
               </w:rPr>
-              <w:t>Tạo tài khoản nhân sự, đổi vai trò, khóa/mở khóa/vô hiệu hóa tài khoản, xem Audit Log thao tác tài khoản. Không có quyền nghiệp vụ khác.</w:t>
+              <w:t>Tạo tài khoản nhân sự, đổi vai trò, Activate/Deactivate tài khoản kèm lý do, xem Audit Log thao tác tài khoản. Không có quyền nghiệp vụ khác.</w:t>
             </w:r>
           </w:p>
         </w:tc>
@@ -26817,7 +26817,7 @@
                 <w:sz w:val="18"/>
                 <w:szCs w:val="18"/>
               </w:rPr>
-              <w:t>Đăng nhập bằng email/mật khẩu; nhận JWT; từ chối tài khoản Banned/Deactivated và tài khoản chưa có mật khẩu.</w:t>
+              <w:t>Đăng nhập bằng email/mật khẩu; nhận JWT; từ chối tài khoản Deactivated và tài khoản chưa có mật khẩu.</w:t>
             </w:r>
           </w:p>
         </w:tc>
@@ -29138,7 +29138,7 @@
                 <w:sz w:val="18"/>
                 <w:szCs w:val="18"/>
               </w:rPr>
-              <w:t>Khóa, mở khóa, vô hiệu hóa tài khoản kèm lý do bắt buộc; không tự khóa; không khóa Admin hoạt động cuối; hiệu lực từ request kế tiếp.</w:t>
+              <w:t>Activate/Deactivate tài khoản kèm lý do bắt buộc; chỉ có Active/Deactivated; không tự Deactivate hoặc Deactivate Admin Active cuối cùng; vô hiệu token cũ từ request kế tiếp.</w:t>
             </w:r>
           </w:p>
         </w:tc>
@@ -29207,7 +29207,7 @@
                 <w:sz w:val="18"/>
                 <w:szCs w:val="18"/>
               </w:rPr>
-              <w:t>POST /api/users/{id}/lock|unlock|deactivate</w:t>
+              <w:t>POST /api/users/{id}/activate|deactivate (lock/unlock là alias tương thích)</w:t>
             </w:r>
           </w:p>
         </w:tc>
@@ -32172,7 +32172,7 @@
                 <w:sz w:val="18"/>
                 <w:szCs w:val="18"/>
               </w:rPr>
-              <w:t>Mỗi thao tác quản trị tài khoản và gói ghi người thực hiện, hành động, đối tượng, giá trị cũ/mới và lý do (khóa/mở khóa/đổi vai trò/sửa email bắt buộc lý do), ghi trong cùng transaction với thao tác.</w:t>
+              <w:t>Mỗi thao tác quản trị tài khoản và gói ghi người thực hiện, hành động, đối tượng, giá trị cũ/mới và lý do (Activate/Deactivate/đổi vai trò/sửa email bắt buộc lý do), ghi trong cùng transaction với thao tác.</w:t>
             </w:r>
           </w:p>
         </w:tc>

</xml_diff>